<commit_message>
Add unit tests for Percentage value object and its operations
- Implement tests for construction, validation, and immutability of Percentage.
- Add tests for conversion between basis points and percentages.
- Create tests for applying percentages to Money amounts.
- Include tests for arithmetic operations on percentages.
- Implement serialization and deserialization tests for Percentage.
- Add tests for string representations of Percentage.
- Create integration tests for combining multiple operations involving Percentage and Money.
</commit_message>
<xml_diff>
--- a/Piano-operativo-v1.7.docx
+++ b/Piano-operativo-v1.7.docx
@@ -2128,27 +2128,49 @@
     </w:p>
     <w:p/>
     <w:p>
-      <w:r>
+      <w:pPr>
+        <w:rPr>
+          <w:highlight w:val="green"/>
+        </w:rPr>
+      </w:pPr>
+      <w:r>
+        <w:rPr>
+          <w:highlight w:val="green"/>
+        </w:rPr>
         <w:t xml:space="preserve">## TASK 1.3: </w:t>
       </w:r>
       <w:proofErr w:type="spellStart"/>
       <w:r>
+        <w:rPr>
+          <w:highlight w:val="green"/>
+        </w:rPr>
         <w:t>Creazione</w:t>
       </w:r>
       <w:proofErr w:type="spellEnd"/>
       <w:r>
+        <w:rPr>
+          <w:highlight w:val="green"/>
+        </w:rPr>
         <w:t xml:space="preserve"> Value Object Money (Backend)</w:t>
       </w:r>
     </w:p>
-    <w:p/>
-    <w:p>
-      <w:pPr>
-        <w:rPr>
-          <w:lang w:val="it-IT"/>
-        </w:rPr>
-      </w:pPr>
-      <w:r>
-        <w:rPr>
+    <w:p>
+      <w:pPr>
+        <w:rPr>
+          <w:highlight w:val="green"/>
+        </w:rPr>
+      </w:pPr>
+    </w:p>
+    <w:p>
+      <w:pPr>
+        <w:rPr>
+          <w:highlight w:val="green"/>
+          <w:lang w:val="it-IT"/>
+        </w:rPr>
+      </w:pPr>
+      <w:r>
+        <w:rPr>
+          <w:highlight w:val="green"/>
           <w:lang w:val="it-IT"/>
         </w:rPr>
         <w:t>**</w:t>
@@ -2156,6 +2178,7 @@
       <w:proofErr w:type="gramStart"/>
       <w:r>
         <w:rPr>
+          <w:highlight w:val="green"/>
           <w:lang w:val="it-IT"/>
         </w:rPr>
         <w:t>Descrizione:*</w:t>
@@ -2163,6 +2186,7 @@
       <w:proofErr w:type="gramEnd"/>
       <w:r>
         <w:rPr>
+          <w:highlight w:val="green"/>
           <w:lang w:val="it-IT"/>
         </w:rPr>
         <w:t xml:space="preserve">* Implementare il </w:t>
@@ -2170,6 +2194,7 @@
       <w:proofErr w:type="spellStart"/>
       <w:r>
         <w:rPr>
+          <w:highlight w:val="green"/>
           <w:lang w:val="it-IT"/>
         </w:rPr>
         <w:t>value</w:t>
@@ -2177,6 +2202,7 @@
       <w:proofErr w:type="spellEnd"/>
       <w:r>
         <w:rPr>
+          <w:highlight w:val="green"/>
           <w:lang w:val="it-IT"/>
         </w:rPr>
         <w:t xml:space="preserve"> </w:t>
@@ -2184,6 +2210,7 @@
       <w:proofErr w:type="spellStart"/>
       <w:r>
         <w:rPr>
+          <w:highlight w:val="green"/>
           <w:lang w:val="it-IT"/>
         </w:rPr>
         <w:t>object</w:t>
@@ -2191,6 +2218,7 @@
       <w:proofErr w:type="spellEnd"/>
       <w:r>
         <w:rPr>
+          <w:highlight w:val="green"/>
           <w:lang w:val="it-IT"/>
         </w:rPr>
         <w:t xml:space="preserve"> immutabile `Money` per gestire importi monetari con precisione decimale.</w:t>
@@ -2199,94 +2227,166 @@
     <w:p>
       <w:pPr>
         <w:rPr>
-          <w:lang w:val="it-IT"/>
-        </w:rPr>
-      </w:pPr>
-    </w:p>
-    <w:p>
-      <w:r>
+          <w:highlight w:val="green"/>
+          <w:lang w:val="it-IT"/>
+        </w:rPr>
+      </w:pPr>
+    </w:p>
+    <w:p>
+      <w:pPr>
+        <w:rPr>
+          <w:highlight w:val="green"/>
+        </w:rPr>
+      </w:pPr>
+      <w:r>
+        <w:rPr>
+          <w:highlight w:val="green"/>
+        </w:rPr>
         <w:t>**</w:t>
       </w:r>
       <w:proofErr w:type="spellStart"/>
       <w:proofErr w:type="gramStart"/>
       <w:r>
+        <w:rPr>
+          <w:highlight w:val="green"/>
+        </w:rPr>
         <w:t>Microstep</w:t>
       </w:r>
       <w:proofErr w:type="spellEnd"/>
       <w:r>
+        <w:rPr>
+          <w:highlight w:val="green"/>
+        </w:rPr>
         <w:t>:*</w:t>
       </w:r>
       <w:proofErr w:type="gramEnd"/>
       <w:r>
+        <w:rPr>
+          <w:highlight w:val="green"/>
+        </w:rPr>
         <w:t>*</w:t>
       </w:r>
     </w:p>
     <w:p>
-      <w:r>
+      <w:pPr>
+        <w:rPr>
+          <w:highlight w:val="green"/>
+        </w:rPr>
+      </w:pPr>
+      <w:r>
+        <w:rPr>
+          <w:highlight w:val="green"/>
+        </w:rPr>
         <w:t xml:space="preserve">1. </w:t>
       </w:r>
       <w:proofErr w:type="spellStart"/>
       <w:r>
+        <w:rPr>
+          <w:highlight w:val="green"/>
+        </w:rPr>
         <w:t>Creare</w:t>
       </w:r>
       <w:proofErr w:type="spellEnd"/>
       <w:r>
+        <w:rPr>
+          <w:highlight w:val="green"/>
+        </w:rPr>
         <w:t xml:space="preserve"> file `backend/</w:t>
       </w:r>
       <w:proofErr w:type="spellStart"/>
       <w:r>
+        <w:rPr>
+          <w:highlight w:val="green"/>
+        </w:rPr>
         <w:t>src</w:t>
       </w:r>
       <w:proofErr w:type="spellEnd"/>
       <w:r>
+        <w:rPr>
+          <w:highlight w:val="green"/>
+        </w:rPr>
         <w:t>/shared/domain/</w:t>
       </w:r>
       <w:proofErr w:type="spellStart"/>
       <w:r>
+        <w:rPr>
+          <w:highlight w:val="green"/>
+        </w:rPr>
         <w:t>value_objects</w:t>
       </w:r>
       <w:proofErr w:type="spellEnd"/>
       <w:r>
+        <w:rPr>
+          <w:highlight w:val="green"/>
+        </w:rPr>
         <w:t>/money.py`</w:t>
       </w:r>
     </w:p>
     <w:p>
-      <w:r>
+      <w:pPr>
+        <w:rPr>
+          <w:highlight w:val="green"/>
+        </w:rPr>
+      </w:pPr>
+      <w:r>
+        <w:rPr>
+          <w:highlight w:val="green"/>
+        </w:rPr>
         <w:t xml:space="preserve">2. </w:t>
       </w:r>
       <w:proofErr w:type="spellStart"/>
       <w:r>
+        <w:rPr>
+          <w:highlight w:val="green"/>
+        </w:rPr>
         <w:t>Definire</w:t>
       </w:r>
       <w:proofErr w:type="spellEnd"/>
       <w:r>
+        <w:rPr>
+          <w:highlight w:val="green"/>
+        </w:rPr>
         <w:t xml:space="preserve"> </w:t>
       </w:r>
       <w:proofErr w:type="spellStart"/>
       <w:r>
+        <w:rPr>
+          <w:highlight w:val="green"/>
+        </w:rPr>
         <w:t>dataclass</w:t>
       </w:r>
       <w:proofErr w:type="spellEnd"/>
       <w:r>
+        <w:rPr>
+          <w:highlight w:val="green"/>
+        </w:rPr>
         <w:t xml:space="preserve"> frozen `Money` con </w:t>
       </w:r>
       <w:proofErr w:type="spellStart"/>
       <w:r>
+        <w:rPr>
+          <w:highlight w:val="green"/>
+        </w:rPr>
         <w:t>campi</w:t>
       </w:r>
       <w:proofErr w:type="spellEnd"/>
       <w:r>
+        <w:rPr>
+          <w:highlight w:val="green"/>
+        </w:rPr>
         <w:t>: `amount` (Decimal), `currency` (str, default "USD")</w:t>
       </w:r>
     </w:p>
     <w:p>
       <w:pPr>
         <w:rPr>
-          <w:lang w:val="it-IT"/>
-        </w:rPr>
-      </w:pPr>
-      <w:r>
-        <w:rPr>
+          <w:highlight w:val="green"/>
+          <w:lang w:val="it-IT"/>
+        </w:rPr>
+      </w:pPr>
+      <w:r>
+        <w:rPr>
+          <w:highlight w:val="green"/>
           <w:lang w:val="it-IT"/>
         </w:rPr>
         <w:lastRenderedPageBreak/>
@@ -2295,6 +2395,7 @@
       <w:proofErr w:type="spellStart"/>
       <w:r>
         <w:rPr>
+          <w:highlight w:val="green"/>
           <w:lang w:val="it-IT"/>
         </w:rPr>
         <w:t>post_init</w:t>
@@ -2302,6 +2403,7 @@
       <w:proofErr w:type="spellEnd"/>
       <w:r>
         <w:rPr>
+          <w:highlight w:val="green"/>
           <w:lang w:val="it-IT"/>
         </w:rPr>
         <w:t>__` per convertire input non-</w:t>
@@ -2309,6 +2411,7 @@
       <w:proofErr w:type="spellStart"/>
       <w:r>
         <w:rPr>
+          <w:highlight w:val="green"/>
           <w:lang w:val="it-IT"/>
         </w:rPr>
         <w:t>Decimal</w:t>
@@ -2316,6 +2419,7 @@
       <w:proofErr w:type="spellEnd"/>
       <w:r>
         <w:rPr>
+          <w:highlight w:val="green"/>
           <w:lang w:val="it-IT"/>
         </w:rPr>
         <w:t xml:space="preserve"> in </w:t>
@@ -2323,6 +2427,7 @@
       <w:proofErr w:type="spellStart"/>
       <w:r>
         <w:rPr>
+          <w:highlight w:val="green"/>
           <w:lang w:val="it-IT"/>
         </w:rPr>
         <w:t>Decimal</w:t>
@@ -2332,11 +2437,13 @@
     <w:p>
       <w:pPr>
         <w:rPr>
-          <w:lang w:val="it-IT"/>
-        </w:rPr>
-      </w:pPr>
-      <w:r>
-        <w:rPr>
+          <w:highlight w:val="green"/>
+          <w:lang w:val="it-IT"/>
+        </w:rPr>
+      </w:pPr>
+      <w:r>
+        <w:rPr>
+          <w:highlight w:val="green"/>
           <w:lang w:val="it-IT"/>
         </w:rPr>
         <w:t>4. Implementare metodi: `__</w:t>
@@ -2344,6 +2451,7 @@
       <w:proofErr w:type="spellStart"/>
       <w:r>
         <w:rPr>
+          <w:highlight w:val="green"/>
           <w:lang w:val="it-IT"/>
         </w:rPr>
         <w:t>add</w:t>
@@ -2351,6 +2459,7 @@
       <w:proofErr w:type="spellEnd"/>
       <w:r>
         <w:rPr>
+          <w:highlight w:val="green"/>
           <w:lang w:val="it-IT"/>
         </w:rPr>
         <w:t>__`, `__sub__`, `__</w:t>
@@ -2358,6 +2467,7 @@
       <w:proofErr w:type="spellStart"/>
       <w:r>
         <w:rPr>
+          <w:highlight w:val="green"/>
           <w:lang w:val="it-IT"/>
         </w:rPr>
         <w:t>mul</w:t>
@@ -2365,6 +2475,7 @@
       <w:proofErr w:type="spellEnd"/>
       <w:r>
         <w:rPr>
+          <w:highlight w:val="green"/>
           <w:lang w:val="it-IT"/>
         </w:rPr>
         <w:t xml:space="preserve">__` (con </w:t>
@@ -2372,6 +2483,7 @@
       <w:proofErr w:type="spellStart"/>
       <w:r>
         <w:rPr>
+          <w:highlight w:val="green"/>
           <w:lang w:val="it-IT"/>
         </w:rPr>
         <w:t>Decimal</w:t>
@@ -2379,6 +2491,7 @@
       <w:proofErr w:type="spellEnd"/>
       <w:r>
         <w:rPr>
+          <w:highlight w:val="green"/>
           <w:lang w:val="it-IT"/>
         </w:rPr>
         <w:t>/</w:t>
@@ -2386,6 +2499,7 @@
       <w:proofErr w:type="spellStart"/>
       <w:r>
         <w:rPr>
+          <w:highlight w:val="green"/>
           <w:lang w:val="it-IT"/>
         </w:rPr>
         <w:t>int</w:t>
@@ -2393,6 +2507,7 @@
       <w:proofErr w:type="spellEnd"/>
       <w:r>
         <w:rPr>
+          <w:highlight w:val="green"/>
           <w:lang w:val="it-IT"/>
         </w:rPr>
         <w:t>), `__</w:t>
@@ -2400,6 +2515,7 @@
       <w:proofErr w:type="spellStart"/>
       <w:r>
         <w:rPr>
+          <w:highlight w:val="green"/>
           <w:lang w:val="it-IT"/>
         </w:rPr>
         <w:t>neg</w:t>
@@ -2407,157 +2523,281 @@
       <w:proofErr w:type="spellEnd"/>
       <w:r>
         <w:rPr>
+          <w:highlight w:val="green"/>
           <w:lang w:val="it-IT"/>
         </w:rPr>
         <w:t>__`</w:t>
       </w:r>
     </w:p>
     <w:p>
-      <w:r>
+      <w:pPr>
+        <w:rPr>
+          <w:highlight w:val="green"/>
+        </w:rPr>
+      </w:pPr>
+      <w:r>
+        <w:rPr>
+          <w:highlight w:val="green"/>
+        </w:rPr>
         <w:t xml:space="preserve">5. </w:t>
       </w:r>
       <w:proofErr w:type="spellStart"/>
       <w:r>
+        <w:rPr>
+          <w:highlight w:val="green"/>
+        </w:rPr>
         <w:t>Implementare</w:t>
       </w:r>
       <w:proofErr w:type="spellEnd"/>
       <w:r>
+        <w:rPr>
+          <w:highlight w:val="green"/>
+        </w:rPr>
         <w:t xml:space="preserve"> </w:t>
       </w:r>
       <w:proofErr w:type="spellStart"/>
       <w:r>
+        <w:rPr>
+          <w:highlight w:val="green"/>
+        </w:rPr>
         <w:t>metodo</w:t>
       </w:r>
       <w:proofErr w:type="spellEnd"/>
       <w:r>
+        <w:rPr>
+          <w:highlight w:val="green"/>
+        </w:rPr>
         <w:t xml:space="preserve"> `</w:t>
       </w:r>
       <w:proofErr w:type="gramStart"/>
       <w:r>
+        <w:rPr>
+          <w:highlight w:val="green"/>
+        </w:rPr>
         <w:t>round(</w:t>
       </w:r>
       <w:proofErr w:type="gramEnd"/>
       <w:r>
+        <w:rPr>
+          <w:highlight w:val="green"/>
+        </w:rPr>
         <w:t xml:space="preserve">places: </w:t>
       </w:r>
       <w:proofErr w:type="gramStart"/>
       <w:r>
+        <w:rPr>
+          <w:highlight w:val="green"/>
+        </w:rPr>
         <w:t>int)`</w:t>
       </w:r>
       <w:proofErr w:type="gramEnd"/>
       <w:r>
+        <w:rPr>
+          <w:highlight w:val="green"/>
+        </w:rPr>
         <w:t xml:space="preserve"> con ROUND_HALF_UP</w:t>
       </w:r>
     </w:p>
     <w:p>
-      <w:r>
+      <w:pPr>
+        <w:rPr>
+          <w:highlight w:val="green"/>
+        </w:rPr>
+      </w:pPr>
+      <w:r>
+        <w:rPr>
+          <w:highlight w:val="green"/>
+        </w:rPr>
         <w:t xml:space="preserve">6. </w:t>
       </w:r>
       <w:proofErr w:type="spellStart"/>
       <w:r>
+        <w:rPr>
+          <w:highlight w:val="green"/>
+        </w:rPr>
         <w:t>Implementare</w:t>
       </w:r>
       <w:proofErr w:type="spellEnd"/>
       <w:r>
+        <w:rPr>
+          <w:highlight w:val="green"/>
+        </w:rPr>
         <w:t xml:space="preserve"> </w:t>
       </w:r>
       <w:proofErr w:type="spellStart"/>
       <w:r>
+        <w:rPr>
+          <w:highlight w:val="green"/>
+        </w:rPr>
         <w:t>metodo</w:t>
       </w:r>
       <w:proofErr w:type="spellEnd"/>
       <w:r>
+        <w:rPr>
+          <w:highlight w:val="green"/>
+        </w:rPr>
         <w:t xml:space="preserve"> `</w:t>
       </w:r>
       <w:proofErr w:type="spellStart"/>
       <w:r>
+        <w:rPr>
+          <w:highlight w:val="green"/>
+        </w:rPr>
         <w:t>to_</w:t>
       </w:r>
       <w:proofErr w:type="gramStart"/>
       <w:r>
+        <w:rPr>
+          <w:highlight w:val="green"/>
+        </w:rPr>
         <w:t>dict</w:t>
       </w:r>
       <w:proofErr w:type="spellEnd"/>
       <w:r>
+        <w:rPr>
+          <w:highlight w:val="green"/>
+        </w:rPr>
         <w:t>(</w:t>
       </w:r>
       <w:proofErr w:type="gramEnd"/>
       <w:r>
+        <w:rPr>
+          <w:highlight w:val="green"/>
+        </w:rPr>
         <w:t xml:space="preserve">)` </w:t>
       </w:r>
       <w:proofErr w:type="spellStart"/>
       <w:r>
+        <w:rPr>
+          <w:highlight w:val="green"/>
+        </w:rPr>
         <w:t>che</w:t>
       </w:r>
       <w:proofErr w:type="spellEnd"/>
       <w:r>
+        <w:rPr>
+          <w:highlight w:val="green"/>
+        </w:rPr>
         <w:t xml:space="preserve"> </w:t>
       </w:r>
       <w:proofErr w:type="spellStart"/>
       <w:r>
+        <w:rPr>
+          <w:highlight w:val="green"/>
+        </w:rPr>
         <w:t>restituisce</w:t>
       </w:r>
       <w:proofErr w:type="spellEnd"/>
       <w:r>
+        <w:rPr>
+          <w:highlight w:val="green"/>
+        </w:rPr>
         <w:t xml:space="preserve"> </w:t>
       </w:r>
       <w:proofErr w:type="gramStart"/>
       <w:r>
+        <w:rPr>
+          <w:highlight w:val="green"/>
+        </w:rPr>
         <w:t>`{</w:t>
       </w:r>
       <w:proofErr w:type="gramEnd"/>
       <w:r>
+        <w:rPr>
+          <w:highlight w:val="green"/>
+        </w:rPr>
         <w:t xml:space="preserve">"amount": str, "currency": </w:t>
       </w:r>
       <w:proofErr w:type="gramStart"/>
       <w:r>
+        <w:rPr>
+          <w:highlight w:val="green"/>
+        </w:rPr>
         <w:t>str}`</w:t>
       </w:r>
       <w:proofErr w:type="gramEnd"/>
     </w:p>
     <w:p>
-      <w:r>
+      <w:pPr>
+        <w:rPr>
+          <w:highlight w:val="green"/>
+        </w:rPr>
+      </w:pPr>
+      <w:r>
+        <w:rPr>
+          <w:highlight w:val="green"/>
+        </w:rPr>
         <w:t xml:space="preserve">7. </w:t>
       </w:r>
       <w:proofErr w:type="spellStart"/>
       <w:r>
+        <w:rPr>
+          <w:highlight w:val="green"/>
+        </w:rPr>
         <w:t>Implementare</w:t>
       </w:r>
       <w:proofErr w:type="spellEnd"/>
       <w:r>
+        <w:rPr>
+          <w:highlight w:val="green"/>
+        </w:rPr>
         <w:t xml:space="preserve"> </w:t>
       </w:r>
       <w:proofErr w:type="spellStart"/>
       <w:r>
+        <w:rPr>
+          <w:highlight w:val="green"/>
+        </w:rPr>
         <w:t>metodo</w:t>
       </w:r>
       <w:proofErr w:type="spellEnd"/>
       <w:r>
+        <w:rPr>
+          <w:highlight w:val="green"/>
+        </w:rPr>
         <w:t xml:space="preserve"> class `</w:t>
       </w:r>
       <w:proofErr w:type="spellStart"/>
       <w:r>
+        <w:rPr>
+          <w:highlight w:val="green"/>
+        </w:rPr>
         <w:t>from_</w:t>
       </w:r>
       <w:proofErr w:type="gramStart"/>
       <w:r>
+        <w:rPr>
+          <w:highlight w:val="green"/>
+        </w:rPr>
         <w:t>dict</w:t>
       </w:r>
       <w:proofErr w:type="spellEnd"/>
       <w:r>
+        <w:rPr>
+          <w:highlight w:val="green"/>
+        </w:rPr>
         <w:t>(</w:t>
       </w:r>
       <w:proofErr w:type="gramEnd"/>
       <w:r>
+        <w:rPr>
+          <w:highlight w:val="green"/>
+        </w:rPr>
         <w:t xml:space="preserve">data: </w:t>
       </w:r>
       <w:proofErr w:type="spellStart"/>
       <w:proofErr w:type="gramStart"/>
       <w:r>
+        <w:rPr>
+          <w:highlight w:val="green"/>
+        </w:rPr>
         <w:t>dict</w:t>
       </w:r>
       <w:proofErr w:type="spellEnd"/>
       <w:r>
+        <w:rPr>
+          <w:highlight w:val="green"/>
+        </w:rPr>
         <w:t>)`</w:t>
       </w:r>
       <w:proofErr w:type="gramEnd"/>
@@ -2565,11 +2805,13 @@
     <w:p>
       <w:pPr>
         <w:rPr>
-          <w:lang w:val="it-IT"/>
-        </w:rPr>
-      </w:pPr>
-      <w:r>
-        <w:rPr>
+          <w:highlight w:val="green"/>
+          <w:lang w:val="it-IT"/>
+        </w:rPr>
+      </w:pPr>
+      <w:r>
+        <w:rPr>
+          <w:highlight w:val="green"/>
           <w:lang w:val="it-IT"/>
         </w:rPr>
         <w:t xml:space="preserve">8. Aggiungere validazione: </w:t>
@@ -2577,6 +2819,7 @@
       <w:proofErr w:type="spellStart"/>
       <w:r>
         <w:rPr>
+          <w:highlight w:val="green"/>
           <w:lang w:val="it-IT"/>
         </w:rPr>
         <w:t>currency</w:t>
@@ -2584,6 +2827,7 @@
       <w:proofErr w:type="spellEnd"/>
       <w:r>
         <w:rPr>
+          <w:highlight w:val="green"/>
           <w:lang w:val="it-IT"/>
         </w:rPr>
         <w:t xml:space="preserve"> deve essere stringa 3 caratteri </w:t>
@@ -2591,6 +2835,7 @@
       <w:proofErr w:type="spellStart"/>
       <w:r>
         <w:rPr>
+          <w:highlight w:val="green"/>
           <w:lang w:val="it-IT"/>
         </w:rPr>
         <w:t>uppercase</w:t>
@@ -2600,18 +2845,21 @@
     <w:p>
       <w:pPr>
         <w:rPr>
-          <w:lang w:val="it-IT"/>
-        </w:rPr>
-      </w:pPr>
-    </w:p>
-    <w:p>
-      <w:pPr>
-        <w:rPr>
-          <w:lang w:val="it-IT"/>
-        </w:rPr>
-      </w:pPr>
-      <w:r>
-        <w:rPr>
+          <w:highlight w:val="green"/>
+          <w:lang w:val="it-IT"/>
+        </w:rPr>
+      </w:pPr>
+    </w:p>
+    <w:p>
+      <w:pPr>
+        <w:rPr>
+          <w:highlight w:val="green"/>
+          <w:lang w:val="it-IT"/>
+        </w:rPr>
+      </w:pPr>
+      <w:r>
+        <w:rPr>
+          <w:highlight w:val="green"/>
           <w:lang w:val="it-IT"/>
         </w:rPr>
         <w:t>**</w:t>
@@ -2619,6 +2867,7 @@
       <w:proofErr w:type="spellStart"/>
       <w:r>
         <w:rPr>
+          <w:highlight w:val="green"/>
           <w:lang w:val="it-IT"/>
         </w:rPr>
         <w:t>Acceptance</w:t>
@@ -2626,6 +2875,7 @@
       <w:proofErr w:type="spellEnd"/>
       <w:r>
         <w:rPr>
+          <w:highlight w:val="green"/>
           <w:lang w:val="it-IT"/>
         </w:rPr>
         <w:t xml:space="preserve"> </w:t>
@@ -2634,6 +2884,7 @@
       <w:proofErr w:type="gramStart"/>
       <w:r>
         <w:rPr>
+          <w:highlight w:val="green"/>
           <w:lang w:val="it-IT"/>
         </w:rPr>
         <w:t>Criteria</w:t>
@@ -2641,6 +2892,7 @@
       <w:proofErr w:type="spellEnd"/>
       <w:r>
         <w:rPr>
+          <w:highlight w:val="green"/>
           <w:lang w:val="it-IT"/>
         </w:rPr>
         <w:t>:*</w:t>
@@ -2648,6 +2900,7 @@
       <w:proofErr w:type="gramEnd"/>
       <w:r>
         <w:rPr>
+          <w:highlight w:val="green"/>
           <w:lang w:val="it-IT"/>
         </w:rPr>
         <w:t>*</w:t>
@@ -2656,11 +2909,13 @@
     <w:p>
       <w:pPr>
         <w:rPr>
-          <w:lang w:val="it-IT"/>
-        </w:rPr>
-      </w:pPr>
-      <w:r>
-        <w:rPr>
+          <w:highlight w:val="green"/>
+          <w:lang w:val="it-IT"/>
+        </w:rPr>
+      </w:pPr>
+      <w:r>
+        <w:rPr>
+          <w:highlight w:val="green"/>
           <w:lang w:val="it-IT"/>
         </w:rPr>
         <w:t xml:space="preserve">- </w:t>
@@ -2668,6 +2923,7 @@
       <w:proofErr w:type="gramStart"/>
       <w:r>
         <w:rPr>
+          <w:highlight w:val="green"/>
           <w:lang w:val="it-IT"/>
         </w:rPr>
         <w:t>[ ]</w:t>
@@ -2675,6 +2931,7 @@
       <w:proofErr w:type="gramEnd"/>
       <w:r>
         <w:rPr>
+          <w:highlight w:val="green"/>
           <w:lang w:val="it-IT"/>
         </w:rPr>
         <w:t xml:space="preserve"> Classe è immutabile (</w:t>
@@ -2682,6 +2939,7 @@
       <w:proofErr w:type="spellStart"/>
       <w:r>
         <w:rPr>
+          <w:highlight w:val="green"/>
           <w:lang w:val="it-IT"/>
         </w:rPr>
         <w:t>frozen</w:t>
@@ -2689,6 +2947,7 @@
       <w:proofErr w:type="spellEnd"/>
       <w:r>
         <w:rPr>
+          <w:highlight w:val="green"/>
           <w:lang w:val="it-IT"/>
         </w:rPr>
         <w:t xml:space="preserve"> </w:t>
@@ -2696,6 +2955,7 @@
       <w:proofErr w:type="spellStart"/>
       <w:r>
         <w:rPr>
+          <w:highlight w:val="green"/>
           <w:lang w:val="it-IT"/>
         </w:rPr>
         <w:t>dataclass</w:t>
@@ -2703,6 +2963,7 @@
       <w:proofErr w:type="spellEnd"/>
       <w:r>
         <w:rPr>
+          <w:highlight w:val="green"/>
           <w:lang w:val="it-IT"/>
         </w:rPr>
         <w:t>)</w:t>
@@ -2711,11 +2972,13 @@
     <w:p>
       <w:pPr>
         <w:rPr>
-          <w:lang w:val="it-IT"/>
-        </w:rPr>
-      </w:pPr>
-      <w:r>
-        <w:rPr>
+          <w:highlight w:val="green"/>
+          <w:lang w:val="it-IT"/>
+        </w:rPr>
+      </w:pPr>
+      <w:r>
+        <w:rPr>
+          <w:highlight w:val="green"/>
           <w:lang w:val="it-IT"/>
         </w:rPr>
         <w:t xml:space="preserve">- </w:t>
@@ -2723,6 +2986,7 @@
       <w:proofErr w:type="gramStart"/>
       <w:r>
         <w:rPr>
+          <w:highlight w:val="green"/>
           <w:lang w:val="it-IT"/>
         </w:rPr>
         <w:t>[ ]</w:t>
@@ -2730,6 +2994,7 @@
       <w:proofErr w:type="gramEnd"/>
       <w:r>
         <w:rPr>
+          <w:highlight w:val="green"/>
           <w:lang w:val="it-IT"/>
         </w:rPr>
         <w:t xml:space="preserve"> Tutti i calcoli usano </w:t>
@@ -2737,6 +3002,7 @@
       <w:proofErr w:type="spellStart"/>
       <w:r>
         <w:rPr>
+          <w:highlight w:val="green"/>
           <w:lang w:val="it-IT"/>
         </w:rPr>
         <w:t>Decimal</w:t>
@@ -2744,6 +3010,7 @@
       <w:proofErr w:type="spellEnd"/>
       <w:r>
         <w:rPr>
+          <w:highlight w:val="green"/>
           <w:lang w:val="it-IT"/>
         </w:rPr>
         <w:t>, mai float</w:t>
@@ -2752,11 +3019,13 @@
     <w:p>
       <w:pPr>
         <w:rPr>
-          <w:lang w:val="it-IT"/>
-        </w:rPr>
-      </w:pPr>
-      <w:r>
-        <w:rPr>
+          <w:highlight w:val="green"/>
+          <w:lang w:val="it-IT"/>
+        </w:rPr>
+      </w:pPr>
+      <w:r>
+        <w:rPr>
+          <w:highlight w:val="green"/>
           <w:lang w:val="it-IT"/>
         </w:rPr>
         <w:t xml:space="preserve">- </w:t>
@@ -2764,6 +3033,7 @@
       <w:proofErr w:type="gramStart"/>
       <w:r>
         <w:rPr>
+          <w:highlight w:val="green"/>
           <w:lang w:val="it-IT"/>
         </w:rPr>
         <w:t>[ ]</w:t>
@@ -2771,6 +3041,7 @@
       <w:proofErr w:type="gramEnd"/>
       <w:r>
         <w:rPr>
+          <w:highlight w:val="green"/>
           <w:lang w:val="it-IT"/>
         </w:rPr>
         <w:t xml:space="preserve"> Somma/sottrazione tra valute diverse solleva </w:t>
@@ -2778,6 +3049,7 @@
       <w:proofErr w:type="spellStart"/>
       <w:r>
         <w:rPr>
+          <w:highlight w:val="green"/>
           <w:lang w:val="it-IT"/>
         </w:rPr>
         <w:t>ValueError</w:t>
@@ -2787,11 +3059,13 @@
     <w:p>
       <w:pPr>
         <w:rPr>
-          <w:lang w:val="it-IT"/>
-        </w:rPr>
-      </w:pPr>
-      <w:r>
-        <w:rPr>
+          <w:highlight w:val="green"/>
+          <w:lang w:val="it-IT"/>
+        </w:rPr>
+      </w:pPr>
+      <w:r>
+        <w:rPr>
+          <w:highlight w:val="green"/>
           <w:lang w:val="it-IT"/>
         </w:rPr>
         <w:t xml:space="preserve">- </w:t>
@@ -2799,6 +3073,7 @@
       <w:proofErr w:type="gramStart"/>
       <w:r>
         <w:rPr>
+          <w:highlight w:val="green"/>
           <w:lang w:val="it-IT"/>
         </w:rPr>
         <w:t>[ ]</w:t>
@@ -2806,6 +3081,7 @@
       <w:proofErr w:type="gramEnd"/>
       <w:r>
         <w:rPr>
+          <w:highlight w:val="green"/>
           <w:lang w:val="it-IT"/>
         </w:rPr>
         <w:t xml:space="preserve"> Moltiplicazione accetta solo </w:t>
@@ -2813,6 +3089,7 @@
       <w:proofErr w:type="spellStart"/>
       <w:r>
         <w:rPr>
+          <w:highlight w:val="green"/>
           <w:lang w:val="it-IT"/>
         </w:rPr>
         <w:t>Decimal</w:t>
@@ -2820,6 +3097,7 @@
       <w:proofErr w:type="spellEnd"/>
       <w:r>
         <w:rPr>
+          <w:highlight w:val="green"/>
           <w:lang w:val="it-IT"/>
         </w:rPr>
         <w:t xml:space="preserve"> o </w:t>
@@ -2827,6 +3105,7 @@
       <w:proofErr w:type="spellStart"/>
       <w:r>
         <w:rPr>
+          <w:highlight w:val="green"/>
           <w:lang w:val="it-IT"/>
         </w:rPr>
         <w:t>int</w:t>
@@ -2836,11 +3115,13 @@
     <w:p>
       <w:pPr>
         <w:rPr>
-          <w:lang w:val="it-IT"/>
-        </w:rPr>
-      </w:pPr>
-      <w:r>
-        <w:rPr>
+          <w:highlight w:val="green"/>
+          <w:lang w:val="it-IT"/>
+        </w:rPr>
+      </w:pPr>
+      <w:r>
+        <w:rPr>
+          <w:highlight w:val="green"/>
           <w:lang w:val="it-IT"/>
         </w:rPr>
         <w:t xml:space="preserve">- </w:t>
@@ -2848,6 +3129,7 @@
       <w:proofErr w:type="gramStart"/>
       <w:r>
         <w:rPr>
+          <w:highlight w:val="green"/>
           <w:lang w:val="it-IT"/>
         </w:rPr>
         <w:t>[ ]</w:t>
@@ -2855,6 +3137,7 @@
       <w:proofErr w:type="gramEnd"/>
       <w:r>
         <w:rPr>
+          <w:highlight w:val="green"/>
           <w:lang w:val="it-IT"/>
         </w:rPr>
         <w:t xml:space="preserve"> Serializzazione/</w:t>
@@ -2862,6 +3145,7 @@
       <w:proofErr w:type="spellStart"/>
       <w:r>
         <w:rPr>
+          <w:highlight w:val="green"/>
           <w:lang w:val="it-IT"/>
         </w:rPr>
         <w:t>deserializzazione</w:t>
@@ -2869,6 +3153,7 @@
       <w:proofErr w:type="spellEnd"/>
       <w:r>
         <w:rPr>
+          <w:highlight w:val="green"/>
           <w:lang w:val="it-IT"/>
         </w:rPr>
         <w:t xml:space="preserve"> round-trip funziona</w:t>
@@ -2882,6 +3167,7 @@
       </w:pPr>
       <w:r>
         <w:rPr>
+          <w:highlight w:val="green"/>
           <w:lang w:val="it-IT"/>
         </w:rPr>
         <w:t xml:space="preserve">- </w:t>
@@ -2889,6 +3175,7 @@
       <w:proofErr w:type="gramStart"/>
       <w:r>
         <w:rPr>
+          <w:highlight w:val="green"/>
           <w:lang w:val="it-IT"/>
         </w:rPr>
         <w:t>[ ]</w:t>
@@ -2896,6 +3183,7 @@
       <w:proofErr w:type="gramEnd"/>
       <w:r>
         <w:rPr>
+          <w:highlight w:val="green"/>
           <w:lang w:val="it-IT"/>
         </w:rPr>
         <w:t xml:space="preserve"> Test unitari coprono tutti i metodi</w:t>
@@ -2915,27 +3203,49 @@
     </w:p>
     <w:p/>
     <w:p>
-      <w:r>
+      <w:pPr>
+        <w:rPr>
+          <w:highlight w:val="green"/>
+        </w:rPr>
+      </w:pPr>
+      <w:r>
+        <w:rPr>
+          <w:highlight w:val="green"/>
+        </w:rPr>
         <w:t xml:space="preserve">## TASK 1.4: </w:t>
       </w:r>
       <w:proofErr w:type="spellStart"/>
       <w:r>
+        <w:rPr>
+          <w:highlight w:val="green"/>
+        </w:rPr>
         <w:t>Creazione</w:t>
       </w:r>
       <w:proofErr w:type="spellEnd"/>
       <w:r>
+        <w:rPr>
+          <w:highlight w:val="green"/>
+        </w:rPr>
         <w:t xml:space="preserve"> Value Object Percentage (Backend)</w:t>
       </w:r>
     </w:p>
-    <w:p/>
-    <w:p>
-      <w:pPr>
-        <w:rPr>
-          <w:lang w:val="it-IT"/>
-        </w:rPr>
-      </w:pPr>
-      <w:r>
-        <w:rPr>
+    <w:p>
+      <w:pPr>
+        <w:rPr>
+          <w:highlight w:val="green"/>
+        </w:rPr>
+      </w:pPr>
+    </w:p>
+    <w:p>
+      <w:pPr>
+        <w:rPr>
+          <w:highlight w:val="green"/>
+          <w:lang w:val="it-IT"/>
+        </w:rPr>
+      </w:pPr>
+      <w:r>
+        <w:rPr>
+          <w:highlight w:val="green"/>
           <w:lang w:val="it-IT"/>
         </w:rPr>
         <w:t>**</w:t>
@@ -2943,6 +3253,7 @@
       <w:proofErr w:type="gramStart"/>
       <w:r>
         <w:rPr>
+          <w:highlight w:val="green"/>
           <w:lang w:val="it-IT"/>
         </w:rPr>
         <w:t>Descrizione:*</w:t>
@@ -2950,6 +3261,7 @@
       <w:proofErr w:type="gramEnd"/>
       <w:r>
         <w:rPr>
+          <w:highlight w:val="green"/>
           <w:lang w:val="it-IT"/>
         </w:rPr>
         <w:t xml:space="preserve">* Implementare il </w:t>
@@ -2957,6 +3269,7 @@
       <w:proofErr w:type="spellStart"/>
       <w:r>
         <w:rPr>
+          <w:highlight w:val="green"/>
           <w:lang w:val="it-IT"/>
         </w:rPr>
         <w:t>value</w:t>
@@ -2964,6 +3277,7 @@
       <w:proofErr w:type="spellEnd"/>
       <w:r>
         <w:rPr>
+          <w:highlight w:val="green"/>
           <w:lang w:val="it-IT"/>
         </w:rPr>
         <w:t xml:space="preserve"> </w:t>
@@ -2971,6 +3285,7 @@
       <w:proofErr w:type="spellStart"/>
       <w:r>
         <w:rPr>
+          <w:highlight w:val="green"/>
           <w:lang w:val="it-IT"/>
         </w:rPr>
         <w:t>object</w:t>
@@ -2978,6 +3293,7 @@
       <w:proofErr w:type="spellEnd"/>
       <w:r>
         <w:rPr>
+          <w:highlight w:val="green"/>
           <w:lang w:val="it-IT"/>
         </w:rPr>
         <w:t xml:space="preserve"> immutabile `</w:t>
@@ -2985,6 +3301,7 @@
       <w:proofErr w:type="spellStart"/>
       <w:r>
         <w:rPr>
+          <w:highlight w:val="green"/>
           <w:lang w:val="it-IT"/>
         </w:rPr>
         <w:t>Percentage</w:t>
@@ -2992,6 +3309,7 @@
       <w:proofErr w:type="spellEnd"/>
       <w:r>
         <w:rPr>
+          <w:highlight w:val="green"/>
           <w:lang w:val="it-IT"/>
         </w:rPr>
         <w:t>` per gestire valori percentuali.</w:t>
@@ -3000,65 +3318,111 @@
     <w:p>
       <w:pPr>
         <w:rPr>
-          <w:lang w:val="it-IT"/>
-        </w:rPr>
-      </w:pPr>
-    </w:p>
-    <w:p>
-      <w:r>
+          <w:highlight w:val="green"/>
+          <w:lang w:val="it-IT"/>
+        </w:rPr>
+      </w:pPr>
+    </w:p>
+    <w:p>
+      <w:pPr>
+        <w:rPr>
+          <w:highlight w:val="green"/>
+        </w:rPr>
+      </w:pPr>
+      <w:r>
+        <w:rPr>
+          <w:highlight w:val="green"/>
+        </w:rPr>
         <w:t>**</w:t>
       </w:r>
       <w:proofErr w:type="spellStart"/>
       <w:proofErr w:type="gramStart"/>
       <w:r>
+        <w:rPr>
+          <w:highlight w:val="green"/>
+        </w:rPr>
         <w:t>Microstep</w:t>
       </w:r>
       <w:proofErr w:type="spellEnd"/>
       <w:r>
+        <w:rPr>
+          <w:highlight w:val="green"/>
+        </w:rPr>
         <w:t>:*</w:t>
       </w:r>
       <w:proofErr w:type="gramEnd"/>
       <w:r>
+        <w:rPr>
+          <w:highlight w:val="green"/>
+        </w:rPr>
         <w:t>*</w:t>
       </w:r>
     </w:p>
     <w:p>
-      <w:r>
+      <w:pPr>
+        <w:rPr>
+          <w:highlight w:val="green"/>
+        </w:rPr>
+      </w:pPr>
+      <w:r>
+        <w:rPr>
+          <w:highlight w:val="green"/>
+        </w:rPr>
         <w:t xml:space="preserve">1. </w:t>
       </w:r>
       <w:proofErr w:type="spellStart"/>
       <w:r>
+        <w:rPr>
+          <w:highlight w:val="green"/>
+        </w:rPr>
         <w:t>Creare</w:t>
       </w:r>
       <w:proofErr w:type="spellEnd"/>
       <w:r>
+        <w:rPr>
+          <w:highlight w:val="green"/>
+        </w:rPr>
         <w:t xml:space="preserve"> file `backend/</w:t>
       </w:r>
       <w:proofErr w:type="spellStart"/>
       <w:r>
+        <w:rPr>
+          <w:highlight w:val="green"/>
+        </w:rPr>
         <w:t>src</w:t>
       </w:r>
       <w:proofErr w:type="spellEnd"/>
       <w:r>
+        <w:rPr>
+          <w:highlight w:val="green"/>
+        </w:rPr>
         <w:t>/shared/domain/</w:t>
       </w:r>
       <w:proofErr w:type="spellStart"/>
       <w:r>
+        <w:rPr>
+          <w:highlight w:val="green"/>
+        </w:rPr>
         <w:t>value_objects</w:t>
       </w:r>
       <w:proofErr w:type="spellEnd"/>
       <w:r>
+        <w:rPr>
+          <w:highlight w:val="green"/>
+        </w:rPr>
         <w:t>/percentage.py`</w:t>
       </w:r>
     </w:p>
     <w:p>
       <w:pPr>
         <w:rPr>
-          <w:lang w:val="it-IT"/>
-        </w:rPr>
-      </w:pPr>
-      <w:r>
-        <w:rPr>
+          <w:highlight w:val="green"/>
+          <w:lang w:val="it-IT"/>
+        </w:rPr>
+      </w:pPr>
+      <w:r>
+        <w:rPr>
+          <w:highlight w:val="green"/>
           <w:lang w:val="it-IT"/>
         </w:rPr>
         <w:t xml:space="preserve">2. Definire </w:t>
@@ -3066,6 +3430,7 @@
       <w:proofErr w:type="spellStart"/>
       <w:r>
         <w:rPr>
+          <w:highlight w:val="green"/>
           <w:lang w:val="it-IT"/>
         </w:rPr>
         <w:t>dataclass</w:t>
@@ -3073,6 +3438,7 @@
       <w:proofErr w:type="spellEnd"/>
       <w:r>
         <w:rPr>
+          <w:highlight w:val="green"/>
           <w:lang w:val="it-IT"/>
         </w:rPr>
         <w:t xml:space="preserve"> </w:t>
@@ -3080,6 +3446,7 @@
       <w:proofErr w:type="spellStart"/>
       <w:r>
         <w:rPr>
+          <w:highlight w:val="green"/>
           <w:lang w:val="it-IT"/>
         </w:rPr>
         <w:t>frozen</w:t>
@@ -3087,6 +3454,7 @@
       <w:proofErr w:type="spellEnd"/>
       <w:r>
         <w:rPr>
+          <w:highlight w:val="green"/>
           <w:lang w:val="it-IT"/>
         </w:rPr>
         <w:t xml:space="preserve"> `</w:t>
@@ -3094,6 +3462,7 @@
       <w:proofErr w:type="spellStart"/>
       <w:r>
         <w:rPr>
+          <w:highlight w:val="green"/>
           <w:lang w:val="it-IT"/>
         </w:rPr>
         <w:t>Percentage</w:t>
@@ -3101,6 +3470,7 @@
       <w:proofErr w:type="spellEnd"/>
       <w:r>
         <w:rPr>
+          <w:highlight w:val="green"/>
           <w:lang w:val="it-IT"/>
         </w:rPr>
         <w:t>` con campo: `</w:t>
@@ -3108,6 +3478,7 @@
       <w:proofErr w:type="spellStart"/>
       <w:r>
         <w:rPr>
+          <w:highlight w:val="green"/>
           <w:lang w:val="it-IT"/>
         </w:rPr>
         <w:t>value</w:t>
@@ -3115,6 +3486,7 @@
       <w:proofErr w:type="spellEnd"/>
       <w:r>
         <w:rPr>
+          <w:highlight w:val="green"/>
           <w:lang w:val="it-IT"/>
         </w:rPr>
         <w:t>` (</w:t>
@@ -3122,6 +3494,7 @@
       <w:proofErr w:type="spellStart"/>
       <w:r>
         <w:rPr>
+          <w:highlight w:val="green"/>
           <w:lang w:val="it-IT"/>
         </w:rPr>
         <w:t>Decimal</w:t>
@@ -3129,123 +3502,216 @@
       <w:proofErr w:type="spellEnd"/>
       <w:r>
         <w:rPr>
+          <w:highlight w:val="green"/>
           <w:lang w:val="it-IT"/>
         </w:rPr>
         <w:t>)</w:t>
       </w:r>
     </w:p>
     <w:p>
-      <w:r>
+      <w:pPr>
+        <w:rPr>
+          <w:highlight w:val="green"/>
+        </w:rPr>
+      </w:pPr>
+      <w:r>
+        <w:rPr>
+          <w:highlight w:val="green"/>
+        </w:rPr>
         <w:t xml:space="preserve">3. </w:t>
       </w:r>
       <w:proofErr w:type="spellStart"/>
       <w:r>
+        <w:rPr>
+          <w:highlight w:val="green"/>
+        </w:rPr>
         <w:t>Implementare</w:t>
       </w:r>
       <w:proofErr w:type="spellEnd"/>
       <w:r>
+        <w:rPr>
+          <w:highlight w:val="green"/>
+        </w:rPr>
         <w:t xml:space="preserve"> `__</w:t>
       </w:r>
       <w:proofErr w:type="spellStart"/>
       <w:r>
+        <w:rPr>
+          <w:highlight w:val="green"/>
+        </w:rPr>
         <w:t>post_init</w:t>
       </w:r>
       <w:proofErr w:type="spellEnd"/>
       <w:r>
+        <w:rPr>
+          <w:highlight w:val="green"/>
+        </w:rPr>
         <w:t xml:space="preserve">__` per </w:t>
       </w:r>
       <w:proofErr w:type="spellStart"/>
       <w:r>
+        <w:rPr>
+          <w:highlight w:val="green"/>
+        </w:rPr>
         <w:t>conversione</w:t>
       </w:r>
       <w:proofErr w:type="spellEnd"/>
       <w:r>
+        <w:rPr>
+          <w:highlight w:val="green"/>
+        </w:rPr>
         <w:t xml:space="preserve"> a Decimal</w:t>
       </w:r>
     </w:p>
     <w:p>
-      <w:r>
+      <w:pPr>
+        <w:rPr>
+          <w:highlight w:val="green"/>
+        </w:rPr>
+      </w:pPr>
+      <w:r>
+        <w:rPr>
+          <w:highlight w:val="green"/>
+        </w:rPr>
         <w:lastRenderedPageBreak/>
         <w:t xml:space="preserve">4. </w:t>
       </w:r>
       <w:proofErr w:type="spellStart"/>
       <w:r>
+        <w:rPr>
+          <w:highlight w:val="green"/>
+        </w:rPr>
         <w:t>Implementare</w:t>
       </w:r>
       <w:proofErr w:type="spellEnd"/>
       <w:r>
+        <w:rPr>
+          <w:highlight w:val="green"/>
+        </w:rPr>
         <w:t xml:space="preserve"> class method `</w:t>
       </w:r>
       <w:proofErr w:type="spellStart"/>
       <w:r>
+        <w:rPr>
+          <w:highlight w:val="green"/>
+        </w:rPr>
         <w:t>from_basis_</w:t>
       </w:r>
       <w:proofErr w:type="gramStart"/>
       <w:r>
+        <w:rPr>
+          <w:highlight w:val="green"/>
+        </w:rPr>
         <w:t>points</w:t>
       </w:r>
       <w:proofErr w:type="spellEnd"/>
       <w:r>
+        <w:rPr>
+          <w:highlight w:val="green"/>
+        </w:rPr>
         <w:t>(</w:t>
       </w:r>
       <w:proofErr w:type="gramEnd"/>
       <w:r>
+        <w:rPr>
+          <w:highlight w:val="green"/>
+        </w:rPr>
         <w:t xml:space="preserve">bps: </w:t>
       </w:r>
       <w:proofErr w:type="gramStart"/>
       <w:r>
+        <w:rPr>
+          <w:highlight w:val="green"/>
+        </w:rPr>
         <w:t>int)`</w:t>
       </w:r>
       <w:proofErr w:type="gramEnd"/>
       <w:r>
+        <w:rPr>
+          <w:highlight w:val="green"/>
+        </w:rPr>
         <w:t xml:space="preserve"> </w:t>
       </w:r>
     </w:p>
     <w:p>
-      <w:r>
+      <w:pPr>
+        <w:rPr>
+          <w:highlight w:val="green"/>
+        </w:rPr>
+      </w:pPr>
+      <w:r>
+        <w:rPr>
+          <w:highlight w:val="green"/>
+        </w:rPr>
         <w:t xml:space="preserve">5. </w:t>
       </w:r>
       <w:proofErr w:type="spellStart"/>
       <w:r>
+        <w:rPr>
+          <w:highlight w:val="green"/>
+        </w:rPr>
         <w:t>Implementare</w:t>
       </w:r>
       <w:proofErr w:type="spellEnd"/>
       <w:r>
+        <w:rPr>
+          <w:highlight w:val="green"/>
+        </w:rPr>
         <w:t xml:space="preserve"> </w:t>
       </w:r>
       <w:proofErr w:type="spellStart"/>
       <w:r>
+        <w:rPr>
+          <w:highlight w:val="green"/>
+        </w:rPr>
         <w:t>metodo</w:t>
       </w:r>
       <w:proofErr w:type="spellEnd"/>
       <w:r>
+        <w:rPr>
+          <w:highlight w:val="green"/>
+        </w:rPr>
         <w:t xml:space="preserve"> `</w:t>
       </w:r>
       <w:proofErr w:type="spellStart"/>
       <w:r>
+        <w:rPr>
+          <w:highlight w:val="green"/>
+        </w:rPr>
         <w:t>apply_</w:t>
       </w:r>
       <w:proofErr w:type="gramStart"/>
       <w:r>
+        <w:rPr>
+          <w:highlight w:val="green"/>
+        </w:rPr>
         <w:t>to</w:t>
       </w:r>
       <w:proofErr w:type="spellEnd"/>
       <w:r>
+        <w:rPr>
+          <w:highlight w:val="green"/>
+        </w:rPr>
         <w:t>(</w:t>
       </w:r>
       <w:proofErr w:type="gramEnd"/>
       <w:r>
+        <w:rPr>
+          <w:highlight w:val="green"/>
+        </w:rPr>
         <w:t>money: Money) -&gt; Money`</w:t>
       </w:r>
     </w:p>
     <w:p>
       <w:pPr>
         <w:rPr>
-          <w:lang w:val="it-IT"/>
-        </w:rPr>
-      </w:pPr>
-      <w:r>
-        <w:rPr>
+          <w:highlight w:val="green"/>
+          <w:lang w:val="it-IT"/>
+        </w:rPr>
+      </w:pPr>
+      <w:r>
+        <w:rPr>
+          <w:highlight w:val="green"/>
           <w:lang w:val="it-IT"/>
         </w:rPr>
         <w:t>6. Implementare metodo `</w:t>
@@ -3253,6 +3719,7 @@
       <w:proofErr w:type="spellStart"/>
       <w:r>
         <w:rPr>
+          <w:highlight w:val="green"/>
           <w:lang w:val="it-IT"/>
         </w:rPr>
         <w:t>as_</w:t>
@@ -3260,6 +3727,7 @@
       <w:proofErr w:type="gramStart"/>
       <w:r>
         <w:rPr>
+          <w:highlight w:val="green"/>
           <w:lang w:val="it-IT"/>
         </w:rPr>
         <w:t>multiplier</w:t>
@@ -3267,6 +3735,7 @@
       <w:proofErr w:type="spellEnd"/>
       <w:r>
         <w:rPr>
+          <w:highlight w:val="green"/>
           <w:lang w:val="it-IT"/>
         </w:rPr>
         <w:t>(</w:t>
@@ -3274,6 +3743,7 @@
       <w:proofErr w:type="gramEnd"/>
       <w:r>
         <w:rPr>
+          <w:highlight w:val="green"/>
           <w:lang w:val="it-IT"/>
         </w:rPr>
         <w:t xml:space="preserve">) -&gt; </w:t>
@@ -3281,6 +3751,7 @@
       <w:proofErr w:type="spellStart"/>
       <w:r>
         <w:rPr>
+          <w:highlight w:val="green"/>
           <w:lang w:val="it-IT"/>
         </w:rPr>
         <w:t>Decimal</w:t>
@@ -3288,6 +3759,7 @@
       <w:proofErr w:type="spellEnd"/>
       <w:r>
         <w:rPr>
+          <w:highlight w:val="green"/>
           <w:lang w:val="it-IT"/>
         </w:rPr>
         <w:t xml:space="preserve">` (restituisce 1 + </w:t>
@@ -3295,6 +3767,7 @@
       <w:proofErr w:type="spellStart"/>
       <w:r>
         <w:rPr>
+          <w:highlight w:val="green"/>
           <w:lang w:val="it-IT"/>
         </w:rPr>
         <w:t>value</w:t>
@@ -3302,6 +3775,7 @@
       <w:proofErr w:type="spellEnd"/>
       <w:r>
         <w:rPr>
+          <w:highlight w:val="green"/>
           <w:lang w:val="it-IT"/>
         </w:rPr>
         <w:t>)</w:t>
@@ -3310,11 +3784,13 @@
     <w:p>
       <w:pPr>
         <w:rPr>
-          <w:lang w:val="it-IT"/>
-        </w:rPr>
-      </w:pPr>
-      <w:r>
-        <w:rPr>
+          <w:highlight w:val="green"/>
+          <w:lang w:val="it-IT"/>
+        </w:rPr>
+      </w:pPr>
+      <w:r>
+        <w:rPr>
+          <w:highlight w:val="green"/>
           <w:lang w:val="it-IT"/>
         </w:rPr>
         <w:t>7. Implementare metodi `__</w:t>
@@ -3322,6 +3798,7 @@
       <w:proofErr w:type="spellStart"/>
       <w:r>
         <w:rPr>
+          <w:highlight w:val="green"/>
           <w:lang w:val="it-IT"/>
         </w:rPr>
         <w:t>add</w:t>
@@ -3329,6 +3806,7 @@
       <w:proofErr w:type="spellEnd"/>
       <w:r>
         <w:rPr>
+          <w:highlight w:val="green"/>
           <w:lang w:val="it-IT"/>
         </w:rPr>
         <w:t xml:space="preserve">__`, `__sub__` tra </w:t>
@@ -3336,6 +3814,7 @@
       <w:proofErr w:type="spellStart"/>
       <w:r>
         <w:rPr>
+          <w:highlight w:val="green"/>
           <w:lang w:val="it-IT"/>
         </w:rPr>
         <w:t>Percentage</w:t>
@@ -3343,59 +3822,105 @@
       <w:proofErr w:type="spellEnd"/>
     </w:p>
     <w:p>
-      <w:r>
+      <w:pPr>
+        <w:rPr>
+          <w:highlight w:val="green"/>
+        </w:rPr>
+      </w:pPr>
+      <w:r>
+        <w:rPr>
+          <w:highlight w:val="green"/>
+        </w:rPr>
         <w:t xml:space="preserve">8. </w:t>
       </w:r>
       <w:proofErr w:type="spellStart"/>
       <w:r>
+        <w:rPr>
+          <w:highlight w:val="green"/>
+        </w:rPr>
         <w:t>Implementare</w:t>
       </w:r>
       <w:proofErr w:type="spellEnd"/>
       <w:r>
+        <w:rPr>
+          <w:highlight w:val="green"/>
+        </w:rPr>
         <w:t xml:space="preserve"> `</w:t>
       </w:r>
       <w:proofErr w:type="spellStart"/>
       <w:r>
+        <w:rPr>
+          <w:highlight w:val="green"/>
+        </w:rPr>
         <w:t>to_</w:t>
       </w:r>
       <w:proofErr w:type="gramStart"/>
       <w:r>
+        <w:rPr>
+          <w:highlight w:val="green"/>
+        </w:rPr>
         <w:t>dict</w:t>
       </w:r>
       <w:proofErr w:type="spellEnd"/>
       <w:r>
+        <w:rPr>
+          <w:highlight w:val="green"/>
+        </w:rPr>
         <w:t>(</w:t>
       </w:r>
       <w:proofErr w:type="gramEnd"/>
       <w:r>
+        <w:rPr>
+          <w:highlight w:val="green"/>
+        </w:rPr>
         <w:t>)` e `</w:t>
       </w:r>
       <w:proofErr w:type="spellStart"/>
       <w:r>
+        <w:rPr>
+          <w:highlight w:val="green"/>
+        </w:rPr>
         <w:t>from_</w:t>
       </w:r>
       <w:proofErr w:type="gramStart"/>
       <w:r>
+        <w:rPr>
+          <w:highlight w:val="green"/>
+        </w:rPr>
         <w:t>dict</w:t>
       </w:r>
       <w:proofErr w:type="spellEnd"/>
       <w:r>
+        <w:rPr>
+          <w:highlight w:val="green"/>
+        </w:rPr>
         <w:t>(</w:t>
       </w:r>
       <w:proofErr w:type="gramEnd"/>
       <w:r>
+        <w:rPr>
+          <w:highlight w:val="green"/>
+        </w:rPr>
         <w:t>)`</w:t>
       </w:r>
     </w:p>
-    <w:p/>
-    <w:p>
-      <w:pPr>
-        <w:rPr>
-          <w:lang w:val="it-IT"/>
-        </w:rPr>
-      </w:pPr>
-      <w:r>
-        <w:rPr>
+    <w:p>
+      <w:pPr>
+        <w:rPr>
+          <w:highlight w:val="green"/>
+        </w:rPr>
+      </w:pPr>
+    </w:p>
+    <w:p>
+      <w:pPr>
+        <w:rPr>
+          <w:highlight w:val="green"/>
+          <w:lang w:val="it-IT"/>
+        </w:rPr>
+      </w:pPr>
+      <w:r>
+        <w:rPr>
+          <w:highlight w:val="green"/>
           <w:lang w:val="it-IT"/>
         </w:rPr>
         <w:t>**</w:t>
@@ -3403,6 +3928,7 @@
       <w:proofErr w:type="spellStart"/>
       <w:r>
         <w:rPr>
+          <w:highlight w:val="green"/>
           <w:lang w:val="it-IT"/>
         </w:rPr>
         <w:t>Acceptance</w:t>
@@ -3410,6 +3936,7 @@
       <w:proofErr w:type="spellEnd"/>
       <w:r>
         <w:rPr>
+          <w:highlight w:val="green"/>
           <w:lang w:val="it-IT"/>
         </w:rPr>
         <w:t xml:space="preserve"> </w:t>
@@ -3418,6 +3945,7 @@
       <w:proofErr w:type="gramStart"/>
       <w:r>
         <w:rPr>
+          <w:highlight w:val="green"/>
           <w:lang w:val="it-IT"/>
         </w:rPr>
         <w:t>Criteria</w:t>
@@ -3425,6 +3953,7 @@
       <w:proofErr w:type="spellEnd"/>
       <w:r>
         <w:rPr>
+          <w:highlight w:val="green"/>
           <w:lang w:val="it-IT"/>
         </w:rPr>
         <w:t>:*</w:t>
@@ -3432,6 +3961,7 @@
       <w:proofErr w:type="gramEnd"/>
       <w:r>
         <w:rPr>
+          <w:highlight w:val="green"/>
           <w:lang w:val="it-IT"/>
         </w:rPr>
         <w:t>*</w:t>
@@ -3440,11 +3970,13 @@
     <w:p>
       <w:pPr>
         <w:rPr>
-          <w:lang w:val="it-IT"/>
-        </w:rPr>
-      </w:pPr>
-      <w:r>
-        <w:rPr>
+          <w:highlight w:val="green"/>
+          <w:lang w:val="it-IT"/>
+        </w:rPr>
+      </w:pPr>
+      <w:r>
+        <w:rPr>
+          <w:highlight w:val="green"/>
           <w:lang w:val="it-IT"/>
         </w:rPr>
         <w:t xml:space="preserve">- </w:t>
@@ -3452,6 +3984,7 @@
       <w:proofErr w:type="gramStart"/>
       <w:r>
         <w:rPr>
+          <w:highlight w:val="green"/>
           <w:lang w:val="it-IT"/>
         </w:rPr>
         <w:t>[ ]</w:t>
@@ -3459,6 +3992,7 @@
       <w:proofErr w:type="gramEnd"/>
       <w:r>
         <w:rPr>
+          <w:highlight w:val="green"/>
           <w:lang w:val="it-IT"/>
         </w:rPr>
         <w:t xml:space="preserve"> Classe è immutabile</w:t>
@@ -3467,11 +4001,13 @@
     <w:p>
       <w:pPr>
         <w:rPr>
-          <w:lang w:val="it-IT"/>
-        </w:rPr>
-      </w:pPr>
-      <w:r>
-        <w:rPr>
+          <w:highlight w:val="green"/>
+          <w:lang w:val="it-IT"/>
+        </w:rPr>
+      </w:pPr>
+      <w:r>
+        <w:rPr>
+          <w:highlight w:val="green"/>
           <w:lang w:val="it-IT"/>
         </w:rPr>
         <w:t xml:space="preserve">- </w:t>
@@ -3479,6 +4015,7 @@
       <w:proofErr w:type="gramStart"/>
       <w:r>
         <w:rPr>
+          <w:highlight w:val="green"/>
           <w:lang w:val="it-IT"/>
         </w:rPr>
         <w:t>[ ]</w:t>
@@ -3486,6 +4023,7 @@
       <w:proofErr w:type="gramEnd"/>
       <w:r>
         <w:rPr>
+          <w:highlight w:val="green"/>
           <w:lang w:val="it-IT"/>
         </w:rPr>
         <w:t xml:space="preserve"> Conversione da </w:t>
@@ -3493,6 +4031,7 @@
       <w:proofErr w:type="spellStart"/>
       <w:r>
         <w:rPr>
+          <w:highlight w:val="green"/>
           <w:lang w:val="it-IT"/>
         </w:rPr>
         <w:t>basis</w:t>
@@ -3500,6 +4039,7 @@
       <w:proofErr w:type="spellEnd"/>
       <w:r>
         <w:rPr>
+          <w:highlight w:val="green"/>
           <w:lang w:val="it-IT"/>
         </w:rPr>
         <w:t xml:space="preserve"> points corretta (100 bps = 1% = 0.01)</w:t>
@@ -3508,11 +4048,13 @@
     <w:p>
       <w:pPr>
         <w:rPr>
-          <w:lang w:val="it-IT"/>
-        </w:rPr>
-      </w:pPr>
-      <w:r>
-        <w:rPr>
+          <w:highlight w:val="green"/>
+          <w:lang w:val="it-IT"/>
+        </w:rPr>
+      </w:pPr>
+      <w:r>
+        <w:rPr>
+          <w:highlight w:val="green"/>
           <w:lang w:val="it-IT"/>
         </w:rPr>
         <w:t xml:space="preserve">- </w:t>
@@ -3520,6 +4062,7 @@
       <w:proofErr w:type="gramStart"/>
       <w:r>
         <w:rPr>
+          <w:highlight w:val="green"/>
           <w:lang w:val="it-IT"/>
         </w:rPr>
         <w:t>[ ]</w:t>
@@ -3527,6 +4070,7 @@
       <w:proofErr w:type="gramEnd"/>
       <w:r>
         <w:rPr>
+          <w:highlight w:val="green"/>
           <w:lang w:val="it-IT"/>
         </w:rPr>
         <w:t xml:space="preserve"> `</w:t>
@@ -3534,6 +4078,7 @@
       <w:proofErr w:type="spellStart"/>
       <w:r>
         <w:rPr>
+          <w:highlight w:val="green"/>
           <w:lang w:val="it-IT"/>
         </w:rPr>
         <w:t>apply_to</w:t>
@@ -3541,6 +4086,7 @@
       <w:proofErr w:type="spellEnd"/>
       <w:r>
         <w:rPr>
+          <w:highlight w:val="green"/>
           <w:lang w:val="it-IT"/>
         </w:rPr>
         <w:t>` restituisce Money con importo corretto</w:t>
@@ -3549,11 +4095,13 @@
     <w:p>
       <w:pPr>
         <w:rPr>
-          <w:lang w:val="it-IT"/>
-        </w:rPr>
-      </w:pPr>
-      <w:r>
-        <w:rPr>
+          <w:highlight w:val="green"/>
+          <w:lang w:val="it-IT"/>
+        </w:rPr>
+      </w:pPr>
+      <w:r>
+        <w:rPr>
+          <w:highlight w:val="green"/>
           <w:lang w:val="it-IT"/>
         </w:rPr>
         <w:t xml:space="preserve">- </w:t>
@@ -3561,6 +4109,7 @@
       <w:proofErr w:type="gramStart"/>
       <w:r>
         <w:rPr>
+          <w:highlight w:val="green"/>
           <w:lang w:val="it-IT"/>
         </w:rPr>
         <w:t>[ ]</w:t>
@@ -3568,6 +4117,7 @@
       <w:proofErr w:type="gramEnd"/>
       <w:r>
         <w:rPr>
+          <w:highlight w:val="green"/>
           <w:lang w:val="it-IT"/>
         </w:rPr>
         <w:t xml:space="preserve"> `</w:t>
@@ -3575,6 +4125,7 @@
       <w:proofErr w:type="spellStart"/>
       <w:r>
         <w:rPr>
+          <w:highlight w:val="green"/>
           <w:lang w:val="it-IT"/>
         </w:rPr>
         <w:t>as_multiplier</w:t>
@@ -3582,6 +4133,7 @@
       <w:proofErr w:type="spellEnd"/>
       <w:r>
         <w:rPr>
+          <w:highlight w:val="green"/>
           <w:lang w:val="it-IT"/>
         </w:rPr>
         <w:t xml:space="preserve">` per 10% restituisce </w:t>
@@ -3590,6 +4142,7 @@
       <w:proofErr w:type="gramStart"/>
       <w:r>
         <w:rPr>
+          <w:highlight w:val="green"/>
           <w:lang w:val="it-IT"/>
         </w:rPr>
         <w:t>Decimal</w:t>
@@ -3597,6 +4150,7 @@
       <w:proofErr w:type="spellEnd"/>
       <w:r>
         <w:rPr>
+          <w:highlight w:val="green"/>
           <w:lang w:val="it-IT"/>
         </w:rPr>
         <w:t>(</w:t>
@@ -3604,6 +4158,7 @@
       <w:proofErr w:type="gramEnd"/>
       <w:r>
         <w:rPr>
+          <w:highlight w:val="green"/>
           <w:lang w:val="it-IT"/>
         </w:rPr>
         <w:t>"1.10")</w:t>
@@ -3617,6 +4172,7 @@
       </w:pPr>
       <w:r>
         <w:rPr>
+          <w:highlight w:val="green"/>
           <w:lang w:val="it-IT"/>
         </w:rPr>
         <w:t xml:space="preserve">- </w:t>
@@ -3624,6 +4180,7 @@
       <w:proofErr w:type="gramStart"/>
       <w:r>
         <w:rPr>
+          <w:highlight w:val="green"/>
           <w:lang w:val="it-IT"/>
         </w:rPr>
         <w:t>[ ]</w:t>
@@ -3631,6 +4188,7 @@
       <w:proofErr w:type="gramEnd"/>
       <w:r>
         <w:rPr>
+          <w:highlight w:val="green"/>
           <w:lang w:val="it-IT"/>
         </w:rPr>
         <w:t xml:space="preserve"> Test unitari coprono tutti i metodi</w:t>

</xml_diff>

<commit_message>
Add unit tests for PriceTarget value object
- Implement tests for LONG and SHORT PriceTarget construction, validation, and risk/reward ratio calculations.
- Include tests for target and stop loss hit detection.
- Add serialization and deserialization tests for PriceTarget.
- Ensure comprehensive coverage of edge cases and error handling.
</commit_message>
<xml_diff>
--- a/Piano-operativo-v1.7.docx
+++ b/Piano-operativo-v1.7.docx
@@ -4208,210 +4208,390 @@
     </w:p>
     <w:p/>
     <w:p>
-      <w:r>
+      <w:pPr>
+        <w:rPr>
+          <w:highlight w:val="green"/>
+        </w:rPr>
+      </w:pPr>
+      <w:r>
+        <w:rPr>
+          <w:highlight w:val="green"/>
+        </w:rPr>
         <w:t xml:space="preserve">## TASK 1.5: </w:t>
       </w:r>
       <w:proofErr w:type="spellStart"/>
       <w:r>
+        <w:rPr>
+          <w:highlight w:val="green"/>
+        </w:rPr>
         <w:t>Creazione</w:t>
       </w:r>
       <w:proofErr w:type="spellEnd"/>
       <w:r>
+        <w:rPr>
+          <w:highlight w:val="green"/>
+        </w:rPr>
         <w:t xml:space="preserve"> Value Object </w:t>
       </w:r>
       <w:proofErr w:type="spellStart"/>
       <w:r>
+        <w:rPr>
+          <w:highlight w:val="green"/>
+        </w:rPr>
         <w:t>PriceTarget</w:t>
       </w:r>
       <w:proofErr w:type="spellEnd"/>
       <w:r>
+        <w:rPr>
+          <w:highlight w:val="green"/>
+        </w:rPr>
         <w:t xml:space="preserve"> (Backend)</w:t>
       </w:r>
     </w:p>
-    <w:p/>
-    <w:p>
-      <w:r>
+    <w:p>
+      <w:pPr>
+        <w:rPr>
+          <w:highlight w:val="green"/>
+        </w:rPr>
+      </w:pPr>
+    </w:p>
+    <w:p>
+      <w:pPr>
+        <w:rPr>
+          <w:highlight w:val="green"/>
+        </w:rPr>
+      </w:pPr>
+      <w:r>
+        <w:rPr>
+          <w:highlight w:val="green"/>
+        </w:rPr>
         <w:t>**</w:t>
       </w:r>
       <w:proofErr w:type="spellStart"/>
       <w:proofErr w:type="gramStart"/>
       <w:r>
+        <w:rPr>
+          <w:highlight w:val="green"/>
+        </w:rPr>
         <w:t>Descrizione</w:t>
       </w:r>
       <w:proofErr w:type="spellEnd"/>
       <w:r>
+        <w:rPr>
+          <w:highlight w:val="green"/>
+        </w:rPr>
         <w:t>:*</w:t>
       </w:r>
       <w:proofErr w:type="gramEnd"/>
       <w:r>
+        <w:rPr>
+          <w:highlight w:val="green"/>
+        </w:rPr>
         <w:t xml:space="preserve">* </w:t>
       </w:r>
       <w:proofErr w:type="spellStart"/>
       <w:r>
+        <w:rPr>
+          <w:highlight w:val="green"/>
+        </w:rPr>
         <w:t>Implementare</w:t>
       </w:r>
       <w:proofErr w:type="spellEnd"/>
       <w:r>
+        <w:rPr>
+          <w:highlight w:val="green"/>
+        </w:rPr>
         <w:t xml:space="preserve"> il value object `</w:t>
       </w:r>
       <w:proofErr w:type="spellStart"/>
       <w:r>
+        <w:rPr>
+          <w:highlight w:val="green"/>
+        </w:rPr>
         <w:t>PriceTarget</w:t>
       </w:r>
       <w:proofErr w:type="spellEnd"/>
       <w:r>
+        <w:rPr>
+          <w:highlight w:val="green"/>
+        </w:rPr>
         <w:t xml:space="preserve">` </w:t>
       </w:r>
       <w:proofErr w:type="spellStart"/>
       <w:r>
+        <w:rPr>
+          <w:highlight w:val="green"/>
+        </w:rPr>
         <w:t>che</w:t>
       </w:r>
       <w:proofErr w:type="spellEnd"/>
       <w:r>
+        <w:rPr>
+          <w:highlight w:val="green"/>
+        </w:rPr>
         <w:t xml:space="preserve"> </w:t>
       </w:r>
       <w:proofErr w:type="spellStart"/>
       <w:r>
+        <w:rPr>
+          <w:highlight w:val="green"/>
+        </w:rPr>
         <w:t>incapsula</w:t>
       </w:r>
       <w:proofErr w:type="spellEnd"/>
       <w:r>
+        <w:rPr>
+          <w:highlight w:val="green"/>
+        </w:rPr>
         <w:t xml:space="preserve"> target, stop loss e take profit con </w:t>
       </w:r>
       <w:proofErr w:type="spellStart"/>
       <w:r>
+        <w:rPr>
+          <w:highlight w:val="green"/>
+        </w:rPr>
         <w:t>validazioni</w:t>
       </w:r>
       <w:proofErr w:type="spellEnd"/>
       <w:r>
+        <w:rPr>
+          <w:highlight w:val="green"/>
+        </w:rPr>
         <w:t>.</w:t>
       </w:r>
     </w:p>
-    <w:p/>
-    <w:p>
-      <w:r>
+    <w:p>
+      <w:pPr>
+        <w:rPr>
+          <w:highlight w:val="green"/>
+        </w:rPr>
+      </w:pPr>
+    </w:p>
+    <w:p>
+      <w:pPr>
+        <w:rPr>
+          <w:highlight w:val="green"/>
+        </w:rPr>
+      </w:pPr>
+      <w:r>
+        <w:rPr>
+          <w:highlight w:val="green"/>
+        </w:rPr>
         <w:t>**</w:t>
       </w:r>
       <w:proofErr w:type="spellStart"/>
       <w:proofErr w:type="gramStart"/>
       <w:r>
+        <w:rPr>
+          <w:highlight w:val="green"/>
+        </w:rPr>
         <w:t>Microstep</w:t>
       </w:r>
       <w:proofErr w:type="spellEnd"/>
       <w:r>
+        <w:rPr>
+          <w:highlight w:val="green"/>
+        </w:rPr>
         <w:t>:*</w:t>
       </w:r>
       <w:proofErr w:type="gramEnd"/>
       <w:r>
+        <w:rPr>
+          <w:highlight w:val="green"/>
+        </w:rPr>
         <w:t>*</w:t>
       </w:r>
     </w:p>
     <w:p>
-      <w:r>
+      <w:pPr>
+        <w:rPr>
+          <w:highlight w:val="green"/>
+        </w:rPr>
+      </w:pPr>
+      <w:r>
+        <w:rPr>
+          <w:highlight w:val="green"/>
+        </w:rPr>
         <w:t xml:space="preserve">1. </w:t>
       </w:r>
       <w:proofErr w:type="spellStart"/>
       <w:r>
+        <w:rPr>
+          <w:highlight w:val="green"/>
+        </w:rPr>
         <w:t>Creare</w:t>
       </w:r>
       <w:proofErr w:type="spellEnd"/>
       <w:r>
+        <w:rPr>
+          <w:highlight w:val="green"/>
+        </w:rPr>
         <w:t xml:space="preserve"> file `backend/</w:t>
       </w:r>
       <w:proofErr w:type="spellStart"/>
       <w:r>
+        <w:rPr>
+          <w:highlight w:val="green"/>
+        </w:rPr>
         <w:t>src</w:t>
       </w:r>
       <w:proofErr w:type="spellEnd"/>
       <w:r>
+        <w:rPr>
+          <w:highlight w:val="green"/>
+        </w:rPr>
         <w:t>/shared/domain/</w:t>
       </w:r>
       <w:proofErr w:type="spellStart"/>
       <w:r>
+        <w:rPr>
+          <w:highlight w:val="green"/>
+        </w:rPr>
         <w:t>value_objects</w:t>
       </w:r>
       <w:proofErr w:type="spellEnd"/>
       <w:r>
+        <w:rPr>
+          <w:highlight w:val="green"/>
+        </w:rPr>
         <w:t>/price_target.py`</w:t>
       </w:r>
     </w:p>
     <w:p>
-      <w:r>
+      <w:pPr>
+        <w:rPr>
+          <w:highlight w:val="green"/>
+        </w:rPr>
+      </w:pPr>
+      <w:r>
+        <w:rPr>
+          <w:highlight w:val="green"/>
+        </w:rPr>
         <w:t xml:space="preserve">2. </w:t>
       </w:r>
       <w:proofErr w:type="spellStart"/>
       <w:r>
+        <w:rPr>
+          <w:highlight w:val="green"/>
+        </w:rPr>
         <w:t>Definire</w:t>
       </w:r>
       <w:proofErr w:type="spellEnd"/>
       <w:r>
+        <w:rPr>
+          <w:highlight w:val="green"/>
+        </w:rPr>
         <w:t xml:space="preserve"> </w:t>
       </w:r>
       <w:proofErr w:type="spellStart"/>
       <w:r>
+        <w:rPr>
+          <w:highlight w:val="green"/>
+        </w:rPr>
         <w:t>dataclass</w:t>
       </w:r>
       <w:proofErr w:type="spellEnd"/>
       <w:r>
+        <w:rPr>
+          <w:highlight w:val="green"/>
+        </w:rPr>
         <w:t xml:space="preserve"> frozen `</w:t>
       </w:r>
       <w:proofErr w:type="spellStart"/>
       <w:r>
+        <w:rPr>
+          <w:highlight w:val="green"/>
+        </w:rPr>
         <w:t>PriceTarget</w:t>
       </w:r>
       <w:proofErr w:type="spellEnd"/>
       <w:r>
+        <w:rPr>
+          <w:highlight w:val="green"/>
+        </w:rPr>
         <w:t xml:space="preserve">` con </w:t>
       </w:r>
       <w:proofErr w:type="spellStart"/>
       <w:r>
+        <w:rPr>
+          <w:highlight w:val="green"/>
+        </w:rPr>
         <w:t>campi</w:t>
       </w:r>
       <w:proofErr w:type="spellEnd"/>
       <w:r>
+        <w:rPr>
+          <w:highlight w:val="green"/>
+        </w:rPr>
         <w:t>: `</w:t>
       </w:r>
       <w:proofErr w:type="spellStart"/>
       <w:r>
+        <w:rPr>
+          <w:highlight w:val="green"/>
+        </w:rPr>
         <w:t>entry_price</w:t>
       </w:r>
       <w:proofErr w:type="spellEnd"/>
       <w:r>
+        <w:rPr>
+          <w:highlight w:val="green"/>
+        </w:rPr>
         <w:t>` (Money), `</w:t>
       </w:r>
       <w:proofErr w:type="spellStart"/>
       <w:r>
+        <w:rPr>
+          <w:highlight w:val="green"/>
+        </w:rPr>
         <w:t>stop_loss</w:t>
       </w:r>
       <w:proofErr w:type="spellEnd"/>
       <w:r>
+        <w:rPr>
+          <w:highlight w:val="green"/>
+        </w:rPr>
         <w:t>` (Money), `</w:t>
       </w:r>
       <w:proofErr w:type="spellStart"/>
       <w:r>
+        <w:rPr>
+          <w:highlight w:val="green"/>
+        </w:rPr>
         <w:t>take_profit</w:t>
       </w:r>
       <w:proofErr w:type="spellEnd"/>
       <w:r>
+        <w:rPr>
+          <w:highlight w:val="green"/>
+        </w:rPr>
         <w:t>` (Money), `direction` (</w:t>
       </w:r>
       <w:proofErr w:type="gramStart"/>
       <w:r>
+        <w:rPr>
+          <w:highlight w:val="green"/>
+        </w:rPr>
         <w:t>Literal[</w:t>
       </w:r>
       <w:proofErr w:type="gramEnd"/>
       <w:r>
+        <w:rPr>
+          <w:highlight w:val="green"/>
+        </w:rPr>
         <w:t>"LONG", "SHORT"])</w:t>
       </w:r>
     </w:p>
     <w:p>
       <w:pPr>
         <w:rPr>
-          <w:lang w:val="it-IT"/>
-        </w:rPr>
-      </w:pPr>
-      <w:r>
-        <w:rPr>
+          <w:highlight w:val="green"/>
+          <w:lang w:val="it-IT"/>
+        </w:rPr>
+      </w:pPr>
+      <w:r>
+        <w:rPr>
+          <w:highlight w:val="green"/>
           <w:lang w:val="it-IT"/>
         </w:rPr>
         <w:t>3. Implementare `__</w:t>
@@ -4419,6 +4599,7 @@
       <w:proofErr w:type="spellStart"/>
       <w:r>
         <w:rPr>
+          <w:highlight w:val="green"/>
           <w:lang w:val="it-IT"/>
         </w:rPr>
         <w:t>post_init</w:t>
@@ -4426,65 +4607,113 @@
       <w:proofErr w:type="spellEnd"/>
       <w:r>
         <w:rPr>
+          <w:highlight w:val="green"/>
           <w:lang w:val="it-IT"/>
         </w:rPr>
         <w:t>__` con validazioni:</w:t>
       </w:r>
     </w:p>
     <w:p>
-      <w:r>
-        <w:rPr>
+      <w:pPr>
+        <w:rPr>
+          <w:highlight w:val="green"/>
+        </w:rPr>
+      </w:pPr>
+      <w:r>
+        <w:rPr>
+          <w:highlight w:val="green"/>
           <w:lang w:val="it-IT"/>
         </w:rPr>
         <w:t xml:space="preserve">   </w:t>
       </w:r>
       <w:r>
+        <w:rPr>
+          <w:highlight w:val="green"/>
+        </w:rPr>
         <w:t xml:space="preserve">- Per LONG: </w:t>
       </w:r>
       <w:proofErr w:type="spellStart"/>
       <w:r>
+        <w:rPr>
+          <w:highlight w:val="green"/>
+        </w:rPr>
         <w:t>stop_loss</w:t>
       </w:r>
       <w:proofErr w:type="spellEnd"/>
       <w:r>
+        <w:rPr>
+          <w:highlight w:val="green"/>
+        </w:rPr>
         <w:t xml:space="preserve"> &lt; </w:t>
       </w:r>
       <w:proofErr w:type="spellStart"/>
       <w:r>
+        <w:rPr>
+          <w:highlight w:val="green"/>
+        </w:rPr>
         <w:t>entry_price</w:t>
       </w:r>
       <w:proofErr w:type="spellEnd"/>
       <w:r>
+        <w:rPr>
+          <w:highlight w:val="green"/>
+        </w:rPr>
         <w:t xml:space="preserve"> &lt; </w:t>
       </w:r>
       <w:proofErr w:type="spellStart"/>
       <w:r>
+        <w:rPr>
+          <w:highlight w:val="green"/>
+        </w:rPr>
         <w:t>take_profit</w:t>
       </w:r>
       <w:proofErr w:type="spellEnd"/>
     </w:p>
     <w:p>
-      <w:r>
+      <w:pPr>
+        <w:rPr>
+          <w:highlight w:val="green"/>
+        </w:rPr>
+      </w:pPr>
+      <w:r>
+        <w:rPr>
+          <w:highlight w:val="green"/>
+        </w:rPr>
         <w:t xml:space="preserve">   - Per SHORT: </w:t>
       </w:r>
       <w:proofErr w:type="spellStart"/>
       <w:r>
+        <w:rPr>
+          <w:highlight w:val="green"/>
+        </w:rPr>
         <w:t>take_profit</w:t>
       </w:r>
       <w:proofErr w:type="spellEnd"/>
       <w:r>
+        <w:rPr>
+          <w:highlight w:val="green"/>
+        </w:rPr>
         <w:t xml:space="preserve"> &lt; </w:t>
       </w:r>
       <w:proofErr w:type="spellStart"/>
       <w:r>
+        <w:rPr>
+          <w:highlight w:val="green"/>
+        </w:rPr>
         <w:t>entry_price</w:t>
       </w:r>
       <w:proofErr w:type="spellEnd"/>
       <w:r>
+        <w:rPr>
+          <w:highlight w:val="green"/>
+        </w:rPr>
         <w:t xml:space="preserve"> &lt; </w:t>
       </w:r>
       <w:proofErr w:type="spellStart"/>
       <w:r>
+        <w:rPr>
+          <w:highlight w:val="green"/>
+        </w:rPr>
         <w:t>stop_loss</w:t>
       </w:r>
       <w:proofErr w:type="spellEnd"/>
@@ -4492,15 +4721,20 @@
     <w:p>
       <w:pPr>
         <w:rPr>
-          <w:lang w:val="it-IT"/>
-        </w:rPr>
-      </w:pPr>
-      <w:r>
+          <w:highlight w:val="green"/>
+          <w:lang w:val="it-IT"/>
+        </w:rPr>
+      </w:pPr>
+      <w:r>
+        <w:rPr>
+          <w:highlight w:val="green"/>
+        </w:rPr>
         <w:lastRenderedPageBreak/>
         <w:t xml:space="preserve">   </w:t>
       </w:r>
       <w:r>
         <w:rPr>
+          <w:highlight w:val="green"/>
           <w:lang w:val="it-IT"/>
         </w:rPr>
         <w:t xml:space="preserve">- Tutte le </w:t>
@@ -4508,6 +4742,7 @@
       <w:proofErr w:type="spellStart"/>
       <w:r>
         <w:rPr>
+          <w:highlight w:val="green"/>
           <w:lang w:val="it-IT"/>
         </w:rPr>
         <w:t>currency</w:t>
@@ -4515,6 +4750,7 @@
       <w:proofErr w:type="spellEnd"/>
       <w:r>
         <w:rPr>
+          <w:highlight w:val="green"/>
           <w:lang w:val="it-IT"/>
         </w:rPr>
         <w:t xml:space="preserve"> devono corrispondere</w:t>
@@ -4523,11 +4759,13 @@
     <w:p>
       <w:pPr>
         <w:rPr>
-          <w:lang w:val="it-IT"/>
-        </w:rPr>
-      </w:pPr>
-      <w:r>
-        <w:rPr>
+          <w:highlight w:val="green"/>
+          <w:lang w:val="it-IT"/>
+        </w:rPr>
+      </w:pPr>
+      <w:r>
+        <w:rPr>
+          <w:highlight w:val="green"/>
           <w:lang w:val="it-IT"/>
         </w:rPr>
         <w:t>4. Implementare metodo `</w:t>
@@ -4535,6 +4773,7 @@
       <w:proofErr w:type="spellStart"/>
       <w:r>
         <w:rPr>
+          <w:highlight w:val="green"/>
           <w:lang w:val="it-IT"/>
         </w:rPr>
         <w:t>risk_reward_</w:t>
@@ -4542,6 +4781,7 @@
       <w:proofErr w:type="gramStart"/>
       <w:r>
         <w:rPr>
+          <w:highlight w:val="green"/>
           <w:lang w:val="it-IT"/>
         </w:rPr>
         <w:t>ratio</w:t>
@@ -4549,6 +4789,7 @@
       <w:proofErr w:type="spellEnd"/>
       <w:r>
         <w:rPr>
+          <w:highlight w:val="green"/>
           <w:lang w:val="it-IT"/>
         </w:rPr>
         <w:t>(</w:t>
@@ -4556,6 +4797,7 @@
       <w:proofErr w:type="gramEnd"/>
       <w:r>
         <w:rPr>
+          <w:highlight w:val="green"/>
           <w:lang w:val="it-IT"/>
         </w:rPr>
         <w:t xml:space="preserve">) -&gt; </w:t>
@@ -4563,6 +4805,7 @@
       <w:proofErr w:type="spellStart"/>
       <w:r>
         <w:rPr>
+          <w:highlight w:val="green"/>
           <w:lang w:val="it-IT"/>
         </w:rPr>
         <w:t>Decimal</w:t>
@@ -4570,149 +4813,266 @@
       <w:proofErr w:type="spellEnd"/>
       <w:r>
         <w:rPr>
+          <w:highlight w:val="green"/>
           <w:lang w:val="it-IT"/>
         </w:rPr>
         <w:t>`</w:t>
       </w:r>
     </w:p>
     <w:p>
-      <w:r>
+      <w:pPr>
+        <w:rPr>
+          <w:highlight w:val="green"/>
+        </w:rPr>
+      </w:pPr>
+      <w:r>
+        <w:rPr>
+          <w:highlight w:val="green"/>
+        </w:rPr>
         <w:t xml:space="preserve">5. </w:t>
       </w:r>
       <w:proofErr w:type="spellStart"/>
       <w:r>
+        <w:rPr>
+          <w:highlight w:val="green"/>
+        </w:rPr>
         <w:t>Implementare</w:t>
       </w:r>
       <w:proofErr w:type="spellEnd"/>
       <w:r>
+        <w:rPr>
+          <w:highlight w:val="green"/>
+        </w:rPr>
         <w:t xml:space="preserve"> </w:t>
       </w:r>
       <w:proofErr w:type="spellStart"/>
       <w:r>
+        <w:rPr>
+          <w:highlight w:val="green"/>
+        </w:rPr>
         <w:t>metodo</w:t>
       </w:r>
       <w:proofErr w:type="spellEnd"/>
       <w:r>
+        <w:rPr>
+          <w:highlight w:val="green"/>
+        </w:rPr>
         <w:t xml:space="preserve"> `</w:t>
       </w:r>
       <w:proofErr w:type="spellStart"/>
       <w:r>
+        <w:rPr>
+          <w:highlight w:val="green"/>
+        </w:rPr>
         <w:t>is_target_</w:t>
       </w:r>
       <w:proofErr w:type="gramStart"/>
       <w:r>
+        <w:rPr>
+          <w:highlight w:val="green"/>
+        </w:rPr>
         <w:t>hit</w:t>
       </w:r>
       <w:proofErr w:type="spellEnd"/>
       <w:r>
+        <w:rPr>
+          <w:highlight w:val="green"/>
+        </w:rPr>
         <w:t>(</w:t>
       </w:r>
       <w:proofErr w:type="spellStart"/>
       <w:proofErr w:type="gramEnd"/>
       <w:r>
+        <w:rPr>
+          <w:highlight w:val="green"/>
+        </w:rPr>
         <w:t>current_price</w:t>
       </w:r>
       <w:proofErr w:type="spellEnd"/>
       <w:r>
+        <w:rPr>
+          <w:highlight w:val="green"/>
+        </w:rPr>
         <w:t>: Money) -&gt; bool`</w:t>
       </w:r>
     </w:p>
     <w:p>
-      <w:r>
+      <w:pPr>
+        <w:rPr>
+          <w:highlight w:val="green"/>
+        </w:rPr>
+      </w:pPr>
+      <w:r>
+        <w:rPr>
+          <w:highlight w:val="green"/>
+        </w:rPr>
         <w:t xml:space="preserve">6. </w:t>
       </w:r>
       <w:proofErr w:type="spellStart"/>
       <w:r>
+        <w:rPr>
+          <w:highlight w:val="green"/>
+        </w:rPr>
         <w:t>Implementare</w:t>
       </w:r>
       <w:proofErr w:type="spellEnd"/>
       <w:r>
+        <w:rPr>
+          <w:highlight w:val="green"/>
+        </w:rPr>
         <w:t xml:space="preserve"> </w:t>
       </w:r>
       <w:proofErr w:type="spellStart"/>
       <w:r>
+        <w:rPr>
+          <w:highlight w:val="green"/>
+        </w:rPr>
         <w:t>metodo</w:t>
       </w:r>
       <w:proofErr w:type="spellEnd"/>
       <w:r>
+        <w:rPr>
+          <w:highlight w:val="green"/>
+        </w:rPr>
         <w:t xml:space="preserve"> `</w:t>
       </w:r>
       <w:proofErr w:type="spellStart"/>
       <w:r>
+        <w:rPr>
+          <w:highlight w:val="green"/>
+        </w:rPr>
         <w:t>is_stop_</w:t>
       </w:r>
       <w:proofErr w:type="gramStart"/>
       <w:r>
+        <w:rPr>
+          <w:highlight w:val="green"/>
+        </w:rPr>
         <w:t>hit</w:t>
       </w:r>
       <w:proofErr w:type="spellEnd"/>
       <w:r>
+        <w:rPr>
+          <w:highlight w:val="green"/>
+        </w:rPr>
         <w:t>(</w:t>
       </w:r>
       <w:proofErr w:type="spellStart"/>
       <w:proofErr w:type="gramEnd"/>
       <w:r>
+        <w:rPr>
+          <w:highlight w:val="green"/>
+        </w:rPr>
         <w:t>current_price</w:t>
       </w:r>
       <w:proofErr w:type="spellEnd"/>
       <w:r>
+        <w:rPr>
+          <w:highlight w:val="green"/>
+        </w:rPr>
         <w:t>: Money) -&gt; bool`</w:t>
       </w:r>
     </w:p>
     <w:p>
-      <w:r>
+      <w:pPr>
+        <w:rPr>
+          <w:highlight w:val="green"/>
+        </w:rPr>
+      </w:pPr>
+      <w:r>
+        <w:rPr>
+          <w:highlight w:val="green"/>
+        </w:rPr>
         <w:t xml:space="preserve">7. </w:t>
       </w:r>
       <w:proofErr w:type="spellStart"/>
       <w:r>
+        <w:rPr>
+          <w:highlight w:val="green"/>
+        </w:rPr>
         <w:t>Implementare</w:t>
       </w:r>
       <w:proofErr w:type="spellEnd"/>
       <w:r>
+        <w:rPr>
+          <w:highlight w:val="green"/>
+        </w:rPr>
         <w:t xml:space="preserve"> `</w:t>
       </w:r>
       <w:proofErr w:type="spellStart"/>
       <w:r>
+        <w:rPr>
+          <w:highlight w:val="green"/>
+        </w:rPr>
         <w:t>to_</w:t>
       </w:r>
       <w:proofErr w:type="gramStart"/>
       <w:r>
+        <w:rPr>
+          <w:highlight w:val="green"/>
+        </w:rPr>
         <w:t>dict</w:t>
       </w:r>
       <w:proofErr w:type="spellEnd"/>
       <w:r>
+        <w:rPr>
+          <w:highlight w:val="green"/>
+        </w:rPr>
         <w:t>(</w:t>
       </w:r>
       <w:proofErr w:type="gramEnd"/>
       <w:r>
+        <w:rPr>
+          <w:highlight w:val="green"/>
+        </w:rPr>
         <w:t>)` e `</w:t>
       </w:r>
       <w:proofErr w:type="spellStart"/>
       <w:r>
+        <w:rPr>
+          <w:highlight w:val="green"/>
+        </w:rPr>
         <w:t>from_</w:t>
       </w:r>
       <w:proofErr w:type="gramStart"/>
       <w:r>
+        <w:rPr>
+          <w:highlight w:val="green"/>
+        </w:rPr>
         <w:t>dict</w:t>
       </w:r>
       <w:proofErr w:type="spellEnd"/>
       <w:r>
+        <w:rPr>
+          <w:highlight w:val="green"/>
+        </w:rPr>
         <w:t>(</w:t>
       </w:r>
       <w:proofErr w:type="gramEnd"/>
       <w:r>
+        <w:rPr>
+          <w:highlight w:val="green"/>
+        </w:rPr>
         <w:t>)`</w:t>
       </w:r>
     </w:p>
-    <w:p/>
-    <w:p>
-      <w:pPr>
-        <w:rPr>
-          <w:lang w:val="it-IT"/>
-        </w:rPr>
-      </w:pPr>
-      <w:r>
-        <w:rPr>
+    <w:p>
+      <w:pPr>
+        <w:rPr>
+          <w:highlight w:val="green"/>
+        </w:rPr>
+      </w:pPr>
+    </w:p>
+    <w:p>
+      <w:pPr>
+        <w:rPr>
+          <w:highlight w:val="green"/>
+          <w:lang w:val="it-IT"/>
+        </w:rPr>
+      </w:pPr>
+      <w:r>
+        <w:rPr>
+          <w:highlight w:val="green"/>
           <w:lang w:val="it-IT"/>
         </w:rPr>
         <w:t>**</w:t>
@@ -4720,6 +5080,7 @@
       <w:proofErr w:type="spellStart"/>
       <w:r>
         <w:rPr>
+          <w:highlight w:val="green"/>
           <w:lang w:val="it-IT"/>
         </w:rPr>
         <w:t>Acceptance</w:t>
@@ -4727,6 +5088,7 @@
       <w:proofErr w:type="spellEnd"/>
       <w:r>
         <w:rPr>
+          <w:highlight w:val="green"/>
           <w:lang w:val="it-IT"/>
         </w:rPr>
         <w:t xml:space="preserve"> </w:t>
@@ -4735,6 +5097,7 @@
       <w:proofErr w:type="gramStart"/>
       <w:r>
         <w:rPr>
+          <w:highlight w:val="green"/>
           <w:lang w:val="it-IT"/>
         </w:rPr>
         <w:t>Criteria</w:t>
@@ -4742,6 +5105,7 @@
       <w:proofErr w:type="spellEnd"/>
       <w:r>
         <w:rPr>
+          <w:highlight w:val="green"/>
           <w:lang w:val="it-IT"/>
         </w:rPr>
         <w:t>:*</w:t>
@@ -4749,6 +5113,7 @@
       <w:proofErr w:type="gramEnd"/>
       <w:r>
         <w:rPr>
+          <w:highlight w:val="green"/>
           <w:lang w:val="it-IT"/>
         </w:rPr>
         <w:t>*</w:t>
@@ -4757,11 +5122,13 @@
     <w:p>
       <w:pPr>
         <w:rPr>
-          <w:lang w:val="it-IT"/>
-        </w:rPr>
-      </w:pPr>
-      <w:r>
-        <w:rPr>
+          <w:highlight w:val="green"/>
+          <w:lang w:val="it-IT"/>
+        </w:rPr>
+      </w:pPr>
+      <w:r>
+        <w:rPr>
+          <w:highlight w:val="green"/>
           <w:lang w:val="it-IT"/>
         </w:rPr>
         <w:t xml:space="preserve">- </w:t>
@@ -4769,6 +5136,7 @@
       <w:proofErr w:type="gramStart"/>
       <w:r>
         <w:rPr>
+          <w:highlight w:val="green"/>
           <w:lang w:val="it-IT"/>
         </w:rPr>
         <w:t>[ ]</w:t>
@@ -4776,6 +5144,7 @@
       <w:proofErr w:type="gramEnd"/>
       <w:r>
         <w:rPr>
+          <w:highlight w:val="green"/>
           <w:lang w:val="it-IT"/>
         </w:rPr>
         <w:t xml:space="preserve"> Validazione solleva </w:t>
@@ -4783,6 +5152,7 @@
       <w:proofErr w:type="spellStart"/>
       <w:r>
         <w:rPr>
+          <w:highlight w:val="green"/>
           <w:lang w:val="it-IT"/>
         </w:rPr>
         <w:t>ValueError</w:t>
@@ -4790,6 +5160,7 @@
       <w:proofErr w:type="spellEnd"/>
       <w:r>
         <w:rPr>
+          <w:highlight w:val="green"/>
           <w:lang w:val="it-IT"/>
         </w:rPr>
         <w:t xml:space="preserve"> per configurazioni invalide</w:t>
@@ -4798,11 +5169,13 @@
     <w:p>
       <w:pPr>
         <w:rPr>
-          <w:lang w:val="it-IT"/>
-        </w:rPr>
-      </w:pPr>
-      <w:r>
-        <w:rPr>
+          <w:highlight w:val="green"/>
+          <w:lang w:val="it-IT"/>
+        </w:rPr>
+      </w:pPr>
+      <w:r>
+        <w:rPr>
+          <w:highlight w:val="green"/>
           <w:lang w:val="it-IT"/>
         </w:rPr>
         <w:t xml:space="preserve">- </w:t>
@@ -4810,6 +5183,7 @@
       <w:proofErr w:type="gramStart"/>
       <w:r>
         <w:rPr>
+          <w:highlight w:val="green"/>
           <w:lang w:val="it-IT"/>
         </w:rPr>
         <w:t>[ ]</w:t>
@@ -4817,6 +5191,7 @@
       <w:proofErr w:type="gramEnd"/>
       <w:r>
         <w:rPr>
+          <w:highlight w:val="green"/>
           <w:lang w:val="it-IT"/>
         </w:rPr>
         <w:t xml:space="preserve"> Risk/</w:t>
@@ -4824,6 +5199,7 @@
       <w:proofErr w:type="spellStart"/>
       <w:r>
         <w:rPr>
+          <w:highlight w:val="green"/>
           <w:lang w:val="it-IT"/>
         </w:rPr>
         <w:t>reward</w:t>
@@ -4831,45 +5207,78 @@
       <w:proofErr w:type="spellEnd"/>
       <w:r>
         <w:rPr>
+          <w:highlight w:val="green"/>
           <w:lang w:val="it-IT"/>
         </w:rPr>
         <w:t xml:space="preserve"> ratio calcolato correttamente per entrambe le direzioni</w:t>
       </w:r>
     </w:p>
     <w:p>
-      <w:r>
+      <w:pPr>
+        <w:rPr>
+          <w:highlight w:val="green"/>
+        </w:rPr>
+      </w:pPr>
+      <w:r>
+        <w:rPr>
+          <w:highlight w:val="green"/>
+        </w:rPr>
         <w:t xml:space="preserve">- </w:t>
       </w:r>
       <w:proofErr w:type="gramStart"/>
       <w:r>
+        <w:rPr>
+          <w:highlight w:val="green"/>
+        </w:rPr>
         <w:t>[ ]</w:t>
       </w:r>
       <w:proofErr w:type="gramEnd"/>
       <w:r>
+        <w:rPr>
+          <w:highlight w:val="green"/>
+        </w:rPr>
         <w:t xml:space="preserve"> Metodi </w:t>
       </w:r>
       <w:proofErr w:type="spellStart"/>
       <w:r>
+        <w:rPr>
+          <w:highlight w:val="green"/>
+        </w:rPr>
         <w:t>is_target_hit</w:t>
       </w:r>
       <w:proofErr w:type="spellEnd"/>
       <w:r>
+        <w:rPr>
+          <w:highlight w:val="green"/>
+        </w:rPr>
         <w:t xml:space="preserve"> e </w:t>
       </w:r>
       <w:proofErr w:type="spellStart"/>
       <w:r>
+        <w:rPr>
+          <w:highlight w:val="green"/>
+        </w:rPr>
         <w:t>is_stop_hit</w:t>
       </w:r>
       <w:proofErr w:type="spellEnd"/>
       <w:r>
+        <w:rPr>
+          <w:highlight w:val="green"/>
+        </w:rPr>
         <w:t xml:space="preserve"> </w:t>
       </w:r>
       <w:proofErr w:type="spellStart"/>
       <w:r>
+        <w:rPr>
+          <w:highlight w:val="green"/>
+        </w:rPr>
         <w:t>funzionano</w:t>
       </w:r>
       <w:proofErr w:type="spellEnd"/>
       <w:r>
+        <w:rPr>
+          <w:highlight w:val="green"/>
+        </w:rPr>
         <w:t xml:space="preserve"> per LONG e SHORT</w:t>
       </w:r>
     </w:p>
@@ -4881,6 +5290,7 @@
       </w:pPr>
       <w:r>
         <w:rPr>
+          <w:highlight w:val="green"/>
           <w:lang w:val="it-IT"/>
         </w:rPr>
         <w:t xml:space="preserve">- </w:t>
@@ -4888,6 +5298,7 @@
       <w:proofErr w:type="gramStart"/>
       <w:r>
         <w:rPr>
+          <w:highlight w:val="green"/>
           <w:lang w:val="it-IT"/>
         </w:rPr>
         <w:t>[ ]</w:t>
@@ -4895,6 +5306,7 @@
       <w:proofErr w:type="gramEnd"/>
       <w:r>
         <w:rPr>
+          <w:highlight w:val="green"/>
           <w:lang w:val="it-IT"/>
         </w:rPr>
         <w:t xml:space="preserve"> Test unitari coprono scenari validi e invalidi</w:t>

</xml_diff>

<commit_message>
feat: Add Estimate model domain entities, a verification script for Task 2.4, and update the operational plan.
</commit_message>
<xml_diff>
--- a/Piano-operativo-v1.7.docx
+++ b/Piano-operativo-v1.7.docx
@@ -4760,21 +4760,46 @@
       <w:pPr>
         <w:rPr>
           <w:highlight w:val="green"/>
-          <w:lang w:val="it-IT"/>
-        </w:rPr>
-      </w:pPr>
-      <w:r>
-        <w:rPr>
-          <w:highlight w:val="green"/>
-          <w:lang w:val="it-IT"/>
-        </w:rPr>
-        <w:t>4. Implementare metodo `</w:t>
-      </w:r>
-      <w:proofErr w:type="spellStart"/>
-      <w:r>
-        <w:rPr>
-          <w:highlight w:val="green"/>
-          <w:lang w:val="it-IT"/>
+        </w:rPr>
+      </w:pPr>
+      <w:r>
+        <w:rPr>
+          <w:highlight w:val="green"/>
+        </w:rPr>
+        <w:t xml:space="preserve">4. </w:t>
+      </w:r>
+      <w:proofErr w:type="spellStart"/>
+      <w:r>
+        <w:rPr>
+          <w:highlight w:val="green"/>
+        </w:rPr>
+        <w:t>Implementare</w:t>
+      </w:r>
+      <w:proofErr w:type="spellEnd"/>
+      <w:r>
+        <w:rPr>
+          <w:highlight w:val="green"/>
+        </w:rPr>
+        <w:t xml:space="preserve"> </w:t>
+      </w:r>
+      <w:proofErr w:type="spellStart"/>
+      <w:r>
+        <w:rPr>
+          <w:highlight w:val="green"/>
+        </w:rPr>
+        <w:t>metodo</w:t>
+      </w:r>
+      <w:proofErr w:type="spellEnd"/>
+      <w:r>
+        <w:rPr>
+          <w:highlight w:val="green"/>
+        </w:rPr>
+        <w:t xml:space="preserve"> `</w:t>
+      </w:r>
+      <w:proofErr w:type="spellStart"/>
+      <w:r>
+        <w:rPr>
+          <w:highlight w:val="green"/>
         </w:rPr>
         <w:t>risk_reward_</w:t>
       </w:r>
@@ -4782,7 +4807,6 @@
       <w:r>
         <w:rPr>
           <w:highlight w:val="green"/>
-          <w:lang w:val="it-IT"/>
         </w:rPr>
         <w:t>ratio</w:t>
       </w:r>
@@ -4790,7 +4814,6 @@
       <w:r>
         <w:rPr>
           <w:highlight w:val="green"/>
-          <w:lang w:val="it-IT"/>
         </w:rPr>
         <w:t>(</w:t>
       </w:r>
@@ -4798,25 +4821,8 @@
       <w:r>
         <w:rPr>
           <w:highlight w:val="green"/>
-          <w:lang w:val="it-IT"/>
-        </w:rPr>
-        <w:t xml:space="preserve">) -&gt; </w:t>
-      </w:r>
-      <w:proofErr w:type="spellStart"/>
-      <w:r>
-        <w:rPr>
-          <w:highlight w:val="green"/>
-          <w:lang w:val="it-IT"/>
-        </w:rPr>
-        <w:t>Decimal</w:t>
-      </w:r>
-      <w:proofErr w:type="spellEnd"/>
-      <w:r>
-        <w:rPr>
-          <w:highlight w:val="green"/>
-          <w:lang w:val="it-IT"/>
-        </w:rPr>
-        <w:t>`</w:t>
+        </w:rPr>
+        <w:t>) -&gt; Decimal`</w:t>
       </w:r>
     </w:p>
     <w:p>
@@ -10294,23 +10300,73 @@
           <w:highlight w:val="green"/>
           <w:lang w:val="it-IT"/>
         </w:rPr>
-        <w:t>Implementare funzioni: addPercentage, subtractPercentage, </w:t>
-      </w:r>
-      <w:proofErr w:type="gramStart"/>
-      <w:r>
-        <w:rPr>
-          <w:highlight w:val="green"/>
-          <w:lang w:val="it-IT"/>
-        </w:rPr>
-        <w:t>formatPercentage(</w:t>
-      </w:r>
-      <w:proofErr w:type="gramEnd"/>
-      <w:r>
-        <w:rPr>
-          <w:highlight w:val="green"/>
-          <w:lang w:val="it-IT"/>
-        </w:rPr>
-        <w:t xml:space="preserve">percentage, </w:t>
+        <w:t>Implementare funzioni: </w:t>
+      </w:r>
+      <w:proofErr w:type="spellStart"/>
+      <w:r>
+        <w:rPr>
+          <w:highlight w:val="green"/>
+          <w:lang w:val="it-IT"/>
+        </w:rPr>
+        <w:t>addPercentage</w:t>
+      </w:r>
+      <w:proofErr w:type="spellEnd"/>
+      <w:r>
+        <w:rPr>
+          <w:highlight w:val="green"/>
+          <w:lang w:val="it-IT"/>
+        </w:rPr>
+        <w:t>, </w:t>
+      </w:r>
+      <w:proofErr w:type="spellStart"/>
+      <w:r>
+        <w:rPr>
+          <w:highlight w:val="green"/>
+          <w:lang w:val="it-IT"/>
+        </w:rPr>
+        <w:t>subtractPercentage</w:t>
+      </w:r>
+      <w:proofErr w:type="spellEnd"/>
+      <w:r>
+        <w:rPr>
+          <w:highlight w:val="green"/>
+          <w:lang w:val="it-IT"/>
+        </w:rPr>
+        <w:t>, </w:t>
+      </w:r>
+      <w:proofErr w:type="spellStart"/>
+      <w:proofErr w:type="gramStart"/>
+      <w:r>
+        <w:rPr>
+          <w:highlight w:val="green"/>
+          <w:lang w:val="it-IT"/>
+        </w:rPr>
+        <w:t>formatPercentage</w:t>
+      </w:r>
+      <w:proofErr w:type="spellEnd"/>
+      <w:r>
+        <w:rPr>
+          <w:highlight w:val="green"/>
+          <w:lang w:val="it-IT"/>
+        </w:rPr>
+        <w:t>(</w:t>
+      </w:r>
+      <w:proofErr w:type="spellStart"/>
+      <w:proofErr w:type="gramEnd"/>
+      <w:r>
+        <w:rPr>
+          <w:highlight w:val="green"/>
+          <w:lang w:val="it-IT"/>
+        </w:rPr>
+        <w:t>percentage</w:t>
+      </w:r>
+      <w:proofErr w:type="spellEnd"/>
+      <w:r>
+        <w:rPr>
+          <w:highlight w:val="green"/>
+          <w:lang w:val="it-IT"/>
+        </w:rPr>
+        <w:t xml:space="preserve">, </w:t>
       </w:r>
       <w:proofErr w:type="spellStart"/>
       <w:r>
@@ -16541,796 +16597,716 @@
       <w:pPr>
         <w:rPr>
           <w:highlight w:val="green"/>
-          <w:lang w:val="it-IT"/>
-        </w:rPr>
-      </w:pPr>
-      <w:r>
-        <w:rPr>
-          <w:highlight w:val="green"/>
-          <w:lang w:val="it-IT"/>
-        </w:rPr>
-        <w:t xml:space="preserve">6. Creare </w:t>
-      </w:r>
-      <w:proofErr w:type="spellStart"/>
-      <w:r>
-        <w:rPr>
-          <w:highlight w:val="green"/>
-          <w:lang w:val="it-IT"/>
-        </w:rPr>
-        <w:t>dependency</w:t>
-      </w:r>
-      <w:proofErr w:type="spellEnd"/>
-      <w:r>
-        <w:rPr>
-          <w:highlight w:val="green"/>
-          <w:lang w:val="it-IT"/>
+        </w:rPr>
+      </w:pPr>
+      <w:r>
+        <w:rPr>
+          <w:highlight w:val="green"/>
+        </w:rPr>
+        <w:t xml:space="preserve">6. </w:t>
+      </w:r>
+      <w:proofErr w:type="spellStart"/>
+      <w:r>
+        <w:rPr>
+          <w:highlight w:val="green"/>
+        </w:rPr>
+        <w:t>Creare</w:t>
+      </w:r>
+      <w:proofErr w:type="spellEnd"/>
+      <w:r>
+        <w:rPr>
+          <w:highlight w:val="green"/>
+        </w:rPr>
+        <w:t xml:space="preserve"> dependency `</w:t>
+      </w:r>
+      <w:proofErr w:type="spellStart"/>
+      <w:r>
+        <w:rPr>
+          <w:highlight w:val="green"/>
+        </w:rPr>
+        <w:t>get_</w:t>
+      </w:r>
+      <w:proofErr w:type="gramStart"/>
+      <w:r>
+        <w:rPr>
+          <w:highlight w:val="green"/>
+        </w:rPr>
+        <w:t>db</w:t>
+      </w:r>
+      <w:proofErr w:type="spellEnd"/>
+      <w:r>
+        <w:rPr>
+          <w:highlight w:val="green"/>
+        </w:rPr>
+        <w:t>(</w:t>
+      </w:r>
+      <w:proofErr w:type="gramEnd"/>
+      <w:r>
+        <w:rPr>
+          <w:highlight w:val="green"/>
+        </w:rPr>
+        <w:t xml:space="preserve">)` per </w:t>
+      </w:r>
+      <w:proofErr w:type="spellStart"/>
+      <w:r>
+        <w:rPr>
+          <w:highlight w:val="green"/>
+        </w:rPr>
+        <w:t>FastAPI</w:t>
+      </w:r>
+      <w:proofErr w:type="spellEnd"/>
+      <w:r>
+        <w:rPr>
+          <w:highlight w:val="green"/>
+        </w:rPr>
+        <w:t xml:space="preserve"> injection</w:t>
+      </w:r>
+    </w:p>
+    <w:p>
+      <w:pPr>
+        <w:rPr>
+          <w:highlight w:val="green"/>
+          <w:lang w:val="it-IT"/>
+        </w:rPr>
+      </w:pPr>
+      <w:r>
+        <w:rPr>
+          <w:highlight w:val="green"/>
+          <w:lang w:val="it-IT"/>
+        </w:rPr>
+        <w:t>7. Esportare `Base`, `</w:t>
+      </w:r>
+      <w:proofErr w:type="spellStart"/>
+      <w:r>
+        <w:rPr>
+          <w:highlight w:val="green"/>
+          <w:lang w:val="it-IT"/>
+        </w:rPr>
+        <w:t>engine</w:t>
+      </w:r>
+      <w:proofErr w:type="spellEnd"/>
+      <w:r>
+        <w:rPr>
+          <w:highlight w:val="green"/>
+          <w:lang w:val="it-IT"/>
+        </w:rPr>
+        <w:t>`, `</w:t>
+      </w:r>
+      <w:proofErr w:type="spellStart"/>
+      <w:r>
+        <w:rPr>
+          <w:highlight w:val="green"/>
+          <w:lang w:val="it-IT"/>
+        </w:rPr>
+        <w:t>AsyncSessionLocal</w:t>
+      </w:r>
+      <w:proofErr w:type="spellEnd"/>
+      <w:r>
+        <w:rPr>
+          <w:highlight w:val="green"/>
+          <w:lang w:val="it-IT"/>
+        </w:rPr>
+        <w:t>`, `</w:t>
+      </w:r>
+      <w:proofErr w:type="spellStart"/>
+      <w:r>
+        <w:rPr>
+          <w:highlight w:val="green"/>
+          <w:lang w:val="it-IT"/>
+        </w:rPr>
+        <w:t>get_db</w:t>
+      </w:r>
+      <w:proofErr w:type="spellEnd"/>
+      <w:r>
+        <w:rPr>
+          <w:highlight w:val="green"/>
+          <w:lang w:val="it-IT"/>
+        </w:rPr>
+        <w:t>` da `__init__.py`</w:t>
+      </w:r>
+    </w:p>
+    <w:p>
+      <w:pPr>
+        <w:rPr>
+          <w:highlight w:val="green"/>
+          <w:lang w:val="it-IT"/>
+        </w:rPr>
+      </w:pPr>
+    </w:p>
+    <w:p>
+      <w:pPr>
+        <w:rPr>
+          <w:highlight w:val="green"/>
+          <w:lang w:val="it-IT"/>
+        </w:rPr>
+      </w:pPr>
+      <w:r>
+        <w:rPr>
+          <w:highlight w:val="green"/>
+          <w:lang w:val="it-IT"/>
+        </w:rPr>
+        <w:t>### PARTE 2: Modello Ticker</w:t>
+      </w:r>
+    </w:p>
+    <w:p>
+      <w:pPr>
+        <w:rPr>
+          <w:highlight w:val="green"/>
+        </w:rPr>
+      </w:pPr>
+      <w:r>
+        <w:rPr>
+          <w:highlight w:val="green"/>
+        </w:rPr>
+        <w:t>8. Creare file `backend/src/market_data/domain/entities.py`</w:t>
+      </w:r>
+    </w:p>
+    <w:p>
+      <w:pPr>
+        <w:rPr>
+          <w:highlight w:val="green"/>
+          <w:lang w:val="it-IT"/>
+        </w:rPr>
+      </w:pPr>
+      <w:r>
+        <w:rPr>
+          <w:highlight w:val="green"/>
+          <w:lang w:val="it-IT"/>
+        </w:rPr>
+        <w:t>9. Importare `Base` da `</w:t>
+      </w:r>
+      <w:proofErr w:type="spellStart"/>
+      <w:proofErr w:type="gramStart"/>
+      <w:r>
+        <w:rPr>
+          <w:highlight w:val="green"/>
+          <w:lang w:val="it-IT"/>
+        </w:rPr>
+        <w:t>shared.infra</w:t>
+      </w:r>
+      <w:proofErr w:type="gramEnd"/>
+      <w:r>
+        <w:rPr>
+          <w:highlight w:val="green"/>
+          <w:lang w:val="it-IT"/>
+        </w:rPr>
+        <w:t>.database</w:t>
+      </w:r>
+      <w:proofErr w:type="spellEnd"/>
+      <w:r>
+        <w:rPr>
+          <w:highlight w:val="green"/>
+          <w:lang w:val="it-IT"/>
+        </w:rPr>
+        <w:t>`</w:t>
+      </w:r>
+    </w:p>
+    <w:p>
+      <w:pPr>
+        <w:rPr>
+          <w:highlight w:val="green"/>
+        </w:rPr>
+      </w:pPr>
+      <w:r>
+        <w:rPr>
+          <w:highlight w:val="green"/>
+        </w:rPr>
+        <w:t>10. Definire classe `Ticker(Base)`:</w:t>
+      </w:r>
+    </w:p>
+    <w:p>
+      <w:pPr>
+        <w:rPr>
+          <w:highlight w:val="green"/>
+        </w:rPr>
+      </w:pPr>
+      <w:r>
+        <w:rPr>
+          <w:highlight w:val="green"/>
+        </w:rPr>
+        <w:t xml:space="preserve">    </w:t>
+      </w:r>
+      <w:r>
+        <w:rPr>
+          <w:highlight w:val="green"/>
+        </w:rPr>
+        <w:t>- `__</w:t>
+      </w:r>
+      <w:proofErr w:type="spellStart"/>
+      <w:r>
+        <w:rPr>
+          <w:highlight w:val="green"/>
+        </w:rPr>
+        <w:t>tablename</w:t>
+      </w:r>
+      <w:proofErr w:type="spellEnd"/>
+      <w:r>
+        <w:rPr>
+          <w:highlight w:val="green"/>
+        </w:rPr>
+        <w:t>__ = "tickers"`</w:t>
+      </w:r>
+    </w:p>
+    <w:p>
+      <w:pPr>
+        <w:rPr>
+          <w:highlight w:val="green"/>
+        </w:rPr>
+      </w:pPr>
+      <w:r>
+        <w:rPr>
+          <w:highlight w:val="green"/>
+        </w:rPr>
+        <w:t xml:space="preserve">    - `id`: UUID primary key con `default=</w:t>
+      </w:r>
+      <w:proofErr w:type="gramStart"/>
+      <w:r>
+        <w:rPr>
+          <w:highlight w:val="green"/>
+        </w:rPr>
+        <w:t>uuid.uuid</w:t>
+      </w:r>
+      <w:proofErr w:type="gramEnd"/>
+      <w:r>
+        <w:rPr>
+          <w:highlight w:val="green"/>
+        </w:rPr>
+        <w:t>4`</w:t>
+      </w:r>
+    </w:p>
+    <w:p>
+      <w:pPr>
+        <w:rPr>
+          <w:highlight w:val="green"/>
+        </w:rPr>
+      </w:pPr>
+      <w:r>
+        <w:rPr>
+          <w:highlight w:val="green"/>
+        </w:rPr>
+        <w:t xml:space="preserve">    - `symbol`: </w:t>
+      </w:r>
+      <w:proofErr w:type="gramStart"/>
+      <w:r>
+        <w:rPr>
+          <w:highlight w:val="green"/>
+        </w:rPr>
+        <w:t>String(</w:t>
+      </w:r>
+      <w:proofErr w:type="gramEnd"/>
+      <w:r>
+        <w:rPr>
+          <w:highlight w:val="green"/>
+        </w:rPr>
+        <w:t>10), unique, not null, index</w:t>
+      </w:r>
+    </w:p>
+    <w:p>
+      <w:pPr>
+        <w:rPr>
+          <w:highlight w:val="green"/>
+        </w:rPr>
+      </w:pPr>
+      <w:r>
+        <w:rPr>
+          <w:highlight w:val="green"/>
+        </w:rPr>
+        <w:t xml:space="preserve">    - `name`: </w:t>
+      </w:r>
+      <w:proofErr w:type="gramStart"/>
+      <w:r>
+        <w:rPr>
+          <w:highlight w:val="green"/>
+        </w:rPr>
+        <w:t>String(</w:t>
+      </w:r>
+      <w:proofErr w:type="gramEnd"/>
+      <w:r>
+        <w:rPr>
+          <w:highlight w:val="green"/>
+        </w:rPr>
+        <w:t>255), not null</w:t>
+      </w:r>
+    </w:p>
+    <w:p>
+      <w:pPr>
+        <w:rPr>
+          <w:highlight w:val="green"/>
+        </w:rPr>
+      </w:pPr>
+      <w:r>
+        <w:rPr>
+          <w:highlight w:val="green"/>
+        </w:rPr>
+        <w:t xml:space="preserve">    - `exchange`: </w:t>
+      </w:r>
+      <w:proofErr w:type="gramStart"/>
+      <w:r>
+        <w:rPr>
+          <w:highlight w:val="green"/>
+        </w:rPr>
+        <w:t>String(</w:t>
+      </w:r>
+      <w:proofErr w:type="gramEnd"/>
+      <w:r>
+        <w:rPr>
+          <w:highlight w:val="green"/>
+        </w:rPr>
+        <w:t>50)</w:t>
+      </w:r>
+    </w:p>
+    <w:p>
+      <w:pPr>
+        <w:rPr>
+          <w:highlight w:val="green"/>
+        </w:rPr>
+      </w:pPr>
+      <w:r>
+        <w:rPr>
+          <w:highlight w:val="green"/>
+        </w:rPr>
+        <w:t xml:space="preserve">    - `currency`: </w:t>
+      </w:r>
+      <w:proofErr w:type="gramStart"/>
+      <w:r>
+        <w:rPr>
+          <w:highlight w:val="green"/>
+        </w:rPr>
+        <w:t>String(</w:t>
+      </w:r>
+      <w:proofErr w:type="gramEnd"/>
+      <w:r>
+        <w:rPr>
+          <w:highlight w:val="green"/>
+        </w:rPr>
+        <w:t>3), default='USD'</w:t>
+      </w:r>
+    </w:p>
+    <w:p>
+      <w:pPr>
+        <w:rPr>
+          <w:highlight w:val="green"/>
+        </w:rPr>
+      </w:pPr>
+      <w:r>
+        <w:rPr>
+          <w:highlight w:val="green"/>
+        </w:rPr>
+        <w:t xml:space="preserve">    - `</w:t>
+      </w:r>
+      <w:proofErr w:type="spellStart"/>
+      <w:r>
+        <w:rPr>
+          <w:highlight w:val="green"/>
+        </w:rPr>
+        <w:t>asset_type</w:t>
+      </w:r>
+      <w:proofErr w:type="spellEnd"/>
+      <w:r>
+        <w:rPr>
+          <w:highlight w:val="green"/>
+        </w:rPr>
+        <w:t xml:space="preserve">`: </w:t>
+      </w:r>
+      <w:proofErr w:type="gramStart"/>
+      <w:r>
+        <w:rPr>
+          <w:highlight w:val="green"/>
+        </w:rPr>
+        <w:t>String(</w:t>
+      </w:r>
+      <w:proofErr w:type="gramEnd"/>
+      <w:r>
+        <w:rPr>
+          <w:highlight w:val="green"/>
+        </w:rPr>
+        <w:t>20), check constraint ('stock','</w:t>
+      </w:r>
+      <w:proofErr w:type="spellStart"/>
+      <w:r>
+        <w:rPr>
+          <w:highlight w:val="green"/>
+        </w:rPr>
+        <w:t>etf</w:t>
+      </w:r>
+      <w:proofErr w:type="spellEnd"/>
+      <w:r>
+        <w:rPr>
+          <w:highlight w:val="green"/>
+        </w:rPr>
+        <w:t>','crypto')</w:t>
+      </w:r>
+    </w:p>
+    <w:p>
+      <w:pPr>
+        <w:rPr>
+          <w:highlight w:val="green"/>
+        </w:rPr>
+      </w:pPr>
+      <w:r>
+        <w:rPr>
+          <w:highlight w:val="green"/>
+        </w:rPr>
+        <w:t xml:space="preserve">11. </w:t>
+      </w:r>
+      <w:proofErr w:type="spellStart"/>
+      <w:r>
+        <w:rPr>
+          <w:highlight w:val="green"/>
+        </w:rPr>
+        <w:t>Aggiungere</w:t>
+      </w:r>
+      <w:proofErr w:type="spellEnd"/>
+      <w:r>
+        <w:rPr>
+          <w:highlight w:val="green"/>
+        </w:rPr>
+        <w:t xml:space="preserve"> </w:t>
+      </w:r>
+      <w:proofErr w:type="spellStart"/>
+      <w:r>
+        <w:rPr>
+          <w:highlight w:val="green"/>
+        </w:rPr>
+        <w:t>colonne</w:t>
+      </w:r>
+      <w:proofErr w:type="spellEnd"/>
+      <w:r>
+        <w:rPr>
+          <w:highlight w:val="green"/>
+        </w:rPr>
+        <w:t xml:space="preserve"> audit:</w:t>
+      </w:r>
+    </w:p>
+    <w:p>
+      <w:pPr>
+        <w:rPr>
+          <w:highlight w:val="green"/>
+        </w:rPr>
+      </w:pPr>
+      <w:r>
+        <w:rPr>
+          <w:highlight w:val="green"/>
+        </w:rPr>
+        <w:t xml:space="preserve">    - `</w:t>
+      </w:r>
+      <w:proofErr w:type="spellStart"/>
+      <w:r>
+        <w:rPr>
+          <w:highlight w:val="green"/>
+        </w:rPr>
+        <w:t>created_at</w:t>
+      </w:r>
+      <w:proofErr w:type="spellEnd"/>
+      <w:r>
+        <w:rPr>
+          <w:highlight w:val="green"/>
+        </w:rPr>
+        <w:t xml:space="preserve">`: </w:t>
+      </w:r>
+      <w:proofErr w:type="spellStart"/>
+      <w:r>
+        <w:rPr>
+          <w:highlight w:val="green"/>
+        </w:rPr>
+        <w:t>DateTime</w:t>
+      </w:r>
+      <w:proofErr w:type="spellEnd"/>
+      <w:r>
+        <w:rPr>
+          <w:highlight w:val="green"/>
+        </w:rPr>
+        <w:t>, `default=</w:t>
+      </w:r>
+      <w:proofErr w:type="spellStart"/>
+      <w:proofErr w:type="gramStart"/>
+      <w:r>
+        <w:rPr>
+          <w:highlight w:val="green"/>
+        </w:rPr>
+        <w:t>func.now</w:t>
+      </w:r>
+      <w:proofErr w:type="spellEnd"/>
+      <w:r>
+        <w:rPr>
+          <w:highlight w:val="green"/>
+        </w:rPr>
+        <w:t>(</w:t>
+      </w:r>
+      <w:proofErr w:type="gramEnd"/>
+      <w:r>
+        <w:rPr>
+          <w:highlight w:val="green"/>
+        </w:rPr>
+        <w:t>)`</w:t>
+      </w:r>
+    </w:p>
+    <w:p>
+      <w:pPr>
+        <w:rPr>
+          <w:highlight w:val="green"/>
+        </w:rPr>
+      </w:pPr>
+      <w:r>
+        <w:rPr>
+          <w:highlight w:val="green"/>
+        </w:rPr>
+        <w:t xml:space="preserve">    - `</w:t>
+      </w:r>
+      <w:proofErr w:type="spellStart"/>
+      <w:r>
+        <w:rPr>
+          <w:highlight w:val="green"/>
+        </w:rPr>
+        <w:t>updated_at</w:t>
+      </w:r>
+      <w:proofErr w:type="spellEnd"/>
+      <w:r>
+        <w:rPr>
+          <w:highlight w:val="green"/>
+        </w:rPr>
+        <w:t xml:space="preserve">`: </w:t>
+      </w:r>
+      <w:proofErr w:type="spellStart"/>
+      <w:r>
+        <w:rPr>
+          <w:highlight w:val="green"/>
+        </w:rPr>
+        <w:t>DateTime</w:t>
+      </w:r>
+      <w:proofErr w:type="spellEnd"/>
+      <w:r>
+        <w:rPr>
+          <w:highlight w:val="green"/>
+        </w:rPr>
+        <w:t>, `default=</w:t>
+      </w:r>
+      <w:proofErr w:type="spellStart"/>
+      <w:proofErr w:type="gramStart"/>
+      <w:r>
+        <w:rPr>
+          <w:highlight w:val="green"/>
+        </w:rPr>
+        <w:t>func.now</w:t>
+      </w:r>
+      <w:proofErr w:type="spellEnd"/>
+      <w:r>
+        <w:rPr>
+          <w:highlight w:val="green"/>
+        </w:rPr>
+        <w:t>(</w:t>
+      </w:r>
+      <w:proofErr w:type="gramEnd"/>
+      <w:r>
+        <w:rPr>
+          <w:highlight w:val="green"/>
+        </w:rPr>
+        <w:t>)`, `</w:t>
+      </w:r>
+      <w:proofErr w:type="spellStart"/>
+      <w:r>
+        <w:rPr>
+          <w:highlight w:val="green"/>
+        </w:rPr>
+        <w:t>onupdate</w:t>
+      </w:r>
+      <w:proofErr w:type="spellEnd"/>
+      <w:r>
+        <w:rPr>
+          <w:highlight w:val="green"/>
+        </w:rPr>
+        <w:t>=</w:t>
+      </w:r>
+      <w:proofErr w:type="spellStart"/>
+      <w:proofErr w:type="gramStart"/>
+      <w:r>
+        <w:rPr>
+          <w:highlight w:val="green"/>
+        </w:rPr>
+        <w:t>func.now</w:t>
+      </w:r>
+      <w:proofErr w:type="spellEnd"/>
+      <w:r>
+        <w:rPr>
+          <w:highlight w:val="green"/>
+        </w:rPr>
+        <w:t>(</w:t>
+      </w:r>
+      <w:proofErr w:type="gramEnd"/>
+      <w:r>
+        <w:rPr>
+          <w:highlight w:val="green"/>
+        </w:rPr>
+        <w:t>)`</w:t>
+      </w:r>
+    </w:p>
+    <w:p>
+      <w:pPr>
+        <w:rPr>
+          <w:highlight w:val="green"/>
+        </w:rPr>
+      </w:pPr>
+      <w:r>
+        <w:rPr>
+          <w:highlight w:val="green"/>
+        </w:rPr>
+        <w:t xml:space="preserve">12. </w:t>
+      </w:r>
+      <w:proofErr w:type="spellStart"/>
+      <w:r>
+        <w:rPr>
+          <w:highlight w:val="green"/>
+        </w:rPr>
+        <w:t>Definire</w:t>
+      </w:r>
+      <w:proofErr w:type="spellEnd"/>
+      <w:r>
+        <w:rPr>
+          <w:highlight w:val="green"/>
+        </w:rPr>
+        <w:t xml:space="preserve"> `__</w:t>
+      </w:r>
+      <w:proofErr w:type="spellStart"/>
+      <w:r>
+        <w:rPr>
+          <w:highlight w:val="green"/>
+        </w:rPr>
+        <w:t>repr</w:t>
+      </w:r>
+      <w:proofErr w:type="spellEnd"/>
+      <w:r>
+        <w:rPr>
+          <w:highlight w:val="green"/>
+        </w:rPr>
+        <w:t>__` per debug</w:t>
+      </w:r>
+    </w:p>
+    <w:p>
+      <w:pPr>
+        <w:rPr>
+          <w:highlight w:val="green"/>
+        </w:rPr>
+      </w:pPr>
+      <w:r>
+        <w:rPr>
+          <w:highlight w:val="green"/>
+        </w:rPr>
+        <w:t xml:space="preserve">13. </w:t>
+      </w:r>
+      <w:proofErr w:type="spellStart"/>
+      <w:r>
+        <w:rPr>
+          <w:highlight w:val="green"/>
+        </w:rPr>
+        <w:t>Aggiungere</w:t>
+      </w:r>
+      <w:proofErr w:type="spellEnd"/>
+      <w:r>
+        <w:rPr>
+          <w:highlight w:val="green"/>
         </w:rPr>
         <w:t xml:space="preserve"> `</w:t>
       </w:r>
-      <w:proofErr w:type="spellStart"/>
-      <w:r>
-        <w:rPr>
-          <w:highlight w:val="green"/>
-          <w:lang w:val="it-IT"/>
-        </w:rPr>
-        <w:t>get_</w:t>
-      </w:r>
-      <w:proofErr w:type="gramStart"/>
-      <w:r>
-        <w:rPr>
-          <w:highlight w:val="green"/>
-          <w:lang w:val="it-IT"/>
-        </w:rPr>
-        <w:t>db</w:t>
-      </w:r>
-      <w:proofErr w:type="spellEnd"/>
-      <w:r>
-        <w:rPr>
-          <w:highlight w:val="green"/>
-          <w:lang w:val="it-IT"/>
-        </w:rPr>
-        <w:t>(</w:t>
-      </w:r>
-      <w:proofErr w:type="gramEnd"/>
-      <w:r>
-        <w:rPr>
-          <w:highlight w:val="green"/>
-          <w:lang w:val="it-IT"/>
-        </w:rPr>
-        <w:t xml:space="preserve">)` per </w:t>
-      </w:r>
-      <w:proofErr w:type="spellStart"/>
-      <w:r>
-        <w:rPr>
-          <w:highlight w:val="green"/>
-          <w:lang w:val="it-IT"/>
-        </w:rPr>
-        <w:t>FastAPI</w:t>
-      </w:r>
-      <w:proofErr w:type="spellEnd"/>
-      <w:r>
-        <w:rPr>
-          <w:highlight w:val="green"/>
-          <w:lang w:val="it-IT"/>
-        </w:rPr>
-        <w:t xml:space="preserve"> injection</w:t>
-      </w:r>
-    </w:p>
-    <w:p>
-      <w:pPr>
-        <w:rPr>
-          <w:highlight w:val="green"/>
-          <w:lang w:val="it-IT"/>
-        </w:rPr>
-      </w:pPr>
-      <w:r>
-        <w:rPr>
-          <w:highlight w:val="green"/>
-          <w:lang w:val="it-IT"/>
-        </w:rPr>
-        <w:t>7. Esportare `Base`, `</w:t>
-      </w:r>
-      <w:proofErr w:type="spellStart"/>
-      <w:r>
-        <w:rPr>
-          <w:highlight w:val="green"/>
-          <w:lang w:val="it-IT"/>
-        </w:rPr>
-        <w:t>engine</w:t>
-      </w:r>
-      <w:proofErr w:type="spellEnd"/>
-      <w:r>
-        <w:rPr>
-          <w:highlight w:val="green"/>
-          <w:lang w:val="it-IT"/>
-        </w:rPr>
-        <w:t>`, `</w:t>
-      </w:r>
-      <w:proofErr w:type="spellStart"/>
-      <w:r>
-        <w:rPr>
-          <w:highlight w:val="green"/>
-          <w:lang w:val="it-IT"/>
-        </w:rPr>
-        <w:t>AsyncSessionLocal</w:t>
-      </w:r>
-      <w:proofErr w:type="spellEnd"/>
-      <w:r>
-        <w:rPr>
-          <w:highlight w:val="green"/>
-          <w:lang w:val="it-IT"/>
-        </w:rPr>
-        <w:t>`, `</w:t>
-      </w:r>
-      <w:proofErr w:type="spellStart"/>
-      <w:r>
-        <w:rPr>
-          <w:highlight w:val="green"/>
-          <w:lang w:val="it-IT"/>
-        </w:rPr>
-        <w:t>get_db</w:t>
-      </w:r>
-      <w:proofErr w:type="spellEnd"/>
-      <w:r>
-        <w:rPr>
-          <w:highlight w:val="green"/>
-          <w:lang w:val="it-IT"/>
-        </w:rPr>
-        <w:t>` da `__init__.py`</w:t>
-      </w:r>
-    </w:p>
-    <w:p>
-      <w:pPr>
-        <w:rPr>
-          <w:highlight w:val="green"/>
-          <w:lang w:val="it-IT"/>
-        </w:rPr>
-      </w:pPr>
-    </w:p>
-    <w:p>
-      <w:pPr>
-        <w:rPr>
-          <w:highlight w:val="green"/>
-          <w:lang w:val="it-IT"/>
-        </w:rPr>
-      </w:pPr>
-      <w:r>
-        <w:rPr>
-          <w:highlight w:val="green"/>
-          <w:lang w:val="it-IT"/>
-        </w:rPr>
-        <w:t>### PARTE 2: Modello Ticker</w:t>
-      </w:r>
-    </w:p>
-    <w:p>
-      <w:pPr>
-        <w:rPr>
-          <w:highlight w:val="green"/>
-          <w:lang w:val="it-IT"/>
-        </w:rPr>
-      </w:pPr>
-      <w:r>
-        <w:rPr>
-          <w:highlight w:val="green"/>
-          <w:lang w:val="it-IT"/>
-        </w:rPr>
-        <w:t>8. Creare file `</w:t>
-      </w:r>
-      <w:proofErr w:type="spellStart"/>
-      <w:r>
-        <w:rPr>
-          <w:highlight w:val="green"/>
-          <w:lang w:val="it-IT"/>
-        </w:rPr>
-        <w:t>backend</w:t>
-      </w:r>
-      <w:proofErr w:type="spellEnd"/>
-      <w:r>
-        <w:rPr>
-          <w:highlight w:val="green"/>
-          <w:lang w:val="it-IT"/>
-        </w:rPr>
-        <w:t>/</w:t>
-      </w:r>
-      <w:proofErr w:type="spellStart"/>
-      <w:r>
-        <w:rPr>
-          <w:highlight w:val="green"/>
-          <w:lang w:val="it-IT"/>
-        </w:rPr>
-        <w:t>src</w:t>
-      </w:r>
-      <w:proofErr w:type="spellEnd"/>
-      <w:r>
-        <w:rPr>
-          <w:highlight w:val="green"/>
-          <w:lang w:val="it-IT"/>
-        </w:rPr>
-        <w:t>/</w:t>
-      </w:r>
-      <w:proofErr w:type="spellStart"/>
-      <w:r>
-        <w:rPr>
-          <w:highlight w:val="green"/>
-          <w:lang w:val="it-IT"/>
-        </w:rPr>
-        <w:t>market_data</w:t>
-      </w:r>
-      <w:proofErr w:type="spellEnd"/>
-      <w:r>
-        <w:rPr>
-          <w:highlight w:val="green"/>
-          <w:lang w:val="it-IT"/>
-        </w:rPr>
-        <w:t>/domain/entities.py`</w:t>
-      </w:r>
-    </w:p>
-    <w:p>
-      <w:pPr>
-        <w:rPr>
-          <w:highlight w:val="green"/>
-          <w:lang w:val="it-IT"/>
-        </w:rPr>
-      </w:pPr>
-      <w:r>
-        <w:rPr>
-          <w:highlight w:val="green"/>
-          <w:lang w:val="it-IT"/>
-        </w:rPr>
-        <w:t>9. Importare `Base` da `</w:t>
-      </w:r>
-      <w:proofErr w:type="spellStart"/>
-      <w:proofErr w:type="gramStart"/>
-      <w:r>
-        <w:rPr>
-          <w:highlight w:val="green"/>
-          <w:lang w:val="it-IT"/>
-        </w:rPr>
-        <w:t>shared.infra</w:t>
-      </w:r>
-      <w:proofErr w:type="gramEnd"/>
-      <w:r>
-        <w:rPr>
-          <w:highlight w:val="green"/>
-          <w:lang w:val="it-IT"/>
-        </w:rPr>
-        <w:t>.database</w:t>
-      </w:r>
-      <w:proofErr w:type="spellEnd"/>
-      <w:r>
-        <w:rPr>
-          <w:highlight w:val="green"/>
-          <w:lang w:val="it-IT"/>
-        </w:rPr>
-        <w:t>`</w:t>
-      </w:r>
-    </w:p>
-    <w:p>
-      <w:pPr>
-        <w:rPr>
-          <w:highlight w:val="green"/>
-          <w:lang w:val="it-IT"/>
-        </w:rPr>
-      </w:pPr>
-      <w:r>
-        <w:rPr>
-          <w:highlight w:val="green"/>
-          <w:lang w:val="it-IT"/>
-        </w:rPr>
-        <w:t>10. Definire classe `</w:t>
-      </w:r>
-      <w:proofErr w:type="gramStart"/>
-      <w:r>
-        <w:rPr>
-          <w:highlight w:val="green"/>
-          <w:lang w:val="it-IT"/>
-        </w:rPr>
-        <w:t>Ticker(</w:t>
-      </w:r>
-      <w:proofErr w:type="gramEnd"/>
-      <w:r>
-        <w:rPr>
-          <w:highlight w:val="green"/>
-          <w:lang w:val="it-IT"/>
-        </w:rPr>
-        <w:t>Base)`:</w:t>
-      </w:r>
-    </w:p>
-    <w:p>
-      <w:pPr>
-        <w:rPr>
-          <w:highlight w:val="green"/>
-        </w:rPr>
-      </w:pPr>
-      <w:r>
-        <w:rPr>
-          <w:highlight w:val="green"/>
-          <w:lang w:val="it-IT"/>
-        </w:rPr>
-        <w:t xml:space="preserve">    </w:t>
-      </w:r>
-      <w:r>
-        <w:rPr>
-          <w:highlight w:val="green"/>
-        </w:rPr>
-        <w:t>- `__</w:t>
-      </w:r>
-      <w:proofErr w:type="spellStart"/>
-      <w:r>
-        <w:rPr>
-          <w:highlight w:val="green"/>
-        </w:rPr>
-        <w:t>tablename</w:t>
-      </w:r>
-      <w:proofErr w:type="spellEnd"/>
-      <w:r>
-        <w:rPr>
-          <w:highlight w:val="green"/>
-        </w:rPr>
-        <w:t>__ = "tickers"`</w:t>
-      </w:r>
-    </w:p>
-    <w:p>
-      <w:pPr>
-        <w:rPr>
-          <w:highlight w:val="green"/>
-        </w:rPr>
-      </w:pPr>
-      <w:r>
-        <w:rPr>
-          <w:highlight w:val="green"/>
-        </w:rPr>
-        <w:t xml:space="preserve">    - `id`: UUID primary key con `default=</w:t>
-      </w:r>
-      <w:proofErr w:type="gramStart"/>
-      <w:r>
-        <w:rPr>
-          <w:highlight w:val="green"/>
-        </w:rPr>
-        <w:t>uuid.uuid</w:t>
-      </w:r>
-      <w:proofErr w:type="gramEnd"/>
-      <w:r>
-        <w:rPr>
-          <w:highlight w:val="green"/>
-        </w:rPr>
-        <w:t>4`</w:t>
-      </w:r>
-    </w:p>
-    <w:p>
-      <w:pPr>
-        <w:rPr>
-          <w:highlight w:val="green"/>
-        </w:rPr>
-      </w:pPr>
-      <w:r>
-        <w:rPr>
-          <w:highlight w:val="green"/>
-        </w:rPr>
-        <w:t xml:space="preserve">    - `symbol`: </w:t>
-      </w:r>
-      <w:proofErr w:type="gramStart"/>
-      <w:r>
-        <w:rPr>
-          <w:highlight w:val="green"/>
-        </w:rPr>
-        <w:t>String(</w:t>
-      </w:r>
-      <w:proofErr w:type="gramEnd"/>
-      <w:r>
-        <w:rPr>
-          <w:highlight w:val="green"/>
-        </w:rPr>
-        <w:t>10), unique, not null, index</w:t>
-      </w:r>
-    </w:p>
-    <w:p>
-      <w:pPr>
-        <w:rPr>
-          <w:highlight w:val="green"/>
-        </w:rPr>
-      </w:pPr>
-      <w:r>
-        <w:rPr>
-          <w:highlight w:val="green"/>
-        </w:rPr>
-        <w:t xml:space="preserve">    - `name`: </w:t>
-      </w:r>
-      <w:proofErr w:type="gramStart"/>
-      <w:r>
-        <w:rPr>
-          <w:highlight w:val="green"/>
-        </w:rPr>
-        <w:t>String(</w:t>
-      </w:r>
-      <w:proofErr w:type="gramEnd"/>
-      <w:r>
-        <w:rPr>
-          <w:highlight w:val="green"/>
-        </w:rPr>
-        <w:t>255), not null</w:t>
-      </w:r>
-    </w:p>
-    <w:p>
-      <w:pPr>
-        <w:rPr>
-          <w:highlight w:val="green"/>
-        </w:rPr>
-      </w:pPr>
-      <w:r>
-        <w:rPr>
-          <w:highlight w:val="green"/>
-        </w:rPr>
-        <w:t xml:space="preserve">    - `exchange`: </w:t>
-      </w:r>
-      <w:proofErr w:type="gramStart"/>
-      <w:r>
-        <w:rPr>
-          <w:highlight w:val="green"/>
-        </w:rPr>
-        <w:t>String(</w:t>
-      </w:r>
-      <w:proofErr w:type="gramEnd"/>
-      <w:r>
-        <w:rPr>
-          <w:highlight w:val="green"/>
-        </w:rPr>
-        <w:t>50)</w:t>
-      </w:r>
-    </w:p>
-    <w:p>
-      <w:pPr>
-        <w:rPr>
-          <w:highlight w:val="green"/>
-        </w:rPr>
-      </w:pPr>
-      <w:r>
-        <w:rPr>
-          <w:highlight w:val="green"/>
-        </w:rPr>
-        <w:t xml:space="preserve">    - `currency`: </w:t>
-      </w:r>
-      <w:proofErr w:type="gramStart"/>
-      <w:r>
-        <w:rPr>
-          <w:highlight w:val="green"/>
-        </w:rPr>
-        <w:t>String(</w:t>
-      </w:r>
-      <w:proofErr w:type="gramEnd"/>
-      <w:r>
-        <w:rPr>
-          <w:highlight w:val="green"/>
-        </w:rPr>
-        <w:t>3), default='USD'</w:t>
-      </w:r>
-    </w:p>
-    <w:p>
-      <w:pPr>
-        <w:rPr>
-          <w:highlight w:val="green"/>
-        </w:rPr>
-      </w:pPr>
-      <w:r>
-        <w:rPr>
-          <w:highlight w:val="green"/>
-        </w:rPr>
-        <w:t xml:space="preserve">    - `</w:t>
-      </w:r>
-      <w:proofErr w:type="spellStart"/>
-      <w:r>
-        <w:rPr>
-          <w:highlight w:val="green"/>
-        </w:rPr>
-        <w:t>asset_type</w:t>
-      </w:r>
-      <w:proofErr w:type="spellEnd"/>
-      <w:r>
-        <w:rPr>
-          <w:highlight w:val="green"/>
-        </w:rPr>
-        <w:t xml:space="preserve">`: </w:t>
-      </w:r>
-      <w:proofErr w:type="gramStart"/>
-      <w:r>
-        <w:rPr>
-          <w:highlight w:val="green"/>
-        </w:rPr>
-        <w:t>String(</w:t>
-      </w:r>
-      <w:proofErr w:type="gramEnd"/>
-      <w:r>
-        <w:rPr>
-          <w:highlight w:val="green"/>
-        </w:rPr>
-        <w:t>20), check constraint ('stock','</w:t>
-      </w:r>
-      <w:proofErr w:type="spellStart"/>
-      <w:r>
-        <w:rPr>
-          <w:highlight w:val="green"/>
-        </w:rPr>
-        <w:t>etf</w:t>
-      </w:r>
-      <w:proofErr w:type="spellEnd"/>
-      <w:r>
-        <w:rPr>
-          <w:highlight w:val="green"/>
-        </w:rPr>
-        <w:t>','crypto')</w:t>
-      </w:r>
-    </w:p>
-    <w:p>
-      <w:pPr>
-        <w:rPr>
-          <w:highlight w:val="green"/>
-        </w:rPr>
-      </w:pPr>
-      <w:r>
-        <w:rPr>
-          <w:highlight w:val="green"/>
-        </w:rPr>
-        <w:t xml:space="preserve">11. </w:t>
-      </w:r>
-      <w:proofErr w:type="spellStart"/>
-      <w:r>
-        <w:rPr>
-          <w:highlight w:val="green"/>
-        </w:rPr>
-        <w:t>Aggiungere</w:t>
-      </w:r>
-      <w:proofErr w:type="spellEnd"/>
-      <w:r>
-        <w:rPr>
-          <w:highlight w:val="green"/>
-        </w:rPr>
-        <w:t xml:space="preserve"> </w:t>
-      </w:r>
-      <w:proofErr w:type="spellStart"/>
-      <w:r>
-        <w:rPr>
-          <w:highlight w:val="green"/>
-        </w:rPr>
-        <w:t>colonne</w:t>
-      </w:r>
-      <w:proofErr w:type="spellEnd"/>
-      <w:r>
-        <w:rPr>
-          <w:highlight w:val="green"/>
-        </w:rPr>
-        <w:t xml:space="preserve"> audit:</w:t>
-      </w:r>
-    </w:p>
-    <w:p>
-      <w:pPr>
-        <w:rPr>
-          <w:highlight w:val="green"/>
-        </w:rPr>
-      </w:pPr>
-      <w:r>
-        <w:rPr>
-          <w:highlight w:val="green"/>
-        </w:rPr>
-        <w:t xml:space="preserve">    - `</w:t>
-      </w:r>
-      <w:proofErr w:type="spellStart"/>
-      <w:r>
-        <w:rPr>
-          <w:highlight w:val="green"/>
-        </w:rPr>
-        <w:t>created_at</w:t>
-      </w:r>
-      <w:proofErr w:type="spellEnd"/>
-      <w:r>
-        <w:rPr>
-          <w:highlight w:val="green"/>
-        </w:rPr>
-        <w:t xml:space="preserve">`: </w:t>
-      </w:r>
-      <w:proofErr w:type="spellStart"/>
-      <w:r>
-        <w:rPr>
-          <w:highlight w:val="green"/>
-        </w:rPr>
-        <w:t>DateTime</w:t>
-      </w:r>
-      <w:proofErr w:type="spellEnd"/>
-      <w:r>
-        <w:rPr>
-          <w:highlight w:val="green"/>
-        </w:rPr>
-        <w:t>, `default=</w:t>
-      </w:r>
-      <w:proofErr w:type="spellStart"/>
-      <w:proofErr w:type="gramStart"/>
-      <w:r>
-        <w:rPr>
-          <w:highlight w:val="green"/>
-        </w:rPr>
-        <w:t>func.now</w:t>
-      </w:r>
-      <w:proofErr w:type="spellEnd"/>
-      <w:r>
-        <w:rPr>
-          <w:highlight w:val="green"/>
-        </w:rPr>
-        <w:t>(</w:t>
-      </w:r>
-      <w:proofErr w:type="gramEnd"/>
-      <w:r>
-        <w:rPr>
-          <w:highlight w:val="green"/>
-        </w:rPr>
-        <w:t>)`</w:t>
-      </w:r>
-    </w:p>
-    <w:p>
-      <w:pPr>
-        <w:rPr>
-          <w:highlight w:val="green"/>
-        </w:rPr>
-      </w:pPr>
-      <w:r>
-        <w:rPr>
-          <w:highlight w:val="green"/>
-        </w:rPr>
-        <w:t xml:space="preserve">    - `</w:t>
-      </w:r>
-      <w:proofErr w:type="spellStart"/>
-      <w:r>
-        <w:rPr>
-          <w:highlight w:val="green"/>
-        </w:rPr>
-        <w:t>updated_at</w:t>
-      </w:r>
-      <w:proofErr w:type="spellEnd"/>
-      <w:r>
-        <w:rPr>
-          <w:highlight w:val="green"/>
-        </w:rPr>
-        <w:t xml:space="preserve">`: </w:t>
-      </w:r>
-      <w:proofErr w:type="spellStart"/>
-      <w:r>
-        <w:rPr>
-          <w:highlight w:val="green"/>
-        </w:rPr>
-        <w:t>DateTime</w:t>
-      </w:r>
-      <w:proofErr w:type="spellEnd"/>
-      <w:r>
-        <w:rPr>
-          <w:highlight w:val="green"/>
-        </w:rPr>
-        <w:t>, `default=</w:t>
-      </w:r>
-      <w:proofErr w:type="spellStart"/>
-      <w:proofErr w:type="gramStart"/>
-      <w:r>
-        <w:rPr>
-          <w:highlight w:val="green"/>
-        </w:rPr>
-        <w:t>func.now</w:t>
-      </w:r>
-      <w:proofErr w:type="spellEnd"/>
-      <w:r>
-        <w:rPr>
-          <w:highlight w:val="green"/>
-        </w:rPr>
-        <w:t>(</w:t>
-      </w:r>
-      <w:proofErr w:type="gramEnd"/>
-      <w:r>
-        <w:rPr>
-          <w:highlight w:val="green"/>
-        </w:rPr>
-        <w:t>)`, `</w:t>
-      </w:r>
-      <w:proofErr w:type="spellStart"/>
-      <w:r>
-        <w:rPr>
-          <w:highlight w:val="green"/>
-        </w:rPr>
-        <w:t>onupdate</w:t>
-      </w:r>
-      <w:proofErr w:type="spellEnd"/>
-      <w:r>
-        <w:rPr>
-          <w:highlight w:val="green"/>
-        </w:rPr>
-        <w:t>=</w:t>
-      </w:r>
-      <w:proofErr w:type="spellStart"/>
-      <w:proofErr w:type="gramStart"/>
-      <w:r>
-        <w:rPr>
-          <w:highlight w:val="green"/>
-        </w:rPr>
-        <w:t>func.now</w:t>
-      </w:r>
-      <w:proofErr w:type="spellEnd"/>
-      <w:r>
-        <w:rPr>
-          <w:highlight w:val="green"/>
-        </w:rPr>
-        <w:t>(</w:t>
-      </w:r>
-      <w:proofErr w:type="gramEnd"/>
-      <w:r>
-        <w:rPr>
-          <w:highlight w:val="green"/>
-        </w:rPr>
-        <w:t>)`</w:t>
-      </w:r>
-    </w:p>
-    <w:p>
-      <w:pPr>
-        <w:rPr>
-          <w:highlight w:val="green"/>
-        </w:rPr>
-      </w:pPr>
-      <w:r>
-        <w:rPr>
-          <w:highlight w:val="green"/>
-        </w:rPr>
-        <w:t xml:space="preserve">12. </w:t>
-      </w:r>
-      <w:proofErr w:type="spellStart"/>
-      <w:r>
-        <w:rPr>
-          <w:highlight w:val="green"/>
-        </w:rPr>
-        <w:t>Definire</w:t>
-      </w:r>
-      <w:proofErr w:type="spellEnd"/>
-      <w:r>
-        <w:rPr>
-          <w:highlight w:val="green"/>
-        </w:rPr>
-        <w:t xml:space="preserve"> `__</w:t>
-      </w:r>
-      <w:proofErr w:type="spellStart"/>
-      <w:r>
-        <w:rPr>
-          <w:highlight w:val="green"/>
-        </w:rPr>
-        <w:t>repr</w:t>
-      </w:r>
-      <w:proofErr w:type="spellEnd"/>
-      <w:r>
-        <w:rPr>
-          <w:highlight w:val="green"/>
-        </w:rPr>
-        <w:t>__` per debug</w:t>
-      </w:r>
-    </w:p>
-    <w:p>
-      <w:pPr>
-        <w:rPr>
-          <w:highlight w:val="green"/>
-          <w:lang w:val="it-IT"/>
-        </w:rPr>
-      </w:pPr>
-      <w:r>
-        <w:rPr>
-          <w:highlight w:val="green"/>
-        </w:rPr>
-        <w:t xml:space="preserve">13. </w:t>
-      </w:r>
-      <w:proofErr w:type="spellStart"/>
-      <w:r>
-        <w:rPr>
-          <w:highlight w:val="green"/>
-        </w:rPr>
-        <w:t>Aggiungere</w:t>
-      </w:r>
-      <w:proofErr w:type="spellEnd"/>
-      <w:r>
-        <w:rPr>
-          <w:highlight w:val="green"/>
-        </w:rPr>
-        <w:t xml:space="preserve"> `</w:t>
-      </w:r>
       <w:proofErr w:type="gramStart"/>
       <w:r>
         <w:rPr>
@@ -17372,7 +17348,6 @@
       <w:pPr>
         <w:rPr>
           <w:highlight w:val="green"/>
-          <w:lang w:val="it-IT"/>
         </w:rPr>
       </w:pPr>
     </w:p>
@@ -17880,11 +17855,13 @@
     <w:p>
       <w:pPr>
         <w:rPr>
-          <w:lang w:val="it-IT"/>
-        </w:rPr>
-      </w:pPr>
-      <w:r>
-        <w:rPr>
+          <w:highlight w:val="green"/>
+          <w:lang w:val="it-IT"/>
+        </w:rPr>
+      </w:pPr>
+      <w:r>
+        <w:rPr>
+          <w:highlight w:val="green"/>
           <w:lang w:val="it-IT"/>
         </w:rPr>
         <w:t xml:space="preserve">## TASK 2.4: Definizione Modello </w:t>
@@ -17892,6 +17869,7 @@
       <w:proofErr w:type="spellStart"/>
       <w:r>
         <w:rPr>
+          <w:highlight w:val="green"/>
           <w:lang w:val="it-IT"/>
         </w:rPr>
         <w:t>SQLAlchemy</w:t>
@@ -17899,6 +17877,7 @@
       <w:proofErr w:type="spellEnd"/>
       <w:r>
         <w:rPr>
+          <w:highlight w:val="green"/>
           <w:lang w:val="it-IT"/>
         </w:rPr>
         <w:t xml:space="preserve"> - Estimate</w:t>
@@ -17907,18 +17886,21 @@
     <w:p>
       <w:pPr>
         <w:rPr>
-          <w:lang w:val="it-IT"/>
-        </w:rPr>
-      </w:pPr>
-    </w:p>
-    <w:p>
-      <w:pPr>
-        <w:rPr>
-          <w:lang w:val="it-IT"/>
-        </w:rPr>
-      </w:pPr>
-      <w:r>
-        <w:rPr>
+          <w:highlight w:val="green"/>
+          <w:lang w:val="it-IT"/>
+        </w:rPr>
+      </w:pPr>
+    </w:p>
+    <w:p>
+      <w:pPr>
+        <w:rPr>
+          <w:highlight w:val="green"/>
+          <w:lang w:val="it-IT"/>
+        </w:rPr>
+      </w:pPr>
+      <w:r>
+        <w:rPr>
+          <w:highlight w:val="green"/>
           <w:lang w:val="it-IT"/>
         </w:rPr>
         <w:t>**</w:t>
@@ -17926,6 +17908,7 @@
       <w:proofErr w:type="gramStart"/>
       <w:r>
         <w:rPr>
+          <w:highlight w:val="green"/>
           <w:lang w:val="it-IT"/>
         </w:rPr>
         <w:t>Descrizione:*</w:t>
@@ -17933,6 +17916,7 @@
       <w:proofErr w:type="gramEnd"/>
       <w:r>
         <w:rPr>
+          <w:highlight w:val="green"/>
           <w:lang w:val="it-IT"/>
         </w:rPr>
         <w:t xml:space="preserve">* Creare il modello </w:t>
@@ -17940,6 +17924,7 @@
       <w:proofErr w:type="spellStart"/>
       <w:r>
         <w:rPr>
+          <w:highlight w:val="green"/>
           <w:lang w:val="it-IT"/>
         </w:rPr>
         <w:t>SQLAlchemy</w:t>
@@ -17947,6 +17932,7 @@
       <w:proofErr w:type="spellEnd"/>
       <w:r>
         <w:rPr>
+          <w:highlight w:val="green"/>
           <w:lang w:val="it-IT"/>
         </w:rPr>
         <w:t xml:space="preserve"> per l'entità Estimate (stime/previsioni).</w:t>
@@ -17955,57 +17941,97 @@
     <w:p>
       <w:pPr>
         <w:rPr>
-          <w:lang w:val="it-IT"/>
-        </w:rPr>
-      </w:pPr>
-    </w:p>
-    <w:p>
-      <w:r>
+          <w:highlight w:val="green"/>
+          <w:lang w:val="it-IT"/>
+        </w:rPr>
+      </w:pPr>
+    </w:p>
+    <w:p>
+      <w:pPr>
+        <w:rPr>
+          <w:highlight w:val="green"/>
+        </w:rPr>
+      </w:pPr>
+      <w:r>
+        <w:rPr>
+          <w:highlight w:val="green"/>
+        </w:rPr>
         <w:t>**</w:t>
       </w:r>
       <w:proofErr w:type="spellStart"/>
       <w:proofErr w:type="gramStart"/>
       <w:r>
+        <w:rPr>
+          <w:highlight w:val="green"/>
+        </w:rPr>
         <w:t>Microstep</w:t>
       </w:r>
       <w:proofErr w:type="spellEnd"/>
       <w:r>
+        <w:rPr>
+          <w:highlight w:val="green"/>
+        </w:rPr>
         <w:t>:*</w:t>
       </w:r>
       <w:proofErr w:type="gramEnd"/>
       <w:r>
+        <w:rPr>
+          <w:highlight w:val="green"/>
+        </w:rPr>
         <w:t>*</w:t>
       </w:r>
     </w:p>
     <w:p>
-      <w:r>
+      <w:pPr>
+        <w:rPr>
+          <w:highlight w:val="green"/>
+        </w:rPr>
+      </w:pPr>
+      <w:r>
+        <w:rPr>
+          <w:highlight w:val="green"/>
+        </w:rPr>
         <w:t xml:space="preserve">1. </w:t>
       </w:r>
       <w:proofErr w:type="spellStart"/>
       <w:r>
+        <w:rPr>
+          <w:highlight w:val="green"/>
+        </w:rPr>
         <w:t>Creare</w:t>
       </w:r>
       <w:proofErr w:type="spellEnd"/>
       <w:r>
+        <w:rPr>
+          <w:highlight w:val="green"/>
+        </w:rPr>
         <w:t xml:space="preserve"> file `backend/</w:t>
       </w:r>
       <w:proofErr w:type="spellStart"/>
       <w:r>
+        <w:rPr>
+          <w:highlight w:val="green"/>
+        </w:rPr>
         <w:t>src</w:t>
       </w:r>
       <w:proofErr w:type="spellEnd"/>
       <w:r>
+        <w:rPr>
+          <w:highlight w:val="green"/>
+        </w:rPr>
         <w:t>/estimates/domain/entities.py`</w:t>
       </w:r>
     </w:p>
     <w:p>
       <w:pPr>
         <w:rPr>
-          <w:lang w:val="it-IT"/>
-        </w:rPr>
-      </w:pPr>
-      <w:r>
-        <w:rPr>
+          <w:highlight w:val="green"/>
+          <w:lang w:val="it-IT"/>
+        </w:rPr>
+      </w:pPr>
+      <w:r>
+        <w:rPr>
+          <w:highlight w:val="green"/>
           <w:lang w:val="it-IT"/>
         </w:rPr>
         <w:t>2. Definire classe `Estimate` che eredita da Base</w:t>
@@ -18014,11 +18040,13 @@
     <w:p>
       <w:pPr>
         <w:rPr>
-          <w:lang w:val="it-IT"/>
-        </w:rPr>
-      </w:pPr>
-      <w:r>
-        <w:rPr>
+          <w:highlight w:val="green"/>
+          <w:lang w:val="it-IT"/>
+        </w:rPr>
+      </w:pPr>
+      <w:r>
+        <w:rPr>
+          <w:highlight w:val="green"/>
           <w:lang w:val="it-IT"/>
         </w:rPr>
         <w:t>3. Definire colonne identificative: `id` (UUID, PK), `</w:t>
@@ -18026,6 +18054,7 @@
       <w:proofErr w:type="spellStart"/>
       <w:r>
         <w:rPr>
+          <w:highlight w:val="green"/>
           <w:lang w:val="it-IT"/>
         </w:rPr>
         <w:t>ticker_id</w:t>
@@ -18033,6 +18062,7 @@
       <w:proofErr w:type="spellEnd"/>
       <w:r>
         <w:rPr>
+          <w:highlight w:val="green"/>
           <w:lang w:val="it-IT"/>
         </w:rPr>
         <w:t>` (FK to Ticker), `</w:t>
@@ -18040,6 +18070,7 @@
       <w:proofErr w:type="spellStart"/>
       <w:r>
         <w:rPr>
+          <w:highlight w:val="green"/>
           <w:lang w:val="it-IT"/>
         </w:rPr>
         <w:t>user_id</w:t>
@@ -18047,6 +18078,7 @@
       <w:proofErr w:type="spellEnd"/>
       <w:r>
         <w:rPr>
+          <w:highlight w:val="green"/>
           <w:lang w:val="it-IT"/>
         </w:rPr>
         <w:t xml:space="preserve">` (FK to User, </w:t>
@@ -18054,6 +18086,7 @@
       <w:proofErr w:type="spellStart"/>
       <w:r>
         <w:rPr>
+          <w:highlight w:val="green"/>
           <w:lang w:val="it-IT"/>
         </w:rPr>
         <w:t>nullable</w:t>
@@ -18061,6 +18094,7 @@
       <w:proofErr w:type="spellEnd"/>
       <w:r>
         <w:rPr>
+          <w:highlight w:val="green"/>
           <w:lang w:val="it-IT"/>
         </w:rPr>
         <w:t xml:space="preserve"> per ora)</w:t>
@@ -18069,11 +18103,13 @@
     <w:p>
       <w:pPr>
         <w:rPr>
-          <w:lang w:val="it-IT"/>
-        </w:rPr>
-      </w:pPr>
-      <w:r>
-        <w:rPr>
+          <w:highlight w:val="green"/>
+          <w:lang w:val="it-IT"/>
+        </w:rPr>
+      </w:pPr>
+      <w:r>
+        <w:rPr>
+          <w:highlight w:val="green"/>
           <w:lang w:val="it-IT"/>
         </w:rPr>
         <w:t>4. Definire colonne prezzo: `</w:t>
@@ -18081,6 +18117,7 @@
       <w:proofErr w:type="spellStart"/>
       <w:r>
         <w:rPr>
+          <w:highlight w:val="green"/>
           <w:lang w:val="it-IT"/>
         </w:rPr>
         <w:t>start_price</w:t>
@@ -18088,6 +18125,7 @@
       <w:proofErr w:type="spellEnd"/>
       <w:r>
         <w:rPr>
+          <w:highlight w:val="green"/>
           <w:lang w:val="it-IT"/>
         </w:rPr>
         <w:t>` (DECIMAL 10,4), `</w:t>
@@ -18095,6 +18133,7 @@
       <w:proofErr w:type="spellStart"/>
       <w:r>
         <w:rPr>
+          <w:highlight w:val="green"/>
           <w:lang w:val="it-IT"/>
         </w:rPr>
         <w:t>target_price</w:t>
@@ -18102,6 +18141,7 @@
       <w:proofErr w:type="spellEnd"/>
       <w:r>
         <w:rPr>
+          <w:highlight w:val="green"/>
           <w:lang w:val="it-IT"/>
         </w:rPr>
         <w:t>` (DECIMAL 10,4), `</w:t>
@@ -18109,6 +18149,7 @@
       <w:proofErr w:type="spellStart"/>
       <w:r>
         <w:rPr>
+          <w:highlight w:val="green"/>
           <w:lang w:val="it-IT"/>
         </w:rPr>
         <w:t>stop_loss_price</w:t>
@@ -18116,85 +18157,146 @@
       <w:proofErr w:type="spellEnd"/>
       <w:r>
         <w:rPr>
+          <w:highlight w:val="green"/>
           <w:lang w:val="it-IT"/>
         </w:rPr>
         <w:t>` (DECIMAL 10,4)</w:t>
       </w:r>
     </w:p>
     <w:p>
-      <w:r>
+      <w:pPr>
+        <w:rPr>
+          <w:highlight w:val="green"/>
+        </w:rPr>
+      </w:pPr>
+      <w:r>
+        <w:rPr>
+          <w:highlight w:val="green"/>
+        </w:rPr>
         <w:t xml:space="preserve">5. </w:t>
       </w:r>
       <w:proofErr w:type="spellStart"/>
       <w:r>
+        <w:rPr>
+          <w:highlight w:val="green"/>
+        </w:rPr>
         <w:t>Definire</w:t>
       </w:r>
       <w:proofErr w:type="spellEnd"/>
       <w:r>
+        <w:rPr>
+          <w:highlight w:val="green"/>
+        </w:rPr>
         <w:t xml:space="preserve"> </w:t>
       </w:r>
       <w:proofErr w:type="spellStart"/>
       <w:r>
+        <w:rPr>
+          <w:highlight w:val="green"/>
+        </w:rPr>
         <w:t>colonne</w:t>
       </w:r>
       <w:proofErr w:type="spellEnd"/>
       <w:r>
+        <w:rPr>
+          <w:highlight w:val="green"/>
+        </w:rPr>
         <w:t xml:space="preserve"> target: `</w:t>
       </w:r>
       <w:proofErr w:type="spellStart"/>
       <w:r>
+        <w:rPr>
+          <w:highlight w:val="green"/>
+        </w:rPr>
         <w:t>target_profit_percent</w:t>
       </w:r>
       <w:proofErr w:type="spellEnd"/>
       <w:r>
+        <w:rPr>
+          <w:highlight w:val="green"/>
+        </w:rPr>
         <w:t>` (DECIMAL 8,4), `</w:t>
       </w:r>
       <w:proofErr w:type="spellStart"/>
       <w:r>
+        <w:rPr>
+          <w:highlight w:val="green"/>
+        </w:rPr>
         <w:t>stop_loss_percent</w:t>
       </w:r>
       <w:proofErr w:type="spellEnd"/>
       <w:r>
+        <w:rPr>
+          <w:highlight w:val="green"/>
+        </w:rPr>
         <w:t>` (DECIMAL 8,4)</w:t>
       </w:r>
     </w:p>
     <w:p>
-      <w:r>
+      <w:pPr>
+        <w:rPr>
+          <w:highlight w:val="green"/>
+        </w:rPr>
+      </w:pPr>
+      <w:r>
+        <w:rPr>
+          <w:highlight w:val="green"/>
+        </w:rPr>
         <w:t xml:space="preserve">6. </w:t>
       </w:r>
       <w:proofErr w:type="spellStart"/>
       <w:r>
+        <w:rPr>
+          <w:highlight w:val="green"/>
+        </w:rPr>
         <w:t>Definire</w:t>
       </w:r>
       <w:proofErr w:type="spellEnd"/>
       <w:r>
+        <w:rPr>
+          <w:highlight w:val="green"/>
+        </w:rPr>
         <w:t xml:space="preserve"> </w:t>
       </w:r>
       <w:proofErr w:type="spellStart"/>
       <w:r>
+        <w:rPr>
+          <w:highlight w:val="green"/>
+        </w:rPr>
         <w:t>colonne</w:t>
       </w:r>
       <w:proofErr w:type="spellEnd"/>
       <w:r>
+        <w:rPr>
+          <w:highlight w:val="green"/>
+        </w:rPr>
         <w:t xml:space="preserve"> </w:t>
       </w:r>
       <w:proofErr w:type="spellStart"/>
       <w:r>
+        <w:rPr>
+          <w:highlight w:val="green"/>
+        </w:rPr>
         <w:t>stato</w:t>
       </w:r>
       <w:proofErr w:type="spellEnd"/>
       <w:r>
+        <w:rPr>
+          <w:highlight w:val="green"/>
+        </w:rPr>
         <w:t>: `status` (Enum: OPEN, CLOSED_WIN, CLOSED_LOSS, CLOSED_MANUAL, EXPIRED), `direction` (Enum: LONG, SHORT)</w:t>
       </w:r>
     </w:p>
     <w:p>
       <w:pPr>
         <w:rPr>
-          <w:lang w:val="it-IT"/>
-        </w:rPr>
-      </w:pPr>
-      <w:r>
-        <w:rPr>
+          <w:highlight w:val="green"/>
+          <w:lang w:val="it-IT"/>
+        </w:rPr>
+      </w:pPr>
+      <w:r>
+        <w:rPr>
+          <w:highlight w:val="green"/>
           <w:lang w:val="it-IT"/>
         </w:rPr>
         <w:t>7. Definire colonne AI: `</w:t>
@@ -18202,6 +18304,7 @@
       <w:proofErr w:type="spellStart"/>
       <w:r>
         <w:rPr>
+          <w:highlight w:val="green"/>
           <w:lang w:val="it-IT"/>
         </w:rPr>
         <w:t>ai_model</w:t>
@@ -18209,6 +18312,7 @@
       <w:proofErr w:type="spellEnd"/>
       <w:r>
         <w:rPr>
+          <w:highlight w:val="green"/>
           <w:lang w:val="it-IT"/>
         </w:rPr>
         <w:t>` (String), `</w:t>
@@ -18216,6 +18320,7 @@
       <w:proofErr w:type="spellStart"/>
       <w:r>
         <w:rPr>
+          <w:highlight w:val="green"/>
           <w:lang w:val="it-IT"/>
         </w:rPr>
         <w:t>ai_confidence</w:t>
@@ -18223,6 +18328,7 @@
       <w:proofErr w:type="spellEnd"/>
       <w:r>
         <w:rPr>
+          <w:highlight w:val="green"/>
           <w:lang w:val="it-IT"/>
         </w:rPr>
         <w:t>` (DECIMAL 5,2), `</w:t>
@@ -18230,6 +18336,7 @@
       <w:proofErr w:type="spellStart"/>
       <w:r>
         <w:rPr>
+          <w:highlight w:val="green"/>
           <w:lang w:val="it-IT"/>
         </w:rPr>
         <w:t>ai_reasoning</w:t>
@@ -18237,64 +18344,105 @@
       <w:proofErr w:type="spellEnd"/>
       <w:r>
         <w:rPr>
+          <w:highlight w:val="green"/>
           <w:lang w:val="it-IT"/>
         </w:rPr>
         <w:t>` (Text)</w:t>
       </w:r>
     </w:p>
     <w:p>
-      <w:r>
+      <w:pPr>
+        <w:rPr>
+          <w:highlight w:val="green"/>
+        </w:rPr>
+      </w:pPr>
+      <w:r>
+        <w:rPr>
+          <w:highlight w:val="green"/>
+        </w:rPr>
         <w:t xml:space="preserve">8. </w:t>
       </w:r>
       <w:proofErr w:type="spellStart"/>
       <w:r>
+        <w:rPr>
+          <w:highlight w:val="green"/>
+        </w:rPr>
         <w:t>Definire</w:t>
       </w:r>
       <w:proofErr w:type="spellEnd"/>
       <w:r>
+        <w:rPr>
+          <w:highlight w:val="green"/>
+        </w:rPr>
         <w:t xml:space="preserve"> </w:t>
       </w:r>
       <w:proofErr w:type="spellStart"/>
       <w:r>
+        <w:rPr>
+          <w:highlight w:val="green"/>
+        </w:rPr>
         <w:t>colonne</w:t>
       </w:r>
       <w:proofErr w:type="spellEnd"/>
       <w:r>
+        <w:rPr>
+          <w:highlight w:val="green"/>
+        </w:rPr>
         <w:t xml:space="preserve"> date: `</w:t>
       </w:r>
       <w:proofErr w:type="spellStart"/>
       <w:r>
+        <w:rPr>
+          <w:highlight w:val="green"/>
+        </w:rPr>
         <w:t>created_at</w:t>
       </w:r>
       <w:proofErr w:type="spellEnd"/>
       <w:r>
+        <w:rPr>
+          <w:highlight w:val="green"/>
+        </w:rPr>
         <w:t>`, `</w:t>
       </w:r>
       <w:proofErr w:type="spellStart"/>
       <w:r>
+        <w:rPr>
+          <w:highlight w:val="green"/>
+        </w:rPr>
         <w:t>updated_at</w:t>
       </w:r>
       <w:proofErr w:type="spellEnd"/>
       <w:r>
+        <w:rPr>
+          <w:highlight w:val="green"/>
+        </w:rPr>
         <w:t>`, `</w:t>
       </w:r>
       <w:proofErr w:type="spellStart"/>
       <w:r>
+        <w:rPr>
+          <w:highlight w:val="green"/>
+        </w:rPr>
         <w:t>closed_at</w:t>
       </w:r>
       <w:proofErr w:type="spellEnd"/>
       <w:r>
+        <w:rPr>
+          <w:highlight w:val="green"/>
+        </w:rPr>
         <w:t>` (nullable)</w:t>
       </w:r>
     </w:p>
     <w:p>
       <w:pPr>
         <w:rPr>
-          <w:lang w:val="it-IT"/>
-        </w:rPr>
-      </w:pPr>
-      <w:r>
-        <w:rPr>
+          <w:highlight w:val="green"/>
+          <w:lang w:val="it-IT"/>
+        </w:rPr>
+      </w:pPr>
+      <w:r>
+        <w:rPr>
+          <w:highlight w:val="green"/>
           <w:lang w:val="it-IT"/>
         </w:rPr>
         <w:t>9. Definire colonne esito: `</w:t>
@@ -18302,6 +18450,7 @@
       <w:proofErr w:type="spellStart"/>
       <w:r>
         <w:rPr>
+          <w:highlight w:val="green"/>
           <w:lang w:val="it-IT"/>
         </w:rPr>
         <w:t>exit_price</w:t>
@@ -18309,6 +18458,7 @@
       <w:proofErr w:type="spellEnd"/>
       <w:r>
         <w:rPr>
+          <w:highlight w:val="green"/>
           <w:lang w:val="it-IT"/>
         </w:rPr>
         <w:t xml:space="preserve">` (DECIMAL 10,4, </w:t>
@@ -18316,6 +18466,7 @@
       <w:proofErr w:type="spellStart"/>
       <w:r>
         <w:rPr>
+          <w:highlight w:val="green"/>
           <w:lang w:val="it-IT"/>
         </w:rPr>
         <w:t>nullable</w:t>
@@ -18323,6 +18474,7 @@
       <w:proofErr w:type="spellEnd"/>
       <w:r>
         <w:rPr>
+          <w:highlight w:val="green"/>
           <w:lang w:val="it-IT"/>
         </w:rPr>
         <w:t>), `</w:t>
@@ -18330,6 +18482,7 @@
       <w:proofErr w:type="spellStart"/>
       <w:r>
         <w:rPr>
+          <w:highlight w:val="green"/>
           <w:lang w:val="it-IT"/>
         </w:rPr>
         <w:t>realized_pnl</w:t>
@@ -18337,6 +18490,7 @@
       <w:proofErr w:type="spellEnd"/>
       <w:r>
         <w:rPr>
+          <w:highlight w:val="green"/>
           <w:lang w:val="it-IT"/>
         </w:rPr>
         <w:t xml:space="preserve">` (DECIMAL 12,4, </w:t>
@@ -18344,6 +18498,7 @@
       <w:proofErr w:type="spellStart"/>
       <w:r>
         <w:rPr>
+          <w:highlight w:val="green"/>
           <w:lang w:val="it-IT"/>
         </w:rPr>
         <w:t>nullable</w:t>
@@ -18351,6 +18506,7 @@
       <w:proofErr w:type="spellEnd"/>
       <w:r>
         <w:rPr>
+          <w:highlight w:val="green"/>
           <w:lang w:val="it-IT"/>
         </w:rPr>
         <w:t>)</w:t>
@@ -18359,11 +18515,13 @@
     <w:p>
       <w:pPr>
         <w:rPr>
-          <w:lang w:val="it-IT"/>
-        </w:rPr>
-      </w:pPr>
-      <w:r>
-        <w:rPr>
+          <w:highlight w:val="green"/>
+          <w:lang w:val="it-IT"/>
+        </w:rPr>
+      </w:pPr>
+      <w:r>
+        <w:rPr>
+          <w:highlight w:val="green"/>
           <w:lang w:val="it-IT"/>
         </w:rPr>
         <w:lastRenderedPageBreak/>
@@ -18373,11 +18531,13 @@
     <w:p>
       <w:pPr>
         <w:rPr>
-          <w:lang w:val="it-IT"/>
-        </w:rPr>
-      </w:pPr>
-      <w:r>
-        <w:rPr>
+          <w:highlight w:val="green"/>
+          <w:lang w:val="it-IT"/>
+        </w:rPr>
+      </w:pPr>
+      <w:r>
+        <w:rPr>
+          <w:highlight w:val="green"/>
           <w:lang w:val="it-IT"/>
         </w:rPr>
         <w:t>11. Definire indici: su `</w:t>
@@ -18385,6 +18545,7 @@
       <w:proofErr w:type="spellStart"/>
       <w:r>
         <w:rPr>
+          <w:highlight w:val="green"/>
           <w:lang w:val="it-IT"/>
         </w:rPr>
         <w:t>ticker_id</w:t>
@@ -18392,6 +18553,7 @@
       <w:proofErr w:type="spellEnd"/>
       <w:r>
         <w:rPr>
+          <w:highlight w:val="green"/>
           <w:lang w:val="it-IT"/>
         </w:rPr>
         <w:t>`, su `status`, su `</w:t>
@@ -18399,6 +18561,7 @@
       <w:proofErr w:type="spellStart"/>
       <w:r>
         <w:rPr>
+          <w:highlight w:val="green"/>
           <w:lang w:val="it-IT"/>
         </w:rPr>
         <w:t>created_at</w:t>
@@ -18406,6 +18569,7 @@
       <w:proofErr w:type="spellEnd"/>
       <w:r>
         <w:rPr>
+          <w:highlight w:val="green"/>
           <w:lang w:val="it-IT"/>
         </w:rPr>
         <w:t>`, indice parziale su status='OPEN'</w:t>
@@ -18414,18 +18578,21 @@
     <w:p>
       <w:pPr>
         <w:rPr>
-          <w:lang w:val="it-IT"/>
-        </w:rPr>
-      </w:pPr>
-    </w:p>
-    <w:p>
-      <w:pPr>
-        <w:rPr>
-          <w:lang w:val="it-IT"/>
-        </w:rPr>
-      </w:pPr>
-      <w:r>
-        <w:rPr>
+          <w:highlight w:val="green"/>
+          <w:lang w:val="it-IT"/>
+        </w:rPr>
+      </w:pPr>
+    </w:p>
+    <w:p>
+      <w:pPr>
+        <w:rPr>
+          <w:highlight w:val="green"/>
+          <w:lang w:val="it-IT"/>
+        </w:rPr>
+      </w:pPr>
+      <w:r>
+        <w:rPr>
+          <w:highlight w:val="green"/>
           <w:lang w:val="it-IT"/>
         </w:rPr>
         <w:t>**</w:t>
@@ -18433,6 +18600,7 @@
       <w:proofErr w:type="spellStart"/>
       <w:r>
         <w:rPr>
+          <w:highlight w:val="green"/>
           <w:lang w:val="it-IT"/>
         </w:rPr>
         <w:t>Acceptance</w:t>
@@ -18440,6 +18608,7 @@
       <w:proofErr w:type="spellEnd"/>
       <w:r>
         <w:rPr>
+          <w:highlight w:val="green"/>
           <w:lang w:val="it-IT"/>
         </w:rPr>
         <w:t xml:space="preserve"> </w:t>
@@ -18448,6 +18617,7 @@
       <w:proofErr w:type="gramStart"/>
       <w:r>
         <w:rPr>
+          <w:highlight w:val="green"/>
           <w:lang w:val="it-IT"/>
         </w:rPr>
         <w:t>Criteria</w:t>
@@ -18455,6 +18625,7 @@
       <w:proofErr w:type="spellEnd"/>
       <w:r>
         <w:rPr>
+          <w:highlight w:val="green"/>
           <w:lang w:val="it-IT"/>
         </w:rPr>
         <w:t>:*</w:t>
@@ -18462,6 +18633,7 @@
       <w:proofErr w:type="gramEnd"/>
       <w:r>
         <w:rPr>
+          <w:highlight w:val="green"/>
           <w:lang w:val="it-IT"/>
         </w:rPr>
         <w:t>*</w:t>
@@ -18470,11 +18642,13 @@
     <w:p>
       <w:pPr>
         <w:rPr>
-          <w:lang w:val="it-IT"/>
-        </w:rPr>
-      </w:pPr>
-      <w:r>
-        <w:rPr>
+          <w:highlight w:val="green"/>
+          <w:lang w:val="it-IT"/>
+        </w:rPr>
+      </w:pPr>
+      <w:r>
+        <w:rPr>
+          <w:highlight w:val="green"/>
           <w:lang w:val="it-IT"/>
         </w:rPr>
         <w:t xml:space="preserve">- </w:t>
@@ -18482,6 +18656,7 @@
       <w:proofErr w:type="gramStart"/>
       <w:r>
         <w:rPr>
+          <w:highlight w:val="green"/>
           <w:lang w:val="it-IT"/>
         </w:rPr>
         <w:t>[ ]</w:t>
@@ -18489,6 +18664,7 @@
       <w:proofErr w:type="gramEnd"/>
       <w:r>
         <w:rPr>
+          <w:highlight w:val="green"/>
           <w:lang w:val="it-IT"/>
         </w:rPr>
         <w:t xml:space="preserve"> Tutti i campi prezzo usano DECIMAL, non FLOAT</w:t>
@@ -18497,11 +18673,13 @@
     <w:p>
       <w:pPr>
         <w:rPr>
-          <w:lang w:val="it-IT"/>
-        </w:rPr>
-      </w:pPr>
-      <w:r>
-        <w:rPr>
+          <w:highlight w:val="green"/>
+          <w:lang w:val="it-IT"/>
+        </w:rPr>
+      </w:pPr>
+      <w:r>
+        <w:rPr>
+          <w:highlight w:val="green"/>
           <w:lang w:val="it-IT"/>
         </w:rPr>
         <w:t xml:space="preserve">- </w:t>
@@ -18509,6 +18687,7 @@
       <w:proofErr w:type="gramStart"/>
       <w:r>
         <w:rPr>
+          <w:highlight w:val="green"/>
           <w:lang w:val="it-IT"/>
         </w:rPr>
         <w:t>[ ]</w:t>
@@ -18516,6 +18695,7 @@
       <w:proofErr w:type="gramEnd"/>
       <w:r>
         <w:rPr>
+          <w:highlight w:val="green"/>
           <w:lang w:val="it-IT"/>
         </w:rPr>
         <w:t xml:space="preserve"> </w:t>
@@ -18523,6 +18703,7 @@
       <w:proofErr w:type="spellStart"/>
       <w:r>
         <w:rPr>
+          <w:highlight w:val="green"/>
           <w:lang w:val="it-IT"/>
         </w:rPr>
         <w:t>Enums</w:t>
@@ -18530,6 +18711,7 @@
       <w:proofErr w:type="spellEnd"/>
       <w:r>
         <w:rPr>
+          <w:highlight w:val="green"/>
           <w:lang w:val="it-IT"/>
         </w:rPr>
         <w:t xml:space="preserve"> definiti come tipi Python </w:t>
@@ -18537,6 +18719,7 @@
       <w:proofErr w:type="spellStart"/>
       <w:r>
         <w:rPr>
+          <w:highlight w:val="green"/>
           <w:lang w:val="it-IT"/>
         </w:rPr>
         <w:t>Enum</w:t>
@@ -18546,11 +18729,13 @@
     <w:p>
       <w:pPr>
         <w:rPr>
-          <w:lang w:val="it-IT"/>
-        </w:rPr>
-      </w:pPr>
-      <w:r>
-        <w:rPr>
+          <w:highlight w:val="green"/>
+          <w:lang w:val="it-IT"/>
+        </w:rPr>
+      </w:pPr>
+      <w:r>
+        <w:rPr>
+          <w:highlight w:val="green"/>
           <w:lang w:val="it-IT"/>
         </w:rPr>
         <w:t xml:space="preserve">- </w:t>
@@ -18558,6 +18743,7 @@
       <w:proofErr w:type="gramStart"/>
       <w:r>
         <w:rPr>
+          <w:highlight w:val="green"/>
           <w:lang w:val="it-IT"/>
         </w:rPr>
         <w:t>[ ]</w:t>
@@ -18565,6 +18751,7 @@
       <w:proofErr w:type="gramEnd"/>
       <w:r>
         <w:rPr>
+          <w:highlight w:val="green"/>
           <w:lang w:val="it-IT"/>
         </w:rPr>
         <w:t xml:space="preserve"> Foreign key a Ticker definita correttamente</w:t>
@@ -18573,11 +18760,13 @@
     <w:p>
       <w:pPr>
         <w:rPr>
-          <w:lang w:val="it-IT"/>
-        </w:rPr>
-      </w:pPr>
-      <w:r>
-        <w:rPr>
+          <w:highlight w:val="green"/>
+          <w:lang w:val="it-IT"/>
+        </w:rPr>
+      </w:pPr>
+      <w:r>
+        <w:rPr>
+          <w:highlight w:val="green"/>
           <w:lang w:val="it-IT"/>
         </w:rPr>
         <w:t xml:space="preserve">- </w:t>
@@ -18585,6 +18774,7 @@
       <w:proofErr w:type="gramStart"/>
       <w:r>
         <w:rPr>
+          <w:highlight w:val="green"/>
           <w:lang w:val="it-IT"/>
         </w:rPr>
         <w:t>[ ]</w:t>
@@ -18592,6 +18782,7 @@
       <w:proofErr w:type="gramEnd"/>
       <w:r>
         <w:rPr>
+          <w:highlight w:val="green"/>
           <w:lang w:val="it-IT"/>
         </w:rPr>
         <w:t xml:space="preserve"> Indici ottimizzati per query frequenti</w:t>
@@ -18605,6 +18796,7 @@
       </w:pPr>
       <w:r>
         <w:rPr>
+          <w:highlight w:val="green"/>
           <w:lang w:val="it-IT"/>
         </w:rPr>
         <w:t xml:space="preserve">- </w:t>
@@ -18612,6 +18804,7 @@
       <w:proofErr w:type="gramStart"/>
       <w:r>
         <w:rPr>
+          <w:highlight w:val="green"/>
           <w:lang w:val="it-IT"/>
         </w:rPr>
         <w:t>[ ]</w:t>
@@ -18619,6 +18812,7 @@
       <w:proofErr w:type="gramEnd"/>
       <w:r>
         <w:rPr>
+          <w:highlight w:val="green"/>
           <w:lang w:val="it-IT"/>
         </w:rPr>
         <w:t xml:space="preserve"> Campi </w:t>
@@ -18626,6 +18820,7 @@
       <w:proofErr w:type="spellStart"/>
       <w:r>
         <w:rPr>
+          <w:highlight w:val="green"/>
           <w:lang w:val="it-IT"/>
         </w:rPr>
         <w:t>nullable</w:t>
@@ -18633,6 +18828,7 @@
       <w:proofErr w:type="spellEnd"/>
       <w:r>
         <w:rPr>
+          <w:highlight w:val="green"/>
           <w:lang w:val="it-IT"/>
         </w:rPr>
         <w:t xml:space="preserve"> marcati esplicitamente</w:t>
@@ -60576,6 +60772,7 @@
   <w:style w:type="character" w:default="1" w:styleId="Carpredefinitoparagrafo">
     <w:name w:val="Default Paragraph Font"/>
     <w:uiPriority w:val="1"/>
+    <w:semiHidden/>
     <w:unhideWhenUsed/>
   </w:style>
   <w:style w:type="table" w:default="1" w:styleId="Tabellanormale">

</xml_diff>

<commit_message>
feat: Add comprehensive project plan, project README, and initial backend market data domain models.
</commit_message>
<xml_diff>
--- a/Piano-operativo-v1.7.docx
+++ b/Piano-operativo-v1.7.docx
@@ -10300,73 +10300,23 @@
           <w:highlight w:val="green"/>
           <w:lang w:val="it-IT"/>
         </w:rPr>
-        <w:t>Implementare funzioni: </w:t>
-      </w:r>
-      <w:proofErr w:type="spellStart"/>
-      <w:r>
-        <w:rPr>
-          <w:highlight w:val="green"/>
-          <w:lang w:val="it-IT"/>
-        </w:rPr>
-        <w:t>addPercentage</w:t>
-      </w:r>
-      <w:proofErr w:type="spellEnd"/>
-      <w:r>
-        <w:rPr>
-          <w:highlight w:val="green"/>
-          <w:lang w:val="it-IT"/>
-        </w:rPr>
-        <w:t>, </w:t>
-      </w:r>
-      <w:proofErr w:type="spellStart"/>
-      <w:r>
-        <w:rPr>
-          <w:highlight w:val="green"/>
-          <w:lang w:val="it-IT"/>
-        </w:rPr>
-        <w:t>subtractPercentage</w:t>
-      </w:r>
-      <w:proofErr w:type="spellEnd"/>
-      <w:r>
-        <w:rPr>
-          <w:highlight w:val="green"/>
-          <w:lang w:val="it-IT"/>
-        </w:rPr>
-        <w:t>, </w:t>
-      </w:r>
-      <w:proofErr w:type="spellStart"/>
-      <w:proofErr w:type="gramStart"/>
-      <w:r>
-        <w:rPr>
-          <w:highlight w:val="green"/>
-          <w:lang w:val="it-IT"/>
-        </w:rPr>
-        <w:t>formatPercentage</w:t>
-      </w:r>
-      <w:proofErr w:type="spellEnd"/>
-      <w:r>
-        <w:rPr>
-          <w:highlight w:val="green"/>
-          <w:lang w:val="it-IT"/>
-        </w:rPr>
-        <w:t>(</w:t>
-      </w:r>
-      <w:proofErr w:type="spellStart"/>
-      <w:proofErr w:type="gramEnd"/>
-      <w:r>
-        <w:rPr>
-          <w:highlight w:val="green"/>
-          <w:lang w:val="it-IT"/>
-        </w:rPr>
-        <w:t>percentage</w:t>
-      </w:r>
-      <w:proofErr w:type="spellEnd"/>
-      <w:r>
-        <w:rPr>
-          <w:highlight w:val="green"/>
-          <w:lang w:val="it-IT"/>
-        </w:rPr>
-        <w:t xml:space="preserve">, </w:t>
+        <w:t>Implementare funzioni: addPercentage, subtractPercentage, </w:t>
+      </w:r>
+      <w:proofErr w:type="gramStart"/>
+      <w:r>
+        <w:rPr>
+          <w:highlight w:val="green"/>
+          <w:lang w:val="it-IT"/>
+        </w:rPr>
+        <w:t>formatPercentage(</w:t>
+      </w:r>
+      <w:proofErr w:type="gramEnd"/>
+      <w:r>
+        <w:rPr>
+          <w:highlight w:val="green"/>
+          <w:lang w:val="it-IT"/>
+        </w:rPr>
+        <w:t xml:space="preserve">percentage, </w:t>
       </w:r>
       <w:proofErr w:type="spellStart"/>
       <w:r>
@@ -18864,11 +18814,13 @@
     <w:p>
       <w:pPr>
         <w:rPr>
-          <w:lang w:val="it-IT"/>
-        </w:rPr>
-      </w:pPr>
-      <w:r>
-        <w:rPr>
+          <w:highlight w:val="green"/>
+          <w:lang w:val="it-IT"/>
+        </w:rPr>
+      </w:pPr>
+      <w:r>
+        <w:rPr>
+          <w:highlight w:val="green"/>
           <w:lang w:val="it-IT"/>
         </w:rPr>
         <w:t xml:space="preserve">## TASK 2.5: Definizione Modello </w:t>
@@ -18876,6 +18828,7 @@
       <w:proofErr w:type="spellStart"/>
       <w:r>
         <w:rPr>
+          <w:highlight w:val="green"/>
           <w:lang w:val="it-IT"/>
         </w:rPr>
         <w:t>SQLAlchemy</w:t>
@@ -18883,6 +18836,7 @@
       <w:proofErr w:type="spellEnd"/>
       <w:r>
         <w:rPr>
+          <w:highlight w:val="green"/>
           <w:lang w:val="it-IT"/>
         </w:rPr>
         <w:t xml:space="preserve"> - </w:t>
@@ -18890,6 +18844,7 @@
       <w:proofErr w:type="spellStart"/>
       <w:r>
         <w:rPr>
+          <w:highlight w:val="green"/>
           <w:lang w:val="it-IT"/>
         </w:rPr>
         <w:t>EstimateEvent</w:t>
@@ -18897,6 +18852,7 @@
       <w:proofErr w:type="spellEnd"/>
       <w:r>
         <w:rPr>
+          <w:highlight w:val="green"/>
           <w:lang w:val="it-IT"/>
         </w:rPr>
         <w:t xml:space="preserve"> (Event Sourcing)</w:t>
@@ -18905,18 +18861,21 @@
     <w:p>
       <w:pPr>
         <w:rPr>
-          <w:lang w:val="it-IT"/>
-        </w:rPr>
-      </w:pPr>
-    </w:p>
-    <w:p>
-      <w:pPr>
-        <w:rPr>
-          <w:lang w:val="it-IT"/>
-        </w:rPr>
-      </w:pPr>
-      <w:r>
-        <w:rPr>
+          <w:highlight w:val="green"/>
+          <w:lang w:val="it-IT"/>
+        </w:rPr>
+      </w:pPr>
+    </w:p>
+    <w:p>
+      <w:pPr>
+        <w:rPr>
+          <w:highlight w:val="green"/>
+          <w:lang w:val="it-IT"/>
+        </w:rPr>
+      </w:pPr>
+      <w:r>
+        <w:rPr>
+          <w:highlight w:val="green"/>
           <w:lang w:val="it-IT"/>
         </w:rPr>
         <w:t>**</w:t>
@@ -18924,6 +18883,7 @@
       <w:proofErr w:type="gramStart"/>
       <w:r>
         <w:rPr>
+          <w:highlight w:val="green"/>
           <w:lang w:val="it-IT"/>
         </w:rPr>
         <w:t>Descrizione:*</w:t>
@@ -18931,6 +18891,7 @@
       <w:proofErr w:type="gramEnd"/>
       <w:r>
         <w:rPr>
+          <w:highlight w:val="green"/>
           <w:lang w:val="it-IT"/>
         </w:rPr>
         <w:t>* Creare il modello per Event Sourcing delle stime.</w:t>
@@ -18939,78 +18900,138 @@
     <w:p>
       <w:pPr>
         <w:rPr>
-          <w:lang w:val="it-IT"/>
-        </w:rPr>
-      </w:pPr>
-    </w:p>
-    <w:p>
-      <w:r>
+          <w:highlight w:val="green"/>
+          <w:lang w:val="it-IT"/>
+        </w:rPr>
+      </w:pPr>
+    </w:p>
+    <w:p>
+      <w:pPr>
+        <w:rPr>
+          <w:highlight w:val="green"/>
+        </w:rPr>
+      </w:pPr>
+      <w:r>
+        <w:rPr>
+          <w:highlight w:val="green"/>
+        </w:rPr>
         <w:t>**</w:t>
       </w:r>
       <w:proofErr w:type="spellStart"/>
       <w:proofErr w:type="gramStart"/>
       <w:r>
+        <w:rPr>
+          <w:highlight w:val="green"/>
+        </w:rPr>
         <w:t>Microstep</w:t>
       </w:r>
       <w:proofErr w:type="spellEnd"/>
       <w:r>
+        <w:rPr>
+          <w:highlight w:val="green"/>
+        </w:rPr>
         <w:t>:*</w:t>
       </w:r>
       <w:proofErr w:type="gramEnd"/>
       <w:r>
+        <w:rPr>
+          <w:highlight w:val="green"/>
+        </w:rPr>
         <w:t>*</w:t>
       </w:r>
     </w:p>
     <w:p>
-      <w:r>
+      <w:pPr>
+        <w:rPr>
+          <w:highlight w:val="green"/>
+        </w:rPr>
+      </w:pPr>
+      <w:r>
+        <w:rPr>
+          <w:highlight w:val="green"/>
+        </w:rPr>
         <w:t xml:space="preserve">1. </w:t>
       </w:r>
       <w:proofErr w:type="spellStart"/>
       <w:r>
+        <w:rPr>
+          <w:highlight w:val="green"/>
+        </w:rPr>
         <w:t>Creare</w:t>
       </w:r>
       <w:proofErr w:type="spellEnd"/>
       <w:r>
+        <w:rPr>
+          <w:highlight w:val="green"/>
+        </w:rPr>
         <w:t xml:space="preserve"> file `backend/</w:t>
       </w:r>
       <w:proofErr w:type="spellStart"/>
       <w:r>
+        <w:rPr>
+          <w:highlight w:val="green"/>
+        </w:rPr>
         <w:t>src</w:t>
       </w:r>
       <w:proofErr w:type="spellEnd"/>
       <w:r>
+        <w:rPr>
+          <w:highlight w:val="green"/>
+        </w:rPr>
         <w:t>/estimates/domain/events.py`</w:t>
       </w:r>
     </w:p>
     <w:p>
-      <w:r>
+      <w:pPr>
+        <w:rPr>
+          <w:highlight w:val="green"/>
+        </w:rPr>
+      </w:pPr>
+      <w:r>
+        <w:rPr>
+          <w:highlight w:val="green"/>
+        </w:rPr>
         <w:t xml:space="preserve">2. </w:t>
       </w:r>
       <w:proofErr w:type="spellStart"/>
       <w:r>
+        <w:rPr>
+          <w:highlight w:val="green"/>
+        </w:rPr>
         <w:t>Definire</w:t>
       </w:r>
       <w:proofErr w:type="spellEnd"/>
       <w:r>
+        <w:rPr>
+          <w:highlight w:val="green"/>
+        </w:rPr>
         <w:t xml:space="preserve"> Enum `</w:t>
       </w:r>
       <w:proofErr w:type="spellStart"/>
       <w:r>
+        <w:rPr>
+          <w:highlight w:val="green"/>
+        </w:rPr>
         <w:t>EstimateEventType</w:t>
       </w:r>
       <w:proofErr w:type="spellEnd"/>
       <w:r>
+        <w:rPr>
+          <w:highlight w:val="green"/>
+        </w:rPr>
         <w:t>`: CREATED, UPDATED, PRICE_UPDATED, TARGET_HIT, STOP_HIT, CLOSED, REOPENED</w:t>
       </w:r>
     </w:p>
     <w:p>
       <w:pPr>
         <w:rPr>
-          <w:lang w:val="it-IT"/>
-        </w:rPr>
-      </w:pPr>
-      <w:r>
-        <w:rPr>
+          <w:highlight w:val="green"/>
+          <w:lang w:val="it-IT"/>
+        </w:rPr>
+      </w:pPr>
+      <w:r>
+        <w:rPr>
+          <w:highlight w:val="green"/>
           <w:lang w:val="it-IT"/>
         </w:rPr>
         <w:t>3. Definire classe `</w:t>
@@ -19018,6 +19039,7 @@
       <w:proofErr w:type="spellStart"/>
       <w:r>
         <w:rPr>
+          <w:highlight w:val="green"/>
           <w:lang w:val="it-IT"/>
         </w:rPr>
         <w:t>EstimateEvent</w:t>
@@ -19025,88 +19047,147 @@
       <w:proofErr w:type="spellEnd"/>
       <w:r>
         <w:rPr>
+          <w:highlight w:val="green"/>
           <w:lang w:val="it-IT"/>
         </w:rPr>
         <w:t>` che eredita da Base</w:t>
       </w:r>
     </w:p>
     <w:p>
-      <w:r>
+      <w:pPr>
+        <w:rPr>
+          <w:highlight w:val="green"/>
+        </w:rPr>
+      </w:pPr>
+      <w:r>
+        <w:rPr>
+          <w:highlight w:val="green"/>
+        </w:rPr>
         <w:t xml:space="preserve">4. </w:t>
       </w:r>
       <w:proofErr w:type="spellStart"/>
       <w:r>
+        <w:rPr>
+          <w:highlight w:val="green"/>
+        </w:rPr>
         <w:t>Definire</w:t>
       </w:r>
       <w:proofErr w:type="spellEnd"/>
       <w:r>
+        <w:rPr>
+          <w:highlight w:val="green"/>
+        </w:rPr>
         <w:t xml:space="preserve"> </w:t>
       </w:r>
       <w:proofErr w:type="spellStart"/>
       <w:r>
+        <w:rPr>
+          <w:highlight w:val="green"/>
+        </w:rPr>
         <w:t>colonne</w:t>
       </w:r>
       <w:proofErr w:type="spellEnd"/>
       <w:r>
+        <w:rPr>
+          <w:highlight w:val="green"/>
+        </w:rPr>
         <w:t>: `id` (UUID, PK), `</w:t>
       </w:r>
       <w:proofErr w:type="spellStart"/>
       <w:r>
+        <w:rPr>
+          <w:highlight w:val="green"/>
+        </w:rPr>
         <w:t>estimate_id</w:t>
       </w:r>
       <w:proofErr w:type="spellEnd"/>
       <w:r>
+        <w:rPr>
+          <w:highlight w:val="green"/>
+        </w:rPr>
         <w:t>` (FK to Estimate), `</w:t>
       </w:r>
       <w:proofErr w:type="spellStart"/>
       <w:r>
+        <w:rPr>
+          <w:highlight w:val="green"/>
+        </w:rPr>
         <w:t>event_type</w:t>
       </w:r>
       <w:proofErr w:type="spellEnd"/>
       <w:r>
+        <w:rPr>
+          <w:highlight w:val="green"/>
+        </w:rPr>
         <w:t>` (Enum), `</w:t>
       </w:r>
       <w:proofErr w:type="spellStart"/>
       <w:r>
+        <w:rPr>
+          <w:highlight w:val="green"/>
+        </w:rPr>
         <w:t>event_data</w:t>
       </w:r>
       <w:proofErr w:type="spellEnd"/>
       <w:r>
+        <w:rPr>
+          <w:highlight w:val="green"/>
+        </w:rPr>
         <w:t>` (JSONB), `</w:t>
       </w:r>
       <w:proofErr w:type="spellStart"/>
       <w:r>
+        <w:rPr>
+          <w:highlight w:val="green"/>
+        </w:rPr>
         <w:t>user_id</w:t>
       </w:r>
       <w:proofErr w:type="spellEnd"/>
       <w:r>
+        <w:rPr>
+          <w:highlight w:val="green"/>
+        </w:rPr>
         <w:t>` (UUID, nullable), `timestamp` (</w:t>
       </w:r>
       <w:proofErr w:type="spellStart"/>
       <w:r>
+        <w:rPr>
+          <w:highlight w:val="green"/>
+        </w:rPr>
         <w:t>DateTime</w:t>
       </w:r>
       <w:proofErr w:type="spellEnd"/>
       <w:r>
+        <w:rPr>
+          <w:highlight w:val="green"/>
+        </w:rPr>
         <w:t xml:space="preserve"> with </w:t>
       </w:r>
       <w:proofErr w:type="spellStart"/>
       <w:r>
+        <w:rPr>
+          <w:highlight w:val="green"/>
+        </w:rPr>
         <w:t>timezone</w:t>
       </w:r>
       <w:proofErr w:type="spellEnd"/>
       <w:r>
+        <w:rPr>
+          <w:highlight w:val="green"/>
+        </w:rPr>
         <w:t>)</w:t>
       </w:r>
     </w:p>
     <w:p>
       <w:pPr>
         <w:rPr>
-          <w:lang w:val="it-IT"/>
-        </w:rPr>
-      </w:pPr>
-      <w:r>
-        <w:rPr>
+          <w:highlight w:val="green"/>
+          <w:lang w:val="it-IT"/>
+        </w:rPr>
+      </w:pPr>
+      <w:r>
+        <w:rPr>
+          <w:highlight w:val="green"/>
           <w:lang w:val="it-IT"/>
         </w:rPr>
         <w:t xml:space="preserve">5. Definire indice composto su </w:t>
@@ -19114,6 +19195,7 @@
       <w:proofErr w:type="gramStart"/>
       <w:r>
         <w:rPr>
+          <w:highlight w:val="green"/>
           <w:lang w:val="it-IT"/>
         </w:rPr>
         <w:t>`(</w:t>
@@ -19122,6 +19204,7 @@
       <w:proofErr w:type="gramEnd"/>
       <w:r>
         <w:rPr>
+          <w:highlight w:val="green"/>
           <w:lang w:val="it-IT"/>
         </w:rPr>
         <w:t>estimate_id</w:t>
@@ -19129,6 +19212,7 @@
       <w:proofErr w:type="spellEnd"/>
       <w:r>
         <w:rPr>
+          <w:highlight w:val="green"/>
           <w:lang w:val="it-IT"/>
         </w:rPr>
         <w:t xml:space="preserve">, </w:t>
@@ -19137,6 +19221,7 @@
       <w:proofErr w:type="gramStart"/>
       <w:r>
         <w:rPr>
+          <w:highlight w:val="green"/>
           <w:lang w:val="it-IT"/>
         </w:rPr>
         <w:t>timestamp</w:t>
@@ -19144,6 +19229,7 @@
       <w:proofErr w:type="spellEnd"/>
       <w:r>
         <w:rPr>
+          <w:highlight w:val="green"/>
           <w:lang w:val="it-IT"/>
         </w:rPr>
         <w:t>)`</w:t>
@@ -19153,11 +19239,13 @@
     <w:p>
       <w:pPr>
         <w:rPr>
-          <w:lang w:val="it-IT"/>
-        </w:rPr>
-      </w:pPr>
-      <w:r>
-        <w:rPr>
+          <w:highlight w:val="green"/>
+          <w:lang w:val="it-IT"/>
+        </w:rPr>
+      </w:pPr>
+      <w:r>
+        <w:rPr>
+          <w:highlight w:val="green"/>
           <w:lang w:val="it-IT"/>
         </w:rPr>
         <w:t xml:space="preserve">6. Definire </w:t>
@@ -19165,6 +19253,7 @@
       <w:proofErr w:type="spellStart"/>
       <w:r>
         <w:rPr>
+          <w:highlight w:val="green"/>
           <w:lang w:val="it-IT"/>
         </w:rPr>
         <w:t>constraint</w:t>
@@ -19172,6 +19261,7 @@
       <w:proofErr w:type="spellEnd"/>
       <w:r>
         <w:rPr>
+          <w:highlight w:val="green"/>
           <w:lang w:val="it-IT"/>
         </w:rPr>
         <w:t xml:space="preserve">: </w:t>
@@ -19179,6 +19269,7 @@
       <w:proofErr w:type="spellStart"/>
       <w:r>
         <w:rPr>
+          <w:highlight w:val="green"/>
           <w:lang w:val="it-IT"/>
         </w:rPr>
         <w:t>timestamp</w:t>
@@ -19186,6 +19277,7 @@
       <w:proofErr w:type="spellEnd"/>
       <w:r>
         <w:rPr>
+          <w:highlight w:val="green"/>
           <w:lang w:val="it-IT"/>
         </w:rPr>
         <w:t xml:space="preserve"> deve avere </w:t>
@@ -19193,6 +19285,7 @@
       <w:proofErr w:type="spellStart"/>
       <w:r>
         <w:rPr>
+          <w:highlight w:val="green"/>
           <w:lang w:val="it-IT"/>
         </w:rPr>
         <w:t>timezone</w:t>
@@ -19202,18 +19295,21 @@
     <w:p>
       <w:pPr>
         <w:rPr>
-          <w:lang w:val="it-IT"/>
-        </w:rPr>
-      </w:pPr>
-    </w:p>
-    <w:p>
-      <w:pPr>
-        <w:rPr>
-          <w:lang w:val="it-IT"/>
-        </w:rPr>
-      </w:pPr>
-      <w:r>
-        <w:rPr>
+          <w:highlight w:val="green"/>
+          <w:lang w:val="it-IT"/>
+        </w:rPr>
+      </w:pPr>
+    </w:p>
+    <w:p>
+      <w:pPr>
+        <w:rPr>
+          <w:highlight w:val="green"/>
+          <w:lang w:val="it-IT"/>
+        </w:rPr>
+      </w:pPr>
+      <w:r>
+        <w:rPr>
+          <w:highlight w:val="green"/>
           <w:lang w:val="it-IT"/>
         </w:rPr>
         <w:t>**</w:t>
@@ -19221,6 +19317,7 @@
       <w:proofErr w:type="spellStart"/>
       <w:r>
         <w:rPr>
+          <w:highlight w:val="green"/>
           <w:lang w:val="it-IT"/>
         </w:rPr>
         <w:t>Acceptance</w:t>
@@ -19228,6 +19325,7 @@
       <w:proofErr w:type="spellEnd"/>
       <w:r>
         <w:rPr>
+          <w:highlight w:val="green"/>
           <w:lang w:val="it-IT"/>
         </w:rPr>
         <w:t xml:space="preserve"> </w:t>
@@ -19236,6 +19334,7 @@
       <w:proofErr w:type="gramStart"/>
       <w:r>
         <w:rPr>
+          <w:highlight w:val="green"/>
           <w:lang w:val="it-IT"/>
         </w:rPr>
         <w:t>Criteria</w:t>
@@ -19243,6 +19342,7 @@
       <w:proofErr w:type="spellEnd"/>
       <w:r>
         <w:rPr>
+          <w:highlight w:val="green"/>
           <w:lang w:val="it-IT"/>
         </w:rPr>
         <w:t>:*</w:t>
@@ -19250,6 +19350,7 @@
       <w:proofErr w:type="gramEnd"/>
       <w:r>
         <w:rPr>
+          <w:highlight w:val="green"/>
           <w:lang w:val="it-IT"/>
         </w:rPr>
         <w:t>*</w:t>
@@ -19258,11 +19359,13 @@
     <w:p>
       <w:pPr>
         <w:rPr>
-          <w:lang w:val="it-IT"/>
-        </w:rPr>
-      </w:pPr>
-      <w:r>
-        <w:rPr>
+          <w:highlight w:val="green"/>
+          <w:lang w:val="it-IT"/>
+        </w:rPr>
+      </w:pPr>
+      <w:r>
+        <w:rPr>
+          <w:highlight w:val="green"/>
           <w:lang w:val="it-IT"/>
         </w:rPr>
         <w:lastRenderedPageBreak/>
@@ -19271,6 +19374,7 @@
       <w:proofErr w:type="gramStart"/>
       <w:r>
         <w:rPr>
+          <w:highlight w:val="green"/>
           <w:lang w:val="it-IT"/>
         </w:rPr>
         <w:t>[ ]</w:t>
@@ -19278,6 +19382,7 @@
       <w:proofErr w:type="gramEnd"/>
       <w:r>
         <w:rPr>
+          <w:highlight w:val="green"/>
           <w:lang w:val="it-IT"/>
         </w:rPr>
         <w:t xml:space="preserve"> Eventi sono immutabili (no update)</w:t>
@@ -19286,11 +19391,13 @@
     <w:p>
       <w:pPr>
         <w:rPr>
-          <w:lang w:val="it-IT"/>
-        </w:rPr>
-      </w:pPr>
-      <w:r>
-        <w:rPr>
+          <w:highlight w:val="green"/>
+          <w:lang w:val="it-IT"/>
+        </w:rPr>
+      </w:pPr>
+      <w:r>
+        <w:rPr>
+          <w:highlight w:val="green"/>
           <w:lang w:val="it-IT"/>
         </w:rPr>
         <w:t xml:space="preserve">- </w:t>
@@ -19298,6 +19405,7 @@
       <w:proofErr w:type="gramStart"/>
       <w:r>
         <w:rPr>
+          <w:highlight w:val="green"/>
           <w:lang w:val="it-IT"/>
         </w:rPr>
         <w:t>[ ]</w:t>
@@ -19305,6 +19413,7 @@
       <w:proofErr w:type="gramEnd"/>
       <w:r>
         <w:rPr>
+          <w:highlight w:val="green"/>
           <w:lang w:val="it-IT"/>
         </w:rPr>
         <w:t xml:space="preserve"> JSONB usato per flessibilità dati evento</w:t>
@@ -19313,11 +19422,13 @@
     <w:p>
       <w:pPr>
         <w:rPr>
-          <w:lang w:val="it-IT"/>
-        </w:rPr>
-      </w:pPr>
-      <w:r>
-        <w:rPr>
+          <w:highlight w:val="green"/>
+          <w:lang w:val="it-IT"/>
+        </w:rPr>
+      </w:pPr>
+      <w:r>
+        <w:rPr>
+          <w:highlight w:val="green"/>
           <w:lang w:val="it-IT"/>
         </w:rPr>
         <w:t xml:space="preserve">- </w:t>
@@ -19325,6 +19436,7 @@
       <w:proofErr w:type="gramStart"/>
       <w:r>
         <w:rPr>
+          <w:highlight w:val="green"/>
           <w:lang w:val="it-IT"/>
         </w:rPr>
         <w:t>[ ]</w:t>
@@ -19332,6 +19444,7 @@
       <w:proofErr w:type="gramEnd"/>
       <w:r>
         <w:rPr>
+          <w:highlight w:val="green"/>
           <w:lang w:val="it-IT"/>
         </w:rPr>
         <w:t xml:space="preserve"> Indice permette query efficienti per timeline</w:t>
@@ -19345,6 +19458,7 @@
       </w:pPr>
       <w:r>
         <w:rPr>
+          <w:highlight w:val="green"/>
           <w:lang w:val="it-IT"/>
         </w:rPr>
         <w:t xml:space="preserve">- </w:t>
@@ -19352,6 +19466,7 @@
       <w:proofErr w:type="gramStart"/>
       <w:r>
         <w:rPr>
+          <w:highlight w:val="green"/>
           <w:lang w:val="it-IT"/>
         </w:rPr>
         <w:t>[ ]</w:t>
@@ -19359,6 +19474,7 @@
       <w:proofErr w:type="gramEnd"/>
       <w:r>
         <w:rPr>
+          <w:highlight w:val="green"/>
           <w:lang w:val="it-IT"/>
         </w:rPr>
         <w:t xml:space="preserve"> Ogni tipo evento documentato nel </w:t>
@@ -19366,6 +19482,7 @@
       <w:proofErr w:type="spellStart"/>
       <w:r>
         <w:rPr>
+          <w:highlight w:val="green"/>
           <w:lang w:val="it-IT"/>
         </w:rPr>
         <w:t>Enum</w:t>
@@ -19402,11 +19519,13 @@
     <w:p>
       <w:pPr>
         <w:rPr>
-          <w:lang w:val="it-IT"/>
-        </w:rPr>
-      </w:pPr>
-      <w:r>
-        <w:rPr>
+          <w:highlight w:val="green"/>
+          <w:lang w:val="it-IT"/>
+        </w:rPr>
+      </w:pPr>
+      <w:r>
+        <w:rPr>
+          <w:highlight w:val="green"/>
           <w:lang w:val="it-IT"/>
         </w:rPr>
         <w:t xml:space="preserve">## TASK 2.6: Definizione Modello </w:t>
@@ -19414,6 +19533,7 @@
       <w:proofErr w:type="spellStart"/>
       <w:r>
         <w:rPr>
+          <w:highlight w:val="green"/>
           <w:lang w:val="it-IT"/>
         </w:rPr>
         <w:t>SQLAlchemy</w:t>
@@ -19421,6 +19541,7 @@
       <w:proofErr w:type="spellEnd"/>
       <w:r>
         <w:rPr>
+          <w:highlight w:val="green"/>
           <w:lang w:val="it-IT"/>
         </w:rPr>
         <w:t xml:space="preserve"> - </w:t>
@@ -19428,6 +19549,7 @@
       <w:proofErr w:type="spellStart"/>
       <w:r>
         <w:rPr>
+          <w:highlight w:val="green"/>
           <w:lang w:val="it-IT"/>
         </w:rPr>
         <w:t>MarketData</w:t>
@@ -19437,18 +19559,21 @@
     <w:p>
       <w:pPr>
         <w:rPr>
-          <w:lang w:val="it-IT"/>
-        </w:rPr>
-      </w:pPr>
-    </w:p>
-    <w:p>
-      <w:pPr>
-        <w:rPr>
-          <w:lang w:val="it-IT"/>
-        </w:rPr>
-      </w:pPr>
-      <w:r>
-        <w:rPr>
+          <w:highlight w:val="green"/>
+          <w:lang w:val="it-IT"/>
+        </w:rPr>
+      </w:pPr>
+    </w:p>
+    <w:p>
+      <w:pPr>
+        <w:rPr>
+          <w:highlight w:val="green"/>
+          <w:lang w:val="it-IT"/>
+        </w:rPr>
+      </w:pPr>
+      <w:r>
+        <w:rPr>
+          <w:highlight w:val="green"/>
           <w:lang w:val="it-IT"/>
         </w:rPr>
         <w:t>**</w:t>
@@ -19456,6 +19581,7 @@
       <w:proofErr w:type="gramStart"/>
       <w:r>
         <w:rPr>
+          <w:highlight w:val="green"/>
           <w:lang w:val="it-IT"/>
         </w:rPr>
         <w:t>Descrizione:*</w:t>
@@ -19463,6 +19589,7 @@
       <w:proofErr w:type="gramEnd"/>
       <w:r>
         <w:rPr>
+          <w:highlight w:val="green"/>
           <w:lang w:val="it-IT"/>
         </w:rPr>
         <w:t>* Creare il modello per dati storici di mercato (OHLCV).</w:t>
@@ -19471,65 +19598,111 @@
     <w:p>
       <w:pPr>
         <w:rPr>
-          <w:lang w:val="it-IT"/>
-        </w:rPr>
-      </w:pPr>
-    </w:p>
-    <w:p>
-      <w:r>
+          <w:highlight w:val="green"/>
+          <w:lang w:val="it-IT"/>
+        </w:rPr>
+      </w:pPr>
+    </w:p>
+    <w:p>
+      <w:pPr>
+        <w:rPr>
+          <w:highlight w:val="green"/>
+        </w:rPr>
+      </w:pPr>
+      <w:r>
+        <w:rPr>
+          <w:highlight w:val="green"/>
+        </w:rPr>
         <w:t>**</w:t>
       </w:r>
       <w:proofErr w:type="spellStart"/>
       <w:proofErr w:type="gramStart"/>
       <w:r>
+        <w:rPr>
+          <w:highlight w:val="green"/>
+        </w:rPr>
         <w:t>Microstep</w:t>
       </w:r>
       <w:proofErr w:type="spellEnd"/>
       <w:r>
+        <w:rPr>
+          <w:highlight w:val="green"/>
+        </w:rPr>
         <w:t>:*</w:t>
       </w:r>
       <w:proofErr w:type="gramEnd"/>
       <w:r>
+        <w:rPr>
+          <w:highlight w:val="green"/>
+        </w:rPr>
         <w:t>*</w:t>
       </w:r>
     </w:p>
     <w:p>
-      <w:r>
+      <w:pPr>
+        <w:rPr>
+          <w:highlight w:val="green"/>
+        </w:rPr>
+      </w:pPr>
+      <w:r>
+        <w:rPr>
+          <w:highlight w:val="green"/>
+        </w:rPr>
         <w:t xml:space="preserve">1. </w:t>
       </w:r>
       <w:proofErr w:type="spellStart"/>
       <w:r>
+        <w:rPr>
+          <w:highlight w:val="green"/>
+        </w:rPr>
         <w:t>Creare</w:t>
       </w:r>
       <w:proofErr w:type="spellEnd"/>
       <w:r>
+        <w:rPr>
+          <w:highlight w:val="green"/>
+        </w:rPr>
         <w:t xml:space="preserve"> file `backend/</w:t>
       </w:r>
       <w:proofErr w:type="spellStart"/>
       <w:r>
+        <w:rPr>
+          <w:highlight w:val="green"/>
+        </w:rPr>
         <w:t>src</w:t>
       </w:r>
       <w:proofErr w:type="spellEnd"/>
       <w:r>
+        <w:rPr>
+          <w:highlight w:val="green"/>
+        </w:rPr>
         <w:t>/</w:t>
       </w:r>
       <w:proofErr w:type="spellStart"/>
       <w:r>
+        <w:rPr>
+          <w:highlight w:val="green"/>
+        </w:rPr>
         <w:t>market_data</w:t>
       </w:r>
       <w:proofErr w:type="spellEnd"/>
       <w:r>
+        <w:rPr>
+          <w:highlight w:val="green"/>
+        </w:rPr>
         <w:t>/domain/market_data.py`</w:t>
       </w:r>
     </w:p>
     <w:p>
       <w:pPr>
         <w:rPr>
-          <w:lang w:val="it-IT"/>
-        </w:rPr>
-      </w:pPr>
-      <w:r>
-        <w:rPr>
+          <w:highlight w:val="green"/>
+          <w:lang w:val="it-IT"/>
+        </w:rPr>
+      </w:pPr>
+      <w:r>
+        <w:rPr>
+          <w:highlight w:val="green"/>
           <w:lang w:val="it-IT"/>
         </w:rPr>
         <w:t>2. Definire classe `</w:t>
@@ -19537,6 +19710,7 @@
       <w:proofErr w:type="spellStart"/>
       <w:r>
         <w:rPr>
+          <w:highlight w:val="green"/>
           <w:lang w:val="it-IT"/>
         </w:rPr>
         <w:t>MarketData</w:t>
@@ -19544,148 +19718,259 @@
       <w:proofErr w:type="spellEnd"/>
       <w:r>
         <w:rPr>
+          <w:highlight w:val="green"/>
           <w:lang w:val="it-IT"/>
         </w:rPr>
         <w:t>` che eredita da Base</w:t>
       </w:r>
     </w:p>
     <w:p>
-      <w:r>
+      <w:pPr>
+        <w:rPr>
+          <w:highlight w:val="green"/>
+        </w:rPr>
+      </w:pPr>
+      <w:r>
+        <w:rPr>
+          <w:highlight w:val="green"/>
+        </w:rPr>
         <w:t xml:space="preserve">3. </w:t>
       </w:r>
       <w:proofErr w:type="spellStart"/>
       <w:r>
+        <w:rPr>
+          <w:highlight w:val="green"/>
+        </w:rPr>
         <w:t>Definire</w:t>
       </w:r>
       <w:proofErr w:type="spellEnd"/>
       <w:r>
+        <w:rPr>
+          <w:highlight w:val="green"/>
+        </w:rPr>
         <w:t xml:space="preserve"> </w:t>
       </w:r>
       <w:proofErr w:type="spellStart"/>
       <w:r>
+        <w:rPr>
+          <w:highlight w:val="green"/>
+        </w:rPr>
         <w:t>colonne</w:t>
       </w:r>
       <w:proofErr w:type="spellEnd"/>
       <w:r>
+        <w:rPr>
+          <w:highlight w:val="green"/>
+        </w:rPr>
         <w:t>: `</w:t>
       </w:r>
       <w:proofErr w:type="spellStart"/>
       <w:r>
+        <w:rPr>
+          <w:highlight w:val="green"/>
+        </w:rPr>
         <w:t>ticker_id</w:t>
       </w:r>
       <w:proofErr w:type="spellEnd"/>
       <w:r>
+        <w:rPr>
+          <w:highlight w:val="green"/>
+        </w:rPr>
         <w:t>` (FK), `date` (Date), `open` (DECIMAL 10,4), `high` (DECIMAL 10,4), `low` (DECIMAL 10,4), `close` (DECIMAL 10,4), `volume` (</w:t>
       </w:r>
       <w:proofErr w:type="spellStart"/>
       <w:r>
+        <w:rPr>
+          <w:highlight w:val="green"/>
+        </w:rPr>
         <w:t>BigInteger</w:t>
       </w:r>
       <w:proofErr w:type="spellEnd"/>
       <w:r>
+        <w:rPr>
+          <w:highlight w:val="green"/>
+        </w:rPr>
         <w:t>)</w:t>
       </w:r>
     </w:p>
     <w:p>
-      <w:r>
+      <w:pPr>
+        <w:rPr>
+          <w:highlight w:val="green"/>
+        </w:rPr>
+      </w:pPr>
+      <w:r>
+        <w:rPr>
+          <w:highlight w:val="green"/>
+        </w:rPr>
         <w:t xml:space="preserve">4. </w:t>
       </w:r>
       <w:proofErr w:type="spellStart"/>
       <w:r>
+        <w:rPr>
+          <w:highlight w:val="green"/>
+        </w:rPr>
         <w:t>Definire</w:t>
       </w:r>
       <w:proofErr w:type="spellEnd"/>
       <w:r>
+        <w:rPr>
+          <w:highlight w:val="green"/>
+        </w:rPr>
         <w:t xml:space="preserve"> PK </w:t>
       </w:r>
       <w:proofErr w:type="spellStart"/>
       <w:r>
+        <w:rPr>
+          <w:highlight w:val="green"/>
+        </w:rPr>
         <w:t>composta</w:t>
       </w:r>
       <w:proofErr w:type="spellEnd"/>
       <w:r>
+        <w:rPr>
+          <w:highlight w:val="green"/>
+        </w:rPr>
         <w:t xml:space="preserve">: </w:t>
       </w:r>
       <w:proofErr w:type="gramStart"/>
       <w:r>
+        <w:rPr>
+          <w:highlight w:val="green"/>
+        </w:rPr>
         <w:t>`(</w:t>
       </w:r>
       <w:proofErr w:type="spellStart"/>
       <w:proofErr w:type="gramEnd"/>
       <w:r>
+        <w:rPr>
+          <w:highlight w:val="green"/>
+        </w:rPr>
         <w:t>ticker_id</w:t>
       </w:r>
       <w:proofErr w:type="spellEnd"/>
       <w:r>
+        <w:rPr>
+          <w:highlight w:val="green"/>
+        </w:rPr>
         <w:t xml:space="preserve">, </w:t>
       </w:r>
       <w:proofErr w:type="gramStart"/>
       <w:r>
+        <w:rPr>
+          <w:highlight w:val="green"/>
+        </w:rPr>
         <w:t>date)`</w:t>
       </w:r>
       <w:proofErr w:type="gramEnd"/>
     </w:p>
     <w:p>
-      <w:r>
+      <w:pPr>
+        <w:rPr>
+          <w:highlight w:val="green"/>
+        </w:rPr>
+      </w:pPr>
+      <w:r>
+        <w:rPr>
+          <w:highlight w:val="green"/>
+        </w:rPr>
         <w:t xml:space="preserve">5. </w:t>
       </w:r>
       <w:proofErr w:type="spellStart"/>
       <w:r>
+        <w:rPr>
+          <w:highlight w:val="green"/>
+        </w:rPr>
         <w:t>Definire</w:t>
       </w:r>
       <w:proofErr w:type="spellEnd"/>
       <w:r>
+        <w:rPr>
+          <w:highlight w:val="green"/>
+        </w:rPr>
         <w:t xml:space="preserve"> </w:t>
       </w:r>
       <w:proofErr w:type="spellStart"/>
       <w:r>
+        <w:rPr>
+          <w:highlight w:val="green"/>
+        </w:rPr>
         <w:t>colonne</w:t>
       </w:r>
       <w:proofErr w:type="spellEnd"/>
       <w:r>
+        <w:rPr>
+          <w:highlight w:val="green"/>
+        </w:rPr>
         <w:t xml:space="preserve"> lineage: `</w:t>
       </w:r>
       <w:proofErr w:type="spellStart"/>
       <w:r>
+        <w:rPr>
+          <w:highlight w:val="green"/>
+        </w:rPr>
         <w:t>data_source</w:t>
       </w:r>
       <w:proofErr w:type="spellEnd"/>
       <w:r>
+        <w:rPr>
+          <w:highlight w:val="green"/>
+        </w:rPr>
         <w:t>` (String), `</w:t>
       </w:r>
       <w:proofErr w:type="spellStart"/>
       <w:r>
+        <w:rPr>
+          <w:highlight w:val="green"/>
+        </w:rPr>
         <w:t>ingested_at</w:t>
       </w:r>
       <w:proofErr w:type="spellEnd"/>
       <w:r>
+        <w:rPr>
+          <w:highlight w:val="green"/>
+        </w:rPr>
         <w:t>` (</w:t>
       </w:r>
       <w:proofErr w:type="spellStart"/>
       <w:r>
+        <w:rPr>
+          <w:highlight w:val="green"/>
+        </w:rPr>
         <w:t>DateTime</w:t>
       </w:r>
       <w:proofErr w:type="spellEnd"/>
       <w:r>
+        <w:rPr>
+          <w:highlight w:val="green"/>
+        </w:rPr>
         <w:t>), `</w:t>
       </w:r>
       <w:proofErr w:type="spellStart"/>
       <w:r>
+        <w:rPr>
+          <w:highlight w:val="green"/>
+        </w:rPr>
         <w:t>quality_score</w:t>
       </w:r>
       <w:proofErr w:type="spellEnd"/>
       <w:r>
+        <w:rPr>
+          <w:highlight w:val="green"/>
+        </w:rPr>
         <w:t>` (DECIMAL 3,2)</w:t>
       </w:r>
     </w:p>
     <w:p>
       <w:pPr>
         <w:rPr>
-          <w:lang w:val="it-IT"/>
-        </w:rPr>
-      </w:pPr>
-      <w:r>
-        <w:rPr>
+          <w:highlight w:val="green"/>
+          <w:lang w:val="it-IT"/>
+        </w:rPr>
+      </w:pPr>
+      <w:r>
+        <w:rPr>
+          <w:highlight w:val="green"/>
           <w:lang w:val="it-IT"/>
         </w:rPr>
         <w:t xml:space="preserve">6. Definire indici: su `date`, su </w:t>
@@ -19693,6 +19978,7 @@
       <w:proofErr w:type="gramStart"/>
       <w:r>
         <w:rPr>
+          <w:highlight w:val="green"/>
           <w:lang w:val="it-IT"/>
         </w:rPr>
         <w:t>`(</w:t>
@@ -19701,6 +19987,7 @@
       <w:proofErr w:type="gramEnd"/>
       <w:r>
         <w:rPr>
+          <w:highlight w:val="green"/>
           <w:lang w:val="it-IT"/>
         </w:rPr>
         <w:t>ticker_id</w:t>
@@ -19708,6 +19995,7 @@
       <w:proofErr w:type="spellEnd"/>
       <w:r>
         <w:rPr>
+          <w:highlight w:val="green"/>
           <w:lang w:val="it-IT"/>
         </w:rPr>
         <w:t xml:space="preserve">, </w:t>
@@ -19715,6 +20003,7 @@
       <w:proofErr w:type="gramStart"/>
       <w:r>
         <w:rPr>
+          <w:highlight w:val="green"/>
           <w:lang w:val="it-IT"/>
         </w:rPr>
         <w:t>date)`</w:t>
@@ -19722,6 +20011,7 @@
       <w:proofErr w:type="gramEnd"/>
       <w:r>
         <w:rPr>
+          <w:highlight w:val="green"/>
           <w:lang w:val="it-IT"/>
         </w:rPr>
         <w:t xml:space="preserve"> </w:t>
@@ -19729,6 +20019,7 @@
       <w:proofErr w:type="spellStart"/>
       <w:r>
         <w:rPr>
+          <w:highlight w:val="green"/>
           <w:lang w:val="it-IT"/>
         </w:rPr>
         <w:t>unique</w:t>
@@ -19738,18 +20029,21 @@
     <w:p>
       <w:pPr>
         <w:rPr>
-          <w:lang w:val="it-IT"/>
-        </w:rPr>
-      </w:pPr>
-    </w:p>
-    <w:p>
-      <w:pPr>
-        <w:rPr>
-          <w:lang w:val="it-IT"/>
-        </w:rPr>
-      </w:pPr>
-      <w:r>
-        <w:rPr>
+          <w:highlight w:val="green"/>
+          <w:lang w:val="it-IT"/>
+        </w:rPr>
+      </w:pPr>
+    </w:p>
+    <w:p>
+      <w:pPr>
+        <w:rPr>
+          <w:highlight w:val="green"/>
+          <w:lang w:val="it-IT"/>
+        </w:rPr>
+      </w:pPr>
+      <w:r>
+        <w:rPr>
+          <w:highlight w:val="green"/>
           <w:lang w:val="it-IT"/>
         </w:rPr>
         <w:t>**</w:t>
@@ -19757,6 +20051,7 @@
       <w:proofErr w:type="spellStart"/>
       <w:r>
         <w:rPr>
+          <w:highlight w:val="green"/>
           <w:lang w:val="it-IT"/>
         </w:rPr>
         <w:t>Acceptance</w:t>
@@ -19764,6 +20059,7 @@
       <w:proofErr w:type="spellEnd"/>
       <w:r>
         <w:rPr>
+          <w:highlight w:val="green"/>
           <w:lang w:val="it-IT"/>
         </w:rPr>
         <w:t xml:space="preserve"> </w:t>
@@ -19772,6 +20068,7 @@
       <w:proofErr w:type="gramStart"/>
       <w:r>
         <w:rPr>
+          <w:highlight w:val="green"/>
           <w:lang w:val="it-IT"/>
         </w:rPr>
         <w:t>Criteria</w:t>
@@ -19779,6 +20076,7 @@
       <w:proofErr w:type="spellEnd"/>
       <w:r>
         <w:rPr>
+          <w:highlight w:val="green"/>
           <w:lang w:val="it-IT"/>
         </w:rPr>
         <w:t>:*</w:t>
@@ -19786,6 +20084,7 @@
       <w:proofErr w:type="gramEnd"/>
       <w:r>
         <w:rPr>
+          <w:highlight w:val="green"/>
           <w:lang w:val="it-IT"/>
         </w:rPr>
         <w:t>*</w:t>
@@ -19794,11 +20093,13 @@
     <w:p>
       <w:pPr>
         <w:rPr>
-          <w:lang w:val="it-IT"/>
-        </w:rPr>
-      </w:pPr>
-      <w:r>
-        <w:rPr>
+          <w:highlight w:val="green"/>
+          <w:lang w:val="it-IT"/>
+        </w:rPr>
+      </w:pPr>
+      <w:r>
+        <w:rPr>
+          <w:highlight w:val="green"/>
           <w:lang w:val="it-IT"/>
         </w:rPr>
         <w:t xml:space="preserve">- </w:t>
@@ -19806,6 +20107,7 @@
       <w:proofErr w:type="gramStart"/>
       <w:r>
         <w:rPr>
+          <w:highlight w:val="green"/>
           <w:lang w:val="it-IT"/>
         </w:rPr>
         <w:t>[ ]</w:t>
@@ -19813,6 +20115,7 @@
       <w:proofErr w:type="gramEnd"/>
       <w:r>
         <w:rPr>
+          <w:highlight w:val="green"/>
           <w:lang w:val="it-IT"/>
         </w:rPr>
         <w:t xml:space="preserve"> PK composta impedisce duplicati per </w:t>
@@ -19820,6 +20123,7 @@
       <w:proofErr w:type="spellStart"/>
       <w:r>
         <w:rPr>
+          <w:highlight w:val="green"/>
           <w:lang w:val="it-IT"/>
         </w:rPr>
         <w:t>ticker+data</w:t>
@@ -19829,11 +20133,13 @@
     <w:p>
       <w:pPr>
         <w:rPr>
-          <w:lang w:val="it-IT"/>
-        </w:rPr>
-      </w:pPr>
-      <w:r>
-        <w:rPr>
+          <w:highlight w:val="green"/>
+          <w:lang w:val="it-IT"/>
+        </w:rPr>
+      </w:pPr>
+      <w:r>
+        <w:rPr>
+          <w:highlight w:val="green"/>
           <w:lang w:val="it-IT"/>
         </w:rPr>
         <w:t xml:space="preserve">- </w:t>
@@ -19841,6 +20147,7 @@
       <w:proofErr w:type="gramStart"/>
       <w:r>
         <w:rPr>
+          <w:highlight w:val="green"/>
           <w:lang w:val="it-IT"/>
         </w:rPr>
         <w:t>[ ]</w:t>
@@ -19848,6 +20155,7 @@
       <w:proofErr w:type="gramEnd"/>
       <w:r>
         <w:rPr>
+          <w:highlight w:val="green"/>
           <w:lang w:val="it-IT"/>
         </w:rPr>
         <w:t xml:space="preserve"> Tutti i prezzi usano DECIMAL</w:t>
@@ -19856,11 +20164,13 @@
     <w:p>
       <w:pPr>
         <w:rPr>
-          <w:lang w:val="it-IT"/>
-        </w:rPr>
-      </w:pPr>
-      <w:r>
-        <w:rPr>
+          <w:highlight w:val="green"/>
+          <w:lang w:val="it-IT"/>
+        </w:rPr>
+      </w:pPr>
+      <w:r>
+        <w:rPr>
+          <w:highlight w:val="green"/>
           <w:lang w:val="it-IT"/>
         </w:rPr>
         <w:t xml:space="preserve">- </w:t>
@@ -19868,6 +20178,7 @@
       <w:proofErr w:type="gramStart"/>
       <w:r>
         <w:rPr>
+          <w:highlight w:val="green"/>
           <w:lang w:val="it-IT"/>
         </w:rPr>
         <w:t>[ ]</w:t>
@@ -19875,6 +20186,7 @@
       <w:proofErr w:type="gramEnd"/>
       <w:r>
         <w:rPr>
+          <w:highlight w:val="green"/>
           <w:lang w:val="it-IT"/>
         </w:rPr>
         <w:t xml:space="preserve"> Volume usa </w:t>
@@ -19882,6 +20194,7 @@
       <w:proofErr w:type="spellStart"/>
       <w:r>
         <w:rPr>
+          <w:highlight w:val="green"/>
           <w:lang w:val="it-IT"/>
         </w:rPr>
         <w:t>BigInteger</w:t>
@@ -19889,6 +20202,7 @@
       <w:proofErr w:type="spellEnd"/>
       <w:r>
         <w:rPr>
+          <w:highlight w:val="green"/>
           <w:lang w:val="it-IT"/>
         </w:rPr>
         <w:t xml:space="preserve"> per supportare valori grandi</w:t>
@@ -19902,6 +20216,7 @@
       </w:pPr>
       <w:r>
         <w:rPr>
+          <w:highlight w:val="green"/>
           <w:lang w:val="it-IT"/>
         </w:rPr>
         <w:t xml:space="preserve">- </w:t>
@@ -19909,6 +20224,7 @@
       <w:proofErr w:type="gramStart"/>
       <w:r>
         <w:rPr>
+          <w:highlight w:val="green"/>
           <w:lang w:val="it-IT"/>
         </w:rPr>
         <w:t>[ ]</w:t>
@@ -19916,6 +20232,7 @@
       <w:proofErr w:type="gramEnd"/>
       <w:r>
         <w:rPr>
+          <w:highlight w:val="green"/>
           <w:lang w:val="it-IT"/>
         </w:rPr>
         <w:t xml:space="preserve"> Metadati </w:t>
@@ -19923,6 +20240,7 @@
       <w:proofErr w:type="spellStart"/>
       <w:r>
         <w:rPr>
+          <w:highlight w:val="green"/>
           <w:lang w:val="it-IT"/>
         </w:rPr>
         <w:t>lineage</w:t>
@@ -19930,6 +20248,7 @@
       <w:proofErr w:type="spellEnd"/>
       <w:r>
         <w:rPr>
+          <w:highlight w:val="green"/>
           <w:lang w:val="it-IT"/>
         </w:rPr>
         <w:t xml:space="preserve"> presenti per audit</w:t>

</xml_diff>

<commit_message>
feat: Initialize TickerTracker v3.0 project with foundational backend setup and comprehensive development guidelines.
</commit_message>
<xml_diff>
--- a/Piano-operativo-v1.7.docx
+++ b/Piano-operativo-v1.7.docx
@@ -10300,23 +10300,73 @@
           <w:highlight w:val="green"/>
           <w:lang w:val="it-IT"/>
         </w:rPr>
-        <w:t>Implementare funzioni: addPercentage, subtractPercentage, </w:t>
-      </w:r>
-      <w:proofErr w:type="gramStart"/>
-      <w:r>
-        <w:rPr>
-          <w:highlight w:val="green"/>
-          <w:lang w:val="it-IT"/>
-        </w:rPr>
-        <w:t>formatPercentage(</w:t>
-      </w:r>
-      <w:proofErr w:type="gramEnd"/>
-      <w:r>
-        <w:rPr>
-          <w:highlight w:val="green"/>
-          <w:lang w:val="it-IT"/>
-        </w:rPr>
-        <w:t xml:space="preserve">percentage, </w:t>
+        <w:t>Implementare funzioni: </w:t>
+      </w:r>
+      <w:proofErr w:type="spellStart"/>
+      <w:r>
+        <w:rPr>
+          <w:highlight w:val="green"/>
+          <w:lang w:val="it-IT"/>
+        </w:rPr>
+        <w:t>addPercentage</w:t>
+      </w:r>
+      <w:proofErr w:type="spellEnd"/>
+      <w:r>
+        <w:rPr>
+          <w:highlight w:val="green"/>
+          <w:lang w:val="it-IT"/>
+        </w:rPr>
+        <w:t>, </w:t>
+      </w:r>
+      <w:proofErr w:type="spellStart"/>
+      <w:r>
+        <w:rPr>
+          <w:highlight w:val="green"/>
+          <w:lang w:val="it-IT"/>
+        </w:rPr>
+        <w:t>subtractPercentage</w:t>
+      </w:r>
+      <w:proofErr w:type="spellEnd"/>
+      <w:r>
+        <w:rPr>
+          <w:highlight w:val="green"/>
+          <w:lang w:val="it-IT"/>
+        </w:rPr>
+        <w:t>, </w:t>
+      </w:r>
+      <w:proofErr w:type="spellStart"/>
+      <w:proofErr w:type="gramStart"/>
+      <w:r>
+        <w:rPr>
+          <w:highlight w:val="green"/>
+          <w:lang w:val="it-IT"/>
+        </w:rPr>
+        <w:t>formatPercentage</w:t>
+      </w:r>
+      <w:proofErr w:type="spellEnd"/>
+      <w:r>
+        <w:rPr>
+          <w:highlight w:val="green"/>
+          <w:lang w:val="it-IT"/>
+        </w:rPr>
+        <w:t>(</w:t>
+      </w:r>
+      <w:proofErr w:type="spellStart"/>
+      <w:proofErr w:type="gramEnd"/>
+      <w:r>
+        <w:rPr>
+          <w:highlight w:val="green"/>
+          <w:lang w:val="it-IT"/>
+        </w:rPr>
+        <w:t>percentage</w:t>
+      </w:r>
+      <w:proofErr w:type="spellEnd"/>
+      <w:r>
+        <w:rPr>
+          <w:highlight w:val="green"/>
+          <w:lang w:val="it-IT"/>
+        </w:rPr>
+        <w:t xml:space="preserve">, </w:t>
       </w:r>
       <w:proofErr w:type="spellStart"/>
       <w:r>
@@ -20285,11 +20335,13 @@
     <w:p>
       <w:pPr>
         <w:rPr>
-          <w:lang w:val="it-IT"/>
-        </w:rPr>
-      </w:pPr>
-      <w:r>
-        <w:rPr>
+          <w:highlight w:val="green"/>
+          <w:lang w:val="it-IT"/>
+        </w:rPr>
+      </w:pPr>
+      <w:r>
+        <w:rPr>
+          <w:highlight w:val="green"/>
           <w:lang w:val="it-IT"/>
         </w:rPr>
         <w:t xml:space="preserve">## TASK 2.7: Definizione Modello </w:t>
@@ -20297,6 +20349,7 @@
       <w:proofErr w:type="spellStart"/>
       <w:r>
         <w:rPr>
+          <w:highlight w:val="green"/>
           <w:lang w:val="it-IT"/>
         </w:rPr>
         <w:t>SQLAlchemy</w:t>
@@ -20304,6 +20357,7 @@
       <w:proofErr w:type="spellEnd"/>
       <w:r>
         <w:rPr>
+          <w:highlight w:val="green"/>
           <w:lang w:val="it-IT"/>
         </w:rPr>
         <w:t xml:space="preserve"> - User e Role (RBAC Base)</w:t>
@@ -20312,18 +20366,21 @@
     <w:p>
       <w:pPr>
         <w:rPr>
-          <w:lang w:val="it-IT"/>
-        </w:rPr>
-      </w:pPr>
-    </w:p>
-    <w:p>
-      <w:pPr>
-        <w:rPr>
-          <w:lang w:val="it-IT"/>
-        </w:rPr>
-      </w:pPr>
-      <w:r>
-        <w:rPr>
+          <w:highlight w:val="green"/>
+          <w:lang w:val="it-IT"/>
+        </w:rPr>
+      </w:pPr>
+    </w:p>
+    <w:p>
+      <w:pPr>
+        <w:rPr>
+          <w:highlight w:val="green"/>
+          <w:lang w:val="it-IT"/>
+        </w:rPr>
+      </w:pPr>
+      <w:r>
+        <w:rPr>
+          <w:highlight w:val="green"/>
           <w:lang w:val="it-IT"/>
         </w:rPr>
         <w:t>**</w:t>
@@ -20331,6 +20388,7 @@
       <w:proofErr w:type="gramStart"/>
       <w:r>
         <w:rPr>
+          <w:highlight w:val="green"/>
           <w:lang w:val="it-IT"/>
         </w:rPr>
         <w:t>Descrizione:*</w:t>
@@ -20338,6 +20396,7 @@
       <w:proofErr w:type="gramEnd"/>
       <w:r>
         <w:rPr>
+          <w:highlight w:val="green"/>
           <w:lang w:val="it-IT"/>
         </w:rPr>
         <w:t xml:space="preserve">* Creare modelli per utenti e ruoli, preparando per </w:t>
@@ -20345,6 +20404,7 @@
       <w:proofErr w:type="gramStart"/>
       <w:r>
         <w:rPr>
+          <w:highlight w:val="green"/>
           <w:lang w:val="it-IT"/>
         </w:rPr>
         <w:t>multi-utente</w:t>
@@ -20352,6 +20412,7 @@
       <w:proofErr w:type="gramEnd"/>
       <w:r>
         <w:rPr>
+          <w:highlight w:val="green"/>
           <w:lang w:val="it-IT"/>
         </w:rPr>
         <w:t xml:space="preserve"> futuro.</w:t>
@@ -20360,131 +20421,235 @@
     <w:p>
       <w:pPr>
         <w:rPr>
-          <w:lang w:val="it-IT"/>
-        </w:rPr>
-      </w:pPr>
-    </w:p>
-    <w:p>
-      <w:r>
+          <w:highlight w:val="green"/>
+          <w:lang w:val="it-IT"/>
+        </w:rPr>
+      </w:pPr>
+    </w:p>
+    <w:p>
+      <w:pPr>
+        <w:rPr>
+          <w:highlight w:val="green"/>
+        </w:rPr>
+      </w:pPr>
+      <w:r>
+        <w:rPr>
+          <w:highlight w:val="green"/>
+        </w:rPr>
         <w:t>**</w:t>
       </w:r>
       <w:proofErr w:type="spellStart"/>
       <w:proofErr w:type="gramStart"/>
       <w:r>
+        <w:rPr>
+          <w:highlight w:val="green"/>
+        </w:rPr>
         <w:t>Microstep</w:t>
       </w:r>
       <w:proofErr w:type="spellEnd"/>
       <w:r>
+        <w:rPr>
+          <w:highlight w:val="green"/>
+        </w:rPr>
         <w:t>:*</w:t>
       </w:r>
       <w:proofErr w:type="gramEnd"/>
       <w:r>
+        <w:rPr>
+          <w:highlight w:val="green"/>
+        </w:rPr>
         <w:t>*</w:t>
       </w:r>
     </w:p>
     <w:p>
-      <w:r>
+      <w:pPr>
+        <w:rPr>
+          <w:highlight w:val="green"/>
+        </w:rPr>
+      </w:pPr>
+      <w:r>
+        <w:rPr>
+          <w:highlight w:val="green"/>
+        </w:rPr>
         <w:t xml:space="preserve">1. </w:t>
       </w:r>
       <w:proofErr w:type="spellStart"/>
       <w:r>
+        <w:rPr>
+          <w:highlight w:val="green"/>
+        </w:rPr>
         <w:t>Creare</w:t>
       </w:r>
       <w:proofErr w:type="spellEnd"/>
       <w:r>
+        <w:rPr>
+          <w:highlight w:val="green"/>
+        </w:rPr>
         <w:t xml:space="preserve"> file `backend/</w:t>
       </w:r>
       <w:proofErr w:type="spellStart"/>
       <w:r>
+        <w:rPr>
+          <w:highlight w:val="green"/>
+        </w:rPr>
         <w:t>src</w:t>
       </w:r>
       <w:proofErr w:type="spellEnd"/>
       <w:r>
+        <w:rPr>
+          <w:highlight w:val="green"/>
+        </w:rPr>
         <w:t>/shared/domain/user.py`</w:t>
       </w:r>
     </w:p>
     <w:p>
-      <w:r>
+      <w:pPr>
+        <w:rPr>
+          <w:highlight w:val="green"/>
+        </w:rPr>
+      </w:pPr>
+      <w:r>
+        <w:rPr>
+          <w:highlight w:val="green"/>
+        </w:rPr>
         <w:t xml:space="preserve">2. </w:t>
       </w:r>
       <w:proofErr w:type="spellStart"/>
       <w:r>
+        <w:rPr>
+          <w:highlight w:val="green"/>
+        </w:rPr>
         <w:t>Definire</w:t>
       </w:r>
       <w:proofErr w:type="spellEnd"/>
       <w:r>
+        <w:rPr>
+          <w:highlight w:val="green"/>
+        </w:rPr>
         <w:t xml:space="preserve"> Enum `</w:t>
       </w:r>
       <w:proofErr w:type="spellStart"/>
       <w:r>
+        <w:rPr>
+          <w:highlight w:val="green"/>
+        </w:rPr>
         <w:t>RoleType</w:t>
       </w:r>
       <w:proofErr w:type="spellEnd"/>
       <w:r>
+        <w:rPr>
+          <w:highlight w:val="green"/>
+        </w:rPr>
         <w:t>`: ADMIN, USER, READONLY</w:t>
       </w:r>
     </w:p>
     <w:p>
-      <w:r>
+      <w:pPr>
+        <w:rPr>
+          <w:highlight w:val="green"/>
+        </w:rPr>
+      </w:pPr>
+      <w:r>
+        <w:rPr>
+          <w:highlight w:val="green"/>
+        </w:rPr>
         <w:t xml:space="preserve">3. </w:t>
       </w:r>
       <w:proofErr w:type="spellStart"/>
       <w:r>
+        <w:rPr>
+          <w:highlight w:val="green"/>
+        </w:rPr>
         <w:t>Definire</w:t>
       </w:r>
       <w:proofErr w:type="spellEnd"/>
       <w:r>
+        <w:rPr>
+          <w:highlight w:val="green"/>
+        </w:rPr>
         <w:t xml:space="preserve"> </w:t>
       </w:r>
       <w:proofErr w:type="spellStart"/>
       <w:r>
+        <w:rPr>
+          <w:highlight w:val="green"/>
+        </w:rPr>
         <w:t>classe</w:t>
       </w:r>
       <w:proofErr w:type="spellEnd"/>
       <w:r>
+        <w:rPr>
+          <w:highlight w:val="green"/>
+        </w:rPr>
         <w:t xml:space="preserve"> `User`: `id` (UUID), `email` (String, unique), `</w:t>
       </w:r>
       <w:proofErr w:type="spellStart"/>
       <w:r>
+        <w:rPr>
+          <w:highlight w:val="green"/>
+        </w:rPr>
         <w:t>hashed_password</w:t>
       </w:r>
       <w:proofErr w:type="spellEnd"/>
       <w:r>
+        <w:rPr>
+          <w:highlight w:val="green"/>
+        </w:rPr>
         <w:t>` (String, nullable), `</w:t>
       </w:r>
       <w:proofErr w:type="spellStart"/>
       <w:r>
+        <w:rPr>
+          <w:highlight w:val="green"/>
+        </w:rPr>
         <w:t>is_active</w:t>
       </w:r>
       <w:proofErr w:type="spellEnd"/>
       <w:r>
+        <w:rPr>
+          <w:highlight w:val="green"/>
+        </w:rPr>
         <w:t>` (Boolean), `</w:t>
       </w:r>
       <w:proofErr w:type="spellStart"/>
       <w:r>
+        <w:rPr>
+          <w:highlight w:val="green"/>
+        </w:rPr>
         <w:t>created_at</w:t>
       </w:r>
       <w:proofErr w:type="spellEnd"/>
       <w:r>
+        <w:rPr>
+          <w:highlight w:val="green"/>
+        </w:rPr>
         <w:t>`, `</w:t>
       </w:r>
       <w:proofErr w:type="spellStart"/>
       <w:r>
+        <w:rPr>
+          <w:highlight w:val="green"/>
+        </w:rPr>
         <w:t>updated_at</w:t>
       </w:r>
       <w:proofErr w:type="spellEnd"/>
       <w:r>
+        <w:rPr>
+          <w:highlight w:val="green"/>
+        </w:rPr>
         <w:t>`</w:t>
       </w:r>
     </w:p>
     <w:p>
       <w:pPr>
         <w:rPr>
-          <w:lang w:val="it-IT"/>
-        </w:rPr>
-      </w:pPr>
-      <w:r>
-        <w:rPr>
+          <w:highlight w:val="green"/>
+          <w:lang w:val="it-IT"/>
+        </w:rPr>
+      </w:pPr>
+      <w:r>
+        <w:rPr>
+          <w:highlight w:val="green"/>
           <w:lang w:val="it-IT"/>
         </w:rPr>
         <w:t>4. Definire classe `Role`: `id` (UUID), `name` (</w:t>
@@ -20492,6 +20657,7 @@
       <w:proofErr w:type="spellStart"/>
       <w:r>
         <w:rPr>
+          <w:highlight w:val="green"/>
           <w:lang w:val="it-IT"/>
         </w:rPr>
         <w:t>RoleType</w:t>
@@ -20499,6 +20665,7 @@
       <w:proofErr w:type="spellEnd"/>
       <w:r>
         <w:rPr>
+          <w:highlight w:val="green"/>
           <w:lang w:val="it-IT"/>
         </w:rPr>
         <w:t>), `</w:t>
@@ -20506,6 +20673,7 @@
       <w:proofErr w:type="spellStart"/>
       <w:r>
         <w:rPr>
+          <w:highlight w:val="green"/>
           <w:lang w:val="it-IT"/>
         </w:rPr>
         <w:t>description</w:t>
@@ -20513,6 +20681,7 @@
       <w:proofErr w:type="spellEnd"/>
       <w:r>
         <w:rPr>
+          <w:highlight w:val="green"/>
           <w:lang w:val="it-IT"/>
         </w:rPr>
         <w:t>` (String)</w:t>
@@ -20521,11 +20690,13 @@
     <w:p>
       <w:pPr>
         <w:rPr>
-          <w:lang w:val="it-IT"/>
-        </w:rPr>
-      </w:pPr>
-      <w:r>
-        <w:rPr>
+          <w:highlight w:val="green"/>
+          <w:lang w:val="it-IT"/>
+        </w:rPr>
+      </w:pPr>
+      <w:r>
+        <w:rPr>
+          <w:highlight w:val="green"/>
           <w:lang w:val="it-IT"/>
         </w:rPr>
         <w:t>5. Definire tabella associativa `</w:t>
@@ -20533,6 +20704,7 @@
       <w:proofErr w:type="spellStart"/>
       <w:r>
         <w:rPr>
+          <w:highlight w:val="green"/>
           <w:lang w:val="it-IT"/>
         </w:rPr>
         <w:t>user_roles</w:t>
@@ -20540,6 +20712,7 @@
       <w:proofErr w:type="spellEnd"/>
       <w:r>
         <w:rPr>
+          <w:highlight w:val="green"/>
           <w:lang w:val="it-IT"/>
         </w:rPr>
         <w:t xml:space="preserve">` per relazione </w:t>
@@ -20547,6 +20720,7 @@
       <w:proofErr w:type="spellStart"/>
       <w:r>
         <w:rPr>
+          <w:highlight w:val="green"/>
           <w:lang w:val="it-IT"/>
         </w:rPr>
         <w:t>many</w:t>
@@ -20554,6 +20728,7 @@
       <w:proofErr w:type="spellEnd"/>
       <w:r>
         <w:rPr>
+          <w:highlight w:val="green"/>
           <w:lang w:val="it-IT"/>
         </w:rPr>
         <w:t>-to-</w:t>
@@ -20561,6 +20736,7 @@
       <w:proofErr w:type="spellStart"/>
       <w:r>
         <w:rPr>
+          <w:highlight w:val="green"/>
           <w:lang w:val="it-IT"/>
         </w:rPr>
         <w:t>many</w:t>
@@ -20570,11 +20746,13 @@
     <w:p>
       <w:pPr>
         <w:rPr>
-          <w:lang w:val="it-IT"/>
-        </w:rPr>
-      </w:pPr>
-      <w:r>
-        <w:rPr>
+          <w:highlight w:val="green"/>
+          <w:lang w:val="it-IT"/>
+        </w:rPr>
+      </w:pPr>
+      <w:r>
+        <w:rPr>
+          <w:highlight w:val="green"/>
           <w:lang w:val="it-IT"/>
         </w:rPr>
         <w:t>6. Definire relazioni bidirezionali User &lt;-&gt; Role</w:t>
@@ -20583,18 +20761,21 @@
     <w:p>
       <w:pPr>
         <w:rPr>
-          <w:lang w:val="it-IT"/>
-        </w:rPr>
-      </w:pPr>
-    </w:p>
-    <w:p>
-      <w:pPr>
-        <w:rPr>
-          <w:lang w:val="it-IT"/>
-        </w:rPr>
-      </w:pPr>
-      <w:r>
-        <w:rPr>
+          <w:highlight w:val="green"/>
+          <w:lang w:val="it-IT"/>
+        </w:rPr>
+      </w:pPr>
+    </w:p>
+    <w:p>
+      <w:pPr>
+        <w:rPr>
+          <w:highlight w:val="green"/>
+          <w:lang w:val="it-IT"/>
+        </w:rPr>
+      </w:pPr>
+      <w:r>
+        <w:rPr>
+          <w:highlight w:val="green"/>
           <w:lang w:val="it-IT"/>
         </w:rPr>
         <w:t>**</w:t>
@@ -20602,6 +20783,7 @@
       <w:proofErr w:type="spellStart"/>
       <w:r>
         <w:rPr>
+          <w:highlight w:val="green"/>
           <w:lang w:val="it-IT"/>
         </w:rPr>
         <w:t>Acceptance</w:t>
@@ -20609,6 +20791,7 @@
       <w:proofErr w:type="spellEnd"/>
       <w:r>
         <w:rPr>
+          <w:highlight w:val="green"/>
           <w:lang w:val="it-IT"/>
         </w:rPr>
         <w:t xml:space="preserve"> </w:t>
@@ -20617,6 +20800,7 @@
       <w:proofErr w:type="gramStart"/>
       <w:r>
         <w:rPr>
+          <w:highlight w:val="green"/>
           <w:lang w:val="it-IT"/>
         </w:rPr>
         <w:t>Criteria</w:t>
@@ -20624,6 +20808,7 @@
       <w:proofErr w:type="spellEnd"/>
       <w:r>
         <w:rPr>
+          <w:highlight w:val="green"/>
           <w:lang w:val="it-IT"/>
         </w:rPr>
         <w:t>:*</w:t>
@@ -20631,6 +20816,7 @@
       <w:proofErr w:type="gramEnd"/>
       <w:r>
         <w:rPr>
+          <w:highlight w:val="green"/>
           <w:lang w:val="it-IT"/>
         </w:rPr>
         <w:t>*</w:t>
@@ -20639,11 +20825,13 @@
     <w:p>
       <w:pPr>
         <w:rPr>
-          <w:lang w:val="it-IT"/>
-        </w:rPr>
-      </w:pPr>
-      <w:r>
-        <w:rPr>
+          <w:highlight w:val="green"/>
+          <w:lang w:val="it-IT"/>
+        </w:rPr>
+      </w:pPr>
+      <w:r>
+        <w:rPr>
+          <w:highlight w:val="green"/>
           <w:lang w:val="it-IT"/>
         </w:rPr>
         <w:t xml:space="preserve">- </w:t>
@@ -20651,6 +20839,7 @@
       <w:proofErr w:type="gramStart"/>
       <w:r>
         <w:rPr>
+          <w:highlight w:val="green"/>
           <w:lang w:val="it-IT"/>
         </w:rPr>
         <w:t>[ ]</w:t>
@@ -20658,6 +20847,7 @@
       <w:proofErr w:type="gramEnd"/>
       <w:r>
         <w:rPr>
+          <w:highlight w:val="green"/>
           <w:lang w:val="it-IT"/>
         </w:rPr>
         <w:t xml:space="preserve"> Password mai salvata in chiaro (campo per </w:t>
@@ -20665,6 +20855,7 @@
       <w:proofErr w:type="spellStart"/>
       <w:r>
         <w:rPr>
+          <w:highlight w:val="green"/>
           <w:lang w:val="it-IT"/>
         </w:rPr>
         <w:t>hash</w:t>
@@ -20672,6 +20863,7 @@
       <w:proofErr w:type="spellEnd"/>
       <w:r>
         <w:rPr>
+          <w:highlight w:val="green"/>
           <w:lang w:val="it-IT"/>
         </w:rPr>
         <w:t>)</w:t>
@@ -20680,11 +20872,13 @@
     <w:p>
       <w:pPr>
         <w:rPr>
-          <w:lang w:val="it-IT"/>
-        </w:rPr>
-      </w:pPr>
-      <w:r>
-        <w:rPr>
+          <w:highlight w:val="green"/>
+          <w:lang w:val="it-IT"/>
+        </w:rPr>
+      </w:pPr>
+      <w:r>
+        <w:rPr>
+          <w:highlight w:val="green"/>
           <w:lang w:val="it-IT"/>
         </w:rPr>
         <w:t xml:space="preserve">- </w:t>
@@ -20692,6 +20886,7 @@
       <w:proofErr w:type="gramStart"/>
       <w:r>
         <w:rPr>
+          <w:highlight w:val="green"/>
           <w:lang w:val="it-IT"/>
         </w:rPr>
         <w:t>[ ]</w:t>
@@ -20699,6 +20894,7 @@
       <w:proofErr w:type="gramEnd"/>
       <w:r>
         <w:rPr>
+          <w:highlight w:val="green"/>
           <w:lang w:val="it-IT"/>
         </w:rPr>
         <w:t xml:space="preserve"> Relazione </w:t>
@@ -20706,6 +20902,7 @@
       <w:proofErr w:type="spellStart"/>
       <w:r>
         <w:rPr>
+          <w:highlight w:val="green"/>
           <w:lang w:val="it-IT"/>
         </w:rPr>
         <w:t>many</w:t>
@@ -20713,6 +20910,7 @@
       <w:proofErr w:type="spellEnd"/>
       <w:r>
         <w:rPr>
+          <w:highlight w:val="green"/>
           <w:lang w:val="it-IT"/>
         </w:rPr>
         <w:t>-to-</w:t>
@@ -20720,6 +20918,7 @@
       <w:proofErr w:type="spellStart"/>
       <w:r>
         <w:rPr>
+          <w:highlight w:val="green"/>
           <w:lang w:val="it-IT"/>
         </w:rPr>
         <w:t>many</w:t>
@@ -20727,6 +20926,7 @@
       <w:proofErr w:type="spellEnd"/>
       <w:r>
         <w:rPr>
+          <w:highlight w:val="green"/>
           <w:lang w:val="it-IT"/>
         </w:rPr>
         <w:t xml:space="preserve"> funzionante</w:t>
@@ -20735,11 +20935,13 @@
     <w:p>
       <w:pPr>
         <w:rPr>
-          <w:lang w:val="it-IT"/>
-        </w:rPr>
-      </w:pPr>
-      <w:r>
-        <w:rPr>
+          <w:highlight w:val="green"/>
+          <w:lang w:val="it-IT"/>
+        </w:rPr>
+      </w:pPr>
+      <w:r>
+        <w:rPr>
+          <w:highlight w:val="green"/>
           <w:lang w:val="it-IT"/>
         </w:rPr>
         <w:t xml:space="preserve">- </w:t>
@@ -20747,6 +20949,7 @@
       <w:proofErr w:type="gramStart"/>
       <w:r>
         <w:rPr>
+          <w:highlight w:val="green"/>
           <w:lang w:val="it-IT"/>
         </w:rPr>
         <w:t>[ ]</w:t>
@@ -20754,6 +20957,7 @@
       <w:proofErr w:type="gramEnd"/>
       <w:r>
         <w:rPr>
+          <w:highlight w:val="green"/>
           <w:lang w:val="it-IT"/>
         </w:rPr>
         <w:t xml:space="preserve"> Ruoli base definiti</w:t>
@@ -20767,6 +20971,7 @@
       </w:pPr>
       <w:r>
         <w:rPr>
+          <w:highlight w:val="green"/>
           <w:lang w:val="it-IT"/>
         </w:rPr>
         <w:t xml:space="preserve">- </w:t>
@@ -20774,6 +20979,7 @@
       <w:proofErr w:type="gramStart"/>
       <w:r>
         <w:rPr>
+          <w:highlight w:val="green"/>
           <w:lang w:val="it-IT"/>
         </w:rPr>
         <w:t>[ ]</w:t>
@@ -20781,6 +20987,7 @@
       <w:proofErr w:type="gramEnd"/>
       <w:r>
         <w:rPr>
+          <w:highlight w:val="green"/>
           <w:lang w:val="it-IT"/>
         </w:rPr>
         <w:t xml:space="preserve"> Utente può avere multipli ruoli</w:t>
@@ -20816,11 +21023,13 @@
     <w:p>
       <w:pPr>
         <w:rPr>
-          <w:lang w:val="it-IT"/>
-        </w:rPr>
-      </w:pPr>
-      <w:r>
-        <w:rPr>
+          <w:highlight w:val="green"/>
+          <w:lang w:val="it-IT"/>
+        </w:rPr>
+      </w:pPr>
+      <w:r>
+        <w:rPr>
+          <w:highlight w:val="green"/>
           <w:lang w:val="it-IT"/>
         </w:rPr>
         <w:t xml:space="preserve">## TASK 2.8: Definizione Modello </w:t>
@@ -20828,6 +21037,7 @@
       <w:proofErr w:type="spellStart"/>
       <w:r>
         <w:rPr>
+          <w:highlight w:val="green"/>
           <w:lang w:val="it-IT"/>
         </w:rPr>
         <w:t>SQLAlchemy</w:t>
@@ -20835,6 +21045,7 @@
       <w:proofErr w:type="spellEnd"/>
       <w:r>
         <w:rPr>
+          <w:highlight w:val="green"/>
           <w:lang w:val="it-IT"/>
         </w:rPr>
         <w:t xml:space="preserve"> - </w:t>
@@ -20842,6 +21053,7 @@
       <w:proofErr w:type="spellStart"/>
       <w:r>
         <w:rPr>
+          <w:highlight w:val="green"/>
           <w:lang w:val="it-IT"/>
         </w:rPr>
         <w:t>SyncJob</w:t>
@@ -20851,18 +21063,21 @@
     <w:p>
       <w:pPr>
         <w:rPr>
-          <w:lang w:val="it-IT"/>
-        </w:rPr>
-      </w:pPr>
-    </w:p>
-    <w:p>
-      <w:pPr>
-        <w:rPr>
-          <w:lang w:val="it-IT"/>
-        </w:rPr>
-      </w:pPr>
-      <w:r>
-        <w:rPr>
+          <w:highlight w:val="green"/>
+          <w:lang w:val="it-IT"/>
+        </w:rPr>
+      </w:pPr>
+    </w:p>
+    <w:p>
+      <w:pPr>
+        <w:rPr>
+          <w:highlight w:val="green"/>
+          <w:lang w:val="it-IT"/>
+        </w:rPr>
+      </w:pPr>
+      <w:r>
+        <w:rPr>
+          <w:highlight w:val="green"/>
           <w:lang w:val="it-IT"/>
         </w:rPr>
         <w:t>**</w:t>
@@ -20870,6 +21085,7 @@
       <w:proofErr w:type="gramStart"/>
       <w:r>
         <w:rPr>
+          <w:highlight w:val="green"/>
           <w:lang w:val="it-IT"/>
         </w:rPr>
         <w:t>Descrizione:*</w:t>
@@ -20877,6 +21093,7 @@
       <w:proofErr w:type="gramEnd"/>
       <w:r>
         <w:rPr>
+          <w:highlight w:val="green"/>
           <w:lang w:val="it-IT"/>
         </w:rPr>
         <w:t>* Creare modello per tracciare i job di sincronizzazione con Google Drive.</w:t>
@@ -20885,192 +21102,346 @@
     <w:p>
       <w:pPr>
         <w:rPr>
-          <w:lang w:val="it-IT"/>
-        </w:rPr>
-      </w:pPr>
-    </w:p>
-    <w:p>
-      <w:r>
+          <w:highlight w:val="green"/>
+          <w:lang w:val="it-IT"/>
+        </w:rPr>
+      </w:pPr>
+    </w:p>
+    <w:p>
+      <w:pPr>
+        <w:rPr>
+          <w:highlight w:val="green"/>
+        </w:rPr>
+      </w:pPr>
+      <w:r>
+        <w:rPr>
+          <w:highlight w:val="green"/>
+        </w:rPr>
         <w:t>**</w:t>
       </w:r>
       <w:proofErr w:type="spellStart"/>
       <w:proofErr w:type="gramStart"/>
       <w:r>
+        <w:rPr>
+          <w:highlight w:val="green"/>
+        </w:rPr>
         <w:t>Microstep</w:t>
       </w:r>
       <w:proofErr w:type="spellEnd"/>
       <w:r>
+        <w:rPr>
+          <w:highlight w:val="green"/>
+        </w:rPr>
         <w:t>:*</w:t>
       </w:r>
       <w:proofErr w:type="gramEnd"/>
       <w:r>
+        <w:rPr>
+          <w:highlight w:val="green"/>
+        </w:rPr>
         <w:t>*</w:t>
       </w:r>
     </w:p>
     <w:p>
-      <w:r>
+      <w:pPr>
+        <w:rPr>
+          <w:highlight w:val="green"/>
+        </w:rPr>
+      </w:pPr>
+      <w:r>
+        <w:rPr>
+          <w:highlight w:val="green"/>
+        </w:rPr>
         <w:t xml:space="preserve">1. </w:t>
       </w:r>
       <w:proofErr w:type="spellStart"/>
       <w:r>
+        <w:rPr>
+          <w:highlight w:val="green"/>
+        </w:rPr>
         <w:t>Creare</w:t>
       </w:r>
       <w:proofErr w:type="spellEnd"/>
       <w:r>
+        <w:rPr>
+          <w:highlight w:val="green"/>
+        </w:rPr>
         <w:t xml:space="preserve"> file `backend/</w:t>
       </w:r>
       <w:proofErr w:type="spellStart"/>
       <w:r>
+        <w:rPr>
+          <w:highlight w:val="green"/>
+        </w:rPr>
         <w:t>src</w:t>
       </w:r>
       <w:proofErr w:type="spellEnd"/>
       <w:r>
+        <w:rPr>
+          <w:highlight w:val="green"/>
+        </w:rPr>
         <w:t>/sync/domain/entities.py`</w:t>
       </w:r>
     </w:p>
     <w:p>
-      <w:r>
+      <w:pPr>
+        <w:rPr>
+          <w:highlight w:val="green"/>
+        </w:rPr>
+      </w:pPr>
+      <w:r>
+        <w:rPr>
+          <w:highlight w:val="green"/>
+        </w:rPr>
         <w:t xml:space="preserve">2. </w:t>
       </w:r>
       <w:proofErr w:type="spellStart"/>
       <w:r>
+        <w:rPr>
+          <w:highlight w:val="green"/>
+        </w:rPr>
         <w:t>Definire</w:t>
       </w:r>
       <w:proofErr w:type="spellEnd"/>
       <w:r>
+        <w:rPr>
+          <w:highlight w:val="green"/>
+        </w:rPr>
         <w:t xml:space="preserve"> Enum `</w:t>
       </w:r>
       <w:proofErr w:type="spellStart"/>
       <w:r>
+        <w:rPr>
+          <w:highlight w:val="green"/>
+        </w:rPr>
         <w:t>SyncJobType</w:t>
       </w:r>
       <w:proofErr w:type="spellEnd"/>
       <w:r>
+        <w:rPr>
+          <w:highlight w:val="green"/>
+        </w:rPr>
         <w:t>`: INITIAL_IMPORT, DAILY_HISTORY_UPDATE, ON_ESTIMATE_SAVE, MANUAL_SYNC</w:t>
       </w:r>
     </w:p>
     <w:p>
-      <w:r>
+      <w:pPr>
+        <w:rPr>
+          <w:highlight w:val="green"/>
+        </w:rPr>
+      </w:pPr>
+      <w:r>
+        <w:rPr>
+          <w:highlight w:val="green"/>
+        </w:rPr>
         <w:t xml:space="preserve">3. </w:t>
       </w:r>
       <w:proofErr w:type="spellStart"/>
       <w:r>
+        <w:rPr>
+          <w:highlight w:val="green"/>
+        </w:rPr>
         <w:t>Definire</w:t>
       </w:r>
       <w:proofErr w:type="spellEnd"/>
       <w:r>
+        <w:rPr>
+          <w:highlight w:val="green"/>
+        </w:rPr>
         <w:t xml:space="preserve"> Enum `</w:t>
       </w:r>
       <w:proofErr w:type="spellStart"/>
       <w:r>
+        <w:rPr>
+          <w:highlight w:val="green"/>
+        </w:rPr>
         <w:t>SyncJobStatus</w:t>
       </w:r>
       <w:proofErr w:type="spellEnd"/>
       <w:r>
+        <w:rPr>
+          <w:highlight w:val="green"/>
+        </w:rPr>
         <w:t>`: PENDING, RUNNING, COMPLETED, FAILED, PARTIAL</w:t>
       </w:r>
     </w:p>
     <w:p>
-      <w:r>
+      <w:pPr>
+        <w:rPr>
+          <w:highlight w:val="green"/>
+        </w:rPr>
+      </w:pPr>
+      <w:r>
+        <w:rPr>
+          <w:highlight w:val="green"/>
+        </w:rPr>
         <w:t xml:space="preserve">4. </w:t>
       </w:r>
       <w:proofErr w:type="spellStart"/>
       <w:r>
+        <w:rPr>
+          <w:highlight w:val="green"/>
+        </w:rPr>
         <w:t>Definire</w:t>
       </w:r>
       <w:proofErr w:type="spellEnd"/>
       <w:r>
+        <w:rPr>
+          <w:highlight w:val="green"/>
+        </w:rPr>
         <w:t xml:space="preserve"> </w:t>
       </w:r>
       <w:proofErr w:type="spellStart"/>
       <w:r>
+        <w:rPr>
+          <w:highlight w:val="green"/>
+        </w:rPr>
         <w:t>classe</w:t>
       </w:r>
       <w:proofErr w:type="spellEnd"/>
       <w:r>
+        <w:rPr>
+          <w:highlight w:val="green"/>
+        </w:rPr>
         <w:t xml:space="preserve"> `</w:t>
       </w:r>
       <w:proofErr w:type="spellStart"/>
       <w:r>
+        <w:rPr>
+          <w:highlight w:val="green"/>
+        </w:rPr>
         <w:t>SyncJob</w:t>
       </w:r>
       <w:proofErr w:type="spellEnd"/>
       <w:r>
+        <w:rPr>
+          <w:highlight w:val="green"/>
+        </w:rPr>
         <w:t>`: `id` (UUID), `</w:t>
       </w:r>
       <w:proofErr w:type="spellStart"/>
       <w:r>
+        <w:rPr>
+          <w:highlight w:val="green"/>
+        </w:rPr>
         <w:t>job_type</w:t>
       </w:r>
       <w:proofErr w:type="spellEnd"/>
       <w:r>
+        <w:rPr>
+          <w:highlight w:val="green"/>
+        </w:rPr>
         <w:t>` (Enum), `status` (Enum), `</w:t>
       </w:r>
       <w:proofErr w:type="spellStart"/>
       <w:r>
+        <w:rPr>
+          <w:highlight w:val="green"/>
+        </w:rPr>
         <w:t>started_at</w:t>
       </w:r>
       <w:proofErr w:type="spellEnd"/>
       <w:r>
+        <w:rPr>
+          <w:highlight w:val="green"/>
+        </w:rPr>
         <w:t>`, `</w:t>
       </w:r>
       <w:proofErr w:type="spellStart"/>
       <w:r>
+        <w:rPr>
+          <w:highlight w:val="green"/>
+        </w:rPr>
         <w:t>finished_at</w:t>
       </w:r>
       <w:proofErr w:type="spellEnd"/>
       <w:r>
+        <w:rPr>
+          <w:highlight w:val="green"/>
+        </w:rPr>
         <w:t>` (nullable), `</w:t>
       </w:r>
       <w:proofErr w:type="spellStart"/>
       <w:r>
+        <w:rPr>
+          <w:highlight w:val="green"/>
+        </w:rPr>
         <w:t>error_message</w:t>
       </w:r>
       <w:proofErr w:type="spellEnd"/>
       <w:r>
+        <w:rPr>
+          <w:highlight w:val="green"/>
+        </w:rPr>
         <w:t>` (Text, nullable), `filename` (String), `</w:t>
       </w:r>
       <w:proofErr w:type="spellStart"/>
       <w:r>
+        <w:rPr>
+          <w:highlight w:val="green"/>
+        </w:rPr>
         <w:t>checksum_before</w:t>
       </w:r>
       <w:proofErr w:type="spellEnd"/>
       <w:r>
+        <w:rPr>
+          <w:highlight w:val="green"/>
+        </w:rPr>
         <w:t>` (String), `</w:t>
       </w:r>
       <w:proofErr w:type="spellStart"/>
       <w:r>
+        <w:rPr>
+          <w:highlight w:val="green"/>
+        </w:rPr>
         <w:t>checksum_after</w:t>
       </w:r>
       <w:proofErr w:type="spellEnd"/>
       <w:r>
+        <w:rPr>
+          <w:highlight w:val="green"/>
+        </w:rPr>
         <w:t>` (String), `</w:t>
       </w:r>
       <w:proofErr w:type="spellStart"/>
       <w:r>
+        <w:rPr>
+          <w:highlight w:val="green"/>
+        </w:rPr>
         <w:t>records_processed</w:t>
       </w:r>
       <w:proofErr w:type="spellEnd"/>
       <w:r>
+        <w:rPr>
+          <w:highlight w:val="green"/>
+        </w:rPr>
         <w:t>` (Integer), `</w:t>
       </w:r>
       <w:proofErr w:type="spellStart"/>
       <w:r>
+        <w:rPr>
+          <w:highlight w:val="green"/>
+        </w:rPr>
         <w:t>records_failed</w:t>
       </w:r>
       <w:proofErr w:type="spellEnd"/>
       <w:r>
+        <w:rPr>
+          <w:highlight w:val="green"/>
+        </w:rPr>
         <w:t>` (Integer)</w:t>
       </w:r>
     </w:p>
     <w:p>
       <w:pPr>
         <w:rPr>
-          <w:lang w:val="it-IT"/>
-        </w:rPr>
-      </w:pPr>
-      <w:r>
-        <w:rPr>
+          <w:highlight w:val="green"/>
+          <w:lang w:val="it-IT"/>
+        </w:rPr>
+      </w:pPr>
+      <w:r>
+        <w:rPr>
+          <w:highlight w:val="green"/>
           <w:lang w:val="it-IT"/>
         </w:rPr>
         <w:t>5. Definire indice su `</w:t>
@@ -21078,6 +21449,7 @@
       <w:proofErr w:type="spellStart"/>
       <w:r>
         <w:rPr>
+          <w:highlight w:val="green"/>
           <w:lang w:val="it-IT"/>
         </w:rPr>
         <w:t>started_at</w:t>
@@ -21085,6 +21457,7 @@
       <w:proofErr w:type="spellEnd"/>
       <w:r>
         <w:rPr>
+          <w:highlight w:val="green"/>
           <w:lang w:val="it-IT"/>
         </w:rPr>
         <w:t>` per ordinamento cronologico</w:t>
@@ -21093,18 +21466,21 @@
     <w:p>
       <w:pPr>
         <w:rPr>
-          <w:lang w:val="it-IT"/>
-        </w:rPr>
-      </w:pPr>
-    </w:p>
-    <w:p>
-      <w:pPr>
-        <w:rPr>
-          <w:lang w:val="it-IT"/>
-        </w:rPr>
-      </w:pPr>
-      <w:r>
-        <w:rPr>
+          <w:highlight w:val="green"/>
+          <w:lang w:val="it-IT"/>
+        </w:rPr>
+      </w:pPr>
+    </w:p>
+    <w:p>
+      <w:pPr>
+        <w:rPr>
+          <w:highlight w:val="green"/>
+          <w:lang w:val="it-IT"/>
+        </w:rPr>
+      </w:pPr>
+      <w:r>
+        <w:rPr>
+          <w:highlight w:val="green"/>
           <w:lang w:val="it-IT"/>
         </w:rPr>
         <w:t>**</w:t>
@@ -21112,6 +21488,7 @@
       <w:proofErr w:type="spellStart"/>
       <w:r>
         <w:rPr>
+          <w:highlight w:val="green"/>
           <w:lang w:val="it-IT"/>
         </w:rPr>
         <w:t>Acceptance</w:t>
@@ -21119,6 +21496,7 @@
       <w:proofErr w:type="spellEnd"/>
       <w:r>
         <w:rPr>
+          <w:highlight w:val="green"/>
           <w:lang w:val="it-IT"/>
         </w:rPr>
         <w:t xml:space="preserve"> </w:t>
@@ -21127,6 +21505,7 @@
       <w:proofErr w:type="gramStart"/>
       <w:r>
         <w:rPr>
+          <w:highlight w:val="green"/>
           <w:lang w:val="it-IT"/>
         </w:rPr>
         <w:t>Criteria</w:t>
@@ -21134,6 +21513,7 @@
       <w:proofErr w:type="spellEnd"/>
       <w:r>
         <w:rPr>
+          <w:highlight w:val="green"/>
           <w:lang w:val="it-IT"/>
         </w:rPr>
         <w:t>:*</w:t>
@@ -21141,6 +21521,7 @@
       <w:proofErr w:type="gramEnd"/>
       <w:r>
         <w:rPr>
+          <w:highlight w:val="green"/>
           <w:lang w:val="it-IT"/>
         </w:rPr>
         <w:t>*</w:t>
@@ -21149,11 +21530,13 @@
     <w:p>
       <w:pPr>
         <w:rPr>
-          <w:lang w:val="it-IT"/>
-        </w:rPr>
-      </w:pPr>
-      <w:r>
-        <w:rPr>
+          <w:highlight w:val="green"/>
+          <w:lang w:val="it-IT"/>
+        </w:rPr>
+      </w:pPr>
+      <w:r>
+        <w:rPr>
+          <w:highlight w:val="green"/>
           <w:lang w:val="it-IT"/>
         </w:rPr>
         <w:t xml:space="preserve">- </w:t>
@@ -21161,6 +21544,7 @@
       <w:proofErr w:type="gramStart"/>
       <w:r>
         <w:rPr>
+          <w:highlight w:val="green"/>
           <w:lang w:val="it-IT"/>
         </w:rPr>
         <w:t>[ ]</w:t>
@@ -21168,6 +21552,7 @@
       <w:proofErr w:type="gramEnd"/>
       <w:r>
         <w:rPr>
+          <w:highlight w:val="green"/>
           <w:lang w:val="it-IT"/>
         </w:rPr>
         <w:t xml:space="preserve"> Tutti i tipi di job rappresentati</w:t>
@@ -21176,11 +21561,13 @@
     <w:p>
       <w:pPr>
         <w:rPr>
-          <w:lang w:val="it-IT"/>
-        </w:rPr>
-      </w:pPr>
-      <w:r>
-        <w:rPr>
+          <w:highlight w:val="green"/>
+          <w:lang w:val="it-IT"/>
+        </w:rPr>
+      </w:pPr>
+      <w:r>
+        <w:rPr>
+          <w:highlight w:val="green"/>
           <w:lang w:val="it-IT"/>
         </w:rPr>
         <w:t xml:space="preserve">- </w:t>
@@ -21188,6 +21575,7 @@
       <w:proofErr w:type="gramStart"/>
       <w:r>
         <w:rPr>
+          <w:highlight w:val="green"/>
           <w:lang w:val="it-IT"/>
         </w:rPr>
         <w:t>[ ]</w:t>
@@ -21195,6 +21583,7 @@
       <w:proofErr w:type="gramEnd"/>
       <w:r>
         <w:rPr>
+          <w:highlight w:val="green"/>
           <w:lang w:val="it-IT"/>
         </w:rPr>
         <w:t xml:space="preserve"> Stati permettono tracking completo del ciclo di vita</w:t>
@@ -21203,11 +21592,13 @@
     <w:p>
       <w:pPr>
         <w:rPr>
-          <w:lang w:val="it-IT"/>
-        </w:rPr>
-      </w:pPr>
-      <w:r>
-        <w:rPr>
+          <w:highlight w:val="green"/>
+          <w:lang w:val="it-IT"/>
+        </w:rPr>
+      </w:pPr>
+      <w:r>
+        <w:rPr>
+          <w:highlight w:val="green"/>
           <w:lang w:val="it-IT"/>
         </w:rPr>
         <w:t xml:space="preserve">- </w:t>
@@ -21215,6 +21606,7 @@
       <w:proofErr w:type="gramStart"/>
       <w:r>
         <w:rPr>
+          <w:highlight w:val="green"/>
           <w:lang w:val="it-IT"/>
         </w:rPr>
         <w:t>[ ]</w:t>
@@ -21222,6 +21614,7 @@
       <w:proofErr w:type="gramEnd"/>
       <w:r>
         <w:rPr>
+          <w:highlight w:val="green"/>
           <w:lang w:val="it-IT"/>
         </w:rPr>
         <w:t xml:space="preserve"> </w:t>
@@ -21229,6 +21622,7 @@
       <w:proofErr w:type="spellStart"/>
       <w:r>
         <w:rPr>
+          <w:highlight w:val="green"/>
           <w:lang w:val="it-IT"/>
         </w:rPr>
         <w:t>Checksum</w:t>
@@ -21236,6 +21630,7 @@
       <w:proofErr w:type="spellEnd"/>
       <w:r>
         <w:rPr>
+          <w:highlight w:val="green"/>
           <w:lang w:val="it-IT"/>
         </w:rPr>
         <w:t xml:space="preserve"> permette verifica integrità</w:t>
@@ -21249,6 +21644,7 @@
       </w:pPr>
       <w:r>
         <w:rPr>
+          <w:highlight w:val="green"/>
           <w:lang w:val="it-IT"/>
         </w:rPr>
         <w:t xml:space="preserve">- </w:t>
@@ -21256,6 +21652,7 @@
       <w:proofErr w:type="gramStart"/>
       <w:r>
         <w:rPr>
+          <w:highlight w:val="green"/>
           <w:lang w:val="it-IT"/>
         </w:rPr>
         <w:t>[ ]</w:t>
@@ -21263,6 +21660,7 @@
       <w:proofErr w:type="gramEnd"/>
       <w:r>
         <w:rPr>
+          <w:highlight w:val="green"/>
           <w:lang w:val="it-IT"/>
         </w:rPr>
         <w:t xml:space="preserve"> Contatori permettono monitoraggio successo/fallimento</w:t>

</xml_diff>

<commit_message>
feat: Initialize Alembic for database migrations, configuring it for asyncpg and linking to project models.
</commit_message>
<xml_diff>
--- a/Piano-operativo-v1.7.docx
+++ b/Piano-operativo-v1.7.docx
@@ -21696,11 +21696,13 @@
     <w:p>
       <w:pPr>
         <w:rPr>
-          <w:lang w:val="it-IT"/>
-        </w:rPr>
-      </w:pPr>
-      <w:r>
-        <w:rPr>
+          <w:highlight w:val="green"/>
+          <w:lang w:val="it-IT"/>
+        </w:rPr>
+      </w:pPr>
+      <w:r>
+        <w:rPr>
+          <w:highlight w:val="green"/>
           <w:lang w:val="it-IT"/>
         </w:rPr>
         <w:t xml:space="preserve">## TASK 2.9: Definizione Modello </w:t>
@@ -21708,6 +21710,7 @@
       <w:proofErr w:type="spellStart"/>
       <w:r>
         <w:rPr>
+          <w:highlight w:val="green"/>
           <w:lang w:val="it-IT"/>
         </w:rPr>
         <w:t>SQLAlchemy</w:t>
@@ -21715,6 +21718,7 @@
       <w:proofErr w:type="spellEnd"/>
       <w:r>
         <w:rPr>
+          <w:highlight w:val="green"/>
           <w:lang w:val="it-IT"/>
         </w:rPr>
         <w:t xml:space="preserve"> - </w:t>
@@ -21722,6 +21726,7 @@
       <w:proofErr w:type="spellStart"/>
       <w:r>
         <w:rPr>
+          <w:highlight w:val="green"/>
           <w:lang w:val="it-IT"/>
         </w:rPr>
         <w:t>AiModelRun</w:t>
@@ -21731,18 +21736,21 @@
     <w:p>
       <w:pPr>
         <w:rPr>
-          <w:lang w:val="it-IT"/>
-        </w:rPr>
-      </w:pPr>
-    </w:p>
-    <w:p>
-      <w:pPr>
-        <w:rPr>
-          <w:lang w:val="it-IT"/>
-        </w:rPr>
-      </w:pPr>
-      <w:r>
-        <w:rPr>
+          <w:highlight w:val="green"/>
+          <w:lang w:val="it-IT"/>
+        </w:rPr>
+      </w:pPr>
+    </w:p>
+    <w:p>
+      <w:pPr>
+        <w:rPr>
+          <w:highlight w:val="green"/>
+          <w:lang w:val="it-IT"/>
+        </w:rPr>
+      </w:pPr>
+      <w:r>
+        <w:rPr>
+          <w:highlight w:val="green"/>
           <w:lang w:val="it-IT"/>
         </w:rPr>
         <w:t>**</w:t>
@@ -21750,6 +21758,7 @@
       <w:proofErr w:type="gramStart"/>
       <w:r>
         <w:rPr>
+          <w:highlight w:val="green"/>
           <w:lang w:val="it-IT"/>
         </w:rPr>
         <w:t>Descrizione:*</w:t>
@@ -21757,6 +21766,7 @@
       <w:proofErr w:type="gramEnd"/>
       <w:r>
         <w:rPr>
+          <w:highlight w:val="green"/>
           <w:lang w:val="it-IT"/>
         </w:rPr>
         <w:t>* Creare modello per tracciare esecuzioni dei modelli AI.</w:t>
@@ -21765,170 +21775,299 @@
     <w:p>
       <w:pPr>
         <w:rPr>
-          <w:lang w:val="it-IT"/>
-        </w:rPr>
-      </w:pPr>
-    </w:p>
-    <w:p>
-      <w:r>
+          <w:highlight w:val="green"/>
+          <w:lang w:val="it-IT"/>
+        </w:rPr>
+      </w:pPr>
+    </w:p>
+    <w:p>
+      <w:pPr>
+        <w:rPr>
+          <w:highlight w:val="green"/>
+        </w:rPr>
+      </w:pPr>
+      <w:r>
+        <w:rPr>
+          <w:highlight w:val="green"/>
+        </w:rPr>
         <w:t>**</w:t>
       </w:r>
       <w:proofErr w:type="spellStart"/>
       <w:proofErr w:type="gramStart"/>
       <w:r>
+        <w:rPr>
+          <w:highlight w:val="green"/>
+        </w:rPr>
         <w:t>Microstep</w:t>
       </w:r>
       <w:proofErr w:type="spellEnd"/>
       <w:r>
+        <w:rPr>
+          <w:highlight w:val="green"/>
+        </w:rPr>
         <w:t>:*</w:t>
       </w:r>
       <w:proofErr w:type="gramEnd"/>
       <w:r>
+        <w:rPr>
+          <w:highlight w:val="green"/>
+        </w:rPr>
         <w:t>*</w:t>
       </w:r>
     </w:p>
     <w:p>
-      <w:r>
+      <w:pPr>
+        <w:rPr>
+          <w:highlight w:val="green"/>
+        </w:rPr>
+      </w:pPr>
+      <w:r>
+        <w:rPr>
+          <w:highlight w:val="green"/>
+        </w:rPr>
         <w:t xml:space="preserve">1. </w:t>
       </w:r>
       <w:proofErr w:type="spellStart"/>
       <w:r>
+        <w:rPr>
+          <w:highlight w:val="green"/>
+        </w:rPr>
         <w:t>Creare</w:t>
       </w:r>
       <w:proofErr w:type="spellEnd"/>
       <w:r>
+        <w:rPr>
+          <w:highlight w:val="green"/>
+        </w:rPr>
         <w:t xml:space="preserve"> file `backend/</w:t>
       </w:r>
       <w:proofErr w:type="spellStart"/>
       <w:r>
+        <w:rPr>
+          <w:highlight w:val="green"/>
+        </w:rPr>
         <w:t>src</w:t>
       </w:r>
       <w:proofErr w:type="spellEnd"/>
       <w:r>
+        <w:rPr>
+          <w:highlight w:val="green"/>
+        </w:rPr>
         <w:t>/analytics/domain/entities.py`</w:t>
       </w:r>
     </w:p>
     <w:p>
-      <w:r>
+      <w:pPr>
+        <w:rPr>
+          <w:highlight w:val="green"/>
+        </w:rPr>
+      </w:pPr>
+      <w:r>
+        <w:rPr>
+          <w:highlight w:val="green"/>
+        </w:rPr>
         <w:t xml:space="preserve">2. </w:t>
       </w:r>
       <w:proofErr w:type="spellStart"/>
       <w:r>
+        <w:rPr>
+          <w:highlight w:val="green"/>
+        </w:rPr>
         <w:t>Definire</w:t>
       </w:r>
       <w:proofErr w:type="spellEnd"/>
       <w:r>
+        <w:rPr>
+          <w:highlight w:val="green"/>
+        </w:rPr>
         <w:t xml:space="preserve"> </w:t>
       </w:r>
       <w:proofErr w:type="spellStart"/>
       <w:r>
+        <w:rPr>
+          <w:highlight w:val="green"/>
+        </w:rPr>
         <w:t>classe</w:t>
       </w:r>
       <w:proofErr w:type="spellEnd"/>
       <w:r>
+        <w:rPr>
+          <w:highlight w:val="green"/>
+        </w:rPr>
         <w:t xml:space="preserve"> `</w:t>
       </w:r>
       <w:proofErr w:type="spellStart"/>
       <w:r>
+        <w:rPr>
+          <w:highlight w:val="green"/>
+        </w:rPr>
         <w:t>AiModelRun</w:t>
       </w:r>
       <w:proofErr w:type="spellEnd"/>
       <w:r>
+        <w:rPr>
+          <w:highlight w:val="green"/>
+        </w:rPr>
         <w:t>`: `id` (UUID), `</w:t>
       </w:r>
       <w:proofErr w:type="spellStart"/>
       <w:r>
+        <w:rPr>
+          <w:highlight w:val="green"/>
+        </w:rPr>
         <w:t>estimate_id</w:t>
       </w:r>
       <w:proofErr w:type="spellEnd"/>
       <w:r>
+        <w:rPr>
+          <w:highlight w:val="green"/>
+        </w:rPr>
         <w:t>` (FK, nullable), `</w:t>
       </w:r>
       <w:proofErr w:type="spellStart"/>
       <w:r>
+        <w:rPr>
+          <w:highlight w:val="green"/>
+        </w:rPr>
         <w:t>model_name</w:t>
       </w:r>
       <w:proofErr w:type="spellEnd"/>
       <w:r>
+        <w:rPr>
+          <w:highlight w:val="green"/>
+        </w:rPr>
         <w:t>` (String), `</w:t>
       </w:r>
       <w:proofErr w:type="spellStart"/>
       <w:r>
+        <w:rPr>
+          <w:highlight w:val="green"/>
+        </w:rPr>
         <w:t>model_version</w:t>
       </w:r>
       <w:proofErr w:type="spellEnd"/>
       <w:r>
+        <w:rPr>
+          <w:highlight w:val="green"/>
+        </w:rPr>
         <w:t>` (String), `</w:t>
       </w:r>
       <w:proofErr w:type="spellStart"/>
       <w:r>
+        <w:rPr>
+          <w:highlight w:val="green"/>
+        </w:rPr>
         <w:t>prompt_hash</w:t>
       </w:r>
       <w:proofErr w:type="spellEnd"/>
       <w:r>
+        <w:rPr>
+          <w:highlight w:val="green"/>
+        </w:rPr>
         <w:t>` (String), `</w:t>
       </w:r>
       <w:proofErr w:type="spellStart"/>
       <w:r>
+        <w:rPr>
+          <w:highlight w:val="green"/>
+        </w:rPr>
         <w:t>prompt_tokens</w:t>
       </w:r>
       <w:proofErr w:type="spellEnd"/>
       <w:r>
+        <w:rPr>
+          <w:highlight w:val="green"/>
+        </w:rPr>
         <w:t xml:space="preserve">` (Integer), </w:t>
       </w:r>
       <w:r>
+        <w:rPr>
+          <w:highlight w:val="green"/>
+        </w:rPr>
         <w:lastRenderedPageBreak/>
         <w:t>`</w:t>
       </w:r>
       <w:proofErr w:type="spellStart"/>
       <w:r>
+        <w:rPr>
+          <w:highlight w:val="green"/>
+        </w:rPr>
         <w:t>completion_tokens</w:t>
       </w:r>
       <w:proofErr w:type="spellEnd"/>
       <w:r>
+        <w:rPr>
+          <w:highlight w:val="green"/>
+        </w:rPr>
         <w:t>` (Integer), `</w:t>
       </w:r>
       <w:proofErr w:type="spellStart"/>
       <w:r>
+        <w:rPr>
+          <w:highlight w:val="green"/>
+        </w:rPr>
         <w:t>latency_ms</w:t>
       </w:r>
       <w:proofErr w:type="spellEnd"/>
       <w:r>
+        <w:rPr>
+          <w:highlight w:val="green"/>
+        </w:rPr>
         <w:t>` (Integer), `</w:t>
       </w:r>
       <w:proofErr w:type="spellStart"/>
       <w:r>
+        <w:rPr>
+          <w:highlight w:val="green"/>
+        </w:rPr>
         <w:t>output_summary</w:t>
       </w:r>
       <w:proofErr w:type="spellEnd"/>
       <w:r>
+        <w:rPr>
+          <w:highlight w:val="green"/>
+        </w:rPr>
         <w:t>` (Text), `</w:t>
       </w:r>
       <w:proofErr w:type="spellStart"/>
       <w:r>
+        <w:rPr>
+          <w:highlight w:val="green"/>
+        </w:rPr>
         <w:t>raw_response</w:t>
       </w:r>
       <w:proofErr w:type="spellEnd"/>
       <w:r>
+        <w:rPr>
+          <w:highlight w:val="green"/>
+        </w:rPr>
         <w:t>` (JSONB), `</w:t>
       </w:r>
       <w:proofErr w:type="spellStart"/>
       <w:r>
+        <w:rPr>
+          <w:highlight w:val="green"/>
+        </w:rPr>
         <w:t>created_at</w:t>
       </w:r>
       <w:proofErr w:type="spellEnd"/>
       <w:r>
+        <w:rPr>
+          <w:highlight w:val="green"/>
+        </w:rPr>
         <w:t>`</w:t>
       </w:r>
     </w:p>
     <w:p>
       <w:pPr>
         <w:rPr>
-          <w:lang w:val="it-IT"/>
-        </w:rPr>
-      </w:pPr>
-      <w:r>
-        <w:rPr>
+          <w:highlight w:val="green"/>
+          <w:lang w:val="it-IT"/>
+        </w:rPr>
+      </w:pPr>
+      <w:r>
+        <w:rPr>
+          <w:highlight w:val="green"/>
           <w:lang w:val="it-IT"/>
         </w:rPr>
         <w:t>3. Definire indice su `</w:t>
@@ -21936,6 +22075,7 @@
       <w:proofErr w:type="spellStart"/>
       <w:r>
         <w:rPr>
+          <w:highlight w:val="green"/>
           <w:lang w:val="it-IT"/>
         </w:rPr>
         <w:t>model_name</w:t>
@@ -21943,6 +22083,7 @@
       <w:proofErr w:type="spellEnd"/>
       <w:r>
         <w:rPr>
+          <w:highlight w:val="green"/>
           <w:lang w:val="it-IT"/>
         </w:rPr>
         <w:t>` e `</w:t>
@@ -21950,6 +22091,7 @@
       <w:proofErr w:type="spellStart"/>
       <w:r>
         <w:rPr>
+          <w:highlight w:val="green"/>
           <w:lang w:val="it-IT"/>
         </w:rPr>
         <w:t>created_at</w:t>
@@ -21957,6 +22099,7 @@
       <w:proofErr w:type="spellEnd"/>
       <w:r>
         <w:rPr>
+          <w:highlight w:val="green"/>
           <w:lang w:val="it-IT"/>
         </w:rPr>
         <w:t>`</w:t>
@@ -21965,18 +22108,21 @@
     <w:p>
       <w:pPr>
         <w:rPr>
-          <w:lang w:val="it-IT"/>
-        </w:rPr>
-      </w:pPr>
-    </w:p>
-    <w:p>
-      <w:pPr>
-        <w:rPr>
-          <w:lang w:val="it-IT"/>
-        </w:rPr>
-      </w:pPr>
-      <w:r>
-        <w:rPr>
+          <w:highlight w:val="green"/>
+          <w:lang w:val="it-IT"/>
+        </w:rPr>
+      </w:pPr>
+    </w:p>
+    <w:p>
+      <w:pPr>
+        <w:rPr>
+          <w:highlight w:val="green"/>
+          <w:lang w:val="it-IT"/>
+        </w:rPr>
+      </w:pPr>
+      <w:r>
+        <w:rPr>
+          <w:highlight w:val="green"/>
           <w:lang w:val="it-IT"/>
         </w:rPr>
         <w:t>**</w:t>
@@ -21984,6 +22130,7 @@
       <w:proofErr w:type="spellStart"/>
       <w:r>
         <w:rPr>
+          <w:highlight w:val="green"/>
           <w:lang w:val="it-IT"/>
         </w:rPr>
         <w:t>Acceptance</w:t>
@@ -21991,6 +22138,7 @@
       <w:proofErr w:type="spellEnd"/>
       <w:r>
         <w:rPr>
+          <w:highlight w:val="green"/>
           <w:lang w:val="it-IT"/>
         </w:rPr>
         <w:t xml:space="preserve"> </w:t>
@@ -21999,6 +22147,7 @@
       <w:proofErr w:type="gramStart"/>
       <w:r>
         <w:rPr>
+          <w:highlight w:val="green"/>
           <w:lang w:val="it-IT"/>
         </w:rPr>
         <w:t>Criteria</w:t>
@@ -22006,6 +22155,7 @@
       <w:proofErr w:type="spellEnd"/>
       <w:r>
         <w:rPr>
+          <w:highlight w:val="green"/>
           <w:lang w:val="it-IT"/>
         </w:rPr>
         <w:t>:*</w:t>
@@ -22013,6 +22163,7 @@
       <w:proofErr w:type="gramEnd"/>
       <w:r>
         <w:rPr>
+          <w:highlight w:val="green"/>
           <w:lang w:val="it-IT"/>
         </w:rPr>
         <w:t>*</w:t>
@@ -22021,11 +22172,13 @@
     <w:p>
       <w:pPr>
         <w:rPr>
-          <w:lang w:val="it-IT"/>
-        </w:rPr>
-      </w:pPr>
-      <w:r>
-        <w:rPr>
+          <w:highlight w:val="green"/>
+          <w:lang w:val="it-IT"/>
+        </w:rPr>
+      </w:pPr>
+      <w:r>
+        <w:rPr>
+          <w:highlight w:val="green"/>
           <w:lang w:val="it-IT"/>
         </w:rPr>
         <w:t xml:space="preserve">- </w:t>
@@ -22033,6 +22186,7 @@
       <w:proofErr w:type="gramStart"/>
       <w:r>
         <w:rPr>
+          <w:highlight w:val="green"/>
           <w:lang w:val="it-IT"/>
         </w:rPr>
         <w:t>[ ]</w:t>
@@ -22040,6 +22194,7 @@
       <w:proofErr w:type="gramEnd"/>
       <w:r>
         <w:rPr>
+          <w:highlight w:val="green"/>
           <w:lang w:val="it-IT"/>
         </w:rPr>
         <w:t xml:space="preserve"> Traccia consumo token per monitoraggio costi</w:t>
@@ -22048,11 +22203,13 @@
     <w:p>
       <w:pPr>
         <w:rPr>
-          <w:lang w:val="it-IT"/>
-        </w:rPr>
-      </w:pPr>
-      <w:r>
-        <w:rPr>
+          <w:highlight w:val="green"/>
+          <w:lang w:val="it-IT"/>
+        </w:rPr>
+      </w:pPr>
+      <w:r>
+        <w:rPr>
+          <w:highlight w:val="green"/>
           <w:lang w:val="it-IT"/>
         </w:rPr>
         <w:t xml:space="preserve">- </w:t>
@@ -22060,6 +22217,7 @@
       <w:proofErr w:type="gramStart"/>
       <w:r>
         <w:rPr>
+          <w:highlight w:val="green"/>
           <w:lang w:val="it-IT"/>
         </w:rPr>
         <w:t>[ ]</w:t>
@@ -22067,6 +22225,7 @@
       <w:proofErr w:type="gramEnd"/>
       <w:r>
         <w:rPr>
+          <w:highlight w:val="green"/>
           <w:lang w:val="it-IT"/>
         </w:rPr>
         <w:t xml:space="preserve"> Hash del prompt per deduplicazione</w:t>
@@ -22075,11 +22234,13 @@
     <w:p>
       <w:pPr>
         <w:rPr>
-          <w:lang w:val="it-IT"/>
-        </w:rPr>
-      </w:pPr>
-      <w:r>
-        <w:rPr>
+          <w:highlight w:val="green"/>
+          <w:lang w:val="it-IT"/>
+        </w:rPr>
+      </w:pPr>
+      <w:r>
+        <w:rPr>
+          <w:highlight w:val="green"/>
           <w:lang w:val="it-IT"/>
         </w:rPr>
         <w:t xml:space="preserve">- </w:t>
@@ -22087,6 +22248,7 @@
       <w:proofErr w:type="gramStart"/>
       <w:r>
         <w:rPr>
+          <w:highlight w:val="green"/>
           <w:lang w:val="it-IT"/>
         </w:rPr>
         <w:t>[ ]</w:t>
@@ -22094,6 +22256,7 @@
       <w:proofErr w:type="gramEnd"/>
       <w:r>
         <w:rPr>
+          <w:highlight w:val="green"/>
           <w:lang w:val="it-IT"/>
         </w:rPr>
         <w:t xml:space="preserve"> Latenza per performance monitoring</w:t>
@@ -22107,6 +22270,7 @@
       </w:pPr>
       <w:r>
         <w:rPr>
+          <w:highlight w:val="green"/>
           <w:lang w:val="it-IT"/>
         </w:rPr>
         <w:t xml:space="preserve">- </w:t>
@@ -22114,6 +22278,7 @@
       <w:proofErr w:type="gramStart"/>
       <w:r>
         <w:rPr>
+          <w:highlight w:val="green"/>
           <w:lang w:val="it-IT"/>
         </w:rPr>
         <w:t>[ ]</w:t>
@@ -22121,6 +22286,7 @@
       <w:proofErr w:type="gramEnd"/>
       <w:r>
         <w:rPr>
+          <w:highlight w:val="green"/>
           <w:lang w:val="it-IT"/>
         </w:rPr>
         <w:t xml:space="preserve"> JSONB per risposta </w:t>
@@ -22128,6 +22294,7 @@
       <w:proofErr w:type="spellStart"/>
       <w:r>
         <w:rPr>
+          <w:highlight w:val="green"/>
           <w:lang w:val="it-IT"/>
         </w:rPr>
         <w:t>raw</w:t>
@@ -22135,6 +22302,7 @@
       <w:proofErr w:type="spellEnd"/>
       <w:r>
         <w:rPr>
+          <w:highlight w:val="green"/>
           <w:lang w:val="it-IT"/>
         </w:rPr>
         <w:t xml:space="preserve"> flessibile</w:t>

</xml_diff>

<commit_message>
feat: Add initial database models for estimates and users, and configure Alembic for migrations.
</commit_message>
<xml_diff>
--- a/Piano-operativo-v1.7.docx
+++ b/Piano-operativo-v1.7.docx
@@ -22338,11 +22338,13 @@
     <w:p>
       <w:pPr>
         <w:rPr>
-          <w:lang w:val="it-IT"/>
-        </w:rPr>
-      </w:pPr>
-      <w:r>
-        <w:rPr>
+          <w:highlight w:val="green"/>
+          <w:lang w:val="it-IT"/>
+        </w:rPr>
+      </w:pPr>
+      <w:r>
+        <w:rPr>
+          <w:highlight w:val="green"/>
           <w:lang w:val="it-IT"/>
         </w:rPr>
         <w:t xml:space="preserve">## TASK 2.10: Setup </w:t>
@@ -22350,6 +22352,7 @@
       <w:proofErr w:type="spellStart"/>
       <w:r>
         <w:rPr>
+          <w:highlight w:val="green"/>
           <w:lang w:val="it-IT"/>
         </w:rPr>
         <w:t>Alembic</w:t>
@@ -22357,6 +22360,7 @@
       <w:proofErr w:type="spellEnd"/>
       <w:r>
         <w:rPr>
+          <w:highlight w:val="green"/>
           <w:lang w:val="it-IT"/>
         </w:rPr>
         <w:t xml:space="preserve"> per Migrazioni Database</w:t>
@@ -22365,18 +22369,21 @@
     <w:p>
       <w:pPr>
         <w:rPr>
-          <w:lang w:val="it-IT"/>
-        </w:rPr>
-      </w:pPr>
-    </w:p>
-    <w:p>
-      <w:pPr>
-        <w:rPr>
-          <w:lang w:val="it-IT"/>
-        </w:rPr>
-      </w:pPr>
-      <w:r>
-        <w:rPr>
+          <w:highlight w:val="green"/>
+          <w:lang w:val="it-IT"/>
+        </w:rPr>
+      </w:pPr>
+    </w:p>
+    <w:p>
+      <w:pPr>
+        <w:rPr>
+          <w:highlight w:val="green"/>
+          <w:lang w:val="it-IT"/>
+        </w:rPr>
+      </w:pPr>
+      <w:r>
+        <w:rPr>
+          <w:highlight w:val="green"/>
           <w:lang w:val="it-IT"/>
         </w:rPr>
         <w:t>**</w:t>
@@ -22384,6 +22391,7 @@
       <w:proofErr w:type="gramStart"/>
       <w:r>
         <w:rPr>
+          <w:highlight w:val="green"/>
           <w:lang w:val="it-IT"/>
         </w:rPr>
         <w:t>Descrizione:*</w:t>
@@ -22391,6 +22399,7 @@
       <w:proofErr w:type="gramEnd"/>
       <w:r>
         <w:rPr>
+          <w:highlight w:val="green"/>
           <w:lang w:val="it-IT"/>
         </w:rPr>
         <w:t xml:space="preserve">* Configurare </w:t>
@@ -22398,6 +22407,7 @@
       <w:proofErr w:type="spellStart"/>
       <w:r>
         <w:rPr>
+          <w:highlight w:val="green"/>
           <w:lang w:val="it-IT"/>
         </w:rPr>
         <w:t>Alembic</w:t>
@@ -22405,6 +22415,7 @@
       <w:proofErr w:type="spellEnd"/>
       <w:r>
         <w:rPr>
+          <w:highlight w:val="green"/>
           <w:lang w:val="it-IT"/>
         </w:rPr>
         <w:t xml:space="preserve"> per gestione migrazioni schema database.</w:t>
@@ -22413,18 +22424,21 @@
     <w:p>
       <w:pPr>
         <w:rPr>
-          <w:lang w:val="it-IT"/>
-        </w:rPr>
-      </w:pPr>
-    </w:p>
-    <w:p>
-      <w:pPr>
-        <w:rPr>
-          <w:lang w:val="it-IT"/>
-        </w:rPr>
-      </w:pPr>
-      <w:r>
-        <w:rPr>
+          <w:highlight w:val="green"/>
+          <w:lang w:val="it-IT"/>
+        </w:rPr>
+      </w:pPr>
+    </w:p>
+    <w:p>
+      <w:pPr>
+        <w:rPr>
+          <w:highlight w:val="green"/>
+          <w:lang w:val="it-IT"/>
+        </w:rPr>
+      </w:pPr>
+      <w:r>
+        <w:rPr>
+          <w:highlight w:val="green"/>
           <w:lang w:val="it-IT"/>
         </w:rPr>
         <w:t>**</w:t>
@@ -22433,6 +22447,7 @@
       <w:proofErr w:type="gramStart"/>
       <w:r>
         <w:rPr>
+          <w:highlight w:val="green"/>
           <w:lang w:val="it-IT"/>
         </w:rPr>
         <w:t>Microstep</w:t>
@@ -22440,6 +22455,7 @@
       <w:proofErr w:type="spellEnd"/>
       <w:r>
         <w:rPr>
+          <w:highlight w:val="green"/>
           <w:lang w:val="it-IT"/>
         </w:rPr>
         <w:t>:*</w:t>
@@ -22447,6 +22463,7 @@
       <w:proofErr w:type="gramEnd"/>
       <w:r>
         <w:rPr>
+          <w:highlight w:val="green"/>
           <w:lang w:val="it-IT"/>
         </w:rPr>
         <w:t>*</w:t>
@@ -22455,11 +22472,13 @@
     <w:p>
       <w:pPr>
         <w:rPr>
-          <w:lang w:val="it-IT"/>
-        </w:rPr>
-      </w:pPr>
-      <w:r>
-        <w:rPr>
+          <w:highlight w:val="green"/>
+          <w:lang w:val="it-IT"/>
+        </w:rPr>
+      </w:pPr>
+      <w:r>
+        <w:rPr>
+          <w:highlight w:val="green"/>
           <w:lang w:val="it-IT"/>
         </w:rPr>
         <w:t xml:space="preserve">1. Installare </w:t>
@@ -22467,6 +22486,7 @@
       <w:proofErr w:type="spellStart"/>
       <w:r>
         <w:rPr>
+          <w:highlight w:val="green"/>
           <w:lang w:val="it-IT"/>
         </w:rPr>
         <w:t>alembic</w:t>
@@ -22474,6 +22494,7 @@
       <w:proofErr w:type="spellEnd"/>
       <w:r>
         <w:rPr>
+          <w:highlight w:val="green"/>
           <w:lang w:val="it-IT"/>
         </w:rPr>
         <w:t xml:space="preserve"> come dipendenza</w:t>
@@ -22482,11 +22503,13 @@
     <w:p>
       <w:pPr>
         <w:rPr>
-          <w:lang w:val="it-IT"/>
-        </w:rPr>
-      </w:pPr>
-      <w:r>
-        <w:rPr>
+          <w:highlight w:val="green"/>
+          <w:lang w:val="it-IT"/>
+        </w:rPr>
+      </w:pPr>
+      <w:r>
+        <w:rPr>
+          <w:highlight w:val="green"/>
           <w:lang w:val="it-IT"/>
         </w:rPr>
         <w:t>2. Eseguire `</w:t>
@@ -22494,6 +22517,7 @@
       <w:proofErr w:type="spellStart"/>
       <w:r>
         <w:rPr>
+          <w:highlight w:val="green"/>
           <w:lang w:val="it-IT"/>
         </w:rPr>
         <w:t>alembic</w:t>
@@ -22501,6 +22525,7 @@
       <w:proofErr w:type="spellEnd"/>
       <w:r>
         <w:rPr>
+          <w:highlight w:val="green"/>
           <w:lang w:val="it-IT"/>
         </w:rPr>
         <w:t xml:space="preserve"> </w:t>
@@ -22508,6 +22533,7 @@
       <w:proofErr w:type="spellStart"/>
       <w:r>
         <w:rPr>
+          <w:highlight w:val="green"/>
           <w:lang w:val="it-IT"/>
         </w:rPr>
         <w:t>init</w:t>
@@ -22515,6 +22541,7 @@
       <w:proofErr w:type="spellEnd"/>
       <w:r>
         <w:rPr>
+          <w:highlight w:val="green"/>
           <w:lang w:val="it-IT"/>
         </w:rPr>
         <w:t xml:space="preserve"> </w:t>
@@ -22522,6 +22549,7 @@
       <w:proofErr w:type="spellStart"/>
       <w:r>
         <w:rPr>
+          <w:highlight w:val="green"/>
           <w:lang w:val="it-IT"/>
         </w:rPr>
         <w:t>backend</w:t>
@@ -22529,6 +22557,7 @@
       <w:proofErr w:type="spellEnd"/>
       <w:r>
         <w:rPr>
+          <w:highlight w:val="green"/>
           <w:lang w:val="it-IT"/>
         </w:rPr>
         <w:t>/</w:t>
@@ -22536,6 +22565,7 @@
       <w:proofErr w:type="spellStart"/>
       <w:r>
         <w:rPr>
+          <w:highlight w:val="green"/>
           <w:lang w:val="it-IT"/>
         </w:rPr>
         <w:t>alembic</w:t>
@@ -22543,6 +22573,7 @@
       <w:proofErr w:type="spellEnd"/>
       <w:r>
         <w:rPr>
+          <w:highlight w:val="green"/>
           <w:lang w:val="it-IT"/>
         </w:rPr>
         <w:t>`</w:t>
@@ -22551,11 +22582,13 @@
     <w:p>
       <w:pPr>
         <w:rPr>
-          <w:lang w:val="it-IT"/>
-        </w:rPr>
-      </w:pPr>
-      <w:r>
-        <w:rPr>
+          <w:highlight w:val="green"/>
+          <w:lang w:val="it-IT"/>
+        </w:rPr>
+      </w:pPr>
+      <w:r>
+        <w:rPr>
+          <w:highlight w:val="green"/>
           <w:lang w:val="it-IT"/>
         </w:rPr>
         <w:t xml:space="preserve">3. Configurare `alembic.ini` con </w:t>
@@ -22563,6 +22596,7 @@
       <w:proofErr w:type="spellStart"/>
       <w:r>
         <w:rPr>
+          <w:highlight w:val="green"/>
           <w:lang w:val="it-IT"/>
         </w:rPr>
         <w:t>path</w:t>
@@ -22570,6 +22604,7 @@
       <w:proofErr w:type="spellEnd"/>
       <w:r>
         <w:rPr>
+          <w:highlight w:val="green"/>
           <w:lang w:val="it-IT"/>
         </w:rPr>
         <w:t xml:space="preserve"> corretto</w:t>
@@ -22578,11 +22613,13 @@
     <w:p>
       <w:pPr>
         <w:rPr>
-          <w:lang w:val="it-IT"/>
-        </w:rPr>
-      </w:pPr>
-      <w:r>
-        <w:rPr>
+          <w:highlight w:val="green"/>
+          <w:lang w:val="it-IT"/>
+        </w:rPr>
+      </w:pPr>
+      <w:r>
+        <w:rPr>
+          <w:highlight w:val="green"/>
           <w:lang w:val="it-IT"/>
         </w:rPr>
         <w:t>4. Modificare `</w:t>
@@ -22590,6 +22627,7 @@
       <w:proofErr w:type="spellStart"/>
       <w:r>
         <w:rPr>
+          <w:highlight w:val="green"/>
           <w:lang w:val="it-IT"/>
         </w:rPr>
         <w:t>alembic</w:t>
@@ -22597,6 +22635,7 @@
       <w:proofErr w:type="spellEnd"/>
       <w:r>
         <w:rPr>
+          <w:highlight w:val="green"/>
           <w:lang w:val="it-IT"/>
         </w:rPr>
         <w:t xml:space="preserve">/env.py` per usare </w:t>
@@ -22604,6 +22643,7 @@
       <w:proofErr w:type="spellStart"/>
       <w:r>
         <w:rPr>
+          <w:highlight w:val="green"/>
           <w:lang w:val="it-IT"/>
         </w:rPr>
         <w:t>async</w:t>
@@ -22611,6 +22651,7 @@
       <w:proofErr w:type="spellEnd"/>
       <w:r>
         <w:rPr>
+          <w:highlight w:val="green"/>
           <w:lang w:val="it-IT"/>
         </w:rPr>
         <w:t xml:space="preserve"> </w:t>
@@ -22618,6 +22659,7 @@
       <w:proofErr w:type="spellStart"/>
       <w:r>
         <w:rPr>
+          <w:highlight w:val="green"/>
           <w:lang w:val="it-IT"/>
         </w:rPr>
         <w:t>engine</w:t>
@@ -22625,6 +22667,7 @@
       <w:proofErr w:type="spellEnd"/>
       <w:r>
         <w:rPr>
+          <w:highlight w:val="green"/>
           <w:lang w:val="it-IT"/>
         </w:rPr>
         <w:t xml:space="preserve"> e importare tutti i modelli</w:t>
@@ -22633,11 +22676,13 @@
     <w:p>
       <w:pPr>
         <w:rPr>
-          <w:lang w:val="it-IT"/>
-        </w:rPr>
-      </w:pPr>
-      <w:r>
-        <w:rPr>
+          <w:highlight w:val="green"/>
+          <w:lang w:val="it-IT"/>
+        </w:rPr>
+      </w:pPr>
+      <w:r>
+        <w:rPr>
+          <w:highlight w:val="green"/>
           <w:lang w:val="it-IT"/>
         </w:rPr>
         <w:t>5. Configurare `</w:t>
@@ -22645,6 +22690,7 @@
       <w:proofErr w:type="spellStart"/>
       <w:r>
         <w:rPr>
+          <w:highlight w:val="green"/>
           <w:lang w:val="it-IT"/>
         </w:rPr>
         <w:t>alembic</w:t>
@@ -22652,6 +22698,7 @@
       <w:proofErr w:type="spellEnd"/>
       <w:r>
         <w:rPr>
+          <w:highlight w:val="green"/>
           <w:lang w:val="it-IT"/>
         </w:rPr>
         <w:t>/env.py` per leggere DATABASE_URL da Settings</w:t>
@@ -22660,11 +22707,13 @@
     <w:p>
       <w:pPr>
         <w:rPr>
-          <w:lang w:val="it-IT"/>
-        </w:rPr>
-      </w:pPr>
-      <w:r>
-        <w:rPr>
+          <w:highlight w:val="green"/>
+          <w:lang w:val="it-IT"/>
+        </w:rPr>
+      </w:pPr>
+      <w:r>
+        <w:rPr>
+          <w:highlight w:val="green"/>
           <w:lang w:val="it-IT"/>
         </w:rPr>
         <w:t>6. Creare prima migrazione: `</w:t>
@@ -22672,6 +22721,7 @@
       <w:proofErr w:type="spellStart"/>
       <w:r>
         <w:rPr>
+          <w:highlight w:val="green"/>
           <w:lang w:val="it-IT"/>
         </w:rPr>
         <w:t>alembic</w:t>
@@ -22679,6 +22729,7 @@
       <w:proofErr w:type="spellEnd"/>
       <w:r>
         <w:rPr>
+          <w:highlight w:val="green"/>
           <w:lang w:val="it-IT"/>
         </w:rPr>
         <w:t xml:space="preserve"> </w:t>
@@ -22686,6 +22737,7 @@
       <w:proofErr w:type="spellStart"/>
       <w:r>
         <w:rPr>
+          <w:highlight w:val="green"/>
           <w:lang w:val="it-IT"/>
         </w:rPr>
         <w:t>revision</w:t>
@@ -22693,6 +22745,7 @@
       <w:proofErr w:type="spellEnd"/>
       <w:r>
         <w:rPr>
+          <w:highlight w:val="green"/>
           <w:lang w:val="it-IT"/>
         </w:rPr>
         <w:t xml:space="preserve"> --autogenerate -m "</w:t>
@@ -22700,6 +22753,7 @@
       <w:proofErr w:type="spellStart"/>
       <w:r>
         <w:rPr>
+          <w:highlight w:val="green"/>
           <w:lang w:val="it-IT"/>
         </w:rPr>
         <w:t>initial_schema</w:t>
@@ -22707,6 +22761,7 @@
       <w:proofErr w:type="spellEnd"/>
       <w:r>
         <w:rPr>
+          <w:highlight w:val="green"/>
           <w:lang w:val="it-IT"/>
         </w:rPr>
         <w:t>"`</w:t>
@@ -22715,11 +22770,13 @@
     <w:p>
       <w:pPr>
         <w:rPr>
-          <w:lang w:val="it-IT"/>
-        </w:rPr>
-      </w:pPr>
-      <w:r>
-        <w:rPr>
+          <w:highlight w:val="green"/>
+          <w:lang w:val="it-IT"/>
+        </w:rPr>
+      </w:pPr>
+      <w:r>
+        <w:rPr>
+          <w:highlight w:val="green"/>
           <w:lang w:val="it-IT"/>
         </w:rPr>
         <w:t>7. Verificare migrazione generata</w:t>
@@ -22728,11 +22785,13 @@
     <w:p>
       <w:pPr>
         <w:rPr>
-          <w:lang w:val="it-IT"/>
-        </w:rPr>
-      </w:pPr>
-      <w:r>
-        <w:rPr>
+          <w:highlight w:val="green"/>
+          <w:lang w:val="it-IT"/>
+        </w:rPr>
+      </w:pPr>
+      <w:r>
+        <w:rPr>
+          <w:highlight w:val="green"/>
           <w:lang w:val="it-IT"/>
         </w:rPr>
         <w:t xml:space="preserve">8. Documentare comandi nel </w:t>
@@ -22740,6 +22799,7 @@
       <w:proofErr w:type="spellStart"/>
       <w:r>
         <w:rPr>
+          <w:highlight w:val="green"/>
           <w:lang w:val="it-IT"/>
         </w:rPr>
         <w:t>Makefile</w:t>
@@ -22747,6 +22807,7 @@
       <w:proofErr w:type="spellEnd"/>
       <w:r>
         <w:rPr>
+          <w:highlight w:val="green"/>
           <w:lang w:val="it-IT"/>
         </w:rPr>
         <w:t>: `make migrate`, `make migrate-down`, `make migrate-new`</w:t>
@@ -22755,18 +22816,21 @@
     <w:p>
       <w:pPr>
         <w:rPr>
-          <w:lang w:val="it-IT"/>
-        </w:rPr>
-      </w:pPr>
-    </w:p>
-    <w:p>
-      <w:pPr>
-        <w:rPr>
-          <w:lang w:val="it-IT"/>
-        </w:rPr>
-      </w:pPr>
-      <w:r>
-        <w:rPr>
+          <w:highlight w:val="green"/>
+          <w:lang w:val="it-IT"/>
+        </w:rPr>
+      </w:pPr>
+    </w:p>
+    <w:p>
+      <w:pPr>
+        <w:rPr>
+          <w:highlight w:val="green"/>
+          <w:lang w:val="it-IT"/>
+        </w:rPr>
+      </w:pPr>
+      <w:r>
+        <w:rPr>
+          <w:highlight w:val="green"/>
           <w:lang w:val="it-IT"/>
         </w:rPr>
         <w:lastRenderedPageBreak/>
@@ -22775,6 +22839,7 @@
       <w:proofErr w:type="spellStart"/>
       <w:r>
         <w:rPr>
+          <w:highlight w:val="green"/>
           <w:lang w:val="it-IT"/>
         </w:rPr>
         <w:t>Acceptance</w:t>
@@ -22782,6 +22847,7 @@
       <w:proofErr w:type="spellEnd"/>
       <w:r>
         <w:rPr>
+          <w:highlight w:val="green"/>
           <w:lang w:val="it-IT"/>
         </w:rPr>
         <w:t xml:space="preserve"> </w:t>
@@ -22790,6 +22856,7 @@
       <w:proofErr w:type="gramStart"/>
       <w:r>
         <w:rPr>
+          <w:highlight w:val="green"/>
           <w:lang w:val="it-IT"/>
         </w:rPr>
         <w:t>Criteria</w:t>
@@ -22797,6 +22864,7 @@
       <w:proofErr w:type="spellEnd"/>
       <w:r>
         <w:rPr>
+          <w:highlight w:val="green"/>
           <w:lang w:val="it-IT"/>
         </w:rPr>
         <w:t>:*</w:t>
@@ -22804,6 +22872,7 @@
       <w:proofErr w:type="gramEnd"/>
       <w:r>
         <w:rPr>
+          <w:highlight w:val="green"/>
           <w:lang w:val="it-IT"/>
         </w:rPr>
         <w:t>*</w:t>
@@ -22812,11 +22881,13 @@
     <w:p>
       <w:pPr>
         <w:rPr>
-          <w:lang w:val="it-IT"/>
-        </w:rPr>
-      </w:pPr>
-      <w:r>
-        <w:rPr>
+          <w:highlight w:val="green"/>
+          <w:lang w:val="it-IT"/>
+        </w:rPr>
+      </w:pPr>
+      <w:r>
+        <w:rPr>
+          <w:highlight w:val="green"/>
           <w:lang w:val="it-IT"/>
         </w:rPr>
         <w:t xml:space="preserve">- </w:t>
@@ -22824,6 +22895,7 @@
       <w:proofErr w:type="gramStart"/>
       <w:r>
         <w:rPr>
+          <w:highlight w:val="green"/>
           <w:lang w:val="it-IT"/>
         </w:rPr>
         <w:t>[ ]</w:t>
@@ -22831,6 +22903,7 @@
       <w:proofErr w:type="gramEnd"/>
       <w:r>
         <w:rPr>
+          <w:highlight w:val="green"/>
           <w:lang w:val="it-IT"/>
         </w:rPr>
         <w:t xml:space="preserve"> `</w:t>
@@ -22838,6 +22911,7 @@
       <w:proofErr w:type="spellStart"/>
       <w:r>
         <w:rPr>
+          <w:highlight w:val="green"/>
           <w:lang w:val="it-IT"/>
         </w:rPr>
         <w:t>alembic</w:t>
@@ -22845,6 +22919,7 @@
       <w:proofErr w:type="spellEnd"/>
       <w:r>
         <w:rPr>
+          <w:highlight w:val="green"/>
           <w:lang w:val="it-IT"/>
         </w:rPr>
         <w:t xml:space="preserve"> upgrade head` esegue senza errori</w:t>
@@ -22853,11 +22928,13 @@
     <w:p>
       <w:pPr>
         <w:rPr>
-          <w:lang w:val="it-IT"/>
-        </w:rPr>
-      </w:pPr>
-      <w:r>
-        <w:rPr>
+          <w:highlight w:val="green"/>
+          <w:lang w:val="it-IT"/>
+        </w:rPr>
+      </w:pPr>
+      <w:r>
+        <w:rPr>
+          <w:highlight w:val="green"/>
           <w:lang w:val="it-IT"/>
         </w:rPr>
         <w:t xml:space="preserve">- </w:t>
@@ -22865,6 +22942,7 @@
       <w:proofErr w:type="gramStart"/>
       <w:r>
         <w:rPr>
+          <w:highlight w:val="green"/>
           <w:lang w:val="it-IT"/>
         </w:rPr>
         <w:t>[ ]</w:t>
@@ -22872,6 +22950,7 @@
       <w:proofErr w:type="gramEnd"/>
       <w:r>
         <w:rPr>
+          <w:highlight w:val="green"/>
           <w:lang w:val="it-IT"/>
         </w:rPr>
         <w:t xml:space="preserve"> `</w:t>
@@ -22879,6 +22958,7 @@
       <w:proofErr w:type="spellStart"/>
       <w:r>
         <w:rPr>
+          <w:highlight w:val="green"/>
           <w:lang w:val="it-IT"/>
         </w:rPr>
         <w:t>alembic</w:t>
@@ -22886,6 +22966,7 @@
       <w:proofErr w:type="spellEnd"/>
       <w:r>
         <w:rPr>
+          <w:highlight w:val="green"/>
           <w:lang w:val="it-IT"/>
         </w:rPr>
         <w:t xml:space="preserve"> downgrade -1` esegue senza errori</w:t>
@@ -22894,11 +22975,13 @@
     <w:p>
       <w:pPr>
         <w:rPr>
-          <w:lang w:val="it-IT"/>
-        </w:rPr>
-      </w:pPr>
-      <w:r>
-        <w:rPr>
+          <w:highlight w:val="green"/>
+          <w:lang w:val="it-IT"/>
+        </w:rPr>
+      </w:pPr>
+      <w:r>
+        <w:rPr>
+          <w:highlight w:val="green"/>
           <w:lang w:val="it-IT"/>
         </w:rPr>
         <w:t xml:space="preserve">- </w:t>
@@ -22906,6 +22989,7 @@
       <w:proofErr w:type="gramStart"/>
       <w:r>
         <w:rPr>
+          <w:highlight w:val="green"/>
           <w:lang w:val="it-IT"/>
         </w:rPr>
         <w:t>[ ]</w:t>
@@ -22913,6 +22997,7 @@
       <w:proofErr w:type="gramEnd"/>
       <w:r>
         <w:rPr>
+          <w:highlight w:val="green"/>
           <w:lang w:val="it-IT"/>
         </w:rPr>
         <w:t xml:space="preserve"> Migrazione riflette tutti i modelli definiti</w:t>
@@ -22926,6 +23011,7 @@
       </w:pPr>
       <w:r>
         <w:rPr>
+          <w:highlight w:val="green"/>
           <w:lang w:val="it-IT"/>
         </w:rPr>
         <w:t xml:space="preserve">- </w:t>
@@ -22933,6 +23019,7 @@
       <w:proofErr w:type="gramStart"/>
       <w:r>
         <w:rPr>
+          <w:highlight w:val="green"/>
           <w:lang w:val="it-IT"/>
         </w:rPr>
         <w:t>[ ]</w:t>
@@ -22940,6 +23027,7 @@
       <w:proofErr w:type="gramEnd"/>
       <w:r>
         <w:rPr>
+          <w:highlight w:val="green"/>
           <w:lang w:val="it-IT"/>
         </w:rPr>
         <w:t xml:space="preserve"> </w:t>
@@ -22947,6 +23035,7 @@
       <w:proofErr w:type="spellStart"/>
       <w:r>
         <w:rPr>
+          <w:highlight w:val="green"/>
           <w:lang w:val="it-IT"/>
         </w:rPr>
         <w:t>Async</w:t>
@@ -22954,6 +23043,7 @@
       <w:proofErr w:type="spellEnd"/>
       <w:r>
         <w:rPr>
+          <w:highlight w:val="green"/>
           <w:lang w:val="it-IT"/>
         </w:rPr>
         <w:t xml:space="preserve"> </w:t>
@@ -22961,6 +23051,7 @@
       <w:proofErr w:type="spellStart"/>
       <w:r>
         <w:rPr>
+          <w:highlight w:val="green"/>
           <w:lang w:val="it-IT"/>
         </w:rPr>
         <w:t>engine</w:t>
@@ -22968,6 +23059,7 @@
       <w:proofErr w:type="spellEnd"/>
       <w:r>
         <w:rPr>
+          <w:highlight w:val="green"/>
           <w:lang w:val="it-IT"/>
         </w:rPr>
         <w:t xml:space="preserve"> configurato correttamente</w:t>

</xml_diff>

<commit_message>
feat: Implement EstimateHistoryService for event-sourced estimate state reconstruction, audit trails, and change tracking, accompanied by dedicated tests.
</commit_message>
<xml_diff>
--- a/Piano-operativo-v1.7.docx
+++ b/Piano-operativo-v1.7.docx
@@ -26712,27 +26712,49 @@
     </w:p>
     <w:p/>
     <w:p>
-      <w:r>
+      <w:pPr>
+        <w:rPr>
+          <w:highlight w:val="green"/>
+        </w:rPr>
+      </w:pPr>
+      <w:r>
+        <w:rPr>
+          <w:highlight w:val="green"/>
+        </w:rPr>
         <w:t xml:space="preserve">## TASK 2.15: </w:t>
       </w:r>
       <w:proofErr w:type="spellStart"/>
       <w:r>
+        <w:rPr>
+          <w:highlight w:val="green"/>
+        </w:rPr>
         <w:t>Creazione</w:t>
       </w:r>
       <w:proofErr w:type="spellEnd"/>
       <w:r>
+        <w:rPr>
+          <w:highlight w:val="green"/>
+        </w:rPr>
         <w:t xml:space="preserve"> Service EstimateHistoryService (Event Sourcing)</w:t>
       </w:r>
     </w:p>
-    <w:p/>
-    <w:p>
-      <w:pPr>
-        <w:rPr>
-          <w:lang w:val="it-IT"/>
-        </w:rPr>
-      </w:pPr>
-      <w:r>
-        <w:rPr>
+    <w:p>
+      <w:pPr>
+        <w:rPr>
+          <w:highlight w:val="green"/>
+        </w:rPr>
+      </w:pPr>
+    </w:p>
+    <w:p>
+      <w:pPr>
+        <w:rPr>
+          <w:highlight w:val="green"/>
+          <w:lang w:val="it-IT"/>
+        </w:rPr>
+      </w:pPr>
+      <w:r>
+        <w:rPr>
+          <w:highlight w:val="green"/>
           <w:lang w:val="it-IT"/>
         </w:rPr>
         <w:t>**</w:t>
@@ -26740,6 +26762,7 @@
       <w:proofErr w:type="gramStart"/>
       <w:r>
         <w:rPr>
+          <w:highlight w:val="green"/>
           <w:lang w:val="it-IT"/>
         </w:rPr>
         <w:t>Descrizione:*</w:t>
@@ -26747,6 +26770,7 @@
       <w:proofErr w:type="gramEnd"/>
       <w:r>
         <w:rPr>
+          <w:highlight w:val="green"/>
           <w:lang w:val="it-IT"/>
         </w:rPr>
         <w:t>* Implementare service per ricostruzione stato storico stime.</w:t>
@@ -26755,57 +26779,97 @@
     <w:p>
       <w:pPr>
         <w:rPr>
-          <w:lang w:val="it-IT"/>
-        </w:rPr>
-      </w:pPr>
-    </w:p>
-    <w:p>
-      <w:r>
+          <w:highlight w:val="green"/>
+          <w:lang w:val="it-IT"/>
+        </w:rPr>
+      </w:pPr>
+    </w:p>
+    <w:p>
+      <w:pPr>
+        <w:rPr>
+          <w:highlight w:val="green"/>
+        </w:rPr>
+      </w:pPr>
+      <w:r>
+        <w:rPr>
+          <w:highlight w:val="green"/>
+        </w:rPr>
         <w:t>**</w:t>
       </w:r>
       <w:proofErr w:type="spellStart"/>
       <w:proofErr w:type="gramStart"/>
       <w:r>
+        <w:rPr>
+          <w:highlight w:val="green"/>
+        </w:rPr>
         <w:t>Microstep</w:t>
       </w:r>
       <w:proofErr w:type="spellEnd"/>
       <w:r>
+        <w:rPr>
+          <w:highlight w:val="green"/>
+        </w:rPr>
         <w:t>:*</w:t>
       </w:r>
       <w:proofErr w:type="gramEnd"/>
       <w:r>
+        <w:rPr>
+          <w:highlight w:val="green"/>
+        </w:rPr>
         <w:t>*</w:t>
       </w:r>
     </w:p>
     <w:p>
-      <w:r>
+      <w:pPr>
+        <w:rPr>
+          <w:highlight w:val="green"/>
+        </w:rPr>
+      </w:pPr>
+      <w:r>
+        <w:rPr>
+          <w:highlight w:val="green"/>
+        </w:rPr>
         <w:t xml:space="preserve">1. </w:t>
       </w:r>
       <w:proofErr w:type="spellStart"/>
       <w:r>
+        <w:rPr>
+          <w:highlight w:val="green"/>
+        </w:rPr>
         <w:t>Creare</w:t>
       </w:r>
       <w:proofErr w:type="spellEnd"/>
       <w:r>
+        <w:rPr>
+          <w:highlight w:val="green"/>
+        </w:rPr>
         <w:t xml:space="preserve"> file `backend/</w:t>
       </w:r>
       <w:proofErr w:type="spellStart"/>
       <w:r>
+        <w:rPr>
+          <w:highlight w:val="green"/>
+        </w:rPr>
         <w:t>src</w:t>
       </w:r>
       <w:proofErr w:type="spellEnd"/>
       <w:r>
+        <w:rPr>
+          <w:highlight w:val="green"/>
+        </w:rPr>
         <w:t>/estimates/services/estimate_history_service.py`</w:t>
       </w:r>
     </w:p>
     <w:p>
       <w:pPr>
         <w:rPr>
-          <w:lang w:val="it-IT"/>
-        </w:rPr>
-      </w:pPr>
-      <w:r>
-        <w:rPr>
+          <w:highlight w:val="green"/>
+          <w:lang w:val="it-IT"/>
+        </w:rPr>
+      </w:pPr>
+      <w:r>
+        <w:rPr>
+          <w:highlight w:val="green"/>
           <w:lang w:val="it-IT"/>
         </w:rPr>
         <w:t>2. Definire classe `</w:t>
@@ -26813,6 +26877,7 @@
       <w:proofErr w:type="spellStart"/>
       <w:r>
         <w:rPr>
+          <w:highlight w:val="green"/>
           <w:lang w:val="it-IT"/>
         </w:rPr>
         <w:t>EstimateHistoryService</w:t>
@@ -26820,6 +26885,7 @@
       <w:proofErr w:type="spellEnd"/>
       <w:r>
         <w:rPr>
+          <w:highlight w:val="green"/>
           <w:lang w:val="it-IT"/>
         </w:rPr>
         <w:t>`</w:t>
@@ -26828,11 +26894,13 @@
     <w:p>
       <w:pPr>
         <w:rPr>
-          <w:lang w:val="it-IT"/>
-        </w:rPr>
-      </w:pPr>
-      <w:r>
-        <w:rPr>
+          <w:highlight w:val="green"/>
+          <w:lang w:val="it-IT"/>
+        </w:rPr>
+      </w:pPr>
+      <w:r>
+        <w:rPr>
+          <w:highlight w:val="green"/>
           <w:lang w:val="it-IT"/>
         </w:rPr>
         <w:t>3. Iniettare `</w:t>
@@ -26840,6 +26908,7 @@
       <w:proofErr w:type="spellStart"/>
       <w:r>
         <w:rPr>
+          <w:highlight w:val="green"/>
           <w:lang w:val="it-IT"/>
         </w:rPr>
         <w:t>EstimateEventRepository</w:t>
@@ -26847,80 +26916,133 @@
       <w:proofErr w:type="spellEnd"/>
       <w:r>
         <w:rPr>
+          <w:highlight w:val="green"/>
           <w:lang w:val="it-IT"/>
         </w:rPr>
         <w:t>`</w:t>
       </w:r>
     </w:p>
     <w:p>
-      <w:r>
+      <w:pPr>
+        <w:rPr>
+          <w:highlight w:val="green"/>
+        </w:rPr>
+      </w:pPr>
+      <w:r>
+        <w:rPr>
+          <w:highlight w:val="green"/>
+        </w:rPr>
         <w:t xml:space="preserve">4. </w:t>
       </w:r>
       <w:proofErr w:type="spellStart"/>
       <w:r>
+        <w:rPr>
+          <w:highlight w:val="green"/>
+        </w:rPr>
         <w:t>Implementare</w:t>
       </w:r>
       <w:proofErr w:type="spellEnd"/>
       <w:r>
+        <w:rPr>
+          <w:highlight w:val="green"/>
+        </w:rPr>
         <w:t xml:space="preserve"> </w:t>
       </w:r>
       <w:proofErr w:type="spellStart"/>
       <w:r>
+        <w:rPr>
+          <w:highlight w:val="green"/>
+        </w:rPr>
         <w:t>metodo</w:t>
       </w:r>
       <w:proofErr w:type="spellEnd"/>
       <w:r>
+        <w:rPr>
+          <w:highlight w:val="green"/>
+        </w:rPr>
         <w:t xml:space="preserve"> `</w:t>
       </w:r>
       <w:proofErr w:type="spellStart"/>
       <w:r>
+        <w:rPr>
+          <w:highlight w:val="green"/>
+        </w:rPr>
         <w:t>get_state_</w:t>
       </w:r>
       <w:proofErr w:type="gramStart"/>
       <w:r>
+        <w:rPr>
+          <w:highlight w:val="green"/>
+        </w:rPr>
         <w:t>at</w:t>
       </w:r>
       <w:proofErr w:type="spellEnd"/>
       <w:r>
+        <w:rPr>
+          <w:highlight w:val="green"/>
+        </w:rPr>
         <w:t>(</w:t>
       </w:r>
       <w:proofErr w:type="spellStart"/>
       <w:proofErr w:type="gramEnd"/>
       <w:r>
+        <w:rPr>
+          <w:highlight w:val="green"/>
+        </w:rPr>
         <w:t>estimate_id</w:t>
       </w:r>
       <w:proofErr w:type="spellEnd"/>
       <w:r>
+        <w:rPr>
+          <w:highlight w:val="green"/>
+        </w:rPr>
         <w:t xml:space="preserve">: UUID, </w:t>
       </w:r>
       <w:proofErr w:type="spellStart"/>
       <w:r>
+        <w:rPr>
+          <w:highlight w:val="green"/>
+        </w:rPr>
         <w:t>at_time</w:t>
       </w:r>
       <w:proofErr w:type="spellEnd"/>
       <w:r>
+        <w:rPr>
+          <w:highlight w:val="green"/>
+        </w:rPr>
         <w:t xml:space="preserve">: datetime) -&gt; </w:t>
       </w:r>
       <w:proofErr w:type="spellStart"/>
       <w:r>
+        <w:rPr>
+          <w:highlight w:val="green"/>
+        </w:rPr>
         <w:t>EstimateSnapshot</w:t>
       </w:r>
       <w:proofErr w:type="spellEnd"/>
       <w:r>
+        <w:rPr>
+          <w:highlight w:val="green"/>
+        </w:rPr>
         <w:t>`:</w:t>
       </w:r>
     </w:p>
     <w:p>
       <w:pPr>
         <w:rPr>
-          <w:lang w:val="it-IT"/>
-        </w:rPr>
-      </w:pPr>
-      <w:r>
+          <w:highlight w:val="green"/>
+          <w:lang w:val="it-IT"/>
+        </w:rPr>
+      </w:pPr>
+      <w:r>
+        <w:rPr>
+          <w:highlight w:val="green"/>
+        </w:rPr>
         <w:t xml:space="preserve">   </w:t>
       </w:r>
       <w:r>
         <w:rPr>
+          <w:highlight w:val="green"/>
           <w:lang w:val="it-IT"/>
         </w:rPr>
         <w:t xml:space="preserve">- Recuperare tutti gli eventi fino </w:t>
@@ -26928,6 +27050,7 @@
       <w:proofErr w:type="gramStart"/>
       <w:r>
         <w:rPr>
+          <w:highlight w:val="green"/>
           <w:lang w:val="it-IT"/>
         </w:rPr>
         <w:t>a</w:t>
@@ -26935,6 +27058,7 @@
       <w:proofErr w:type="gramEnd"/>
       <w:r>
         <w:rPr>
+          <w:highlight w:val="green"/>
           <w:lang w:val="it-IT"/>
         </w:rPr>
         <w:t xml:space="preserve"> </w:t>
@@ -26942,6 +27066,7 @@
       <w:proofErr w:type="spellStart"/>
       <w:r>
         <w:rPr>
+          <w:highlight w:val="green"/>
           <w:lang w:val="it-IT"/>
         </w:rPr>
         <w:t>at_time</w:t>
@@ -26951,159 +27076,280 @@
     <w:p>
       <w:pPr>
         <w:rPr>
-          <w:lang w:val="it-IT"/>
-        </w:rPr>
-      </w:pPr>
-      <w:r>
-        <w:rPr>
+          <w:highlight w:val="green"/>
+          <w:lang w:val="it-IT"/>
+        </w:rPr>
+      </w:pPr>
+      <w:r>
+        <w:rPr>
+          <w:highlight w:val="green"/>
           <w:lang w:val="it-IT"/>
         </w:rPr>
         <w:t xml:space="preserve">   - Ricostruire stato applicando eventi in ordine</w:t>
       </w:r>
     </w:p>
     <w:p>
-      <w:r>
+      <w:pPr>
+        <w:rPr>
+          <w:highlight w:val="green"/>
+        </w:rPr>
+      </w:pPr>
+      <w:r>
+        <w:rPr>
+          <w:highlight w:val="green"/>
+        </w:rPr>
         <w:t xml:space="preserve">5. </w:t>
       </w:r>
       <w:proofErr w:type="spellStart"/>
       <w:r>
+        <w:rPr>
+          <w:highlight w:val="green"/>
+        </w:rPr>
         <w:t>Implementare</w:t>
       </w:r>
       <w:proofErr w:type="spellEnd"/>
       <w:r>
+        <w:rPr>
+          <w:highlight w:val="green"/>
+        </w:rPr>
         <w:t xml:space="preserve"> </w:t>
       </w:r>
       <w:proofErr w:type="spellStart"/>
       <w:r>
+        <w:rPr>
+          <w:highlight w:val="green"/>
+        </w:rPr>
         <w:t>metodo</w:t>
       </w:r>
       <w:proofErr w:type="spellEnd"/>
       <w:r>
+        <w:rPr>
+          <w:highlight w:val="green"/>
+        </w:rPr>
         <w:t xml:space="preserve"> `</w:t>
       </w:r>
       <w:proofErr w:type="spellStart"/>
       <w:r>
+        <w:rPr>
+          <w:highlight w:val="green"/>
+        </w:rPr>
         <w:t>get_audit_</w:t>
       </w:r>
       <w:proofErr w:type="gramStart"/>
       <w:r>
+        <w:rPr>
+          <w:highlight w:val="green"/>
+        </w:rPr>
         <w:t>trail</w:t>
       </w:r>
       <w:proofErr w:type="spellEnd"/>
       <w:r>
+        <w:rPr>
+          <w:highlight w:val="green"/>
+        </w:rPr>
         <w:t>(</w:t>
       </w:r>
       <w:proofErr w:type="spellStart"/>
       <w:proofErr w:type="gramEnd"/>
       <w:r>
+        <w:rPr>
+          <w:highlight w:val="green"/>
+        </w:rPr>
         <w:t>estimate_id</w:t>
       </w:r>
       <w:proofErr w:type="spellEnd"/>
       <w:r>
+        <w:rPr>
+          <w:highlight w:val="green"/>
+        </w:rPr>
         <w:t xml:space="preserve">: UUID) -&gt; </w:t>
       </w:r>
       <w:proofErr w:type="gramStart"/>
       <w:r>
+        <w:rPr>
+          <w:highlight w:val="green"/>
+        </w:rPr>
         <w:t>List[</w:t>
       </w:r>
       <w:proofErr w:type="spellStart"/>
       <w:proofErr w:type="gramEnd"/>
       <w:r>
+        <w:rPr>
+          <w:highlight w:val="green"/>
+        </w:rPr>
         <w:t>AuditEntry</w:t>
       </w:r>
       <w:proofErr w:type="spellEnd"/>
       <w:r>
+        <w:rPr>
+          <w:highlight w:val="green"/>
+        </w:rPr>
         <w:t>]`:</w:t>
       </w:r>
     </w:p>
     <w:p>
-      <w:r>
+      <w:pPr>
+        <w:rPr>
+          <w:highlight w:val="green"/>
+        </w:rPr>
+      </w:pPr>
+      <w:r>
+        <w:rPr>
+          <w:highlight w:val="green"/>
+        </w:rPr>
         <w:t xml:space="preserve">   - </w:t>
       </w:r>
       <w:proofErr w:type="spellStart"/>
       <w:r>
+        <w:rPr>
+          <w:highlight w:val="green"/>
+        </w:rPr>
         <w:t>Restituire</w:t>
       </w:r>
       <w:proofErr w:type="spellEnd"/>
       <w:r>
+        <w:rPr>
+          <w:highlight w:val="green"/>
+        </w:rPr>
         <w:t xml:space="preserve"> </w:t>
       </w:r>
       <w:proofErr w:type="spellStart"/>
       <w:r>
+        <w:rPr>
+          <w:highlight w:val="green"/>
+        </w:rPr>
         <w:t>lista</w:t>
       </w:r>
       <w:proofErr w:type="spellEnd"/>
       <w:r>
+        <w:rPr>
+          <w:highlight w:val="green"/>
+        </w:rPr>
         <w:t xml:space="preserve"> </w:t>
       </w:r>
       <w:proofErr w:type="spellStart"/>
       <w:r>
+        <w:rPr>
+          <w:highlight w:val="green"/>
+        </w:rPr>
         <w:t>eventi</w:t>
       </w:r>
       <w:proofErr w:type="spellEnd"/>
       <w:r>
+        <w:rPr>
+          <w:highlight w:val="green"/>
+        </w:rPr>
         <w:t xml:space="preserve"> con metadata human-readable</w:t>
       </w:r>
     </w:p>
     <w:p>
-      <w:r>
+      <w:pPr>
+        <w:rPr>
+          <w:highlight w:val="green"/>
+        </w:rPr>
+      </w:pPr>
+      <w:r>
+        <w:rPr>
+          <w:highlight w:val="green"/>
+        </w:rPr>
         <w:t xml:space="preserve">6. </w:t>
       </w:r>
       <w:proofErr w:type="spellStart"/>
       <w:r>
+        <w:rPr>
+          <w:highlight w:val="green"/>
+        </w:rPr>
         <w:t>Implementare</w:t>
       </w:r>
       <w:proofErr w:type="spellEnd"/>
       <w:r>
+        <w:rPr>
+          <w:highlight w:val="green"/>
+        </w:rPr>
         <w:t xml:space="preserve"> </w:t>
       </w:r>
       <w:proofErr w:type="spellStart"/>
       <w:r>
+        <w:rPr>
+          <w:highlight w:val="green"/>
+        </w:rPr>
         <w:t>metodo</w:t>
       </w:r>
       <w:proofErr w:type="spellEnd"/>
       <w:r>
+        <w:rPr>
+          <w:highlight w:val="green"/>
+        </w:rPr>
         <w:t xml:space="preserve"> `</w:t>
       </w:r>
       <w:proofErr w:type="spellStart"/>
       <w:r>
+        <w:rPr>
+          <w:highlight w:val="green"/>
+        </w:rPr>
         <w:t>get_changes_</w:t>
       </w:r>
       <w:proofErr w:type="gramStart"/>
       <w:r>
+        <w:rPr>
+          <w:highlight w:val="green"/>
+        </w:rPr>
         <w:t>between</w:t>
       </w:r>
       <w:proofErr w:type="spellEnd"/>
       <w:r>
+        <w:rPr>
+          <w:highlight w:val="green"/>
+        </w:rPr>
         <w:t>(</w:t>
       </w:r>
       <w:proofErr w:type="spellStart"/>
       <w:proofErr w:type="gramEnd"/>
       <w:r>
+        <w:rPr>
+          <w:highlight w:val="green"/>
+        </w:rPr>
         <w:t>estimate_id</w:t>
       </w:r>
       <w:proofErr w:type="spellEnd"/>
       <w:r>
+        <w:rPr>
+          <w:highlight w:val="green"/>
+        </w:rPr>
         <w:t xml:space="preserve">: UUID, start: datetime, end: datetime) -&gt; </w:t>
       </w:r>
       <w:proofErr w:type="gramStart"/>
       <w:r>
+        <w:rPr>
+          <w:highlight w:val="green"/>
+        </w:rPr>
         <w:t>List[</w:t>
       </w:r>
       <w:proofErr w:type="gramEnd"/>
       <w:r>
+        <w:rPr>
+          <w:highlight w:val="green"/>
+        </w:rPr>
         <w:t>Change]`</w:t>
       </w:r>
     </w:p>
-    <w:p/>
-    <w:p>
-      <w:pPr>
-        <w:rPr>
-          <w:lang w:val="it-IT"/>
-        </w:rPr>
-      </w:pPr>
-      <w:r>
-        <w:rPr>
+    <w:p>
+      <w:pPr>
+        <w:rPr>
+          <w:highlight w:val="green"/>
+        </w:rPr>
+      </w:pPr>
+    </w:p>
+    <w:p>
+      <w:pPr>
+        <w:rPr>
+          <w:highlight w:val="green"/>
+          <w:lang w:val="it-IT"/>
+        </w:rPr>
+      </w:pPr>
+      <w:r>
+        <w:rPr>
+          <w:highlight w:val="green"/>
           <w:lang w:val="it-IT"/>
         </w:rPr>
         <w:t>**</w:t>
@@ -27111,6 +27357,7 @@
       <w:proofErr w:type="spellStart"/>
       <w:r>
         <w:rPr>
+          <w:highlight w:val="green"/>
           <w:lang w:val="it-IT"/>
         </w:rPr>
         <w:t>Acceptance</w:t>
@@ -27118,6 +27365,7 @@
       <w:proofErr w:type="spellEnd"/>
       <w:r>
         <w:rPr>
+          <w:highlight w:val="green"/>
           <w:lang w:val="it-IT"/>
         </w:rPr>
         <w:t xml:space="preserve"> </w:t>
@@ -27126,6 +27374,7 @@
       <w:proofErr w:type="gramStart"/>
       <w:r>
         <w:rPr>
+          <w:highlight w:val="green"/>
           <w:lang w:val="it-IT"/>
         </w:rPr>
         <w:t>Criteria</w:t>
@@ -27133,6 +27382,7 @@
       <w:proofErr w:type="spellEnd"/>
       <w:r>
         <w:rPr>
+          <w:highlight w:val="green"/>
           <w:lang w:val="it-IT"/>
         </w:rPr>
         <w:t>:*</w:t>
@@ -27140,6 +27390,7 @@
       <w:proofErr w:type="gramEnd"/>
       <w:r>
         <w:rPr>
+          <w:highlight w:val="green"/>
           <w:lang w:val="it-IT"/>
         </w:rPr>
         <w:t>*</w:t>
@@ -27148,11 +27399,13 @@
     <w:p>
       <w:pPr>
         <w:rPr>
-          <w:lang w:val="it-IT"/>
-        </w:rPr>
-      </w:pPr>
-      <w:r>
-        <w:rPr>
+          <w:highlight w:val="green"/>
+          <w:lang w:val="it-IT"/>
+        </w:rPr>
+      </w:pPr>
+      <w:r>
+        <w:rPr>
+          <w:highlight w:val="green"/>
           <w:lang w:val="it-IT"/>
         </w:rPr>
         <w:t xml:space="preserve">- </w:t>
@@ -27160,6 +27413,7 @@
       <w:proofErr w:type="gramStart"/>
       <w:r>
         <w:rPr>
+          <w:highlight w:val="green"/>
           <w:lang w:val="it-IT"/>
         </w:rPr>
         <w:t>[ ]</w:t>
@@ -27167,6 +27421,7 @@
       <w:proofErr w:type="gramEnd"/>
       <w:r>
         <w:rPr>
+          <w:highlight w:val="green"/>
           <w:lang w:val="it-IT"/>
         </w:rPr>
         <w:t xml:space="preserve"> Stato ricostruito correttamente per qualsiasi </w:t>
@@ -27174,6 +27429,7 @@
       <w:proofErr w:type="spellStart"/>
       <w:r>
         <w:rPr>
+          <w:highlight w:val="green"/>
           <w:lang w:val="it-IT"/>
         </w:rPr>
         <w:t>timestamp</w:t>
@@ -27183,11 +27439,13 @@
     <w:p>
       <w:pPr>
         <w:rPr>
-          <w:lang w:val="it-IT"/>
-        </w:rPr>
-      </w:pPr>
-      <w:r>
-        <w:rPr>
+          <w:highlight w:val="green"/>
+          <w:lang w:val="it-IT"/>
+        </w:rPr>
+      </w:pPr>
+      <w:r>
+        <w:rPr>
+          <w:highlight w:val="green"/>
           <w:lang w:val="it-IT"/>
         </w:rPr>
         <w:t xml:space="preserve">- </w:t>
@@ -27195,6 +27453,7 @@
       <w:proofErr w:type="gramStart"/>
       <w:r>
         <w:rPr>
+          <w:highlight w:val="green"/>
           <w:lang w:val="it-IT"/>
         </w:rPr>
         <w:t>[ ]</w:t>
@@ -27202,6 +27461,7 @@
       <w:proofErr w:type="gramEnd"/>
       <w:r>
         <w:rPr>
+          <w:highlight w:val="green"/>
           <w:lang w:val="it-IT"/>
         </w:rPr>
         <w:t xml:space="preserve"> Audit </w:t>
@@ -27209,6 +27469,7 @@
       <w:proofErr w:type="spellStart"/>
       <w:r>
         <w:rPr>
+          <w:highlight w:val="green"/>
           <w:lang w:val="it-IT"/>
         </w:rPr>
         <w:t>trail</w:t>
@@ -27216,6 +27477,7 @@
       <w:proofErr w:type="spellEnd"/>
       <w:r>
         <w:rPr>
+          <w:highlight w:val="green"/>
           <w:lang w:val="it-IT"/>
         </w:rPr>
         <w:t xml:space="preserve"> completo e ordinato</w:t>
@@ -27229,6 +27491,7 @@
       </w:pPr>
       <w:r>
         <w:rPr>
+          <w:highlight w:val="green"/>
           <w:lang w:val="it-IT"/>
         </w:rPr>
         <w:t xml:space="preserve">- </w:t>
@@ -27236,6 +27499,7 @@
       <w:proofErr w:type="gramStart"/>
       <w:r>
         <w:rPr>
+          <w:highlight w:val="green"/>
           <w:lang w:val="it-IT"/>
         </w:rPr>
         <w:t>[ ]</w:t>
@@ -27243,6 +27507,7 @@
       <w:proofErr w:type="gramEnd"/>
       <w:r>
         <w:rPr>
+          <w:highlight w:val="green"/>
           <w:lang w:val="it-IT"/>
         </w:rPr>
         <w:t xml:space="preserve"> Performance accettabile per stime con molti eventi</w:t>

</xml_diff>

<commit_message>
feat: Implement cached market data provider with retry logic, TTL caching, and stale data fallback.
</commit_message>
<xml_diff>
--- a/Piano-operativo-v1.7.docx
+++ b/Piano-operativo-v1.7.docx
@@ -29604,11 +29604,13 @@
     <w:p>
       <w:pPr>
         <w:rPr>
-          <w:lang w:val="it-IT"/>
-        </w:rPr>
-      </w:pPr>
-      <w:r>
-        <w:rPr>
+          <w:highlight w:val="green"/>
+          <w:lang w:val="it-IT"/>
+        </w:rPr>
+      </w:pPr>
+      <w:r>
+        <w:rPr>
+          <w:highlight w:val="green"/>
           <w:lang w:val="it-IT"/>
         </w:rPr>
         <w:t xml:space="preserve">TASK 2.19: Caching &amp; Backoff per </w:t>
@@ -29616,6 +29618,7 @@
       <w:proofErr w:type="spellStart"/>
       <w:r>
         <w:rPr>
+          <w:highlight w:val="green"/>
           <w:lang w:val="it-IT"/>
         </w:rPr>
         <w:t>MarketDataProvider</w:t>
@@ -29625,17 +29628,20 @@
     <w:p>
       <w:pPr>
         <w:rPr>
-          <w:lang w:val="it-IT"/>
-        </w:rPr>
-      </w:pPr>
-      <w:r>
-        <w:rPr>
+          <w:highlight w:val="green"/>
+          <w:lang w:val="it-IT"/>
+        </w:rPr>
+      </w:pPr>
+      <w:r>
+        <w:rPr>
+          <w:highlight w:val="green"/>
           <w:lang w:val="it-IT"/>
         </w:rPr>
         <w:t>Descrizione:</w:t>
       </w:r>
       <w:r>
         <w:rPr>
+          <w:highlight w:val="green"/>
           <w:lang w:val="it-IT"/>
         </w:rPr>
         <w:br/>
@@ -29644,6 +29650,7 @@
       <w:proofErr w:type="spellStart"/>
       <w:r>
         <w:rPr>
+          <w:highlight w:val="green"/>
           <w:lang w:val="it-IT"/>
         </w:rPr>
         <w:t>Finnhub</w:t>
@@ -29651,6 +29658,7 @@
       <w:proofErr w:type="spellEnd"/>
       <w:r>
         <w:rPr>
+          <w:highlight w:val="green"/>
           <w:lang w:val="it-IT"/>
         </w:rPr>
         <w:t xml:space="preserve"> e gestire in modo resiliente </w:t>
@@ -29658,6 +29666,7 @@
       <w:proofErr w:type="spellStart"/>
       <w:r>
         <w:rPr>
+          <w:highlight w:val="green"/>
           <w:lang w:val="it-IT"/>
         </w:rPr>
         <w:t>timeouts</w:t>
@@ -29665,6 +29674,7 @@
       <w:proofErr w:type="spellEnd"/>
       <w:r>
         <w:rPr>
+          <w:highlight w:val="green"/>
           <w:lang w:val="it-IT"/>
         </w:rPr>
         <w:t xml:space="preserve"> e rate-</w:t>
@@ -29672,6 +29682,7 @@
       <w:proofErr w:type="spellStart"/>
       <w:r>
         <w:rPr>
+          <w:highlight w:val="green"/>
           <w:lang w:val="it-IT"/>
         </w:rPr>
         <w:t>limit</w:t>
@@ -29679,6 +29690,7 @@
       <w:proofErr w:type="spellEnd"/>
       <w:r>
         <w:rPr>
+          <w:highlight w:val="green"/>
           <w:lang w:val="it-IT"/>
         </w:rPr>
         <w:t xml:space="preserve">, usando cache in memoria e </w:t>
@@ -29686,6 +29698,7 @@
       <w:proofErr w:type="spellStart"/>
       <w:r>
         <w:rPr>
+          <w:highlight w:val="green"/>
           <w:lang w:val="it-IT"/>
         </w:rPr>
         <w:t>backoff</w:t>
@@ -29693,6 +29706,7 @@
       <w:proofErr w:type="spellEnd"/>
       <w:r>
         <w:rPr>
+          <w:highlight w:val="green"/>
           <w:lang w:val="it-IT"/>
         </w:rPr>
         <w:t>.</w:t>
@@ -29701,12 +29715,14 @@
     <w:p>
       <w:pPr>
         <w:rPr>
-          <w:lang w:val="it-IT"/>
-        </w:rPr>
-      </w:pPr>
-      <w:proofErr w:type="spellStart"/>
-      <w:r>
-        <w:rPr>
+          <w:highlight w:val="green"/>
+          <w:lang w:val="it-IT"/>
+        </w:rPr>
+      </w:pPr>
+      <w:proofErr w:type="spellStart"/>
+      <w:r>
+        <w:rPr>
+          <w:highlight w:val="green"/>
           <w:lang w:val="it-IT"/>
         </w:rPr>
         <w:t>Microstep</w:t>
@@ -29714,6 +29730,7 @@
       <w:proofErr w:type="spellEnd"/>
       <w:r>
         <w:rPr>
+          <w:highlight w:val="green"/>
           <w:lang w:val="it-IT"/>
         </w:rPr>
         <w:t>:</w:t>
@@ -29722,11 +29739,13 @@
     <w:p>
       <w:pPr>
         <w:rPr>
-          <w:lang w:val="it-IT"/>
-        </w:rPr>
-      </w:pPr>
-      <w:r>
-        <w:rPr>
+          <w:highlight w:val="green"/>
+          <w:lang w:val="it-IT"/>
+        </w:rPr>
+      </w:pPr>
+      <w:r>
+        <w:rPr>
+          <w:highlight w:val="green"/>
           <w:lang w:val="it-IT"/>
         </w:rPr>
         <w:t>Creare file backend/src/infra/cache/memory_cache.py con una semplice cache LRU/TTL (es. </w:t>
@@ -29735,6 +29754,7 @@
       <w:proofErr w:type="gramStart"/>
       <w:r>
         <w:rPr>
+          <w:highlight w:val="green"/>
           <w:lang w:val="it-IT"/>
         </w:rPr>
         <w:t>cachetools.TTLCache</w:t>
@@ -29743,6 +29763,7 @@
       <w:proofErr w:type="gramEnd"/>
       <w:r>
         <w:rPr>
+          <w:highlight w:val="green"/>
           <w:lang w:val="it-IT"/>
         </w:rPr>
         <w:t>).</w:t>
@@ -29751,11 +29772,13 @@
     <w:p>
       <w:pPr>
         <w:rPr>
-          <w:lang w:val="it-IT"/>
-        </w:rPr>
-      </w:pPr>
-      <w:r>
-        <w:rPr>
+          <w:highlight w:val="green"/>
+          <w:lang w:val="it-IT"/>
+        </w:rPr>
+      </w:pPr>
+      <w:r>
+        <w:rPr>
+          <w:highlight w:val="green"/>
           <w:lang w:val="it-IT"/>
         </w:rPr>
         <w:t>Creare classe CachedMarketDataProvider in backend/src/market_data/infrastructure/cached_provider.py che implementa </w:t>
@@ -29763,6 +29786,7 @@
       <w:proofErr w:type="spellStart"/>
       <w:r>
         <w:rPr>
+          <w:highlight w:val="green"/>
           <w:lang w:val="it-IT"/>
         </w:rPr>
         <w:t>MarketDataProvider</w:t>
@@ -29770,6 +29794,7 @@
       <w:proofErr w:type="spellEnd"/>
       <w:r>
         <w:rPr>
+          <w:highlight w:val="green"/>
           <w:lang w:val="it-IT"/>
         </w:rPr>
         <w:t xml:space="preserve"> e </w:t>
@@ -29777,6 +29802,7 @@
       <w:proofErr w:type="spellStart"/>
       <w:r>
         <w:rPr>
+          <w:highlight w:val="green"/>
           <w:lang w:val="it-IT"/>
         </w:rPr>
         <w:t>wrappa</w:t>
@@ -29784,6 +29810,7 @@
       <w:proofErr w:type="spellEnd"/>
       <w:r>
         <w:rPr>
+          <w:highlight w:val="green"/>
           <w:lang w:val="it-IT"/>
         </w:rPr>
         <w:t xml:space="preserve"> un provider sottostante (</w:t>
@@ -29791,6 +29818,7 @@
       <w:proofErr w:type="spellStart"/>
       <w:r>
         <w:rPr>
+          <w:highlight w:val="green"/>
           <w:lang w:val="it-IT"/>
         </w:rPr>
         <w:t>YahooMarketDataProvider</w:t>
@@ -29798,6 +29826,7 @@
       <w:proofErr w:type="spellEnd"/>
       <w:r>
         <w:rPr>
+          <w:highlight w:val="green"/>
           <w:lang w:val="it-IT"/>
         </w:rPr>
         <w:t>).</w:t>
@@ -29806,11 +29835,13 @@
     <w:p>
       <w:pPr>
         <w:rPr>
-          <w:lang w:val="it-IT"/>
-        </w:rPr>
-      </w:pPr>
-      <w:r>
-        <w:rPr>
+          <w:highlight w:val="green"/>
+          <w:lang w:val="it-IT"/>
+        </w:rPr>
+      </w:pPr>
+      <w:r>
+        <w:rPr>
+          <w:highlight w:val="green"/>
           <w:lang w:val="it-IT"/>
         </w:rPr>
         <w:t>Implementare TTL differenziato:</w:t>
@@ -29819,11 +29850,13 @@
     <w:p>
       <w:pPr>
         <w:rPr>
-          <w:lang w:val="it-IT"/>
-        </w:rPr>
-      </w:pPr>
-      <w:r>
-        <w:rPr>
+          <w:highlight w:val="green"/>
+          <w:lang w:val="it-IT"/>
+        </w:rPr>
+      </w:pPr>
+      <w:r>
+        <w:rPr>
+          <w:highlight w:val="green"/>
           <w:lang w:val="it-IT"/>
         </w:rPr>
         <w:t>Prezzi correnti: TTL 60s.</w:t>
@@ -29832,11 +29865,13 @@
     <w:p>
       <w:pPr>
         <w:rPr>
-          <w:lang w:val="it-IT"/>
-        </w:rPr>
-      </w:pPr>
-      <w:r>
-        <w:rPr>
+          <w:highlight w:val="green"/>
+          <w:lang w:val="it-IT"/>
+        </w:rPr>
+      </w:pPr>
+      <w:r>
+        <w:rPr>
+          <w:highlight w:val="green"/>
           <w:lang w:val="it-IT"/>
         </w:rPr>
         <w:t>Storico: TTL 1h.</w:t>
@@ -29845,11 +29880,13 @@
     <w:p>
       <w:pPr>
         <w:rPr>
-          <w:lang w:val="it-IT"/>
-        </w:rPr>
-      </w:pPr>
-      <w:r>
-        <w:rPr>
+          <w:highlight w:val="green"/>
+          <w:lang w:val="it-IT"/>
+        </w:rPr>
+      </w:pPr>
+      <w:r>
+        <w:rPr>
+          <w:highlight w:val="green"/>
           <w:lang w:val="it-IT"/>
         </w:rPr>
         <w:t>Fundamentals: TTL 24h.</w:t>
@@ -29858,11 +29895,13 @@
     <w:p>
       <w:pPr>
         <w:rPr>
-          <w:lang w:val="it-IT"/>
-        </w:rPr>
-      </w:pPr>
-      <w:r>
-        <w:rPr>
+          <w:highlight w:val="green"/>
+          <w:lang w:val="it-IT"/>
+        </w:rPr>
+      </w:pPr>
+      <w:r>
+        <w:rPr>
+          <w:highlight w:val="green"/>
           <w:lang w:val="it-IT"/>
         </w:rPr>
         <w:lastRenderedPageBreak/>
@@ -29871,6 +29910,7 @@
       <w:proofErr w:type="spellStart"/>
       <w:r>
         <w:rPr>
+          <w:highlight w:val="green"/>
           <w:lang w:val="it-IT"/>
         </w:rPr>
         <w:t>backoff</w:t>
@@ -29878,6 +29918,7 @@
       <w:proofErr w:type="spellEnd"/>
       <w:r>
         <w:rPr>
+          <w:highlight w:val="green"/>
           <w:lang w:val="it-IT"/>
         </w:rPr>
         <w:t>:</w:t>
@@ -29886,11 +29927,13 @@
     <w:p>
       <w:pPr>
         <w:rPr>
-          <w:lang w:val="it-IT"/>
-        </w:rPr>
-      </w:pPr>
-      <w:r>
-        <w:rPr>
+          <w:highlight w:val="green"/>
+          <w:lang w:val="it-IT"/>
+        </w:rPr>
+      </w:pPr>
+      <w:r>
+        <w:rPr>
+          <w:highlight w:val="green"/>
           <w:lang w:val="it-IT"/>
         </w:rPr>
         <w:t>Su </w:t>
@@ -29898,6 +29941,7 @@
       <w:proofErr w:type="spellStart"/>
       <w:r>
         <w:rPr>
+          <w:highlight w:val="green"/>
           <w:lang w:val="it-IT"/>
         </w:rPr>
         <w:t>TimeoutError</w:t>
@@ -29905,6 +29949,7 @@
       <w:proofErr w:type="spellEnd"/>
       <w:r>
         <w:rPr>
+          <w:highlight w:val="green"/>
           <w:lang w:val="it-IT"/>
         </w:rPr>
         <w:t> o HTTP 429/5xx, ritentare fino a N volte (es. 3) con ritardo esponenziale (es. 0.5s, 1s, 2s).</w:t>
@@ -29913,11 +29958,13 @@
     <w:p>
       <w:pPr>
         <w:rPr>
-          <w:lang w:val="it-IT"/>
-        </w:rPr>
-      </w:pPr>
-      <w:r>
-        <w:rPr>
+          <w:highlight w:val="green"/>
+          <w:lang w:val="it-IT"/>
+        </w:rPr>
+      </w:pPr>
+      <w:r>
+        <w:rPr>
+          <w:highlight w:val="green"/>
           <w:lang w:val="it-IT"/>
         </w:rPr>
         <w:t>In caso di fallimento definitivo, se presente un valore in cache “</w:t>
@@ -29925,6 +29972,7 @@
       <w:proofErr w:type="spellStart"/>
       <w:r>
         <w:rPr>
+          <w:highlight w:val="green"/>
           <w:lang w:val="it-IT"/>
         </w:rPr>
         <w:t>stale</w:t>
@@ -29932,6 +29980,7 @@
       <w:proofErr w:type="spellEnd"/>
       <w:r>
         <w:rPr>
+          <w:highlight w:val="green"/>
           <w:lang w:val="it-IT"/>
         </w:rPr>
         <w:t>”, restituirlo con flag </w:t>
@@ -29939,6 +29988,7 @@
       <w:proofErr w:type="spellStart"/>
       <w:r>
         <w:rPr>
+          <w:highlight w:val="green"/>
           <w:lang w:val="it-IT"/>
         </w:rPr>
         <w:t>stale</w:t>
@@ -29946,6 +29996,7 @@
       <w:proofErr w:type="spellEnd"/>
       <w:r>
         <w:rPr>
+          <w:highlight w:val="green"/>
           <w:lang w:val="it-IT"/>
         </w:rPr>
         <w:t>=True nel </w:t>
@@ -29953,6 +30004,7 @@
       <w:proofErr w:type="spellStart"/>
       <w:r>
         <w:rPr>
+          <w:highlight w:val="green"/>
           <w:lang w:val="it-IT"/>
         </w:rPr>
         <w:t>PriceData</w:t>
@@ -29960,6 +30012,7 @@
       <w:proofErr w:type="spellEnd"/>
       <w:r>
         <w:rPr>
+          <w:highlight w:val="green"/>
           <w:lang w:val="it-IT"/>
         </w:rPr>
         <w:t>/</w:t>
@@ -29967,6 +30020,7 @@
       <w:proofErr w:type="spellStart"/>
       <w:r>
         <w:rPr>
+          <w:highlight w:val="green"/>
           <w:lang w:val="it-IT"/>
         </w:rPr>
         <w:t>FundamentalsData</w:t>
@@ -29974,6 +30028,7 @@
       <w:proofErr w:type="spellEnd"/>
       <w:r>
         <w:rPr>
+          <w:highlight w:val="green"/>
           <w:lang w:val="it-IT"/>
         </w:rPr>
         <w:t>.</w:t>
@@ -29982,11 +30037,13 @@
     <w:p>
       <w:pPr>
         <w:rPr>
-          <w:lang w:val="it-IT"/>
-        </w:rPr>
-      </w:pPr>
-      <w:r>
-        <w:rPr>
+          <w:highlight w:val="green"/>
+          <w:lang w:val="it-IT"/>
+        </w:rPr>
+      </w:pPr>
+      <w:r>
+        <w:rPr>
+          <w:highlight w:val="green"/>
           <w:lang w:val="it-IT"/>
         </w:rPr>
         <w:t xml:space="preserve">Configurare via Settings i TTL e il numero massimo di </w:t>
@@ -29994,6 +30051,7 @@
       <w:proofErr w:type="spellStart"/>
       <w:r>
         <w:rPr>
+          <w:highlight w:val="green"/>
           <w:lang w:val="it-IT"/>
         </w:rPr>
         <w:t>retry</w:t>
@@ -30001,6 +30059,7 @@
       <w:proofErr w:type="spellEnd"/>
       <w:r>
         <w:rPr>
+          <w:highlight w:val="green"/>
           <w:lang w:val="it-IT"/>
         </w:rPr>
         <w:t>.</w:t>
@@ -30009,11 +30068,13 @@
     <w:p>
       <w:pPr>
         <w:rPr>
-          <w:lang w:val="it-IT"/>
-        </w:rPr>
-      </w:pPr>
-      <w:r>
-        <w:rPr>
+          <w:highlight w:val="green"/>
+          <w:lang w:val="it-IT"/>
+        </w:rPr>
+      </w:pPr>
+      <w:r>
+        <w:rPr>
+          <w:highlight w:val="green"/>
           <w:lang w:val="it-IT"/>
         </w:rPr>
         <w:t xml:space="preserve">Aggiornare la </w:t>
@@ -30021,6 +30082,7 @@
       <w:proofErr w:type="spellStart"/>
       <w:r>
         <w:rPr>
+          <w:highlight w:val="green"/>
           <w:lang w:val="it-IT"/>
         </w:rPr>
         <w:t>dependency</w:t>
@@ -30028,6 +30090,7 @@
       <w:proofErr w:type="spellEnd"/>
       <w:r>
         <w:rPr>
+          <w:highlight w:val="green"/>
           <w:lang w:val="it-IT"/>
         </w:rPr>
         <w:t xml:space="preserve"> injection in </w:t>
@@ -30035,6 +30098,7 @@
       <w:proofErr w:type="spellStart"/>
       <w:r>
         <w:rPr>
+          <w:highlight w:val="green"/>
           <w:lang w:val="it-IT"/>
         </w:rPr>
         <w:t>FastAPI</w:t>
@@ -30042,6 +30106,7 @@
       <w:proofErr w:type="spellEnd"/>
       <w:r>
         <w:rPr>
+          <w:highlight w:val="green"/>
           <w:lang w:val="it-IT"/>
         </w:rPr>
         <w:t xml:space="preserve"> per usare </w:t>
@@ -30049,6 +30114,7 @@
       <w:proofErr w:type="spellStart"/>
       <w:r>
         <w:rPr>
+          <w:highlight w:val="green"/>
           <w:lang w:val="it-IT"/>
         </w:rPr>
         <w:t>CachedMarketDataProvider</w:t>
@@ -30056,6 +30122,7 @@
       <w:proofErr w:type="spellEnd"/>
       <w:r>
         <w:rPr>
+          <w:highlight w:val="green"/>
           <w:lang w:val="it-IT"/>
         </w:rPr>
         <w:t> come implementazione di default.</w:t>
@@ -30064,12 +30131,14 @@
     <w:p>
       <w:pPr>
         <w:rPr>
-          <w:lang w:val="it-IT"/>
-        </w:rPr>
-      </w:pPr>
-      <w:proofErr w:type="spellStart"/>
-      <w:r>
-        <w:rPr>
+          <w:highlight w:val="green"/>
+          <w:lang w:val="it-IT"/>
+        </w:rPr>
+      </w:pPr>
+      <w:proofErr w:type="spellStart"/>
+      <w:r>
+        <w:rPr>
+          <w:highlight w:val="green"/>
           <w:lang w:val="it-IT"/>
         </w:rPr>
         <w:t>Acceptance</w:t>
@@ -30077,6 +30146,7 @@
       <w:proofErr w:type="spellEnd"/>
       <w:r>
         <w:rPr>
+          <w:highlight w:val="green"/>
           <w:lang w:val="it-IT"/>
         </w:rPr>
         <w:t xml:space="preserve"> </w:t>
@@ -30084,6 +30154,7 @@
       <w:proofErr w:type="spellStart"/>
       <w:r>
         <w:rPr>
+          <w:highlight w:val="green"/>
           <w:lang w:val="it-IT"/>
         </w:rPr>
         <w:t>Criteria</w:t>
@@ -30091,6 +30162,7 @@
       <w:proofErr w:type="spellEnd"/>
       <w:r>
         <w:rPr>
+          <w:highlight w:val="green"/>
           <w:lang w:val="it-IT"/>
         </w:rPr>
         <w:t>:</w:t>
@@ -30099,11 +30171,13 @@
     <w:p>
       <w:pPr>
         <w:rPr>
-          <w:lang w:val="it-IT"/>
-        </w:rPr>
-      </w:pPr>
-      <w:r>
-        <w:rPr>
+          <w:highlight w:val="green"/>
+          <w:lang w:val="it-IT"/>
+        </w:rPr>
+      </w:pPr>
+      <w:r>
+        <w:rPr>
+          <w:highlight w:val="green"/>
           <w:lang w:val="it-IT"/>
         </w:rPr>
         <w:t> Le chiamate ripetute allo stesso endpoint/ticker entro il TTL non generano chiamate esterne aggiuntive.</w:t>
@@ -30112,11 +30186,13 @@
     <w:p>
       <w:pPr>
         <w:rPr>
-          <w:lang w:val="it-IT"/>
-        </w:rPr>
-      </w:pPr>
-      <w:r>
-        <w:rPr>
+          <w:highlight w:val="green"/>
+          <w:lang w:val="it-IT"/>
+        </w:rPr>
+      </w:pPr>
+      <w:r>
+        <w:rPr>
+          <w:highlight w:val="green"/>
           <w:lang w:val="it-IT"/>
         </w:rPr>
         <w:t xml:space="preserve"> In caso di </w:t>
@@ -30124,6 +30200,7 @@
       <w:proofErr w:type="spellStart"/>
       <w:r>
         <w:rPr>
+          <w:highlight w:val="green"/>
           <w:lang w:val="it-IT"/>
         </w:rPr>
         <w:t>timeout</w:t>
@@ -30131,6 +30208,7 @@
       <w:proofErr w:type="spellEnd"/>
       <w:r>
         <w:rPr>
+          <w:highlight w:val="green"/>
           <w:lang w:val="it-IT"/>
         </w:rPr>
         <w:t>/rate-</w:t>
@@ -30138,6 +30216,7 @@
       <w:proofErr w:type="spellStart"/>
       <w:r>
         <w:rPr>
+          <w:highlight w:val="green"/>
           <w:lang w:val="it-IT"/>
         </w:rPr>
         <w:t>limit</w:t>
@@ -30145,6 +30224,7 @@
       <w:proofErr w:type="spellEnd"/>
       <w:r>
         <w:rPr>
+          <w:highlight w:val="green"/>
           <w:lang w:val="it-IT"/>
         </w:rPr>
         <w:t>, il sistema usa il dato in cache se disponibile e non va in errore 500 immediato.</w:t>
@@ -30158,6 +30238,7 @@
       </w:pPr>
       <w:r>
         <w:rPr>
+          <w:highlight w:val="green"/>
           <w:lang w:val="it-IT"/>
         </w:rPr>
         <w:t xml:space="preserve"> I test coprono: cache hit, cache miss, </w:t>
@@ -30165,6 +30246,7 @@
       <w:proofErr w:type="spellStart"/>
       <w:r>
         <w:rPr>
+          <w:highlight w:val="green"/>
           <w:lang w:val="it-IT"/>
         </w:rPr>
         <w:t>fallback</w:t>
@@ -30172,6 +30254,7 @@
       <w:proofErr w:type="spellEnd"/>
       <w:r>
         <w:rPr>
+          <w:highlight w:val="green"/>
           <w:lang w:val="it-IT"/>
         </w:rPr>
         <w:t xml:space="preserve"> a dati </w:t>
@@ -30179,6 +30262,7 @@
       <w:proofErr w:type="spellStart"/>
       <w:r>
         <w:rPr>
+          <w:highlight w:val="green"/>
           <w:lang w:val="it-IT"/>
         </w:rPr>
         <w:t>stale</w:t>
@@ -30186,6 +30270,7 @@
       <w:proofErr w:type="spellEnd"/>
       <w:r>
         <w:rPr>
+          <w:highlight w:val="green"/>
           <w:lang w:val="it-IT"/>
         </w:rPr>
         <w:t xml:space="preserve">, </w:t>
@@ -30193,6 +30278,7 @@
       <w:proofErr w:type="spellStart"/>
       <w:r>
         <w:rPr>
+          <w:highlight w:val="green"/>
           <w:lang w:val="it-IT"/>
         </w:rPr>
         <w:t>backoff</w:t>
@@ -30200,6 +30286,7 @@
       <w:proofErr w:type="spellEnd"/>
       <w:r>
         <w:rPr>
+          <w:highlight w:val="green"/>
           <w:lang w:val="it-IT"/>
         </w:rPr>
         <w:t xml:space="preserve"> su errori.</w:t>

</xml_diff>

<commit_message>
feat: Initialize frontend project with React Query for data management and establish a detailed development plan.
</commit_message>
<xml_diff>
--- a/Piano-operativo-v1.7.docx
+++ b/Piano-operativo-v1.7.docx
@@ -43785,11 +43785,13 @@
     <w:p>
       <w:pPr>
         <w:rPr>
-          <w:lang w:val="it-IT"/>
-        </w:rPr>
-      </w:pPr>
-      <w:r>
-        <w:rPr>
+          <w:highlight w:val="green"/>
+          <w:lang w:val="it-IT"/>
+        </w:rPr>
+      </w:pPr>
+      <w:r>
+        <w:rPr>
+          <w:highlight w:val="green"/>
           <w:lang w:val="it-IT"/>
         </w:rPr>
         <w:t>## TASK 4.3: Configurazione React Query</w:t>
@@ -43798,18 +43800,21 @@
     <w:p>
       <w:pPr>
         <w:rPr>
-          <w:lang w:val="it-IT"/>
-        </w:rPr>
-      </w:pPr>
-    </w:p>
-    <w:p>
-      <w:pPr>
-        <w:rPr>
-          <w:lang w:val="it-IT"/>
-        </w:rPr>
-      </w:pPr>
-      <w:r>
-        <w:rPr>
+          <w:highlight w:val="green"/>
+          <w:lang w:val="it-IT"/>
+        </w:rPr>
+      </w:pPr>
+    </w:p>
+    <w:p>
+      <w:pPr>
+        <w:rPr>
+          <w:highlight w:val="green"/>
+          <w:lang w:val="it-IT"/>
+        </w:rPr>
+      </w:pPr>
+      <w:r>
+        <w:rPr>
+          <w:highlight w:val="green"/>
           <w:lang w:val="it-IT"/>
         </w:rPr>
         <w:t>**</w:t>
@@ -43817,6 +43822,7 @@
       <w:proofErr w:type="gramStart"/>
       <w:r>
         <w:rPr>
+          <w:highlight w:val="green"/>
           <w:lang w:val="it-IT"/>
         </w:rPr>
         <w:t>Descrizione:*</w:t>
@@ -43824,6 +43830,7 @@
       <w:proofErr w:type="gramEnd"/>
       <w:r>
         <w:rPr>
+          <w:highlight w:val="green"/>
           <w:lang w:val="it-IT"/>
         </w:rPr>
         <w:t xml:space="preserve">* Configurare </w:t>
@@ -43831,6 +43838,7 @@
       <w:proofErr w:type="spellStart"/>
       <w:r>
         <w:rPr>
+          <w:highlight w:val="green"/>
           <w:lang w:val="it-IT"/>
         </w:rPr>
         <w:t>TanStack</w:t>
@@ -43838,6 +43846,7 @@
       <w:proofErr w:type="spellEnd"/>
       <w:r>
         <w:rPr>
+          <w:highlight w:val="green"/>
           <w:lang w:val="it-IT"/>
         </w:rPr>
         <w:t xml:space="preserve"> Query per data </w:t>
@@ -43845,6 +43854,7 @@
       <w:proofErr w:type="spellStart"/>
       <w:r>
         <w:rPr>
+          <w:highlight w:val="green"/>
           <w:lang w:val="it-IT"/>
         </w:rPr>
         <w:t>fetching</w:t>
@@ -43852,6 +43862,7 @@
       <w:proofErr w:type="spellEnd"/>
       <w:r>
         <w:rPr>
+          <w:highlight w:val="green"/>
           <w:lang w:val="it-IT"/>
         </w:rPr>
         <w:t xml:space="preserve"> centralizzato.</w:t>
@@ -43860,65 +43871,111 @@
     <w:p>
       <w:pPr>
         <w:rPr>
-          <w:lang w:val="it-IT"/>
-        </w:rPr>
-      </w:pPr>
-    </w:p>
-    <w:p>
-      <w:r>
+          <w:highlight w:val="green"/>
+          <w:lang w:val="it-IT"/>
+        </w:rPr>
+      </w:pPr>
+    </w:p>
+    <w:p>
+      <w:pPr>
+        <w:rPr>
+          <w:highlight w:val="green"/>
+        </w:rPr>
+      </w:pPr>
+      <w:r>
+        <w:rPr>
+          <w:highlight w:val="green"/>
+        </w:rPr>
         <w:t>**</w:t>
       </w:r>
       <w:proofErr w:type="spellStart"/>
       <w:proofErr w:type="gramStart"/>
       <w:r>
+        <w:rPr>
+          <w:highlight w:val="green"/>
+        </w:rPr>
         <w:t>Microstep</w:t>
       </w:r>
       <w:proofErr w:type="spellEnd"/>
       <w:r>
+        <w:rPr>
+          <w:highlight w:val="green"/>
+        </w:rPr>
         <w:t>:*</w:t>
       </w:r>
       <w:proofErr w:type="gramEnd"/>
       <w:r>
+        <w:rPr>
+          <w:highlight w:val="green"/>
+        </w:rPr>
         <w:t>*</w:t>
       </w:r>
     </w:p>
     <w:p>
-      <w:r>
+      <w:pPr>
+        <w:rPr>
+          <w:highlight w:val="green"/>
+        </w:rPr>
+      </w:pPr>
+      <w:r>
+        <w:rPr>
+          <w:highlight w:val="green"/>
+        </w:rPr>
         <w:t xml:space="preserve">1. </w:t>
       </w:r>
       <w:proofErr w:type="spellStart"/>
       <w:r>
+        <w:rPr>
+          <w:highlight w:val="green"/>
+        </w:rPr>
         <w:t>Creare</w:t>
       </w:r>
       <w:proofErr w:type="spellEnd"/>
       <w:r>
+        <w:rPr>
+          <w:highlight w:val="green"/>
+        </w:rPr>
         <w:t xml:space="preserve"> file `frontend/</w:t>
       </w:r>
       <w:proofErr w:type="spellStart"/>
       <w:r>
+        <w:rPr>
+          <w:highlight w:val="green"/>
+        </w:rPr>
         <w:t>src</w:t>
       </w:r>
       <w:proofErr w:type="spellEnd"/>
       <w:r>
+        <w:rPr>
+          <w:highlight w:val="green"/>
+        </w:rPr>
         <w:t>/app/providers/</w:t>
       </w:r>
       <w:proofErr w:type="spellStart"/>
       <w:r>
+        <w:rPr>
+          <w:highlight w:val="green"/>
+        </w:rPr>
         <w:t>QueryProvider.tsx</w:t>
       </w:r>
       <w:proofErr w:type="spellEnd"/>
       <w:r>
+        <w:rPr>
+          <w:highlight w:val="green"/>
+        </w:rPr>
         <w:t>`</w:t>
       </w:r>
     </w:p>
     <w:p>
       <w:pPr>
         <w:rPr>
-          <w:lang w:val="it-IT"/>
-        </w:rPr>
-      </w:pPr>
-      <w:r>
-        <w:rPr>
+          <w:highlight w:val="green"/>
+          <w:lang w:val="it-IT"/>
+        </w:rPr>
+      </w:pPr>
+      <w:r>
+        <w:rPr>
+          <w:highlight w:val="green"/>
           <w:lang w:val="it-IT"/>
         </w:rPr>
         <w:t xml:space="preserve">2. Configurare </w:t>
@@ -43926,6 +43983,7 @@
       <w:proofErr w:type="spellStart"/>
       <w:r>
         <w:rPr>
+          <w:highlight w:val="green"/>
           <w:lang w:val="it-IT"/>
         </w:rPr>
         <w:t>QueryClient</w:t>
@@ -43933,6 +43991,7 @@
       <w:proofErr w:type="spellEnd"/>
       <w:r>
         <w:rPr>
+          <w:highlight w:val="green"/>
           <w:lang w:val="it-IT"/>
         </w:rPr>
         <w:t xml:space="preserve"> con defaults:</w:t>
@@ -43941,11 +44000,13 @@
     <w:p>
       <w:pPr>
         <w:rPr>
-          <w:lang w:val="it-IT"/>
-        </w:rPr>
-      </w:pPr>
-      <w:r>
-        <w:rPr>
+          <w:highlight w:val="green"/>
+          <w:lang w:val="it-IT"/>
+        </w:rPr>
+      </w:pPr>
+      <w:r>
+        <w:rPr>
+          <w:highlight w:val="green"/>
           <w:lang w:val="it-IT"/>
         </w:rPr>
         <w:t xml:space="preserve">   - </w:t>
@@ -43953,6 +44014,7 @@
       <w:proofErr w:type="spellStart"/>
       <w:r>
         <w:rPr>
+          <w:highlight w:val="green"/>
           <w:lang w:val="it-IT"/>
         </w:rPr>
         <w:t>staleTime</w:t>
@@ -43960,226 +44022,415 @@
       <w:proofErr w:type="spellEnd"/>
       <w:r>
         <w:rPr>
+          <w:highlight w:val="green"/>
           <w:lang w:val="it-IT"/>
         </w:rPr>
         <w:t>: 5 minuti per dati generici</w:t>
       </w:r>
     </w:p>
     <w:p>
-      <w:r>
-        <w:rPr>
+      <w:pPr>
+        <w:rPr>
+          <w:highlight w:val="green"/>
+        </w:rPr>
+      </w:pPr>
+      <w:r>
+        <w:rPr>
+          <w:highlight w:val="green"/>
           <w:lang w:val="it-IT"/>
         </w:rPr>
         <w:t xml:space="preserve">   </w:t>
       </w:r>
       <w:r>
+        <w:rPr>
+          <w:highlight w:val="green"/>
+        </w:rPr>
         <w:t xml:space="preserve">- </w:t>
       </w:r>
       <w:proofErr w:type="spellStart"/>
       <w:r>
+        <w:rPr>
+          <w:highlight w:val="green"/>
+        </w:rPr>
         <w:t>gcTime</w:t>
       </w:r>
       <w:proofErr w:type="spellEnd"/>
       <w:r>
+        <w:rPr>
+          <w:highlight w:val="green"/>
+        </w:rPr>
         <w:t xml:space="preserve">: 30 </w:t>
       </w:r>
       <w:proofErr w:type="spellStart"/>
       <w:r>
+        <w:rPr>
+          <w:highlight w:val="green"/>
+        </w:rPr>
         <w:t>minuti</w:t>
       </w:r>
       <w:proofErr w:type="spellEnd"/>
     </w:p>
     <w:p>
-      <w:r>
+      <w:pPr>
+        <w:rPr>
+          <w:highlight w:val="green"/>
+        </w:rPr>
+      </w:pPr>
+      <w:r>
+        <w:rPr>
+          <w:highlight w:val="green"/>
+        </w:rPr>
         <w:t xml:space="preserve">   - retry: 3 con backoff</w:t>
       </w:r>
     </w:p>
     <w:p>
-      <w:r>
+      <w:pPr>
+        <w:rPr>
+          <w:highlight w:val="green"/>
+        </w:rPr>
+      </w:pPr>
+      <w:r>
+        <w:rPr>
+          <w:highlight w:val="green"/>
+        </w:rPr>
         <w:t xml:space="preserve">   - </w:t>
       </w:r>
       <w:proofErr w:type="spellStart"/>
       <w:r>
+        <w:rPr>
+          <w:highlight w:val="green"/>
+        </w:rPr>
         <w:t>refetchOnWindowFocus</w:t>
       </w:r>
       <w:proofErr w:type="spellEnd"/>
       <w:r>
+        <w:rPr>
+          <w:highlight w:val="green"/>
+        </w:rPr>
         <w:t>: true</w:t>
       </w:r>
     </w:p>
     <w:p>
-      <w:r>
+      <w:pPr>
+        <w:rPr>
+          <w:highlight w:val="green"/>
+        </w:rPr>
+      </w:pPr>
+      <w:r>
+        <w:rPr>
+          <w:highlight w:val="green"/>
+        </w:rPr>
         <w:t xml:space="preserve">3. </w:t>
       </w:r>
       <w:proofErr w:type="spellStart"/>
       <w:r>
+        <w:rPr>
+          <w:highlight w:val="green"/>
+        </w:rPr>
         <w:t>Creare</w:t>
       </w:r>
       <w:proofErr w:type="spellEnd"/>
       <w:r>
+        <w:rPr>
+          <w:highlight w:val="green"/>
+        </w:rPr>
         <w:t xml:space="preserve"> </w:t>
       </w:r>
       <w:proofErr w:type="spellStart"/>
       <w:r>
+        <w:rPr>
+          <w:highlight w:val="green"/>
+        </w:rPr>
         <w:t>QueryClientProvider</w:t>
       </w:r>
       <w:proofErr w:type="spellEnd"/>
       <w:r>
+        <w:rPr>
+          <w:highlight w:val="green"/>
+        </w:rPr>
         <w:t xml:space="preserve"> wrapper</w:t>
       </w:r>
     </w:p>
     <w:p>
-      <w:r>
+      <w:pPr>
+        <w:rPr>
+          <w:highlight w:val="green"/>
+        </w:rPr>
+      </w:pPr>
+      <w:r>
+        <w:rPr>
+          <w:highlight w:val="green"/>
+        </w:rPr>
         <w:t xml:space="preserve">4. </w:t>
       </w:r>
       <w:proofErr w:type="spellStart"/>
       <w:r>
+        <w:rPr>
+          <w:highlight w:val="green"/>
+        </w:rPr>
         <w:t>Configurare</w:t>
       </w:r>
       <w:proofErr w:type="spellEnd"/>
       <w:r>
+        <w:rPr>
+          <w:highlight w:val="green"/>
+        </w:rPr>
         <w:t xml:space="preserve"> </w:t>
       </w:r>
       <w:proofErr w:type="spellStart"/>
       <w:r>
+        <w:rPr>
+          <w:highlight w:val="green"/>
+        </w:rPr>
         <w:t>devtools</w:t>
       </w:r>
       <w:proofErr w:type="spellEnd"/>
       <w:r>
+        <w:rPr>
+          <w:highlight w:val="green"/>
+        </w:rPr>
         <w:t xml:space="preserve"> in development</w:t>
       </w:r>
     </w:p>
     <w:p>
-      <w:r>
+      <w:pPr>
+        <w:rPr>
+          <w:highlight w:val="green"/>
+        </w:rPr>
+      </w:pPr>
+      <w:r>
+        <w:rPr>
+          <w:highlight w:val="green"/>
+        </w:rPr>
         <w:t xml:space="preserve">5. </w:t>
       </w:r>
       <w:proofErr w:type="spellStart"/>
       <w:r>
+        <w:rPr>
+          <w:highlight w:val="green"/>
+        </w:rPr>
         <w:t>Creare</w:t>
       </w:r>
       <w:proofErr w:type="spellEnd"/>
       <w:r>
+        <w:rPr>
+          <w:highlight w:val="green"/>
+        </w:rPr>
         <w:t xml:space="preserve"> hook custom `</w:t>
       </w:r>
       <w:proofErr w:type="spellStart"/>
       <w:r>
+        <w:rPr>
+          <w:highlight w:val="green"/>
+        </w:rPr>
         <w:t>useApiQuery</w:t>
       </w:r>
       <w:proofErr w:type="spellEnd"/>
       <w:r>
+        <w:rPr>
+          <w:highlight w:val="green"/>
+        </w:rPr>
         <w:t xml:space="preserve">` </w:t>
       </w:r>
       <w:proofErr w:type="spellStart"/>
       <w:r>
+        <w:rPr>
+          <w:highlight w:val="green"/>
+        </w:rPr>
         <w:t>che</w:t>
       </w:r>
       <w:proofErr w:type="spellEnd"/>
       <w:r>
+        <w:rPr>
+          <w:highlight w:val="green"/>
+        </w:rPr>
         <w:t xml:space="preserve"> </w:t>
       </w:r>
       <w:proofErr w:type="spellStart"/>
       <w:r>
+        <w:rPr>
+          <w:highlight w:val="green"/>
+        </w:rPr>
         <w:t>wrappa</w:t>
       </w:r>
       <w:proofErr w:type="spellEnd"/>
       <w:r>
+        <w:rPr>
+          <w:highlight w:val="green"/>
+        </w:rPr>
         <w:t xml:space="preserve"> </w:t>
       </w:r>
       <w:proofErr w:type="spellStart"/>
       <w:r>
+        <w:rPr>
+          <w:highlight w:val="green"/>
+        </w:rPr>
         <w:t>useQuery</w:t>
       </w:r>
       <w:proofErr w:type="spellEnd"/>
       <w:r>
+        <w:rPr>
+          <w:highlight w:val="green"/>
+        </w:rPr>
         <w:t xml:space="preserve"> con </w:t>
       </w:r>
       <w:proofErr w:type="spellStart"/>
       <w:r>
+        <w:rPr>
+          <w:highlight w:val="green"/>
+        </w:rPr>
         <w:t>gestione</w:t>
       </w:r>
       <w:proofErr w:type="spellEnd"/>
       <w:r>
+        <w:rPr>
+          <w:highlight w:val="green"/>
+        </w:rPr>
         <w:t xml:space="preserve"> </w:t>
       </w:r>
       <w:proofErr w:type="spellStart"/>
       <w:r>
+        <w:rPr>
+          <w:highlight w:val="green"/>
+        </w:rPr>
         <w:t>errori</w:t>
       </w:r>
       <w:proofErr w:type="spellEnd"/>
       <w:r>
+        <w:rPr>
+          <w:highlight w:val="green"/>
+        </w:rPr>
         <w:t xml:space="preserve"> standard</w:t>
       </w:r>
     </w:p>
     <w:p>
-      <w:r>
+      <w:pPr>
+        <w:rPr>
+          <w:highlight w:val="green"/>
+        </w:rPr>
+      </w:pPr>
+      <w:r>
+        <w:rPr>
+          <w:highlight w:val="green"/>
+        </w:rPr>
         <w:t xml:space="preserve">6. </w:t>
       </w:r>
       <w:proofErr w:type="spellStart"/>
       <w:r>
+        <w:rPr>
+          <w:highlight w:val="green"/>
+        </w:rPr>
         <w:t>Creare</w:t>
       </w:r>
       <w:proofErr w:type="spellEnd"/>
       <w:r>
+        <w:rPr>
+          <w:highlight w:val="green"/>
+        </w:rPr>
         <w:t xml:space="preserve"> hook custom `</w:t>
       </w:r>
       <w:proofErr w:type="spellStart"/>
       <w:r>
+        <w:rPr>
+          <w:highlight w:val="green"/>
+        </w:rPr>
         <w:t>useApiMutation</w:t>
       </w:r>
       <w:proofErr w:type="spellEnd"/>
       <w:r>
+        <w:rPr>
+          <w:highlight w:val="green"/>
+        </w:rPr>
         <w:t xml:space="preserve">` </w:t>
       </w:r>
       <w:proofErr w:type="spellStart"/>
       <w:r>
+        <w:rPr>
+          <w:highlight w:val="green"/>
+        </w:rPr>
         <w:t>che</w:t>
       </w:r>
       <w:proofErr w:type="spellEnd"/>
       <w:r>
+        <w:rPr>
+          <w:highlight w:val="green"/>
+        </w:rPr>
         <w:t xml:space="preserve"> </w:t>
       </w:r>
       <w:proofErr w:type="spellStart"/>
       <w:r>
+        <w:rPr>
+          <w:highlight w:val="green"/>
+        </w:rPr>
         <w:t>wrappa</w:t>
       </w:r>
       <w:proofErr w:type="spellEnd"/>
       <w:r>
+        <w:rPr>
+          <w:highlight w:val="green"/>
+        </w:rPr>
         <w:t xml:space="preserve"> </w:t>
       </w:r>
       <w:proofErr w:type="spellStart"/>
       <w:r>
+        <w:rPr>
+          <w:highlight w:val="green"/>
+        </w:rPr>
         <w:t>useMutation</w:t>
       </w:r>
       <w:proofErr w:type="spellEnd"/>
       <w:r>
+        <w:rPr>
+          <w:highlight w:val="green"/>
+        </w:rPr>
         <w:t xml:space="preserve"> con </w:t>
       </w:r>
       <w:proofErr w:type="spellStart"/>
       <w:r>
+        <w:rPr>
+          <w:highlight w:val="green"/>
+        </w:rPr>
         <w:t>gestione</w:t>
       </w:r>
       <w:proofErr w:type="spellEnd"/>
       <w:r>
+        <w:rPr>
+          <w:highlight w:val="green"/>
+        </w:rPr>
         <w:t xml:space="preserve"> </w:t>
       </w:r>
       <w:proofErr w:type="spellStart"/>
       <w:r>
+        <w:rPr>
+          <w:highlight w:val="green"/>
+        </w:rPr>
         <w:t>errori</w:t>
       </w:r>
       <w:proofErr w:type="spellEnd"/>
       <w:r>
+        <w:rPr>
+          <w:highlight w:val="green"/>
+        </w:rPr>
         <w:t xml:space="preserve"> e toast</w:t>
       </w:r>
     </w:p>
-    <w:p/>
-    <w:p>
-      <w:pPr>
-        <w:rPr>
-          <w:lang w:val="it-IT"/>
-        </w:rPr>
-      </w:pPr>
-      <w:r>
-        <w:rPr>
+    <w:p>
+      <w:pPr>
+        <w:rPr>
+          <w:highlight w:val="green"/>
+        </w:rPr>
+      </w:pPr>
+    </w:p>
+    <w:p>
+      <w:pPr>
+        <w:rPr>
+          <w:highlight w:val="green"/>
+          <w:lang w:val="it-IT"/>
+        </w:rPr>
+      </w:pPr>
+      <w:r>
+        <w:rPr>
+          <w:highlight w:val="green"/>
           <w:lang w:val="it-IT"/>
         </w:rPr>
         <w:t>**</w:t>
@@ -44187,6 +44438,7 @@
       <w:proofErr w:type="spellStart"/>
       <w:r>
         <w:rPr>
+          <w:highlight w:val="green"/>
           <w:lang w:val="it-IT"/>
         </w:rPr>
         <w:t>Acceptance</w:t>
@@ -44194,6 +44446,7 @@
       <w:proofErr w:type="spellEnd"/>
       <w:r>
         <w:rPr>
+          <w:highlight w:val="green"/>
           <w:lang w:val="it-IT"/>
         </w:rPr>
         <w:t xml:space="preserve"> </w:t>
@@ -44202,6 +44455,7 @@
       <w:proofErr w:type="gramStart"/>
       <w:r>
         <w:rPr>
+          <w:highlight w:val="green"/>
           <w:lang w:val="it-IT"/>
         </w:rPr>
         <w:t>Criteria</w:t>
@@ -44209,6 +44463,7 @@
       <w:proofErr w:type="spellEnd"/>
       <w:r>
         <w:rPr>
+          <w:highlight w:val="green"/>
           <w:lang w:val="it-IT"/>
         </w:rPr>
         <w:t>:*</w:t>
@@ -44216,6 +44471,7 @@
       <w:proofErr w:type="gramEnd"/>
       <w:r>
         <w:rPr>
+          <w:highlight w:val="green"/>
           <w:lang w:val="it-IT"/>
         </w:rPr>
         <w:t>*</w:t>
@@ -44224,11 +44480,13 @@
     <w:p>
       <w:pPr>
         <w:rPr>
-          <w:lang w:val="it-IT"/>
-        </w:rPr>
-      </w:pPr>
-      <w:r>
-        <w:rPr>
+          <w:highlight w:val="green"/>
+          <w:lang w:val="it-IT"/>
+        </w:rPr>
+      </w:pPr>
+      <w:r>
+        <w:rPr>
+          <w:highlight w:val="green"/>
           <w:lang w:val="it-IT"/>
         </w:rPr>
         <w:t xml:space="preserve">- </w:t>
@@ -44236,6 +44494,7 @@
       <w:proofErr w:type="gramStart"/>
       <w:r>
         <w:rPr>
+          <w:highlight w:val="green"/>
           <w:lang w:val="it-IT"/>
         </w:rPr>
         <w:t>[ ]</w:t>
@@ -44243,6 +44502,7 @@
       <w:proofErr w:type="gramEnd"/>
       <w:r>
         <w:rPr>
+          <w:highlight w:val="green"/>
           <w:lang w:val="it-IT"/>
         </w:rPr>
         <w:t xml:space="preserve"> </w:t>
@@ -44250,6 +44510,7 @@
       <w:proofErr w:type="spellStart"/>
       <w:r>
         <w:rPr>
+          <w:highlight w:val="green"/>
           <w:lang w:val="it-IT"/>
         </w:rPr>
         <w:t>QueryClient</w:t>
@@ -44257,6 +44518,7 @@
       <w:proofErr w:type="spellEnd"/>
       <w:r>
         <w:rPr>
+          <w:highlight w:val="green"/>
           <w:lang w:val="it-IT"/>
         </w:rPr>
         <w:t xml:space="preserve"> configurato correttamente</w:t>
@@ -44265,11 +44527,13 @@
     <w:p>
       <w:pPr>
         <w:rPr>
-          <w:lang w:val="it-IT"/>
-        </w:rPr>
-      </w:pPr>
-      <w:r>
-        <w:rPr>
+          <w:highlight w:val="green"/>
+          <w:lang w:val="it-IT"/>
+        </w:rPr>
+      </w:pPr>
+      <w:r>
+        <w:rPr>
+          <w:highlight w:val="green"/>
           <w:lang w:val="it-IT"/>
         </w:rPr>
         <w:t xml:space="preserve">- </w:t>
@@ -44277,6 +44541,7 @@
       <w:proofErr w:type="gramStart"/>
       <w:r>
         <w:rPr>
+          <w:highlight w:val="green"/>
           <w:lang w:val="it-IT"/>
         </w:rPr>
         <w:t>[ ]</w:t>
@@ -44284,6 +44549,7 @@
       <w:proofErr w:type="gramEnd"/>
       <w:r>
         <w:rPr>
+          <w:highlight w:val="green"/>
           <w:lang w:val="it-IT"/>
         </w:rPr>
         <w:t xml:space="preserve"> </w:t>
@@ -44291,6 +44557,7 @@
       <w:proofErr w:type="spellStart"/>
       <w:r>
         <w:rPr>
+          <w:highlight w:val="green"/>
           <w:lang w:val="it-IT"/>
         </w:rPr>
         <w:t>Devtools</w:t>
@@ -44298,6 +44565,7 @@
       <w:proofErr w:type="spellEnd"/>
       <w:r>
         <w:rPr>
+          <w:highlight w:val="green"/>
           <w:lang w:val="it-IT"/>
         </w:rPr>
         <w:t xml:space="preserve"> visibili in </w:t>
@@ -44305,6 +44573,7 @@
       <w:proofErr w:type="spellStart"/>
       <w:r>
         <w:rPr>
+          <w:highlight w:val="green"/>
           <w:lang w:val="it-IT"/>
         </w:rPr>
         <w:t>dev</w:t>
@@ -44314,11 +44583,13 @@
     <w:p>
       <w:pPr>
         <w:rPr>
-          <w:lang w:val="it-IT"/>
-        </w:rPr>
-      </w:pPr>
-      <w:r>
-        <w:rPr>
+          <w:highlight w:val="green"/>
+          <w:lang w:val="it-IT"/>
+        </w:rPr>
+      </w:pPr>
+      <w:r>
+        <w:rPr>
+          <w:highlight w:val="green"/>
           <w:lang w:val="it-IT"/>
         </w:rPr>
         <w:lastRenderedPageBreak/>
@@ -44327,6 +44598,7 @@
       <w:proofErr w:type="gramStart"/>
       <w:r>
         <w:rPr>
+          <w:highlight w:val="green"/>
           <w:lang w:val="it-IT"/>
         </w:rPr>
         <w:t>[ ]</w:t>
@@ -44334,6 +44606,7 @@
       <w:proofErr w:type="gramEnd"/>
       <w:r>
         <w:rPr>
+          <w:highlight w:val="green"/>
           <w:lang w:val="it-IT"/>
         </w:rPr>
         <w:t xml:space="preserve"> Hook custom semplificano uso</w:t>
@@ -44347,6 +44620,7 @@
       </w:pPr>
       <w:r>
         <w:rPr>
+          <w:highlight w:val="green"/>
           <w:lang w:val="it-IT"/>
         </w:rPr>
         <w:t xml:space="preserve">- </w:t>
@@ -44354,6 +44628,7 @@
       <w:proofErr w:type="gramStart"/>
       <w:r>
         <w:rPr>
+          <w:highlight w:val="green"/>
           <w:lang w:val="it-IT"/>
         </w:rPr>
         <w:t>[ ]</w:t>
@@ -44361,6 +44636,7 @@
       <w:proofErr w:type="gramEnd"/>
       <w:r>
         <w:rPr>
+          <w:highlight w:val="green"/>
           <w:lang w:val="it-IT"/>
         </w:rPr>
         <w:t xml:space="preserve"> Errori gestiti uniformemente</w:t>

</xml_diff>

<commit_message>
feat: Implement a centralized API client with request/response interceptors, typed helpers, and add agent documentation.
</commit_message>
<xml_diff>
--- a/Piano-operativo-v1.7.docx
+++ b/Piano-operativo-v1.7.docx
@@ -44672,11 +44672,13 @@
     <w:p>
       <w:pPr>
         <w:rPr>
-          <w:lang w:val="it-IT"/>
-        </w:rPr>
-      </w:pPr>
-      <w:r>
-        <w:rPr>
+          <w:highlight w:val="green"/>
+          <w:lang w:val="it-IT"/>
+        </w:rPr>
+      </w:pPr>
+      <w:r>
+        <w:rPr>
+          <w:highlight w:val="green"/>
           <w:lang w:val="it-IT"/>
         </w:rPr>
         <w:t>## TASK 4.4: Creazione Client API Tipizzato</w:t>
@@ -44685,18 +44687,21 @@
     <w:p>
       <w:pPr>
         <w:rPr>
-          <w:lang w:val="it-IT"/>
-        </w:rPr>
-      </w:pPr>
-    </w:p>
-    <w:p>
-      <w:pPr>
-        <w:rPr>
-          <w:lang w:val="it-IT"/>
-        </w:rPr>
-      </w:pPr>
-      <w:r>
-        <w:rPr>
+          <w:highlight w:val="green"/>
+          <w:lang w:val="it-IT"/>
+        </w:rPr>
+      </w:pPr>
+    </w:p>
+    <w:p>
+      <w:pPr>
+        <w:rPr>
+          <w:highlight w:val="green"/>
+          <w:lang w:val="it-IT"/>
+        </w:rPr>
+      </w:pPr>
+      <w:r>
+        <w:rPr>
+          <w:highlight w:val="green"/>
           <w:lang w:val="it-IT"/>
         </w:rPr>
         <w:t>**</w:t>
@@ -44704,6 +44709,7 @@
       <w:proofErr w:type="gramStart"/>
       <w:r>
         <w:rPr>
+          <w:highlight w:val="green"/>
           <w:lang w:val="it-IT"/>
         </w:rPr>
         <w:t>Descrizione:*</w:t>
@@ -44711,6 +44717,7 @@
       <w:proofErr w:type="gramEnd"/>
       <w:r>
         <w:rPr>
+          <w:highlight w:val="green"/>
           <w:lang w:val="it-IT"/>
         </w:rPr>
         <w:t xml:space="preserve">* Creare client HTTP tipizzato per comunicazione con </w:t>
@@ -44718,6 +44725,7 @@
       <w:proofErr w:type="spellStart"/>
       <w:r>
         <w:rPr>
+          <w:highlight w:val="green"/>
           <w:lang w:val="it-IT"/>
         </w:rPr>
         <w:t>backend</w:t>
@@ -44725,6 +44733,7 @@
       <w:proofErr w:type="spellEnd"/>
       <w:r>
         <w:rPr>
+          <w:highlight w:val="green"/>
           <w:lang w:val="it-IT"/>
         </w:rPr>
         <w:t>.</w:t>
@@ -44733,73 +44742,125 @@
     <w:p>
       <w:pPr>
         <w:rPr>
-          <w:lang w:val="it-IT"/>
-        </w:rPr>
-      </w:pPr>
-    </w:p>
-    <w:p>
-      <w:r>
+          <w:highlight w:val="green"/>
+          <w:lang w:val="it-IT"/>
+        </w:rPr>
+      </w:pPr>
+    </w:p>
+    <w:p>
+      <w:pPr>
+        <w:rPr>
+          <w:highlight w:val="green"/>
+        </w:rPr>
+      </w:pPr>
+      <w:r>
+        <w:rPr>
+          <w:highlight w:val="green"/>
+        </w:rPr>
         <w:t>**</w:t>
       </w:r>
       <w:proofErr w:type="spellStart"/>
       <w:proofErr w:type="gramStart"/>
       <w:r>
+        <w:rPr>
+          <w:highlight w:val="green"/>
+        </w:rPr>
         <w:t>Microstep</w:t>
       </w:r>
       <w:proofErr w:type="spellEnd"/>
       <w:r>
+        <w:rPr>
+          <w:highlight w:val="green"/>
+        </w:rPr>
         <w:t>:*</w:t>
       </w:r>
       <w:proofErr w:type="gramEnd"/>
       <w:r>
+        <w:rPr>
+          <w:highlight w:val="green"/>
+        </w:rPr>
         <w:t>*</w:t>
       </w:r>
     </w:p>
     <w:p>
-      <w:r>
+      <w:pPr>
+        <w:rPr>
+          <w:highlight w:val="green"/>
+        </w:rPr>
+      </w:pPr>
+      <w:r>
+        <w:rPr>
+          <w:highlight w:val="green"/>
+        </w:rPr>
         <w:t xml:space="preserve">1. </w:t>
       </w:r>
       <w:proofErr w:type="spellStart"/>
       <w:r>
+        <w:rPr>
+          <w:highlight w:val="green"/>
+        </w:rPr>
         <w:t>Creare</w:t>
       </w:r>
       <w:proofErr w:type="spellEnd"/>
       <w:r>
+        <w:rPr>
+          <w:highlight w:val="green"/>
+        </w:rPr>
         <w:t xml:space="preserve"> file `frontend/</w:t>
       </w:r>
       <w:proofErr w:type="spellStart"/>
       <w:r>
+        <w:rPr>
+          <w:highlight w:val="green"/>
+        </w:rPr>
         <w:t>src</w:t>
       </w:r>
       <w:proofErr w:type="spellEnd"/>
       <w:r>
+        <w:rPr>
+          <w:highlight w:val="green"/>
+        </w:rPr>
         <w:t>/shared/</w:t>
       </w:r>
       <w:proofErr w:type="spellStart"/>
       <w:r>
+        <w:rPr>
+          <w:highlight w:val="green"/>
+        </w:rPr>
         <w:t>api</w:t>
       </w:r>
       <w:proofErr w:type="spellEnd"/>
       <w:r>
+        <w:rPr>
+          <w:highlight w:val="green"/>
+        </w:rPr>
         <w:t>/</w:t>
       </w:r>
       <w:proofErr w:type="spellStart"/>
       <w:r>
+        <w:rPr>
+          <w:highlight w:val="green"/>
+        </w:rPr>
         <w:t>client.ts</w:t>
       </w:r>
       <w:proofErr w:type="spellEnd"/>
       <w:r>
+        <w:rPr>
+          <w:highlight w:val="green"/>
+        </w:rPr>
         <w:t>`</w:t>
       </w:r>
     </w:p>
     <w:p>
       <w:pPr>
         <w:rPr>
-          <w:lang w:val="it-IT"/>
-        </w:rPr>
-      </w:pPr>
-      <w:r>
-        <w:rPr>
+          <w:highlight w:val="green"/>
+          <w:lang w:val="it-IT"/>
+        </w:rPr>
+      </w:pPr>
+      <w:r>
+        <w:rPr>
+          <w:highlight w:val="green"/>
           <w:lang w:val="it-IT"/>
         </w:rPr>
         <w:t xml:space="preserve">2. Configurare istanza </w:t>
@@ -44807,6 +44868,7 @@
       <w:proofErr w:type="spellStart"/>
       <w:r>
         <w:rPr>
+          <w:highlight w:val="green"/>
           <w:lang w:val="it-IT"/>
         </w:rPr>
         <w:t>axios</w:t>
@@ -44814,6 +44876,7 @@
       <w:proofErr w:type="spellEnd"/>
       <w:r>
         <w:rPr>
+          <w:highlight w:val="green"/>
           <w:lang w:val="it-IT"/>
         </w:rPr>
         <w:t xml:space="preserve"> con </w:t>
@@ -44821,6 +44884,7 @@
       <w:proofErr w:type="spellStart"/>
       <w:r>
         <w:rPr>
+          <w:highlight w:val="green"/>
           <w:lang w:val="it-IT"/>
         </w:rPr>
         <w:t>baseURL</w:t>
@@ -44828,6 +44892,7 @@
       <w:proofErr w:type="spellEnd"/>
       <w:r>
         <w:rPr>
+          <w:highlight w:val="green"/>
           <w:lang w:val="it-IT"/>
         </w:rPr>
         <w:t xml:space="preserve"> da variabile ambiente</w:t>
@@ -44836,11 +44901,13 @@
     <w:p>
       <w:pPr>
         <w:rPr>
-          <w:lang w:val="it-IT"/>
-        </w:rPr>
-      </w:pPr>
-      <w:r>
-        <w:rPr>
+          <w:highlight w:val="green"/>
+          <w:lang w:val="it-IT"/>
+        </w:rPr>
+      </w:pPr>
+      <w:r>
+        <w:rPr>
+          <w:highlight w:val="green"/>
           <w:lang w:val="it-IT"/>
         </w:rPr>
         <w:t xml:space="preserve">3. Aggiungere </w:t>
@@ -44848,6 +44915,7 @@
       <w:proofErr w:type="spellStart"/>
       <w:r>
         <w:rPr>
+          <w:highlight w:val="green"/>
           <w:lang w:val="it-IT"/>
         </w:rPr>
         <w:t>interceptor</w:t>
@@ -44855,6 +44923,7 @@
       <w:proofErr w:type="spellEnd"/>
       <w:r>
         <w:rPr>
+          <w:highlight w:val="green"/>
           <w:lang w:val="it-IT"/>
         </w:rPr>
         <w:t xml:space="preserve"> </w:t>
@@ -44862,6 +44931,7 @@
       <w:proofErr w:type="spellStart"/>
       <w:r>
         <w:rPr>
+          <w:highlight w:val="green"/>
           <w:lang w:val="it-IT"/>
         </w:rPr>
         <w:t>request</w:t>
@@ -44869,6 +44939,7 @@
       <w:proofErr w:type="spellEnd"/>
       <w:r>
         <w:rPr>
+          <w:highlight w:val="green"/>
           <w:lang w:val="it-IT"/>
         </w:rPr>
         <w:t xml:space="preserve"> per:</w:t>
@@ -44877,11 +44948,13 @@
     <w:p>
       <w:pPr>
         <w:rPr>
-          <w:lang w:val="it-IT"/>
-        </w:rPr>
-      </w:pPr>
-      <w:r>
-        <w:rPr>
+          <w:highlight w:val="green"/>
+          <w:lang w:val="it-IT"/>
+        </w:rPr>
+      </w:pPr>
+      <w:r>
+        <w:rPr>
+          <w:highlight w:val="green"/>
           <w:lang w:val="it-IT"/>
         </w:rPr>
         <w:t xml:space="preserve">   - Aggiungere </w:t>
@@ -44889,6 +44962,7 @@
       <w:proofErr w:type="spellStart"/>
       <w:r>
         <w:rPr>
+          <w:highlight w:val="green"/>
           <w:lang w:val="it-IT"/>
         </w:rPr>
         <w:t>header</w:t>
@@ -44896,6 +44970,7 @@
       <w:proofErr w:type="spellEnd"/>
       <w:r>
         <w:rPr>
+          <w:highlight w:val="green"/>
           <w:lang w:val="it-IT"/>
         </w:rPr>
         <w:t xml:space="preserve"> </w:t>
@@ -44903,6 +44978,7 @@
       <w:proofErr w:type="spellStart"/>
       <w:r>
         <w:rPr>
+          <w:highlight w:val="green"/>
           <w:lang w:val="it-IT"/>
         </w:rPr>
         <w:t>Authorization</w:t>
@@ -44910,6 +44986,7 @@
       <w:proofErr w:type="spellEnd"/>
       <w:r>
         <w:rPr>
+          <w:highlight w:val="green"/>
           <w:lang w:val="it-IT"/>
         </w:rPr>
         <w:t xml:space="preserve"> (se presente token)</w:t>
@@ -44918,11 +44995,13 @@
     <w:p>
       <w:pPr>
         <w:rPr>
-          <w:lang w:val="it-IT"/>
-        </w:rPr>
-      </w:pPr>
-      <w:r>
-        <w:rPr>
+          <w:highlight w:val="green"/>
+          <w:lang w:val="it-IT"/>
+        </w:rPr>
+      </w:pPr>
+      <w:r>
+        <w:rPr>
+          <w:highlight w:val="green"/>
           <w:lang w:val="it-IT"/>
         </w:rPr>
         <w:t xml:space="preserve">   - Aggiungere </w:t>
@@ -44930,6 +45009,7 @@
       <w:proofErr w:type="spellStart"/>
       <w:r>
         <w:rPr>
+          <w:highlight w:val="green"/>
           <w:lang w:val="it-IT"/>
         </w:rPr>
         <w:t>header</w:t>
@@ -44937,6 +45017,7 @@
       <w:proofErr w:type="spellEnd"/>
       <w:r>
         <w:rPr>
+          <w:highlight w:val="green"/>
           <w:lang w:val="it-IT"/>
         </w:rPr>
         <w:t xml:space="preserve"> X-</w:t>
@@ -44944,6 +45025,7 @@
       <w:proofErr w:type="spellStart"/>
       <w:r>
         <w:rPr>
+          <w:highlight w:val="green"/>
           <w:lang w:val="it-IT"/>
         </w:rPr>
         <w:t>Correlation</w:t>
@@ -44951,6 +45033,7 @@
       <w:proofErr w:type="spellEnd"/>
       <w:r>
         <w:rPr>
+          <w:highlight w:val="green"/>
           <w:lang w:val="it-IT"/>
         </w:rPr>
         <w:t>-ID (genera UUID)</w:t>
@@ -44959,11 +45042,13 @@
     <w:p>
       <w:pPr>
         <w:rPr>
-          <w:lang w:val="it-IT"/>
-        </w:rPr>
-      </w:pPr>
-      <w:r>
-        <w:rPr>
+          <w:highlight w:val="green"/>
+          <w:lang w:val="it-IT"/>
+        </w:rPr>
+      </w:pPr>
+      <w:r>
+        <w:rPr>
+          <w:highlight w:val="green"/>
           <w:lang w:val="it-IT"/>
         </w:rPr>
         <w:t xml:space="preserve">4. Aggiungere </w:t>
@@ -44971,6 +45056,7 @@
       <w:proofErr w:type="spellStart"/>
       <w:r>
         <w:rPr>
+          <w:highlight w:val="green"/>
           <w:lang w:val="it-IT"/>
         </w:rPr>
         <w:t>interceptor</w:t>
@@ -44978,6 +45064,7 @@
       <w:proofErr w:type="spellEnd"/>
       <w:r>
         <w:rPr>
+          <w:highlight w:val="green"/>
           <w:lang w:val="it-IT"/>
         </w:rPr>
         <w:t xml:space="preserve"> </w:t>
@@ -44985,6 +45072,7 @@
       <w:proofErr w:type="spellStart"/>
       <w:r>
         <w:rPr>
+          <w:highlight w:val="green"/>
           <w:lang w:val="it-IT"/>
         </w:rPr>
         <w:t>response</w:t>
@@ -44992,6 +45080,7 @@
       <w:proofErr w:type="spellEnd"/>
       <w:r>
         <w:rPr>
+          <w:highlight w:val="green"/>
           <w:lang w:val="it-IT"/>
         </w:rPr>
         <w:t xml:space="preserve"> per:</w:t>
@@ -45000,11 +45089,13 @@
     <w:p>
       <w:pPr>
         <w:rPr>
-          <w:lang w:val="it-IT"/>
-        </w:rPr>
-      </w:pPr>
-      <w:r>
-        <w:rPr>
+          <w:highlight w:val="green"/>
+          <w:lang w:val="it-IT"/>
+        </w:rPr>
+      </w:pPr>
+      <w:r>
+        <w:rPr>
+          <w:highlight w:val="green"/>
           <w:lang w:val="it-IT"/>
         </w:rPr>
         <w:t xml:space="preserve">   - Estrarre data da </w:t>
@@ -45012,6 +45103,7 @@
       <w:proofErr w:type="spellStart"/>
       <w:r>
         <w:rPr>
+          <w:highlight w:val="green"/>
           <w:lang w:val="it-IT"/>
         </w:rPr>
         <w:t>ApiResponse</w:t>
@@ -45021,11 +45113,13 @@
     <w:p>
       <w:pPr>
         <w:rPr>
-          <w:lang w:val="it-IT"/>
-        </w:rPr>
-      </w:pPr>
-      <w:r>
-        <w:rPr>
+          <w:highlight w:val="green"/>
+          <w:lang w:val="it-IT"/>
+        </w:rPr>
+      </w:pPr>
+      <w:r>
+        <w:rPr>
+          <w:highlight w:val="green"/>
           <w:lang w:val="it-IT"/>
         </w:rPr>
         <w:t xml:space="preserve">   - Trasformare errori in formato uniforme</w:t>
@@ -45034,11 +45128,13 @@
     <w:p>
       <w:pPr>
         <w:rPr>
-          <w:lang w:val="it-IT"/>
-        </w:rPr>
-      </w:pPr>
-      <w:r>
-        <w:rPr>
+          <w:highlight w:val="green"/>
+          <w:lang w:val="it-IT"/>
+        </w:rPr>
+      </w:pPr>
+      <w:r>
+        <w:rPr>
+          <w:highlight w:val="green"/>
           <w:lang w:val="it-IT"/>
         </w:rPr>
         <w:t>5. Creare file `</w:t>
@@ -45046,6 +45142,7 @@
       <w:proofErr w:type="spellStart"/>
       <w:r>
         <w:rPr>
+          <w:highlight w:val="green"/>
           <w:lang w:val="it-IT"/>
         </w:rPr>
         <w:t>frontend</w:t>
@@ -45053,6 +45150,7 @@
       <w:proofErr w:type="spellEnd"/>
       <w:r>
         <w:rPr>
+          <w:highlight w:val="green"/>
           <w:lang w:val="it-IT"/>
         </w:rPr>
         <w:t>/</w:t>
@@ -45060,6 +45158,7 @@
       <w:proofErr w:type="spellStart"/>
       <w:r>
         <w:rPr>
+          <w:highlight w:val="green"/>
           <w:lang w:val="it-IT"/>
         </w:rPr>
         <w:t>src</w:t>
@@ -45067,6 +45166,7 @@
       <w:proofErr w:type="spellEnd"/>
       <w:r>
         <w:rPr>
+          <w:highlight w:val="green"/>
           <w:lang w:val="it-IT"/>
         </w:rPr>
         <w:t>/</w:t>
@@ -45074,6 +45174,7 @@
       <w:proofErr w:type="spellStart"/>
       <w:r>
         <w:rPr>
+          <w:highlight w:val="green"/>
           <w:lang w:val="it-IT"/>
         </w:rPr>
         <w:t>shared</w:t>
@@ -45081,6 +45182,7 @@
       <w:proofErr w:type="spellEnd"/>
       <w:r>
         <w:rPr>
+          <w:highlight w:val="green"/>
           <w:lang w:val="it-IT"/>
         </w:rPr>
         <w:t>/api/</w:t>
@@ -45088,6 +45190,7 @@
       <w:proofErr w:type="spellStart"/>
       <w:r>
         <w:rPr>
+          <w:highlight w:val="green"/>
           <w:lang w:val="it-IT"/>
         </w:rPr>
         <w:t>types.ts</w:t>
@@ -45095,6 +45198,7 @@
       <w:proofErr w:type="spellEnd"/>
       <w:r>
         <w:rPr>
+          <w:highlight w:val="green"/>
           <w:lang w:val="it-IT"/>
         </w:rPr>
         <w:t xml:space="preserve">` con tipi </w:t>
@@ -45102,6 +45206,7 @@
       <w:proofErr w:type="spellStart"/>
       <w:r>
         <w:rPr>
+          <w:highlight w:val="green"/>
           <w:lang w:val="it-IT"/>
         </w:rPr>
         <w:t>ApiResponse</w:t>
@@ -45109,6 +45214,7 @@
       <w:proofErr w:type="spellEnd"/>
       <w:r>
         <w:rPr>
+          <w:highlight w:val="green"/>
           <w:lang w:val="it-IT"/>
         </w:rPr>
         <w:t xml:space="preserve">, </w:t>
@@ -45116,6 +45222,7 @@
       <w:proofErr w:type="spellStart"/>
       <w:r>
         <w:rPr>
+          <w:highlight w:val="green"/>
           <w:lang w:val="it-IT"/>
         </w:rPr>
         <w:t>ApiError</w:t>
@@ -45125,11 +45232,13 @@
     <w:p>
       <w:pPr>
         <w:rPr>
-          <w:lang w:val="it-IT"/>
-        </w:rPr>
-      </w:pPr>
-      <w:r>
-        <w:rPr>
+          <w:highlight w:val="green"/>
+          <w:lang w:val="it-IT"/>
+        </w:rPr>
+      </w:pPr>
+      <w:r>
+        <w:rPr>
+          <w:highlight w:val="green"/>
           <w:lang w:val="it-IT"/>
         </w:rPr>
         <w:t>6. Creare funzioni tipizzate: `</w:t>
@@ -45137,6 +45246,7 @@
       <w:proofErr w:type="spellStart"/>
       <w:r>
         <w:rPr>
+          <w:highlight w:val="green"/>
           <w:lang w:val="it-IT"/>
         </w:rPr>
         <w:t>get</w:t>
@@ -45144,6 +45254,7 @@
       <w:proofErr w:type="spellEnd"/>
       <w:r>
         <w:rPr>
+          <w:highlight w:val="green"/>
           <w:lang w:val="it-IT"/>
         </w:rPr>
         <w:t>&lt;T&gt;`, `post&lt;T&gt;`, `patch&lt;T&gt;`, `delete&lt;T&gt;`</w:t>
@@ -45152,18 +45263,21 @@
     <w:p>
       <w:pPr>
         <w:rPr>
-          <w:lang w:val="it-IT"/>
-        </w:rPr>
-      </w:pPr>
-    </w:p>
-    <w:p>
-      <w:pPr>
-        <w:rPr>
-          <w:lang w:val="it-IT"/>
-        </w:rPr>
-      </w:pPr>
-      <w:r>
-        <w:rPr>
+          <w:highlight w:val="green"/>
+          <w:lang w:val="it-IT"/>
+        </w:rPr>
+      </w:pPr>
+    </w:p>
+    <w:p>
+      <w:pPr>
+        <w:rPr>
+          <w:highlight w:val="green"/>
+          <w:lang w:val="it-IT"/>
+        </w:rPr>
+      </w:pPr>
+      <w:r>
+        <w:rPr>
+          <w:highlight w:val="green"/>
           <w:lang w:val="it-IT"/>
         </w:rPr>
         <w:t>**</w:t>
@@ -45171,6 +45285,7 @@
       <w:proofErr w:type="spellStart"/>
       <w:r>
         <w:rPr>
+          <w:highlight w:val="green"/>
           <w:lang w:val="it-IT"/>
         </w:rPr>
         <w:t>Acceptance</w:t>
@@ -45178,6 +45293,7 @@
       <w:proofErr w:type="spellEnd"/>
       <w:r>
         <w:rPr>
+          <w:highlight w:val="green"/>
           <w:lang w:val="it-IT"/>
         </w:rPr>
         <w:t xml:space="preserve"> </w:t>
@@ -45186,6 +45302,7 @@
       <w:proofErr w:type="gramStart"/>
       <w:r>
         <w:rPr>
+          <w:highlight w:val="green"/>
           <w:lang w:val="it-IT"/>
         </w:rPr>
         <w:t>Criteria</w:t>
@@ -45193,6 +45310,7 @@
       <w:proofErr w:type="spellEnd"/>
       <w:r>
         <w:rPr>
+          <w:highlight w:val="green"/>
           <w:lang w:val="it-IT"/>
         </w:rPr>
         <w:t>:*</w:t>
@@ -45200,6 +45318,7 @@
       <w:proofErr w:type="gramEnd"/>
       <w:r>
         <w:rPr>
+          <w:highlight w:val="green"/>
           <w:lang w:val="it-IT"/>
         </w:rPr>
         <w:t>*</w:t>
@@ -45208,11 +45327,13 @@
     <w:p>
       <w:pPr>
         <w:rPr>
-          <w:lang w:val="it-IT"/>
-        </w:rPr>
-      </w:pPr>
-      <w:r>
-        <w:rPr>
+          <w:highlight w:val="green"/>
+          <w:lang w:val="it-IT"/>
+        </w:rPr>
+      </w:pPr>
+      <w:r>
+        <w:rPr>
+          <w:highlight w:val="green"/>
           <w:lang w:val="it-IT"/>
         </w:rPr>
         <w:t xml:space="preserve">- </w:t>
@@ -45220,6 +45341,7 @@
       <w:proofErr w:type="gramStart"/>
       <w:r>
         <w:rPr>
+          <w:highlight w:val="green"/>
           <w:lang w:val="it-IT"/>
         </w:rPr>
         <w:t>[ ]</w:t>
@@ -45227,6 +45349,7 @@
       <w:proofErr w:type="gramEnd"/>
       <w:r>
         <w:rPr>
+          <w:highlight w:val="green"/>
           <w:lang w:val="it-IT"/>
         </w:rPr>
         <w:t xml:space="preserve"> Tutte le chiamate usano client centralizzato</w:t>
@@ -45235,11 +45358,13 @@
     <w:p>
       <w:pPr>
         <w:rPr>
-          <w:lang w:val="it-IT"/>
-        </w:rPr>
-      </w:pPr>
-      <w:r>
-        <w:rPr>
+          <w:highlight w:val="green"/>
+          <w:lang w:val="it-IT"/>
+        </w:rPr>
+      </w:pPr>
+      <w:r>
+        <w:rPr>
+          <w:highlight w:val="green"/>
           <w:lang w:val="it-IT"/>
         </w:rPr>
         <w:t xml:space="preserve">- </w:t>
@@ -45247,6 +45372,7 @@
       <w:proofErr w:type="gramStart"/>
       <w:r>
         <w:rPr>
+          <w:highlight w:val="green"/>
           <w:lang w:val="it-IT"/>
         </w:rPr>
         <w:t>[ ]</w:t>
@@ -45254,6 +45380,7 @@
       <w:proofErr w:type="gramEnd"/>
       <w:r>
         <w:rPr>
+          <w:highlight w:val="green"/>
           <w:lang w:val="it-IT"/>
         </w:rPr>
         <w:t xml:space="preserve"> Tipi </w:t>
@@ -45261,6 +45388,7 @@
       <w:proofErr w:type="spellStart"/>
       <w:r>
         <w:rPr>
+          <w:highlight w:val="green"/>
           <w:lang w:val="it-IT"/>
         </w:rPr>
         <w:t>response</w:t>
@@ -45268,6 +45396,7 @@
       <w:proofErr w:type="spellEnd"/>
       <w:r>
         <w:rPr>
+          <w:highlight w:val="green"/>
           <w:lang w:val="it-IT"/>
         </w:rPr>
         <w:t xml:space="preserve"> inferiti correttamente</w:t>
@@ -45276,11 +45405,13 @@
     <w:p>
       <w:pPr>
         <w:rPr>
-          <w:lang w:val="it-IT"/>
-        </w:rPr>
-      </w:pPr>
-      <w:r>
-        <w:rPr>
+          <w:highlight w:val="green"/>
+          <w:lang w:val="it-IT"/>
+        </w:rPr>
+      </w:pPr>
+      <w:r>
+        <w:rPr>
+          <w:highlight w:val="green"/>
           <w:lang w:val="it-IT"/>
         </w:rPr>
         <w:t xml:space="preserve">- </w:t>
@@ -45288,6 +45419,7 @@
       <w:proofErr w:type="gramStart"/>
       <w:r>
         <w:rPr>
+          <w:highlight w:val="green"/>
           <w:lang w:val="it-IT"/>
         </w:rPr>
         <w:t>[ ]</w:t>
@@ -45295,6 +45427,7 @@
       <w:proofErr w:type="gramEnd"/>
       <w:r>
         <w:rPr>
+          <w:highlight w:val="green"/>
           <w:lang w:val="it-IT"/>
         </w:rPr>
         <w:t xml:space="preserve"> Errori hanno struttura uniforme</w:t>
@@ -45308,6 +45441,7 @@
       </w:pPr>
       <w:r>
         <w:rPr>
+          <w:highlight w:val="green"/>
           <w:lang w:val="it-IT"/>
         </w:rPr>
         <w:t xml:space="preserve">- </w:t>
@@ -45315,6 +45449,7 @@
       <w:proofErr w:type="gramStart"/>
       <w:r>
         <w:rPr>
+          <w:highlight w:val="green"/>
           <w:lang w:val="it-IT"/>
         </w:rPr>
         <w:t>[ ]</w:t>
@@ -45322,6 +45457,7 @@
       <w:proofErr w:type="gramEnd"/>
       <w:r>
         <w:rPr>
+          <w:highlight w:val="green"/>
           <w:lang w:val="it-IT"/>
         </w:rPr>
         <w:t xml:space="preserve"> </w:t>
@@ -45329,6 +45465,7 @@
       <w:proofErr w:type="spellStart"/>
       <w:r>
         <w:rPr>
+          <w:highlight w:val="green"/>
           <w:lang w:val="it-IT"/>
         </w:rPr>
         <w:t>Correlation</w:t>
@@ -45336,6 +45473,7 @@
       <w:proofErr w:type="spellEnd"/>
       <w:r>
         <w:rPr>
+          <w:highlight w:val="green"/>
           <w:lang w:val="it-IT"/>
         </w:rPr>
         <w:t xml:space="preserve"> ID propagato</w:t>

</xml_diff>

<commit_message>
feat: Implement estimates feature with API queries and mutations, and add AGENTS.md documentation.
</commit_message>
<xml_diff>
--- a/Piano-operativo-v1.7.docx
+++ b/Piano-operativo-v1.7.docx
@@ -45502,11 +45502,13 @@
     <w:p>
       <w:pPr>
         <w:rPr>
-          <w:lang w:val="it-IT"/>
-        </w:rPr>
-      </w:pPr>
-      <w:r>
-        <w:rPr>
+          <w:highlight w:val="green"/>
+          <w:lang w:val="it-IT"/>
+        </w:rPr>
+      </w:pPr>
+      <w:r>
+        <w:rPr>
+          <w:highlight w:val="green"/>
           <w:lang w:val="it-IT"/>
         </w:rPr>
         <w:t xml:space="preserve">TASK 4.5: </w:t>
@@ -45514,6 +45516,7 @@
       <w:proofErr w:type="spellStart"/>
       <w:r>
         <w:rPr>
+          <w:highlight w:val="green"/>
           <w:lang w:val="it-IT"/>
         </w:rPr>
         <w:t>Wrapper</w:t>
@@ -45521,6 +45524,7 @@
       <w:proofErr w:type="spellEnd"/>
       <w:r>
         <w:rPr>
+          <w:highlight w:val="green"/>
           <w:lang w:val="it-IT"/>
         </w:rPr>
         <w:t xml:space="preserve"> Decimale per Calcoli Finanziari (FE)</w:t>
@@ -45529,17 +45533,20 @@
     <w:p>
       <w:pPr>
         <w:rPr>
-          <w:lang w:val="it-IT"/>
-        </w:rPr>
-      </w:pPr>
-      <w:r>
-        <w:rPr>
+          <w:highlight w:val="green"/>
+          <w:lang w:val="it-IT"/>
+        </w:rPr>
+      </w:pPr>
+      <w:r>
+        <w:rPr>
+          <w:highlight w:val="green"/>
           <w:lang w:val="it-IT"/>
         </w:rPr>
         <w:t>Descrizione:</w:t>
       </w:r>
       <w:r>
         <w:rPr>
+          <w:highlight w:val="green"/>
           <w:lang w:val="it-IT"/>
         </w:rPr>
         <w:br/>
@@ -45548,6 +45555,7 @@
       <w:proofErr w:type="spellStart"/>
       <w:r>
         <w:rPr>
+          <w:highlight w:val="green"/>
           <w:lang w:val="it-IT"/>
         </w:rPr>
         <w:t>frontend</w:t>
@@ -45555,6 +45563,7 @@
       <w:proofErr w:type="spellEnd"/>
       <w:r>
         <w:rPr>
+          <w:highlight w:val="green"/>
           <w:lang w:val="it-IT"/>
         </w:rPr>
         <w:t xml:space="preserve"> per tutti i calcoli monetari e percentuali, evitando i </w:t>
@@ -45562,6 +45571,7 @@
       <w:proofErr w:type="spellStart"/>
       <w:r>
         <w:rPr>
+          <w:highlight w:val="green"/>
           <w:lang w:val="it-IT"/>
         </w:rPr>
         <w:t>number</w:t>
@@ -45569,6 +45579,7 @@
       <w:proofErr w:type="spellEnd"/>
       <w:r>
         <w:rPr>
+          <w:highlight w:val="green"/>
           <w:lang w:val="it-IT"/>
         </w:rPr>
         <w:t> JS nativi.</w:t>
@@ -45577,12 +45588,14 @@
     <w:p>
       <w:pPr>
         <w:rPr>
-          <w:lang w:val="it-IT"/>
-        </w:rPr>
-      </w:pPr>
-      <w:proofErr w:type="spellStart"/>
-      <w:r>
-        <w:rPr>
+          <w:highlight w:val="green"/>
+          <w:lang w:val="it-IT"/>
+        </w:rPr>
+      </w:pPr>
+      <w:proofErr w:type="spellStart"/>
+      <w:r>
+        <w:rPr>
+          <w:highlight w:val="green"/>
           <w:lang w:val="it-IT"/>
         </w:rPr>
         <w:t>Microstep</w:t>
@@ -45590,6 +45603,7 @@
       <w:proofErr w:type="spellEnd"/>
       <w:r>
         <w:rPr>
+          <w:highlight w:val="green"/>
           <w:lang w:val="it-IT"/>
         </w:rPr>
         <w:t>:</w:t>
@@ -45598,11 +45612,13 @@
     <w:p>
       <w:pPr>
         <w:rPr>
-          <w:lang w:val="it-IT"/>
-        </w:rPr>
-      </w:pPr>
-      <w:r>
-        <w:rPr>
+          <w:highlight w:val="green"/>
+          <w:lang w:val="it-IT"/>
+        </w:rPr>
+      </w:pPr>
+      <w:r>
+        <w:rPr>
+          <w:highlight w:val="green"/>
           <w:lang w:val="it-IT"/>
         </w:rPr>
         <w:t xml:space="preserve">Aggiungere dipendenza decimal.js (o big.js) al progetto </w:t>
@@ -45610,6 +45626,7 @@
       <w:proofErr w:type="spellStart"/>
       <w:r>
         <w:rPr>
+          <w:highlight w:val="green"/>
           <w:lang w:val="it-IT"/>
         </w:rPr>
         <w:t>frontend</w:t>
@@ -45617,230 +45634,412 @@
       <w:proofErr w:type="spellEnd"/>
       <w:r>
         <w:rPr>
+          <w:highlight w:val="green"/>
           <w:lang w:val="it-IT"/>
         </w:rPr>
         <w:t>.</w:t>
       </w:r>
     </w:p>
     <w:p>
-      <w:proofErr w:type="spellStart"/>
-      <w:r>
+      <w:pPr>
+        <w:rPr>
+          <w:highlight w:val="green"/>
+        </w:rPr>
+      </w:pPr>
+      <w:proofErr w:type="spellStart"/>
+      <w:r>
+        <w:rPr>
+          <w:highlight w:val="green"/>
+        </w:rPr>
         <w:t>Creare</w:t>
       </w:r>
       <w:proofErr w:type="spellEnd"/>
       <w:r>
+        <w:rPr>
+          <w:highlight w:val="green"/>
+        </w:rPr>
         <w:t xml:space="preserve"> file frontend/</w:t>
       </w:r>
       <w:proofErr w:type="spellStart"/>
       <w:r>
+        <w:rPr>
+          <w:highlight w:val="green"/>
+        </w:rPr>
         <w:t>src</w:t>
       </w:r>
       <w:proofErr w:type="spellEnd"/>
       <w:r>
+        <w:rPr>
+          <w:highlight w:val="green"/>
+        </w:rPr>
         <w:t>/shared/finance/</w:t>
       </w:r>
       <w:proofErr w:type="spellStart"/>
       <w:r>
+        <w:rPr>
+          <w:highlight w:val="green"/>
+        </w:rPr>
         <w:t>decimalMoney.ts</w:t>
       </w:r>
       <w:proofErr w:type="spellEnd"/>
       <w:r>
+        <w:rPr>
+          <w:highlight w:val="green"/>
+        </w:rPr>
         <w:t>.</w:t>
       </w:r>
     </w:p>
     <w:p>
-      <w:proofErr w:type="spellStart"/>
-      <w:r>
+      <w:pPr>
+        <w:rPr>
+          <w:highlight w:val="green"/>
+        </w:rPr>
+      </w:pPr>
+      <w:proofErr w:type="spellStart"/>
+      <w:r>
+        <w:rPr>
+          <w:highlight w:val="green"/>
+        </w:rPr>
         <w:t>Definire</w:t>
       </w:r>
       <w:proofErr w:type="spellEnd"/>
       <w:r>
+        <w:rPr>
+          <w:highlight w:val="green"/>
+        </w:rPr>
         <w:t xml:space="preserve"> type </w:t>
       </w:r>
       <w:proofErr w:type="spellStart"/>
       <w:r>
+        <w:rPr>
+          <w:highlight w:val="green"/>
+        </w:rPr>
         <w:t>MoneyDecimal</w:t>
       </w:r>
       <w:proofErr w:type="spellEnd"/>
       <w:r>
+        <w:rPr>
+          <w:highlight w:val="green"/>
+        </w:rPr>
         <w:t xml:space="preserve"> con </w:t>
       </w:r>
       <w:proofErr w:type="spellStart"/>
       <w:r>
+        <w:rPr>
+          <w:highlight w:val="green"/>
+        </w:rPr>
         <w:t>campi</w:t>
       </w:r>
       <w:proofErr w:type="spellEnd"/>
       <w:r>
+        <w:rPr>
+          <w:highlight w:val="green"/>
+        </w:rPr>
         <w:t>: amount: Decimal, currency: string.</w:t>
       </w:r>
     </w:p>
     <w:p>
-      <w:proofErr w:type="spellStart"/>
-      <w:r>
+      <w:pPr>
+        <w:rPr>
+          <w:highlight w:val="green"/>
+        </w:rPr>
+      </w:pPr>
+      <w:proofErr w:type="spellStart"/>
+      <w:r>
+        <w:rPr>
+          <w:highlight w:val="green"/>
+        </w:rPr>
         <w:t>Implementare</w:t>
       </w:r>
       <w:proofErr w:type="spellEnd"/>
       <w:r>
+        <w:rPr>
+          <w:highlight w:val="green"/>
+        </w:rPr>
         <w:t xml:space="preserve"> </w:t>
       </w:r>
       <w:proofErr w:type="spellStart"/>
       <w:r>
+        <w:rPr>
+          <w:highlight w:val="green"/>
+        </w:rPr>
         <w:t>funzioni</w:t>
       </w:r>
       <w:proofErr w:type="spellEnd"/>
       <w:r>
+        <w:rPr>
+          <w:highlight w:val="green"/>
+        </w:rPr>
         <w:t xml:space="preserve"> helper:</w:t>
       </w:r>
     </w:p>
     <w:p>
+      <w:pPr>
+        <w:rPr>
+          <w:highlight w:val="green"/>
+        </w:rPr>
+      </w:pPr>
       <w:proofErr w:type="spellStart"/>
       <w:proofErr w:type="gramStart"/>
       <w:r>
+        <w:rPr>
+          <w:highlight w:val="green"/>
+        </w:rPr>
         <w:t>parseMoneyFromString</w:t>
       </w:r>
       <w:proofErr w:type="spellEnd"/>
       <w:r>
+        <w:rPr>
+          <w:highlight w:val="green"/>
+        </w:rPr>
         <w:t>(</w:t>
       </w:r>
       <w:proofErr w:type="gramEnd"/>
       <w:r>
+        <w:rPr>
+          <w:highlight w:val="green"/>
+        </w:rPr>
         <w:t xml:space="preserve">value: string, currency: string) -&gt; </w:t>
       </w:r>
       <w:proofErr w:type="spellStart"/>
       <w:r>
+        <w:rPr>
+          <w:highlight w:val="green"/>
+        </w:rPr>
         <w:t>MoneyDecimal</w:t>
       </w:r>
       <w:proofErr w:type="spellEnd"/>
     </w:p>
     <w:p>
+      <w:pPr>
+        <w:rPr>
+          <w:highlight w:val="green"/>
+        </w:rPr>
+      </w:pPr>
       <w:proofErr w:type="spellStart"/>
       <w:proofErr w:type="gramStart"/>
       <w:r>
+        <w:rPr>
+          <w:highlight w:val="green"/>
+        </w:rPr>
         <w:t>formatMoney</w:t>
       </w:r>
       <w:proofErr w:type="spellEnd"/>
       <w:r>
+        <w:rPr>
+          <w:highlight w:val="green"/>
+        </w:rPr>
         <w:t>(</w:t>
       </w:r>
       <w:proofErr w:type="gramEnd"/>
       <w:r>
+        <w:rPr>
+          <w:highlight w:val="green"/>
+        </w:rPr>
         <w:t xml:space="preserve">m: </w:t>
       </w:r>
       <w:proofErr w:type="spellStart"/>
       <w:r>
+        <w:rPr>
+          <w:highlight w:val="green"/>
+        </w:rPr>
         <w:t>MoneyDecimal</w:t>
       </w:r>
       <w:proofErr w:type="spellEnd"/>
       <w:r>
+        <w:rPr>
+          <w:highlight w:val="green"/>
+        </w:rPr>
         <w:t>) -&gt; string</w:t>
       </w:r>
     </w:p>
     <w:p>
+      <w:pPr>
+        <w:rPr>
+          <w:highlight w:val="green"/>
+        </w:rPr>
+      </w:pPr>
       <w:proofErr w:type="spellStart"/>
       <w:proofErr w:type="gramStart"/>
       <w:r>
+        <w:rPr>
+          <w:highlight w:val="green"/>
+        </w:rPr>
         <w:t>calculatePnL</w:t>
       </w:r>
       <w:proofErr w:type="spellEnd"/>
       <w:r>
+        <w:rPr>
+          <w:highlight w:val="green"/>
+        </w:rPr>
         <w:t>(</w:t>
       </w:r>
       <w:proofErr w:type="gramEnd"/>
       <w:r>
+        <w:rPr>
+          <w:highlight w:val="green"/>
+        </w:rPr>
         <w:t xml:space="preserve">entry: </w:t>
       </w:r>
       <w:proofErr w:type="spellStart"/>
       <w:r>
+        <w:rPr>
+          <w:highlight w:val="green"/>
+        </w:rPr>
         <w:t>MoneyDecimal</w:t>
       </w:r>
       <w:proofErr w:type="spellEnd"/>
       <w:r>
+        <w:rPr>
+          <w:highlight w:val="green"/>
+        </w:rPr>
         <w:t xml:space="preserve">, current: </w:t>
       </w:r>
       <w:proofErr w:type="spellStart"/>
       <w:r>
+        <w:rPr>
+          <w:highlight w:val="green"/>
+        </w:rPr>
         <w:t>MoneyDecimal</w:t>
       </w:r>
       <w:proofErr w:type="spellEnd"/>
       <w:r>
+        <w:rPr>
+          <w:highlight w:val="green"/>
+        </w:rPr>
         <w:t>, quantity: Decimal).</w:t>
       </w:r>
     </w:p>
     <w:p>
-      <w:proofErr w:type="spellStart"/>
-      <w:r>
+      <w:pPr>
+        <w:rPr>
+          <w:highlight w:val="green"/>
+        </w:rPr>
+      </w:pPr>
+      <w:proofErr w:type="spellStart"/>
+      <w:r>
+        <w:rPr>
+          <w:highlight w:val="green"/>
+        </w:rPr>
         <w:t>Sostituire</w:t>
       </w:r>
       <w:proofErr w:type="spellEnd"/>
       <w:r>
+        <w:rPr>
+          <w:highlight w:val="green"/>
+        </w:rPr>
         <w:t xml:space="preserve"> </w:t>
       </w:r>
       <w:proofErr w:type="spellStart"/>
       <w:r>
+        <w:rPr>
+          <w:highlight w:val="green"/>
+        </w:rPr>
         <w:t>nei</w:t>
       </w:r>
       <w:proofErr w:type="spellEnd"/>
       <w:r>
+        <w:rPr>
+          <w:highlight w:val="green"/>
+        </w:rPr>
         <w:t xml:space="preserve"> </w:t>
       </w:r>
       <w:proofErr w:type="spellStart"/>
       <w:r>
+        <w:rPr>
+          <w:highlight w:val="green"/>
+        </w:rPr>
         <w:t>componenti</w:t>
       </w:r>
       <w:proofErr w:type="spellEnd"/>
       <w:r>
+        <w:rPr>
+          <w:highlight w:val="green"/>
+        </w:rPr>
         <w:t> </w:t>
       </w:r>
       <w:proofErr w:type="spellStart"/>
       <w:r>
+        <w:rPr>
+          <w:highlight w:val="green"/>
+        </w:rPr>
         <w:t>EstimateCard</w:t>
       </w:r>
       <w:proofErr w:type="spellEnd"/>
       <w:r>
+        <w:rPr>
+          <w:highlight w:val="green"/>
+        </w:rPr>
         <w:t>, </w:t>
       </w:r>
       <w:proofErr w:type="spellStart"/>
       <w:r>
+        <w:rPr>
+          <w:highlight w:val="green"/>
+        </w:rPr>
         <w:t>EstimateForm</w:t>
       </w:r>
       <w:proofErr w:type="spellEnd"/>
       <w:r>
+        <w:rPr>
+          <w:highlight w:val="green"/>
+        </w:rPr>
         <w:t>, Dashboard </w:t>
       </w:r>
       <w:proofErr w:type="spellStart"/>
       <w:r>
+        <w:rPr>
+          <w:highlight w:val="green"/>
+        </w:rPr>
         <w:t>l’uso</w:t>
       </w:r>
       <w:proofErr w:type="spellEnd"/>
       <w:r>
+        <w:rPr>
+          <w:highlight w:val="green"/>
+        </w:rPr>
         <w:t xml:space="preserve"> di number per </w:t>
       </w:r>
       <w:proofErr w:type="spellStart"/>
       <w:r>
+        <w:rPr>
+          <w:highlight w:val="green"/>
+        </w:rPr>
         <w:t>importi</w:t>
       </w:r>
       <w:proofErr w:type="spellEnd"/>
       <w:r>
+        <w:rPr>
+          <w:highlight w:val="green"/>
+        </w:rPr>
         <w:t xml:space="preserve"> con </w:t>
       </w:r>
       <w:proofErr w:type="spellStart"/>
       <w:r>
+        <w:rPr>
+          <w:highlight w:val="green"/>
+        </w:rPr>
         <w:t>MoneyDecimal</w:t>
       </w:r>
       <w:proofErr w:type="spellEnd"/>
       <w:r>
+        <w:rPr>
+          <w:highlight w:val="green"/>
+        </w:rPr>
         <w:t>/helper.</w:t>
       </w:r>
     </w:p>
     <w:p>
       <w:pPr>
         <w:rPr>
-          <w:lang w:val="it-IT"/>
-        </w:rPr>
-      </w:pPr>
-      <w:proofErr w:type="spellStart"/>
-      <w:r>
-        <w:rPr>
+          <w:highlight w:val="green"/>
+          <w:lang w:val="it-IT"/>
+        </w:rPr>
+      </w:pPr>
+      <w:proofErr w:type="spellStart"/>
+      <w:r>
+        <w:rPr>
+          <w:highlight w:val="green"/>
           <w:lang w:val="it-IT"/>
         </w:rPr>
         <w:t>Acceptance</w:t>
@@ -45848,6 +46047,7 @@
       <w:proofErr w:type="spellEnd"/>
       <w:r>
         <w:rPr>
+          <w:highlight w:val="green"/>
           <w:lang w:val="it-IT"/>
         </w:rPr>
         <w:t xml:space="preserve"> </w:t>
@@ -45855,6 +46055,7 @@
       <w:proofErr w:type="spellStart"/>
       <w:r>
         <w:rPr>
+          <w:highlight w:val="green"/>
           <w:lang w:val="it-IT"/>
         </w:rPr>
         <w:t>Criteria</w:t>
@@ -45862,6 +46063,7 @@
       <w:proofErr w:type="spellEnd"/>
       <w:r>
         <w:rPr>
+          <w:highlight w:val="green"/>
           <w:lang w:val="it-IT"/>
         </w:rPr>
         <w:t>:</w:t>
@@ -45870,11 +46072,13 @@
     <w:p>
       <w:pPr>
         <w:rPr>
-          <w:lang w:val="it-IT"/>
-        </w:rPr>
-      </w:pPr>
-      <w:r>
-        <w:rPr>
+          <w:highlight w:val="green"/>
+          <w:lang w:val="it-IT"/>
+        </w:rPr>
+      </w:pPr>
+      <w:r>
+        <w:rPr>
+          <w:highlight w:val="green"/>
           <w:lang w:val="it-IT"/>
         </w:rPr>
         <w:t> Nessun calcolo di P&amp;L, prezzi o percentuali usa più </w:t>
@@ -45882,6 +46086,7 @@
       <w:proofErr w:type="spellStart"/>
       <w:r>
         <w:rPr>
+          <w:highlight w:val="green"/>
           <w:lang w:val="it-IT"/>
         </w:rPr>
         <w:t>number</w:t>
@@ -45889,6 +46094,7 @@
       <w:proofErr w:type="spellEnd"/>
       <w:r>
         <w:rPr>
+          <w:highlight w:val="green"/>
           <w:lang w:val="it-IT"/>
         </w:rPr>
         <w:t> JS puro.</w:t>
@@ -45897,11 +46103,13 @@
     <w:p>
       <w:pPr>
         <w:rPr>
-          <w:lang w:val="it-IT"/>
-        </w:rPr>
-      </w:pPr>
-      <w:r>
-        <w:rPr>
+          <w:highlight w:val="green"/>
+          <w:lang w:val="it-IT"/>
+        </w:rPr>
+      </w:pPr>
+      <w:r>
+        <w:rPr>
+          <w:highlight w:val="green"/>
           <w:lang w:val="it-IT"/>
         </w:rPr>
         <w:t xml:space="preserve"> I risultati di P&amp;L coincidono con quelli calcolati dal </w:t>
@@ -45909,6 +46117,7 @@
       <w:proofErr w:type="spellStart"/>
       <w:r>
         <w:rPr>
+          <w:highlight w:val="green"/>
           <w:lang w:val="it-IT"/>
         </w:rPr>
         <w:t>backend</w:t>
@@ -45916,6 +46125,7 @@
       <w:proofErr w:type="spellEnd"/>
       <w:r>
         <w:rPr>
+          <w:highlight w:val="green"/>
           <w:lang w:val="it-IT"/>
         </w:rPr>
         <w:t xml:space="preserve"> a parità di input.</w:t>
@@ -45929,6 +46139,7 @@
       </w:pPr>
       <w:r>
         <w:rPr>
+          <w:highlight w:val="green"/>
           <w:lang w:val="it-IT"/>
         </w:rPr>
         <w:t> I valori mostrati all’utente non soffrono di errori di arrotondamento “classici” JS (es. 0.1+0.2 ≠ 0.3000004).</w:t>

</xml_diff>

<commit_message>
feat: Introduce new TickerTracker frontend application with React, Vite, and comprehensive project structure.
</commit_message>
<xml_diff>
--- a/Piano-operativo-v1.7.docx
+++ b/Piano-operativo-v1.7.docx
@@ -46175,11 +46175,13 @@
     <w:p>
       <w:pPr>
         <w:rPr>
-          <w:lang w:val="it-IT"/>
-        </w:rPr>
-      </w:pPr>
-      <w:r>
-        <w:rPr>
+          <w:highlight w:val="green"/>
+          <w:lang w:val="it-IT"/>
+        </w:rPr>
+      </w:pPr>
+      <w:r>
+        <w:rPr>
+          <w:highlight w:val="green"/>
           <w:lang w:val="it-IT"/>
         </w:rPr>
         <w:t xml:space="preserve">## TASK 4.6: Implementazione API Hooks per </w:t>
@@ -46187,6 +46189,7 @@
       <w:proofErr w:type="spellStart"/>
       <w:r>
         <w:rPr>
+          <w:highlight w:val="green"/>
           <w:lang w:val="it-IT"/>
         </w:rPr>
         <w:t>Estimates</w:t>
@@ -46196,18 +46199,21 @@
     <w:p>
       <w:pPr>
         <w:rPr>
-          <w:lang w:val="it-IT"/>
-        </w:rPr>
-      </w:pPr>
-    </w:p>
-    <w:p>
-      <w:pPr>
-        <w:rPr>
-          <w:lang w:val="it-IT"/>
-        </w:rPr>
-      </w:pPr>
-      <w:r>
-        <w:rPr>
+          <w:highlight w:val="green"/>
+          <w:lang w:val="it-IT"/>
+        </w:rPr>
+      </w:pPr>
+    </w:p>
+    <w:p>
+      <w:pPr>
+        <w:rPr>
+          <w:highlight w:val="green"/>
+          <w:lang w:val="it-IT"/>
+        </w:rPr>
+      </w:pPr>
+      <w:r>
+        <w:rPr>
+          <w:highlight w:val="green"/>
           <w:lang w:val="it-IT"/>
         </w:rPr>
         <w:t>**</w:t>
@@ -46215,6 +46221,7 @@
       <w:proofErr w:type="gramStart"/>
       <w:r>
         <w:rPr>
+          <w:highlight w:val="green"/>
           <w:lang w:val="it-IT"/>
         </w:rPr>
         <w:t>Descrizione:*</w:t>
@@ -46222,6 +46229,7 @@
       <w:proofErr w:type="gramEnd"/>
       <w:r>
         <w:rPr>
+          <w:highlight w:val="green"/>
           <w:lang w:val="it-IT"/>
         </w:rPr>
         <w:t>* Creare hook React Query per operazioni su stime.</w:t>
@@ -46230,74 +46238,126 @@
     <w:p>
       <w:pPr>
         <w:rPr>
-          <w:lang w:val="it-IT"/>
-        </w:rPr>
-      </w:pPr>
-    </w:p>
-    <w:p>
-      <w:r>
+          <w:highlight w:val="green"/>
+          <w:lang w:val="it-IT"/>
+        </w:rPr>
+      </w:pPr>
+    </w:p>
+    <w:p>
+      <w:pPr>
+        <w:rPr>
+          <w:highlight w:val="green"/>
+        </w:rPr>
+      </w:pPr>
+      <w:r>
+        <w:rPr>
+          <w:highlight w:val="green"/>
+        </w:rPr>
         <w:lastRenderedPageBreak/>
         <w:t>**</w:t>
       </w:r>
       <w:proofErr w:type="spellStart"/>
       <w:proofErr w:type="gramStart"/>
       <w:r>
+        <w:rPr>
+          <w:highlight w:val="green"/>
+        </w:rPr>
         <w:t>Microstep</w:t>
       </w:r>
       <w:proofErr w:type="spellEnd"/>
       <w:r>
+        <w:rPr>
+          <w:highlight w:val="green"/>
+        </w:rPr>
         <w:t>:*</w:t>
       </w:r>
       <w:proofErr w:type="gramEnd"/>
       <w:r>
+        <w:rPr>
+          <w:highlight w:val="green"/>
+        </w:rPr>
         <w:t>*</w:t>
       </w:r>
     </w:p>
     <w:p>
-      <w:r>
+      <w:pPr>
+        <w:rPr>
+          <w:highlight w:val="green"/>
+        </w:rPr>
+      </w:pPr>
+      <w:r>
+        <w:rPr>
+          <w:highlight w:val="green"/>
+        </w:rPr>
         <w:t xml:space="preserve">1. </w:t>
       </w:r>
       <w:proofErr w:type="spellStart"/>
       <w:r>
+        <w:rPr>
+          <w:highlight w:val="green"/>
+        </w:rPr>
         <w:t>Creare</w:t>
       </w:r>
       <w:proofErr w:type="spellEnd"/>
       <w:r>
+        <w:rPr>
+          <w:highlight w:val="green"/>
+        </w:rPr>
         <w:t xml:space="preserve"> file `frontend/</w:t>
       </w:r>
       <w:proofErr w:type="spellStart"/>
       <w:r>
+        <w:rPr>
+          <w:highlight w:val="green"/>
+        </w:rPr>
         <w:t>src</w:t>
       </w:r>
       <w:proofErr w:type="spellEnd"/>
       <w:r>
+        <w:rPr>
+          <w:highlight w:val="green"/>
+        </w:rPr>
         <w:t>/features/estimates/</w:t>
       </w:r>
       <w:proofErr w:type="spellStart"/>
       <w:r>
+        <w:rPr>
+          <w:highlight w:val="green"/>
+        </w:rPr>
         <w:t>api</w:t>
       </w:r>
       <w:proofErr w:type="spellEnd"/>
       <w:r>
+        <w:rPr>
+          <w:highlight w:val="green"/>
+        </w:rPr>
         <w:t>/</w:t>
       </w:r>
       <w:proofErr w:type="spellStart"/>
       <w:r>
+        <w:rPr>
+          <w:highlight w:val="green"/>
+        </w:rPr>
         <w:t>queries.ts</w:t>
       </w:r>
       <w:proofErr w:type="spellEnd"/>
       <w:r>
+        <w:rPr>
+          <w:highlight w:val="green"/>
+        </w:rPr>
         <w:t>`</w:t>
       </w:r>
     </w:p>
     <w:p>
       <w:pPr>
         <w:rPr>
-          <w:lang w:val="it-IT"/>
-        </w:rPr>
-      </w:pPr>
-      <w:r>
-        <w:rPr>
+          <w:highlight w:val="green"/>
+          <w:lang w:val="it-IT"/>
+        </w:rPr>
+      </w:pPr>
+      <w:r>
+        <w:rPr>
+          <w:highlight w:val="green"/>
           <w:lang w:val="it-IT"/>
         </w:rPr>
         <w:t>2. Implementare `</w:t>
@@ -46305,6 +46365,7 @@
       <w:proofErr w:type="spellStart"/>
       <w:r>
         <w:rPr>
+          <w:highlight w:val="green"/>
           <w:lang w:val="it-IT"/>
         </w:rPr>
         <w:t>useEstimates</w:t>
@@ -46312,6 +46373,7 @@
       <w:proofErr w:type="spellEnd"/>
       <w:r>
         <w:rPr>
+          <w:highlight w:val="green"/>
           <w:lang w:val="it-IT"/>
         </w:rPr>
         <w:t>(filters)`: lista stime con filtri</w:t>
@@ -46320,11 +46382,13 @@
     <w:p>
       <w:pPr>
         <w:rPr>
-          <w:lang w:val="it-IT"/>
-        </w:rPr>
-      </w:pPr>
-      <w:r>
-        <w:rPr>
+          <w:highlight w:val="green"/>
+          <w:lang w:val="it-IT"/>
+        </w:rPr>
+      </w:pPr>
+      <w:r>
+        <w:rPr>
+          <w:highlight w:val="green"/>
           <w:lang w:val="it-IT"/>
         </w:rPr>
         <w:t>3. Implementare `</w:t>
@@ -46332,6 +46396,7 @@
       <w:proofErr w:type="spellStart"/>
       <w:r>
         <w:rPr>
+          <w:highlight w:val="green"/>
           <w:lang w:val="it-IT"/>
         </w:rPr>
         <w:t>useEstimate</w:t>
@@ -46339,82 +46404,140 @@
       <w:proofErr w:type="spellEnd"/>
       <w:r>
         <w:rPr>
+          <w:highlight w:val="green"/>
           <w:lang w:val="it-IT"/>
         </w:rPr>
         <w:t>(id)`: singola stima con dettagli</w:t>
       </w:r>
     </w:p>
     <w:p>
-      <w:r>
+      <w:pPr>
+        <w:rPr>
+          <w:highlight w:val="green"/>
+        </w:rPr>
+      </w:pPr>
+      <w:r>
+        <w:rPr>
+          <w:highlight w:val="green"/>
+        </w:rPr>
         <w:t xml:space="preserve">4. </w:t>
       </w:r>
       <w:proofErr w:type="spellStart"/>
       <w:r>
+        <w:rPr>
+          <w:highlight w:val="green"/>
+        </w:rPr>
         <w:t>Implementare</w:t>
       </w:r>
       <w:proofErr w:type="spellEnd"/>
       <w:r>
+        <w:rPr>
+          <w:highlight w:val="green"/>
+        </w:rPr>
         <w:t xml:space="preserve"> `</w:t>
       </w:r>
       <w:proofErr w:type="spellStart"/>
       <w:r>
+        <w:rPr>
+          <w:highlight w:val="green"/>
+        </w:rPr>
         <w:t>useEstimateHistory</w:t>
       </w:r>
       <w:proofErr w:type="spellEnd"/>
       <w:r>
+        <w:rPr>
+          <w:highlight w:val="green"/>
+        </w:rPr>
         <w:t xml:space="preserve">(id)`: audit trail </w:t>
       </w:r>
       <w:proofErr w:type="spellStart"/>
       <w:r>
+        <w:rPr>
+          <w:highlight w:val="green"/>
+        </w:rPr>
         <w:t>stima</w:t>
       </w:r>
       <w:proofErr w:type="spellEnd"/>
     </w:p>
     <w:p>
-      <w:r>
+      <w:pPr>
+        <w:rPr>
+          <w:highlight w:val="green"/>
+        </w:rPr>
+      </w:pPr>
+      <w:r>
+        <w:rPr>
+          <w:highlight w:val="green"/>
+        </w:rPr>
         <w:t xml:space="preserve">5. </w:t>
       </w:r>
       <w:proofErr w:type="spellStart"/>
       <w:r>
+        <w:rPr>
+          <w:highlight w:val="green"/>
+        </w:rPr>
         <w:t>Creare</w:t>
       </w:r>
       <w:proofErr w:type="spellEnd"/>
       <w:r>
+        <w:rPr>
+          <w:highlight w:val="green"/>
+        </w:rPr>
         <w:t xml:space="preserve"> file `frontend/</w:t>
       </w:r>
       <w:proofErr w:type="spellStart"/>
       <w:r>
+        <w:rPr>
+          <w:highlight w:val="green"/>
+        </w:rPr>
         <w:t>src</w:t>
       </w:r>
       <w:proofErr w:type="spellEnd"/>
       <w:r>
+        <w:rPr>
+          <w:highlight w:val="green"/>
+        </w:rPr>
         <w:t>/features/estimates/</w:t>
       </w:r>
       <w:proofErr w:type="spellStart"/>
       <w:r>
+        <w:rPr>
+          <w:highlight w:val="green"/>
+        </w:rPr>
         <w:t>api</w:t>
       </w:r>
       <w:proofErr w:type="spellEnd"/>
       <w:r>
+        <w:rPr>
+          <w:highlight w:val="green"/>
+        </w:rPr>
         <w:t>/</w:t>
       </w:r>
       <w:proofErr w:type="spellStart"/>
       <w:r>
+        <w:rPr>
+          <w:highlight w:val="green"/>
+        </w:rPr>
         <w:t>mutations.ts</w:t>
       </w:r>
       <w:proofErr w:type="spellEnd"/>
       <w:r>
+        <w:rPr>
+          <w:highlight w:val="green"/>
+        </w:rPr>
         <w:t>`</w:t>
       </w:r>
     </w:p>
     <w:p>
       <w:pPr>
         <w:rPr>
-          <w:lang w:val="it-IT"/>
-        </w:rPr>
-      </w:pPr>
-      <w:r>
-        <w:rPr>
+          <w:highlight w:val="green"/>
+          <w:lang w:val="it-IT"/>
+        </w:rPr>
+      </w:pPr>
+      <w:r>
+        <w:rPr>
+          <w:highlight w:val="green"/>
           <w:lang w:val="it-IT"/>
         </w:rPr>
         <w:t>6. Implementare `</w:t>
@@ -46423,6 +46546,7 @@
       <w:proofErr w:type="gramStart"/>
       <w:r>
         <w:rPr>
+          <w:highlight w:val="green"/>
           <w:lang w:val="it-IT"/>
         </w:rPr>
         <w:t>useCreateEstimate</w:t>
@@ -46430,6 +46554,7 @@
       <w:proofErr w:type="spellEnd"/>
       <w:r>
         <w:rPr>
+          <w:highlight w:val="green"/>
           <w:lang w:val="it-IT"/>
         </w:rPr>
         <w:t>(</w:t>
@@ -46437,6 +46562,7 @@
       <w:proofErr w:type="gramEnd"/>
       <w:r>
         <w:rPr>
+          <w:highlight w:val="green"/>
           <w:lang w:val="it-IT"/>
         </w:rPr>
         <w:t>)`: creazione nuova stima</w:t>
@@ -46445,11 +46571,13 @@
     <w:p>
       <w:pPr>
         <w:rPr>
-          <w:lang w:val="it-IT"/>
-        </w:rPr>
-      </w:pPr>
-      <w:r>
-        <w:rPr>
+          <w:highlight w:val="green"/>
+          <w:lang w:val="it-IT"/>
+        </w:rPr>
+      </w:pPr>
+      <w:r>
+        <w:rPr>
+          <w:highlight w:val="green"/>
           <w:lang w:val="it-IT"/>
         </w:rPr>
         <w:t>7. Implementare `</w:t>
@@ -46458,6 +46586,7 @@
       <w:proofErr w:type="gramStart"/>
       <w:r>
         <w:rPr>
+          <w:highlight w:val="green"/>
           <w:lang w:val="it-IT"/>
         </w:rPr>
         <w:t>useUpdateEstimate</w:t>
@@ -46465,6 +46594,7 @@
       <w:proofErr w:type="spellEnd"/>
       <w:r>
         <w:rPr>
+          <w:highlight w:val="green"/>
           <w:lang w:val="it-IT"/>
         </w:rPr>
         <w:t>(</w:t>
@@ -46472,6 +46602,7 @@
       <w:proofErr w:type="gramEnd"/>
       <w:r>
         <w:rPr>
+          <w:highlight w:val="green"/>
           <w:lang w:val="it-IT"/>
         </w:rPr>
         <w:t>)`: aggiornamento stima</w:t>
@@ -46480,11 +46611,13 @@
     <w:p>
       <w:pPr>
         <w:rPr>
-          <w:lang w:val="it-IT"/>
-        </w:rPr>
-      </w:pPr>
-      <w:r>
-        <w:rPr>
+          <w:highlight w:val="green"/>
+          <w:lang w:val="it-IT"/>
+        </w:rPr>
+      </w:pPr>
+      <w:r>
+        <w:rPr>
+          <w:highlight w:val="green"/>
           <w:lang w:val="it-IT"/>
         </w:rPr>
         <w:t>8. Implementare `</w:t>
@@ -46493,6 +46626,7 @@
       <w:proofErr w:type="gramStart"/>
       <w:r>
         <w:rPr>
+          <w:highlight w:val="green"/>
           <w:lang w:val="it-IT"/>
         </w:rPr>
         <w:t>useCloseEstimate</w:t>
@@ -46500,6 +46634,7 @@
       <w:proofErr w:type="spellEnd"/>
       <w:r>
         <w:rPr>
+          <w:highlight w:val="green"/>
           <w:lang w:val="it-IT"/>
         </w:rPr>
         <w:t>(</w:t>
@@ -46507,6 +46642,7 @@
       <w:proofErr w:type="gramEnd"/>
       <w:r>
         <w:rPr>
+          <w:highlight w:val="green"/>
           <w:lang w:val="it-IT"/>
         </w:rPr>
         <w:t>)`: chiusura stima</w:t>
@@ -46515,11 +46651,13 @@
     <w:p>
       <w:pPr>
         <w:rPr>
-          <w:lang w:val="it-IT"/>
-        </w:rPr>
-      </w:pPr>
-      <w:r>
-        <w:rPr>
+          <w:highlight w:val="green"/>
+          <w:lang w:val="it-IT"/>
+        </w:rPr>
+      </w:pPr>
+      <w:r>
+        <w:rPr>
+          <w:highlight w:val="green"/>
           <w:lang w:val="it-IT"/>
         </w:rPr>
         <w:t xml:space="preserve">9. Configurare </w:t>
@@ -46527,6 +46665,7 @@
       <w:proofErr w:type="spellStart"/>
       <w:r>
         <w:rPr>
+          <w:highlight w:val="green"/>
           <w:lang w:val="it-IT"/>
         </w:rPr>
         <w:t>invalidation</w:t>
@@ -46534,6 +46673,7 @@
       <w:proofErr w:type="spellEnd"/>
       <w:r>
         <w:rPr>
+          <w:highlight w:val="green"/>
           <w:lang w:val="it-IT"/>
         </w:rPr>
         <w:t xml:space="preserve"> corretta delle query dopo </w:t>
@@ -46541,6 +46681,7 @@
       <w:proofErr w:type="spellStart"/>
       <w:r>
         <w:rPr>
+          <w:highlight w:val="green"/>
           <w:lang w:val="it-IT"/>
         </w:rPr>
         <w:t>mutation</w:t>
@@ -46550,18 +46691,21 @@
     <w:p>
       <w:pPr>
         <w:rPr>
-          <w:lang w:val="it-IT"/>
-        </w:rPr>
-      </w:pPr>
-    </w:p>
-    <w:p>
-      <w:pPr>
-        <w:rPr>
-          <w:lang w:val="it-IT"/>
-        </w:rPr>
-      </w:pPr>
-      <w:r>
-        <w:rPr>
+          <w:highlight w:val="green"/>
+          <w:lang w:val="it-IT"/>
+        </w:rPr>
+      </w:pPr>
+    </w:p>
+    <w:p>
+      <w:pPr>
+        <w:rPr>
+          <w:highlight w:val="green"/>
+          <w:lang w:val="it-IT"/>
+        </w:rPr>
+      </w:pPr>
+      <w:r>
+        <w:rPr>
+          <w:highlight w:val="green"/>
           <w:lang w:val="it-IT"/>
         </w:rPr>
         <w:t>**</w:t>
@@ -46569,6 +46713,7 @@
       <w:proofErr w:type="spellStart"/>
       <w:r>
         <w:rPr>
+          <w:highlight w:val="green"/>
           <w:lang w:val="it-IT"/>
         </w:rPr>
         <w:t>Acceptance</w:t>
@@ -46576,6 +46721,7 @@
       <w:proofErr w:type="spellEnd"/>
       <w:r>
         <w:rPr>
+          <w:highlight w:val="green"/>
           <w:lang w:val="it-IT"/>
         </w:rPr>
         <w:t xml:space="preserve"> </w:t>
@@ -46584,6 +46730,7 @@
       <w:proofErr w:type="gramStart"/>
       <w:r>
         <w:rPr>
+          <w:highlight w:val="green"/>
           <w:lang w:val="it-IT"/>
         </w:rPr>
         <w:t>Criteria</w:t>
@@ -46591,6 +46738,7 @@
       <w:proofErr w:type="spellEnd"/>
       <w:r>
         <w:rPr>
+          <w:highlight w:val="green"/>
           <w:lang w:val="it-IT"/>
         </w:rPr>
         <w:t>:*</w:t>
@@ -46598,6 +46746,7 @@
       <w:proofErr w:type="gramEnd"/>
       <w:r>
         <w:rPr>
+          <w:highlight w:val="green"/>
           <w:lang w:val="it-IT"/>
         </w:rPr>
         <w:t>*</w:t>
@@ -46606,11 +46755,13 @@
     <w:p>
       <w:pPr>
         <w:rPr>
-          <w:lang w:val="it-IT"/>
-        </w:rPr>
-      </w:pPr>
-      <w:r>
-        <w:rPr>
+          <w:highlight w:val="green"/>
+          <w:lang w:val="it-IT"/>
+        </w:rPr>
+      </w:pPr>
+      <w:r>
+        <w:rPr>
+          <w:highlight w:val="green"/>
           <w:lang w:val="it-IT"/>
         </w:rPr>
         <w:t xml:space="preserve">- </w:t>
@@ -46618,6 +46769,7 @@
       <w:proofErr w:type="gramStart"/>
       <w:r>
         <w:rPr>
+          <w:highlight w:val="green"/>
           <w:lang w:val="it-IT"/>
         </w:rPr>
         <w:t>[ ]</w:t>
@@ -46625,6 +46777,7 @@
       <w:proofErr w:type="gramEnd"/>
       <w:r>
         <w:rPr>
+          <w:highlight w:val="green"/>
           <w:lang w:val="it-IT"/>
         </w:rPr>
         <w:t xml:space="preserve"> Hook restituiscono stati: loading, </w:t>
@@ -46632,6 +46785,7 @@
       <w:proofErr w:type="spellStart"/>
       <w:r>
         <w:rPr>
+          <w:highlight w:val="green"/>
           <w:lang w:val="it-IT"/>
         </w:rPr>
         <w:t>error</w:t>
@@ -46639,6 +46793,7 @@
       <w:proofErr w:type="spellEnd"/>
       <w:r>
         <w:rPr>
+          <w:highlight w:val="green"/>
           <w:lang w:val="it-IT"/>
         </w:rPr>
         <w:t>, data</w:t>
@@ -46647,11 +46802,13 @@
     <w:p>
       <w:pPr>
         <w:rPr>
-          <w:lang w:val="it-IT"/>
-        </w:rPr>
-      </w:pPr>
-      <w:r>
-        <w:rPr>
+          <w:highlight w:val="green"/>
+          <w:lang w:val="it-IT"/>
+        </w:rPr>
+      </w:pPr>
+      <w:r>
+        <w:rPr>
+          <w:highlight w:val="green"/>
           <w:lang w:val="it-IT"/>
         </w:rPr>
         <w:t xml:space="preserve">- </w:t>
@@ -46659,6 +46816,7 @@
       <w:proofErr w:type="gramStart"/>
       <w:r>
         <w:rPr>
+          <w:highlight w:val="green"/>
           <w:lang w:val="it-IT"/>
         </w:rPr>
         <w:t>[ ]</w:t>
@@ -46666,6 +46824,7 @@
       <w:proofErr w:type="gramEnd"/>
       <w:r>
         <w:rPr>
+          <w:highlight w:val="green"/>
           <w:lang w:val="it-IT"/>
         </w:rPr>
         <w:t xml:space="preserve"> Filtri riflessi in query key per caching corretto</w:t>
@@ -46674,11 +46833,13 @@
     <w:p>
       <w:pPr>
         <w:rPr>
-          <w:lang w:val="it-IT"/>
-        </w:rPr>
-      </w:pPr>
-      <w:r>
-        <w:rPr>
+          <w:highlight w:val="green"/>
+          <w:lang w:val="it-IT"/>
+        </w:rPr>
+      </w:pPr>
+      <w:r>
+        <w:rPr>
+          <w:highlight w:val="green"/>
           <w:lang w:val="it-IT"/>
         </w:rPr>
         <w:t xml:space="preserve">- </w:t>
@@ -46686,6 +46847,7 @@
       <w:proofErr w:type="gramStart"/>
       <w:r>
         <w:rPr>
+          <w:highlight w:val="green"/>
           <w:lang w:val="it-IT"/>
         </w:rPr>
         <w:t>[ ]</w:t>
@@ -46693,6 +46855,7 @@
       <w:proofErr w:type="gramEnd"/>
       <w:r>
         <w:rPr>
+          <w:highlight w:val="green"/>
           <w:lang w:val="it-IT"/>
         </w:rPr>
         <w:t xml:space="preserve"> </w:t>
@@ -46700,6 +46863,7 @@
       <w:proofErr w:type="spellStart"/>
       <w:r>
         <w:rPr>
+          <w:highlight w:val="green"/>
           <w:lang w:val="it-IT"/>
         </w:rPr>
         <w:t>Mutation</w:t>
@@ -46707,6 +46871,7 @@
       <w:proofErr w:type="spellEnd"/>
       <w:r>
         <w:rPr>
+          <w:highlight w:val="green"/>
           <w:lang w:val="it-IT"/>
         </w:rPr>
         <w:t xml:space="preserve"> invalida query correlate</w:t>
@@ -46720,6 +46885,7 @@
       </w:pPr>
       <w:r>
         <w:rPr>
+          <w:highlight w:val="green"/>
           <w:lang w:val="it-IT"/>
         </w:rPr>
         <w:t xml:space="preserve">- </w:t>
@@ -46727,6 +46893,7 @@
       <w:proofErr w:type="gramStart"/>
       <w:r>
         <w:rPr>
+          <w:highlight w:val="green"/>
           <w:lang w:val="it-IT"/>
         </w:rPr>
         <w:t>[ ]</w:t>
@@ -46734,6 +46901,7 @@
       <w:proofErr w:type="gramEnd"/>
       <w:r>
         <w:rPr>
+          <w:highlight w:val="green"/>
           <w:lang w:val="it-IT"/>
         </w:rPr>
         <w:t xml:space="preserve"> Tipi </w:t>
@@ -46741,6 +46909,7 @@
       <w:proofErr w:type="spellStart"/>
       <w:r>
         <w:rPr>
+          <w:highlight w:val="green"/>
           <w:lang w:val="it-IT"/>
         </w:rPr>
         <w:t>TypeScript</w:t>
@@ -46748,6 +46917,7 @@
       <w:proofErr w:type="spellEnd"/>
       <w:r>
         <w:rPr>
+          <w:highlight w:val="green"/>
           <w:lang w:val="it-IT"/>
         </w:rPr>
         <w:t xml:space="preserve"> completi</w:t>

</xml_diff>

<commit_message>
feat: Add detailed frontend development guidelines, financial calculation setup instructions, and initial files for an estimates feature.
</commit_message>
<xml_diff>
--- a/Piano-operativo-v1.7.docx
+++ b/Piano-operativo-v1.7.docx
@@ -46946,11 +46946,13 @@
     <w:p>
       <w:pPr>
         <w:rPr>
-          <w:lang w:val="it-IT"/>
-        </w:rPr>
-      </w:pPr>
-      <w:r>
-        <w:rPr>
+          <w:highlight w:val="green"/>
+          <w:lang w:val="it-IT"/>
+        </w:rPr>
+      </w:pPr>
+      <w:r>
+        <w:rPr>
+          <w:highlight w:val="green"/>
           <w:lang w:val="it-IT"/>
         </w:rPr>
         <w:t xml:space="preserve">TASK 4.7: Error </w:t>
@@ -46958,6 +46960,7 @@
       <w:proofErr w:type="spellStart"/>
       <w:r>
         <w:rPr>
+          <w:highlight w:val="green"/>
           <w:lang w:val="it-IT"/>
         </w:rPr>
         <w:t>Boundary</w:t>
@@ -46965,6 +46968,7 @@
       <w:proofErr w:type="spellEnd"/>
       <w:r>
         <w:rPr>
+          <w:highlight w:val="green"/>
           <w:lang w:val="it-IT"/>
         </w:rPr>
         <w:t xml:space="preserve"> Globale &amp; Gestione Errori UX</w:t>
@@ -46973,17 +46977,20 @@
     <w:p>
       <w:pPr>
         <w:rPr>
-          <w:lang w:val="it-IT"/>
-        </w:rPr>
-      </w:pPr>
-      <w:r>
-        <w:rPr>
+          <w:highlight w:val="green"/>
+          <w:lang w:val="it-IT"/>
+        </w:rPr>
+      </w:pPr>
+      <w:r>
+        <w:rPr>
+          <w:highlight w:val="green"/>
           <w:lang w:val="it-IT"/>
         </w:rPr>
         <w:t>Descrizione:</w:t>
       </w:r>
       <w:r>
         <w:rPr>
+          <w:highlight w:val="green"/>
           <w:lang w:val="it-IT"/>
         </w:rPr>
         <w:br/>
@@ -46992,6 +46999,7 @@
       <w:proofErr w:type="spellStart"/>
       <w:r>
         <w:rPr>
+          <w:highlight w:val="green"/>
           <w:lang w:val="it-IT"/>
         </w:rPr>
         <w:t>runtime</w:t>
@@ -46999,6 +47007,7 @@
       <w:proofErr w:type="spellEnd"/>
       <w:r>
         <w:rPr>
+          <w:highlight w:val="green"/>
           <w:lang w:val="it-IT"/>
         </w:rPr>
         <w:t xml:space="preserve"> e di rete, con un </w:t>
@@ -47006,6 +47015,7 @@
       <w:proofErr w:type="spellStart"/>
       <w:r>
         <w:rPr>
+          <w:highlight w:val="green"/>
           <w:lang w:val="it-IT"/>
         </w:rPr>
         <w:t>ErrorBoundary</w:t>
@@ -47013,6 +47023,7 @@
       <w:proofErr w:type="spellEnd"/>
       <w:r>
         <w:rPr>
+          <w:highlight w:val="green"/>
           <w:lang w:val="it-IT"/>
         </w:rPr>
         <w:t xml:space="preserve"> e notifiche consistenti.</w:t>
@@ -47021,12 +47032,14 @@
     <w:p>
       <w:pPr>
         <w:rPr>
-          <w:lang w:val="it-IT"/>
-        </w:rPr>
-      </w:pPr>
-      <w:proofErr w:type="spellStart"/>
-      <w:r>
-        <w:rPr>
+          <w:highlight w:val="green"/>
+          <w:lang w:val="it-IT"/>
+        </w:rPr>
+      </w:pPr>
+      <w:proofErr w:type="spellStart"/>
+      <w:r>
+        <w:rPr>
+          <w:highlight w:val="green"/>
           <w:lang w:val="it-IT"/>
         </w:rPr>
         <w:t>Microstep</w:t>
@@ -47034,6 +47047,7 @@
       <w:proofErr w:type="spellEnd"/>
       <w:r>
         <w:rPr>
+          <w:highlight w:val="green"/>
           <w:lang w:val="it-IT"/>
         </w:rPr>
         <w:t>:</w:t>
@@ -47042,11 +47056,13 @@
     <w:p>
       <w:pPr>
         <w:rPr>
-          <w:lang w:val="it-IT"/>
-        </w:rPr>
-      </w:pPr>
-      <w:r>
-        <w:rPr>
+          <w:highlight w:val="green"/>
+          <w:lang w:val="it-IT"/>
+        </w:rPr>
+      </w:pPr>
+      <w:r>
+        <w:rPr>
+          <w:highlight w:val="green"/>
           <w:lang w:val="it-IT"/>
         </w:rPr>
         <w:t>Creare componente </w:t>
@@ -47054,6 +47070,7 @@
       <w:proofErr w:type="spellStart"/>
       <w:r>
         <w:rPr>
+          <w:highlight w:val="green"/>
           <w:lang w:val="it-IT"/>
         </w:rPr>
         <w:t>frontend</w:t>
@@ -47061,6 +47078,7 @@
       <w:proofErr w:type="spellEnd"/>
       <w:r>
         <w:rPr>
+          <w:highlight w:val="green"/>
           <w:lang w:val="it-IT"/>
         </w:rPr>
         <w:t>/</w:t>
@@ -47068,6 +47086,7 @@
       <w:proofErr w:type="spellStart"/>
       <w:r>
         <w:rPr>
+          <w:highlight w:val="green"/>
           <w:lang w:val="it-IT"/>
         </w:rPr>
         <w:t>src</w:t>
@@ -47075,6 +47094,7 @@
       <w:proofErr w:type="spellEnd"/>
       <w:r>
         <w:rPr>
+          <w:highlight w:val="green"/>
           <w:lang w:val="it-IT"/>
         </w:rPr>
         <w:t>/app/</w:t>
@@ -47082,6 +47102,7 @@
       <w:proofErr w:type="spellStart"/>
       <w:r>
         <w:rPr>
+          <w:highlight w:val="green"/>
           <w:lang w:val="it-IT"/>
         </w:rPr>
         <w:t>components</w:t>
@@ -47089,6 +47110,7 @@
       <w:proofErr w:type="spellEnd"/>
       <w:r>
         <w:rPr>
+          <w:highlight w:val="green"/>
           <w:lang w:val="it-IT"/>
         </w:rPr>
         <w:t>/</w:t>
@@ -47096,6 +47118,7 @@
       <w:proofErr w:type="spellStart"/>
       <w:r>
         <w:rPr>
+          <w:highlight w:val="green"/>
           <w:lang w:val="it-IT"/>
         </w:rPr>
         <w:t>AppErrorBoundary.tsx</w:t>
@@ -47103,6 +47126,7 @@
       <w:proofErr w:type="spellEnd"/>
       <w:r>
         <w:rPr>
+          <w:highlight w:val="green"/>
           <w:lang w:val="it-IT"/>
         </w:rPr>
         <w:t> che:</w:t>
@@ -47111,11 +47135,13 @@
     <w:p>
       <w:pPr>
         <w:rPr>
-          <w:lang w:val="it-IT"/>
-        </w:rPr>
-      </w:pPr>
-      <w:r>
-        <w:rPr>
+          <w:highlight w:val="green"/>
+          <w:lang w:val="it-IT"/>
+        </w:rPr>
+      </w:pPr>
+      <w:r>
+        <w:rPr>
+          <w:highlight w:val="green"/>
           <w:lang w:val="it-IT"/>
         </w:rPr>
         <w:t xml:space="preserve">intercetta errori React e mostra una schermata di </w:t>
@@ -47123,6 +47149,7 @@
       <w:proofErr w:type="spellStart"/>
       <w:r>
         <w:rPr>
+          <w:highlight w:val="green"/>
           <w:lang w:val="it-IT"/>
         </w:rPr>
         <w:t>fallback</w:t>
@@ -47130,6 +47157,7 @@
       <w:proofErr w:type="spellEnd"/>
       <w:r>
         <w:rPr>
+          <w:highlight w:val="green"/>
           <w:lang w:val="it-IT"/>
         </w:rPr>
         <w:t xml:space="preserve"> con bottone “Riprova/Ricarica pagina”.</w:t>
@@ -47138,12 +47166,14 @@
     <w:p>
       <w:pPr>
         <w:rPr>
-          <w:lang w:val="it-IT"/>
-        </w:rPr>
-      </w:pPr>
-      <w:proofErr w:type="spellStart"/>
-      <w:r>
-        <w:rPr>
+          <w:highlight w:val="green"/>
+          <w:lang w:val="it-IT"/>
+        </w:rPr>
+      </w:pPr>
+      <w:proofErr w:type="spellStart"/>
+      <w:r>
+        <w:rPr>
+          <w:highlight w:val="green"/>
           <w:lang w:val="it-IT"/>
         </w:rPr>
         <w:t>Wrappare</w:t>
@@ -47151,6 +47181,7 @@
       <w:proofErr w:type="spellEnd"/>
       <w:r>
         <w:rPr>
+          <w:highlight w:val="green"/>
           <w:lang w:val="it-IT"/>
         </w:rPr>
         <w:t xml:space="preserve"> il router principale / App root con </w:t>
@@ -47158,6 +47189,7 @@
       <w:proofErr w:type="spellStart"/>
       <w:r>
         <w:rPr>
+          <w:highlight w:val="green"/>
           <w:lang w:val="it-IT"/>
         </w:rPr>
         <w:t>AppErrorBoundary</w:t>
@@ -47165,6 +47197,7 @@
       <w:proofErr w:type="spellEnd"/>
       <w:r>
         <w:rPr>
+          <w:highlight w:val="green"/>
           <w:lang w:val="it-IT"/>
         </w:rPr>
         <w:t>.</w:t>
@@ -47173,11 +47206,13 @@
     <w:p>
       <w:pPr>
         <w:rPr>
-          <w:lang w:val="it-IT"/>
-        </w:rPr>
-      </w:pPr>
-      <w:r>
-        <w:rPr>
+          <w:highlight w:val="green"/>
+          <w:lang w:val="it-IT"/>
+        </w:rPr>
+      </w:pPr>
+      <w:r>
+        <w:rPr>
+          <w:highlight w:val="green"/>
           <w:lang w:val="it-IT"/>
         </w:rPr>
         <w:lastRenderedPageBreak/>
@@ -47186,6 +47221,7 @@
       <w:proofErr w:type="spellStart"/>
       <w:r>
         <w:rPr>
+          <w:highlight w:val="green"/>
           <w:lang w:val="it-IT"/>
         </w:rPr>
         <w:t>useNotify</w:t>
@@ -47193,6 +47229,7 @@
       <w:proofErr w:type="spellEnd"/>
       <w:r>
         <w:rPr>
+          <w:highlight w:val="green"/>
           <w:lang w:val="it-IT"/>
         </w:rPr>
         <w:t> in </w:t>
@@ -47200,6 +47237,7 @@
       <w:proofErr w:type="spellStart"/>
       <w:r>
         <w:rPr>
+          <w:highlight w:val="green"/>
           <w:lang w:val="it-IT"/>
         </w:rPr>
         <w:t>frontend</w:t>
@@ -47207,6 +47245,7 @@
       <w:proofErr w:type="spellEnd"/>
       <w:r>
         <w:rPr>
+          <w:highlight w:val="green"/>
           <w:lang w:val="it-IT"/>
         </w:rPr>
         <w:t>/</w:t>
@@ -47214,6 +47253,7 @@
       <w:proofErr w:type="spellStart"/>
       <w:r>
         <w:rPr>
+          <w:highlight w:val="green"/>
           <w:lang w:val="it-IT"/>
         </w:rPr>
         <w:t>src</w:t>
@@ -47221,6 +47261,7 @@
       <w:proofErr w:type="spellEnd"/>
       <w:r>
         <w:rPr>
+          <w:highlight w:val="green"/>
           <w:lang w:val="it-IT"/>
         </w:rPr>
         <w:t>/</w:t>
@@ -47228,6 +47269,7 @@
       <w:proofErr w:type="spellStart"/>
       <w:r>
         <w:rPr>
+          <w:highlight w:val="green"/>
           <w:lang w:val="it-IT"/>
         </w:rPr>
         <w:t>shared</w:t>
@@ -47235,6 +47277,7 @@
       <w:proofErr w:type="spellEnd"/>
       <w:r>
         <w:rPr>
+          <w:highlight w:val="green"/>
           <w:lang w:val="it-IT"/>
         </w:rPr>
         <w:t>/</w:t>
@@ -47242,6 +47285,7 @@
       <w:proofErr w:type="spellStart"/>
       <w:r>
         <w:rPr>
+          <w:highlight w:val="green"/>
           <w:lang w:val="it-IT"/>
         </w:rPr>
         <w:t>ui</w:t>
@@ -47249,6 +47293,7 @@
       <w:proofErr w:type="spellEnd"/>
       <w:r>
         <w:rPr>
+          <w:highlight w:val="green"/>
           <w:lang w:val="it-IT"/>
         </w:rPr>
         <w:t>/</w:t>
@@ -47256,6 +47301,7 @@
       <w:proofErr w:type="spellStart"/>
       <w:r>
         <w:rPr>
+          <w:highlight w:val="green"/>
           <w:lang w:val="it-IT"/>
         </w:rPr>
         <w:t>useNotify.ts</w:t>
@@ -47263,6 +47309,7 @@
       <w:proofErr w:type="spellEnd"/>
       <w:r>
         <w:rPr>
+          <w:highlight w:val="green"/>
           <w:lang w:val="it-IT"/>
         </w:rPr>
         <w:t> per mostrare toast di errore/successo (riusando il sistema di toast che già hai).</w:t>
@@ -47271,11 +47318,13 @@
     <w:p>
       <w:pPr>
         <w:rPr>
-          <w:lang w:val="it-IT"/>
-        </w:rPr>
-      </w:pPr>
-      <w:r>
-        <w:rPr>
+          <w:highlight w:val="green"/>
+          <w:lang w:val="it-IT"/>
+        </w:rPr>
+      </w:pPr>
+      <w:r>
+        <w:rPr>
+          <w:highlight w:val="green"/>
           <w:lang w:val="it-IT"/>
         </w:rPr>
         <w:t>Integrare </w:t>
@@ -47283,6 +47332,7 @@
       <w:proofErr w:type="spellStart"/>
       <w:r>
         <w:rPr>
+          <w:highlight w:val="green"/>
           <w:lang w:val="it-IT"/>
         </w:rPr>
         <w:t>useNotify</w:t>
@@ -47290,6 +47340,7 @@
       <w:proofErr w:type="spellEnd"/>
       <w:r>
         <w:rPr>
+          <w:highlight w:val="green"/>
           <w:lang w:val="it-IT"/>
         </w:rPr>
         <w:t> </w:t>
@@ -47297,6 +47348,7 @@
       <w:proofErr w:type="gramStart"/>
       <w:r>
         <w:rPr>
+          <w:highlight w:val="green"/>
           <w:lang w:val="it-IT"/>
         </w:rPr>
         <w:t>nei</w:t>
@@ -47304,6 +47356,7 @@
       <w:proofErr w:type="gramEnd"/>
       <w:r>
         <w:rPr>
+          <w:highlight w:val="green"/>
           <w:lang w:val="it-IT"/>
         </w:rPr>
         <w:t xml:space="preserve"> hook </w:t>
@@ -47311,6 +47364,7 @@
       <w:proofErr w:type="spellStart"/>
       <w:r>
         <w:rPr>
+          <w:highlight w:val="green"/>
           <w:lang w:val="it-IT"/>
         </w:rPr>
         <w:t>useApiQuery</w:t>
@@ -47318,6 +47372,7 @@
       <w:proofErr w:type="spellEnd"/>
       <w:r>
         <w:rPr>
+          <w:highlight w:val="green"/>
           <w:lang w:val="it-IT"/>
         </w:rPr>
         <w:t>/</w:t>
@@ -47325,6 +47380,7 @@
       <w:proofErr w:type="spellStart"/>
       <w:r>
         <w:rPr>
+          <w:highlight w:val="green"/>
           <w:lang w:val="it-IT"/>
         </w:rPr>
         <w:t>useApiMutation</w:t>
@@ -47332,6 +47388,7 @@
       <w:proofErr w:type="spellEnd"/>
       <w:r>
         <w:rPr>
+          <w:highlight w:val="green"/>
           <w:lang w:val="it-IT"/>
         </w:rPr>
         <w:t> per mostrare errori di business (es. ticker non trovato) in modo uniforme.</w:t>
@@ -47340,12 +47397,14 @@
     <w:p>
       <w:pPr>
         <w:rPr>
-          <w:lang w:val="it-IT"/>
-        </w:rPr>
-      </w:pPr>
-      <w:proofErr w:type="spellStart"/>
-      <w:r>
-        <w:rPr>
+          <w:highlight w:val="green"/>
+          <w:lang w:val="it-IT"/>
+        </w:rPr>
+      </w:pPr>
+      <w:proofErr w:type="spellStart"/>
+      <w:r>
+        <w:rPr>
+          <w:highlight w:val="green"/>
           <w:lang w:val="it-IT"/>
         </w:rPr>
         <w:t>Acceptance</w:t>
@@ -47353,6 +47412,7 @@
       <w:proofErr w:type="spellEnd"/>
       <w:r>
         <w:rPr>
+          <w:highlight w:val="green"/>
           <w:lang w:val="it-IT"/>
         </w:rPr>
         <w:t xml:space="preserve"> </w:t>
@@ -47360,6 +47420,7 @@
       <w:proofErr w:type="spellStart"/>
       <w:r>
         <w:rPr>
+          <w:highlight w:val="green"/>
           <w:lang w:val="it-IT"/>
         </w:rPr>
         <w:t>Criteria</w:t>
@@ -47367,6 +47428,7 @@
       <w:proofErr w:type="spellEnd"/>
       <w:r>
         <w:rPr>
+          <w:highlight w:val="green"/>
           <w:lang w:val="it-IT"/>
         </w:rPr>
         <w:t>:</w:t>
@@ -47375,11 +47437,13 @@
     <w:p>
       <w:pPr>
         <w:rPr>
-          <w:lang w:val="it-IT"/>
-        </w:rPr>
-      </w:pPr>
-      <w:r>
-        <w:rPr>
+          <w:highlight w:val="green"/>
+          <w:lang w:val="it-IT"/>
+        </w:rPr>
+      </w:pPr>
+      <w:r>
+        <w:rPr>
+          <w:highlight w:val="green"/>
           <w:lang w:val="it-IT"/>
         </w:rPr>
         <w:t xml:space="preserve"> Un errore JavaScript in un componente non “rompe” tutta l’app ma mostra la schermata di </w:t>
@@ -47387,6 +47451,7 @@
       <w:proofErr w:type="spellStart"/>
       <w:r>
         <w:rPr>
+          <w:highlight w:val="green"/>
           <w:lang w:val="it-IT"/>
         </w:rPr>
         <w:t>fallback</w:t>
@@ -47394,6 +47459,7 @@
       <w:proofErr w:type="spellEnd"/>
       <w:r>
         <w:rPr>
+          <w:highlight w:val="green"/>
           <w:lang w:val="it-IT"/>
         </w:rPr>
         <w:t>.</w:t>
@@ -47402,11 +47468,13 @@
     <w:p>
       <w:pPr>
         <w:rPr>
-          <w:lang w:val="it-IT"/>
-        </w:rPr>
-      </w:pPr>
-      <w:r>
-        <w:rPr>
+          <w:highlight w:val="green"/>
+          <w:lang w:val="it-IT"/>
+        </w:rPr>
+      </w:pPr>
+      <w:r>
+        <w:rPr>
+          <w:highlight w:val="green"/>
           <w:lang w:val="it-IT"/>
         </w:rPr>
         <w:t> Gli errori di rete/API sono mostrati all’utente con messaggio leggibile e coerente.</w:t>
@@ -47420,6 +47488,7 @@
       </w:pPr>
       <w:r>
         <w:rPr>
+          <w:highlight w:val="green"/>
           <w:lang w:val="it-IT"/>
         </w:rPr>
         <w:t> I toast non si sovrappongono caoticamente (</w:t>
@@ -47427,6 +47496,7 @@
       <w:proofErr w:type="spellStart"/>
       <w:r>
         <w:rPr>
+          <w:highlight w:val="green"/>
           <w:lang w:val="it-IT"/>
         </w:rPr>
         <w:t>throttling</w:t>
@@ -47434,6 +47504,7 @@
       <w:proofErr w:type="spellEnd"/>
       <w:r>
         <w:rPr>
+          <w:highlight w:val="green"/>
           <w:lang w:val="it-IT"/>
         </w:rPr>
         <w:t>/raggruppamento base).</w:t>
@@ -47469,11 +47540,13 @@
     <w:p>
       <w:pPr>
         <w:rPr>
-          <w:lang w:val="it-IT"/>
-        </w:rPr>
-      </w:pPr>
-      <w:r>
-        <w:rPr>
+          <w:highlight w:val="green"/>
+          <w:lang w:val="it-IT"/>
+        </w:rPr>
+      </w:pPr>
+      <w:r>
+        <w:rPr>
+          <w:highlight w:val="green"/>
           <w:lang w:val="it-IT"/>
         </w:rPr>
         <w:t xml:space="preserve">## TASK 4.8: Implementazione Componente </w:t>
@@ -47481,6 +47554,7 @@
       <w:proofErr w:type="spellStart"/>
       <w:r>
         <w:rPr>
+          <w:highlight w:val="green"/>
           <w:lang w:val="it-IT"/>
         </w:rPr>
         <w:t>EstimateForm</w:t>
@@ -47490,18 +47564,21 @@
     <w:p>
       <w:pPr>
         <w:rPr>
-          <w:lang w:val="it-IT"/>
-        </w:rPr>
-      </w:pPr>
-    </w:p>
-    <w:p>
-      <w:pPr>
-        <w:rPr>
-          <w:lang w:val="it-IT"/>
-        </w:rPr>
-      </w:pPr>
-      <w:r>
-        <w:rPr>
+          <w:highlight w:val="green"/>
+          <w:lang w:val="it-IT"/>
+        </w:rPr>
+      </w:pPr>
+    </w:p>
+    <w:p>
+      <w:pPr>
+        <w:rPr>
+          <w:highlight w:val="green"/>
+          <w:lang w:val="it-IT"/>
+        </w:rPr>
+      </w:pPr>
+      <w:r>
+        <w:rPr>
+          <w:highlight w:val="green"/>
           <w:lang w:val="it-IT"/>
         </w:rPr>
         <w:t>**</w:t>
@@ -47509,6 +47586,7 @@
       <w:proofErr w:type="gramStart"/>
       <w:r>
         <w:rPr>
+          <w:highlight w:val="green"/>
           <w:lang w:val="it-IT"/>
         </w:rPr>
         <w:t>Descrizione:*</w:t>
@@ -47516,6 +47594,7 @@
       <w:proofErr w:type="gramEnd"/>
       <w:r>
         <w:rPr>
+          <w:highlight w:val="green"/>
           <w:lang w:val="it-IT"/>
         </w:rPr>
         <w:t>* Creare form per creazione/modifica stime con validazione.</w:t>
@@ -47524,108 +47603,201 @@
     <w:p>
       <w:pPr>
         <w:rPr>
-          <w:lang w:val="it-IT"/>
-        </w:rPr>
-      </w:pPr>
-    </w:p>
-    <w:p>
-      <w:r>
+          <w:highlight w:val="green"/>
+          <w:lang w:val="it-IT"/>
+        </w:rPr>
+      </w:pPr>
+    </w:p>
+    <w:p>
+      <w:pPr>
+        <w:rPr>
+          <w:highlight w:val="green"/>
+        </w:rPr>
+      </w:pPr>
+      <w:r>
+        <w:rPr>
+          <w:highlight w:val="green"/>
+        </w:rPr>
         <w:t>**</w:t>
       </w:r>
       <w:proofErr w:type="spellStart"/>
       <w:proofErr w:type="gramStart"/>
       <w:r>
+        <w:rPr>
+          <w:highlight w:val="green"/>
+        </w:rPr>
         <w:t>Microstep</w:t>
       </w:r>
       <w:proofErr w:type="spellEnd"/>
       <w:r>
+        <w:rPr>
+          <w:highlight w:val="green"/>
+        </w:rPr>
         <w:t>:*</w:t>
       </w:r>
       <w:proofErr w:type="gramEnd"/>
       <w:r>
+        <w:rPr>
+          <w:highlight w:val="green"/>
+        </w:rPr>
         <w:t>*</w:t>
       </w:r>
     </w:p>
     <w:p>
-      <w:r>
+      <w:pPr>
+        <w:rPr>
+          <w:highlight w:val="green"/>
+        </w:rPr>
+      </w:pPr>
+      <w:r>
+        <w:rPr>
+          <w:highlight w:val="green"/>
+        </w:rPr>
         <w:t xml:space="preserve">1. </w:t>
       </w:r>
       <w:proofErr w:type="spellStart"/>
       <w:r>
+        <w:rPr>
+          <w:highlight w:val="green"/>
+        </w:rPr>
         <w:t>Creare</w:t>
       </w:r>
       <w:proofErr w:type="spellEnd"/>
       <w:r>
+        <w:rPr>
+          <w:highlight w:val="green"/>
+        </w:rPr>
         <w:t xml:space="preserve"> file `frontend/</w:t>
       </w:r>
       <w:proofErr w:type="spellStart"/>
       <w:r>
+        <w:rPr>
+          <w:highlight w:val="green"/>
+        </w:rPr>
         <w:t>src</w:t>
       </w:r>
       <w:proofErr w:type="spellEnd"/>
       <w:r>
+        <w:rPr>
+          <w:highlight w:val="green"/>
+        </w:rPr>
         <w:t>/features/estimates/components/</w:t>
       </w:r>
       <w:proofErr w:type="spellStart"/>
       <w:r>
+        <w:rPr>
+          <w:highlight w:val="green"/>
+        </w:rPr>
         <w:t>EstimateForm.tsx</w:t>
       </w:r>
       <w:proofErr w:type="spellEnd"/>
       <w:r>
+        <w:rPr>
+          <w:highlight w:val="green"/>
+        </w:rPr>
         <w:t>`</w:t>
       </w:r>
     </w:p>
     <w:p>
-      <w:r>
+      <w:pPr>
+        <w:rPr>
+          <w:highlight w:val="green"/>
+        </w:rPr>
+      </w:pPr>
+      <w:r>
+        <w:rPr>
+          <w:highlight w:val="green"/>
+        </w:rPr>
         <w:t xml:space="preserve">2. </w:t>
       </w:r>
       <w:proofErr w:type="spellStart"/>
       <w:r>
+        <w:rPr>
+          <w:highlight w:val="green"/>
+        </w:rPr>
         <w:t>Definire</w:t>
       </w:r>
       <w:proofErr w:type="spellEnd"/>
       <w:r>
+        <w:rPr>
+          <w:highlight w:val="green"/>
+        </w:rPr>
         <w:t xml:space="preserve"> schema Zod per </w:t>
       </w:r>
       <w:proofErr w:type="spellStart"/>
       <w:r>
+        <w:rPr>
+          <w:highlight w:val="green"/>
+        </w:rPr>
         <w:t>validazione</w:t>
       </w:r>
       <w:proofErr w:type="spellEnd"/>
       <w:r>
+        <w:rPr>
+          <w:highlight w:val="green"/>
+        </w:rPr>
         <w:t xml:space="preserve">: ticker (required), direction, </w:t>
       </w:r>
       <w:proofErr w:type="spellStart"/>
       <w:r>
+        <w:rPr>
+          <w:highlight w:val="green"/>
+        </w:rPr>
         <w:t>target_profit_percent</w:t>
       </w:r>
       <w:proofErr w:type="spellEnd"/>
       <w:r>
+        <w:rPr>
+          <w:highlight w:val="green"/>
+        </w:rPr>
         <w:t xml:space="preserve">, </w:t>
       </w:r>
       <w:proofErr w:type="spellStart"/>
       <w:r>
+        <w:rPr>
+          <w:highlight w:val="green"/>
+        </w:rPr>
         <w:t>stop_loss_percent</w:t>
       </w:r>
       <w:proofErr w:type="spellEnd"/>
       <w:r>
+        <w:rPr>
+          <w:highlight w:val="green"/>
+        </w:rPr>
         <w:t>, notes</w:t>
       </w:r>
     </w:p>
     <w:p>
-      <w:r>
+      <w:pPr>
+        <w:rPr>
+          <w:highlight w:val="green"/>
+        </w:rPr>
+      </w:pPr>
+      <w:r>
+        <w:rPr>
+          <w:highlight w:val="green"/>
+        </w:rPr>
         <w:t xml:space="preserve">3. </w:t>
       </w:r>
       <w:proofErr w:type="spellStart"/>
       <w:r>
+        <w:rPr>
+          <w:highlight w:val="green"/>
+        </w:rPr>
         <w:t>Configurare</w:t>
       </w:r>
       <w:proofErr w:type="spellEnd"/>
       <w:r>
+        <w:rPr>
+          <w:highlight w:val="green"/>
+        </w:rPr>
         <w:t xml:space="preserve"> react-hook-form con </w:t>
       </w:r>
       <w:proofErr w:type="spellStart"/>
       <w:r>
+        <w:rPr>
+          <w:highlight w:val="green"/>
+        </w:rPr>
         <w:t>zodResolver</w:t>
       </w:r>
       <w:proofErr w:type="spellEnd"/>
@@ -47633,11 +47805,13 @@
     <w:p>
       <w:pPr>
         <w:rPr>
-          <w:lang w:val="it-IT"/>
-        </w:rPr>
-      </w:pPr>
-      <w:r>
-        <w:rPr>
+          <w:highlight w:val="green"/>
+          <w:lang w:val="it-IT"/>
+        </w:rPr>
+      </w:pPr>
+      <w:r>
+        <w:rPr>
+          <w:highlight w:val="green"/>
           <w:lang w:val="it-IT"/>
         </w:rPr>
         <w:t xml:space="preserve">4. Implementare campo ticker con </w:t>
@@ -47645,6 +47819,7 @@
       <w:proofErr w:type="spellStart"/>
       <w:r>
         <w:rPr>
+          <w:highlight w:val="green"/>
           <w:lang w:val="it-IT"/>
         </w:rPr>
         <w:t>autocomplete</w:t>
@@ -47652,6 +47827,7 @@
       <w:proofErr w:type="spellEnd"/>
       <w:r>
         <w:rPr>
+          <w:highlight w:val="green"/>
           <w:lang w:val="it-IT"/>
         </w:rPr>
         <w:t xml:space="preserve"> (usa API </w:t>
@@ -47659,6 +47835,7 @@
       <w:proofErr w:type="spellStart"/>
       <w:r>
         <w:rPr>
+          <w:highlight w:val="green"/>
           <w:lang w:val="it-IT"/>
         </w:rPr>
         <w:t>search</w:t>
@@ -47666,6 +47843,7 @@
       <w:proofErr w:type="spellEnd"/>
       <w:r>
         <w:rPr>
+          <w:highlight w:val="green"/>
           <w:lang w:val="it-IT"/>
         </w:rPr>
         <w:t>)</w:t>
@@ -47674,38 +47852,63 @@
     <w:p>
       <w:pPr>
         <w:rPr>
-          <w:lang w:val="it-IT"/>
-        </w:rPr>
-      </w:pPr>
-      <w:r>
-        <w:rPr>
+          <w:highlight w:val="green"/>
+          <w:lang w:val="it-IT"/>
+        </w:rPr>
+      </w:pPr>
+      <w:r>
+        <w:rPr>
+          <w:highlight w:val="green"/>
           <w:lang w:val="it-IT"/>
         </w:rPr>
         <w:t>5. Implementare campi numerici con validazione range</w:t>
       </w:r>
     </w:p>
     <w:p>
-      <w:r>
+      <w:pPr>
+        <w:rPr>
+          <w:highlight w:val="green"/>
+        </w:rPr>
+      </w:pPr>
+      <w:r>
+        <w:rPr>
+          <w:highlight w:val="green"/>
+        </w:rPr>
         <w:t xml:space="preserve">6. </w:t>
       </w:r>
       <w:proofErr w:type="spellStart"/>
       <w:r>
+        <w:rPr>
+          <w:highlight w:val="green"/>
+        </w:rPr>
         <w:t>Implementare</w:t>
       </w:r>
       <w:proofErr w:type="spellEnd"/>
       <w:r>
+        <w:rPr>
+          <w:highlight w:val="green"/>
+        </w:rPr>
         <w:t xml:space="preserve"> preview </w:t>
       </w:r>
       <w:proofErr w:type="spellStart"/>
       <w:r>
+        <w:rPr>
+          <w:highlight w:val="green"/>
+        </w:rPr>
         <w:t>calcoli</w:t>
       </w:r>
       <w:proofErr w:type="spellEnd"/>
       <w:r>
+        <w:rPr>
+          <w:highlight w:val="green"/>
+        </w:rPr>
         <w:t xml:space="preserve"> (target price, stop loss price) in tempo </w:t>
       </w:r>
       <w:proofErr w:type="spellStart"/>
       <w:r>
+        <w:rPr>
+          <w:highlight w:val="green"/>
+        </w:rPr>
         <w:t>reale</w:t>
       </w:r>
       <w:proofErr w:type="spellEnd"/>
@@ -47713,11 +47916,13 @@
     <w:p>
       <w:pPr>
         <w:rPr>
-          <w:lang w:val="it-IT"/>
-        </w:rPr>
-      </w:pPr>
-      <w:r>
-        <w:rPr>
+          <w:highlight w:val="green"/>
+          <w:lang w:val="it-IT"/>
+        </w:rPr>
+      </w:pPr>
+      <w:r>
+        <w:rPr>
+          <w:highlight w:val="green"/>
           <w:lang w:val="it-IT"/>
         </w:rPr>
         <w:t xml:space="preserve">7. Implementare </w:t>
@@ -47725,6 +47930,7 @@
       <w:proofErr w:type="spellStart"/>
       <w:r>
         <w:rPr>
+          <w:highlight w:val="green"/>
           <w:lang w:val="it-IT"/>
         </w:rPr>
         <w:t>submit</w:t>
@@ -47732,6 +47938,7 @@
       <w:proofErr w:type="spellEnd"/>
       <w:r>
         <w:rPr>
+          <w:highlight w:val="green"/>
           <w:lang w:val="it-IT"/>
         </w:rPr>
         <w:t xml:space="preserve"> con </w:t>
@@ -47739,6 +47946,7 @@
       <w:proofErr w:type="spellStart"/>
       <w:r>
         <w:rPr>
+          <w:highlight w:val="green"/>
           <w:lang w:val="it-IT"/>
         </w:rPr>
         <w:t>useCreateEstimate</w:t>
@@ -47748,11 +47956,13 @@
     <w:p>
       <w:pPr>
         <w:rPr>
-          <w:lang w:val="it-IT"/>
-        </w:rPr>
-      </w:pPr>
-      <w:r>
-        <w:rPr>
+          <w:highlight w:val="green"/>
+          <w:lang w:val="it-IT"/>
+        </w:rPr>
+      </w:pPr>
+      <w:r>
+        <w:rPr>
+          <w:highlight w:val="green"/>
           <w:lang w:val="it-IT"/>
         </w:rPr>
         <w:t xml:space="preserve">8. Mostrare errori validazione </w:t>
@@ -47760,6 +47970,7 @@
       <w:proofErr w:type="spellStart"/>
       <w:r>
         <w:rPr>
+          <w:highlight w:val="green"/>
           <w:lang w:val="it-IT"/>
         </w:rPr>
         <w:t>inline</w:t>
@@ -47769,11 +47980,13 @@
     <w:p>
       <w:pPr>
         <w:rPr>
-          <w:lang w:val="it-IT"/>
-        </w:rPr>
-      </w:pPr>
-      <w:r>
-        <w:rPr>
+          <w:highlight w:val="green"/>
+          <w:lang w:val="it-IT"/>
+        </w:rPr>
+      </w:pPr>
+      <w:r>
+        <w:rPr>
+          <w:highlight w:val="green"/>
           <w:lang w:val="it-IT"/>
         </w:rPr>
         <w:t>9. Mostrare errori API con toast/alert</w:t>
@@ -47782,18 +47995,21 @@
     <w:p>
       <w:pPr>
         <w:rPr>
-          <w:lang w:val="it-IT"/>
-        </w:rPr>
-      </w:pPr>
-    </w:p>
-    <w:p>
-      <w:pPr>
-        <w:rPr>
-          <w:lang w:val="it-IT"/>
-        </w:rPr>
-      </w:pPr>
-      <w:r>
-        <w:rPr>
+          <w:highlight w:val="green"/>
+          <w:lang w:val="it-IT"/>
+        </w:rPr>
+      </w:pPr>
+    </w:p>
+    <w:p>
+      <w:pPr>
+        <w:rPr>
+          <w:highlight w:val="green"/>
+          <w:lang w:val="it-IT"/>
+        </w:rPr>
+      </w:pPr>
+      <w:r>
+        <w:rPr>
+          <w:highlight w:val="green"/>
           <w:lang w:val="it-IT"/>
         </w:rPr>
         <w:lastRenderedPageBreak/>
@@ -47802,6 +48018,7 @@
       <w:proofErr w:type="spellStart"/>
       <w:r>
         <w:rPr>
+          <w:highlight w:val="green"/>
           <w:lang w:val="it-IT"/>
         </w:rPr>
         <w:t>Acceptance</w:t>
@@ -47809,6 +48026,7 @@
       <w:proofErr w:type="spellEnd"/>
       <w:r>
         <w:rPr>
+          <w:highlight w:val="green"/>
           <w:lang w:val="it-IT"/>
         </w:rPr>
         <w:t xml:space="preserve"> </w:t>
@@ -47817,6 +48035,7 @@
       <w:proofErr w:type="gramStart"/>
       <w:r>
         <w:rPr>
+          <w:highlight w:val="green"/>
           <w:lang w:val="it-IT"/>
         </w:rPr>
         <w:t>Criteria</w:t>
@@ -47824,6 +48043,7 @@
       <w:proofErr w:type="spellEnd"/>
       <w:r>
         <w:rPr>
+          <w:highlight w:val="green"/>
           <w:lang w:val="it-IT"/>
         </w:rPr>
         <w:t>:*</w:t>
@@ -47831,6 +48051,7 @@
       <w:proofErr w:type="gramEnd"/>
       <w:r>
         <w:rPr>
+          <w:highlight w:val="green"/>
           <w:lang w:val="it-IT"/>
         </w:rPr>
         <w:t>*</w:t>
@@ -47839,11 +48060,13 @@
     <w:p>
       <w:pPr>
         <w:rPr>
-          <w:lang w:val="it-IT"/>
-        </w:rPr>
-      </w:pPr>
-      <w:r>
-        <w:rPr>
+          <w:highlight w:val="green"/>
+          <w:lang w:val="it-IT"/>
+        </w:rPr>
+      </w:pPr>
+      <w:r>
+        <w:rPr>
+          <w:highlight w:val="green"/>
           <w:lang w:val="it-IT"/>
         </w:rPr>
         <w:t xml:space="preserve">- </w:t>
@@ -47851,6 +48074,7 @@
       <w:proofErr w:type="gramStart"/>
       <w:r>
         <w:rPr>
+          <w:highlight w:val="green"/>
           <w:lang w:val="it-IT"/>
         </w:rPr>
         <w:t>[ ]</w:t>
@@ -47858,6 +48082,7 @@
       <w:proofErr w:type="gramEnd"/>
       <w:r>
         <w:rPr>
+          <w:highlight w:val="green"/>
           <w:lang w:val="it-IT"/>
         </w:rPr>
         <w:t xml:space="preserve"> Validazione client-side completa</w:t>
@@ -47866,11 +48091,13 @@
     <w:p>
       <w:pPr>
         <w:rPr>
-          <w:lang w:val="it-IT"/>
-        </w:rPr>
-      </w:pPr>
-      <w:r>
-        <w:rPr>
+          <w:highlight w:val="green"/>
+          <w:lang w:val="it-IT"/>
+        </w:rPr>
+      </w:pPr>
+      <w:r>
+        <w:rPr>
+          <w:highlight w:val="green"/>
           <w:lang w:val="it-IT"/>
         </w:rPr>
         <w:t xml:space="preserve">- </w:t>
@@ -47878,6 +48105,7 @@
       <w:proofErr w:type="gramStart"/>
       <w:r>
         <w:rPr>
+          <w:highlight w:val="green"/>
           <w:lang w:val="it-IT"/>
         </w:rPr>
         <w:t>[ ]</w:t>
@@ -47885,6 +48113,7 @@
       <w:proofErr w:type="gramEnd"/>
       <w:r>
         <w:rPr>
+          <w:highlight w:val="green"/>
           <w:lang w:val="it-IT"/>
         </w:rPr>
         <w:t xml:space="preserve"> </w:t>
@@ -47892,6 +48121,7 @@
       <w:proofErr w:type="spellStart"/>
       <w:r>
         <w:rPr>
+          <w:highlight w:val="green"/>
           <w:lang w:val="it-IT"/>
         </w:rPr>
         <w:t>Autocomplete</w:t>
@@ -47899,6 +48129,7 @@
       <w:proofErr w:type="spellEnd"/>
       <w:r>
         <w:rPr>
+          <w:highlight w:val="green"/>
           <w:lang w:val="it-IT"/>
         </w:rPr>
         <w:t xml:space="preserve"> ticker funzionante</w:t>
@@ -47907,11 +48138,13 @@
     <w:p>
       <w:pPr>
         <w:rPr>
-          <w:lang w:val="it-IT"/>
-        </w:rPr>
-      </w:pPr>
-      <w:r>
-        <w:rPr>
+          <w:highlight w:val="green"/>
+          <w:lang w:val="it-IT"/>
+        </w:rPr>
+      </w:pPr>
+      <w:r>
+        <w:rPr>
+          <w:highlight w:val="green"/>
           <w:lang w:val="it-IT"/>
         </w:rPr>
         <w:t xml:space="preserve">- </w:t>
@@ -47919,6 +48152,7 @@
       <w:proofErr w:type="gramStart"/>
       <w:r>
         <w:rPr>
+          <w:highlight w:val="green"/>
           <w:lang w:val="it-IT"/>
         </w:rPr>
         <w:t>[ ]</w:t>
@@ -47926,6 +48160,7 @@
       <w:proofErr w:type="gramEnd"/>
       <w:r>
         <w:rPr>
+          <w:highlight w:val="green"/>
           <w:lang w:val="it-IT"/>
         </w:rPr>
         <w:t xml:space="preserve"> Preview calcoli aggiornato in tempo reale</w:t>
@@ -47934,11 +48169,13 @@
     <w:p>
       <w:pPr>
         <w:rPr>
-          <w:lang w:val="it-IT"/>
-        </w:rPr>
-      </w:pPr>
-      <w:r>
-        <w:rPr>
+          <w:highlight w:val="green"/>
+          <w:lang w:val="it-IT"/>
+        </w:rPr>
+      </w:pPr>
+      <w:r>
+        <w:rPr>
+          <w:highlight w:val="green"/>
           <w:lang w:val="it-IT"/>
         </w:rPr>
         <w:t xml:space="preserve">- </w:t>
@@ -47946,6 +48183,7 @@
       <w:proofErr w:type="gramStart"/>
       <w:r>
         <w:rPr>
+          <w:highlight w:val="green"/>
           <w:lang w:val="it-IT"/>
         </w:rPr>
         <w:t>[ ]</w:t>
@@ -47953,6 +48191,7 @@
       <w:proofErr w:type="gramEnd"/>
       <w:r>
         <w:rPr>
+          <w:highlight w:val="green"/>
           <w:lang w:val="it-IT"/>
         </w:rPr>
         <w:t xml:space="preserve"> </w:t>
@@ -47960,6 +48199,7 @@
       <w:proofErr w:type="spellStart"/>
       <w:r>
         <w:rPr>
+          <w:highlight w:val="green"/>
           <w:lang w:val="it-IT"/>
         </w:rPr>
         <w:t>Submit</w:t>
@@ -47967,6 +48207,7 @@
       <w:proofErr w:type="spellEnd"/>
       <w:r>
         <w:rPr>
+          <w:highlight w:val="green"/>
           <w:lang w:val="it-IT"/>
         </w:rPr>
         <w:t xml:space="preserve"> disabilitato durante invio</w:t>
@@ -47980,6 +48221,7 @@
       </w:pPr>
       <w:r>
         <w:rPr>
+          <w:highlight w:val="green"/>
           <w:lang w:val="it-IT"/>
         </w:rPr>
         <w:t xml:space="preserve">- </w:t>
@@ -47987,6 +48229,7 @@
       <w:proofErr w:type="gramStart"/>
       <w:r>
         <w:rPr>
+          <w:highlight w:val="green"/>
           <w:lang w:val="it-IT"/>
         </w:rPr>
         <w:t>[ ]</w:t>
@@ -47994,6 +48237,7 @@
       <w:proofErr w:type="gramEnd"/>
       <w:r>
         <w:rPr>
+          <w:highlight w:val="green"/>
           <w:lang w:val="it-IT"/>
         </w:rPr>
         <w:t xml:space="preserve"> Errori mostrati chiaramente</w:t>

</xml_diff>

<commit_message>
feat: initial commit for new project structure
</commit_message>
<xml_diff>
--- a/Piano-operativo-v1.7.docx
+++ b/Piano-operativo-v1.7.docx
@@ -50055,11 +50055,13 @@
     <w:p>
       <w:pPr>
         <w:rPr>
-          <w:lang w:val="it-IT"/>
-        </w:rPr>
-      </w:pPr>
-      <w:r>
-        <w:rPr>
+          <w:highlight w:val="green"/>
+          <w:lang w:val="it-IT"/>
+        </w:rPr>
+      </w:pPr>
+      <w:r>
+        <w:rPr>
+          <w:highlight w:val="green"/>
           <w:lang w:val="it-IT"/>
         </w:rPr>
         <w:lastRenderedPageBreak/>
@@ -50069,18 +50071,21 @@
     <w:p>
       <w:pPr>
         <w:rPr>
-          <w:lang w:val="it-IT"/>
-        </w:rPr>
-      </w:pPr>
-    </w:p>
-    <w:p>
-      <w:pPr>
-        <w:rPr>
-          <w:lang w:val="it-IT"/>
-        </w:rPr>
-      </w:pPr>
-      <w:r>
-        <w:rPr>
+          <w:highlight w:val="green"/>
+          <w:lang w:val="it-IT"/>
+        </w:rPr>
+      </w:pPr>
+    </w:p>
+    <w:p>
+      <w:pPr>
+        <w:rPr>
+          <w:highlight w:val="green"/>
+          <w:lang w:val="it-IT"/>
+        </w:rPr>
+      </w:pPr>
+      <w:r>
+        <w:rPr>
+          <w:highlight w:val="green"/>
           <w:lang w:val="it-IT"/>
         </w:rPr>
         <w:t>**</w:t>
@@ -50088,6 +50093,7 @@
       <w:proofErr w:type="gramStart"/>
       <w:r>
         <w:rPr>
+          <w:highlight w:val="green"/>
           <w:lang w:val="it-IT"/>
         </w:rPr>
         <w:t>Descrizione:*</w:t>
@@ -50095,6 +50101,7 @@
       <w:proofErr w:type="gramEnd"/>
       <w:r>
         <w:rPr>
+          <w:highlight w:val="green"/>
           <w:lang w:val="it-IT"/>
         </w:rPr>
         <w:t xml:space="preserve">*  </w:t>
@@ -50103,11 +50110,13 @@
     <w:p>
       <w:pPr>
         <w:rPr>
-          <w:lang w:val="it-IT"/>
-        </w:rPr>
-      </w:pPr>
-      <w:r>
-        <w:rPr>
+          <w:highlight w:val="green"/>
+          <w:lang w:val="it-IT"/>
+        </w:rPr>
+      </w:pPr>
+      <w:r>
+        <w:rPr>
+          <w:highlight w:val="green"/>
           <w:lang w:val="it-IT"/>
         </w:rPr>
         <w:t>Migliorare l'accessibilità dei componenti chiave e preparare lo scheletro per localizzazione futura (es. IT/EN).</w:t>
@@ -50116,18 +50125,21 @@
     <w:p>
       <w:pPr>
         <w:rPr>
-          <w:lang w:val="it-IT"/>
-        </w:rPr>
-      </w:pPr>
-    </w:p>
-    <w:p>
-      <w:pPr>
-        <w:rPr>
-          <w:lang w:val="it-IT"/>
-        </w:rPr>
-      </w:pPr>
-      <w:r>
-        <w:rPr>
+          <w:highlight w:val="green"/>
+          <w:lang w:val="it-IT"/>
+        </w:rPr>
+      </w:pPr>
+    </w:p>
+    <w:p>
+      <w:pPr>
+        <w:rPr>
+          <w:highlight w:val="green"/>
+          <w:lang w:val="it-IT"/>
+        </w:rPr>
+      </w:pPr>
+      <w:r>
+        <w:rPr>
+          <w:highlight w:val="green"/>
           <w:lang w:val="it-IT"/>
         </w:rPr>
         <w:t>**</w:t>
@@ -50136,6 +50148,7 @@
       <w:proofErr w:type="gramStart"/>
       <w:r>
         <w:rPr>
+          <w:highlight w:val="green"/>
           <w:lang w:val="it-IT"/>
         </w:rPr>
         <w:t>Microstep</w:t>
@@ -50143,6 +50156,7 @@
       <w:proofErr w:type="spellEnd"/>
       <w:r>
         <w:rPr>
+          <w:highlight w:val="green"/>
           <w:lang w:val="it-IT"/>
         </w:rPr>
         <w:t>:*</w:t>
@@ -50150,6 +50164,7 @@
       <w:proofErr w:type="gramEnd"/>
       <w:r>
         <w:rPr>
+          <w:highlight w:val="green"/>
           <w:lang w:val="it-IT"/>
         </w:rPr>
         <w:t>*</w:t>
@@ -50158,18 +50173,21 @@
     <w:p>
       <w:pPr>
         <w:rPr>
-          <w:lang w:val="it-IT"/>
-        </w:rPr>
-      </w:pPr>
-    </w:p>
-    <w:p>
-      <w:pPr>
-        <w:rPr>
-          <w:lang w:val="it-IT"/>
-        </w:rPr>
-      </w:pPr>
-      <w:r>
-        <w:rPr>
+          <w:highlight w:val="green"/>
+          <w:lang w:val="it-IT"/>
+        </w:rPr>
+      </w:pPr>
+    </w:p>
+    <w:p>
+      <w:pPr>
+        <w:rPr>
+          <w:highlight w:val="green"/>
+          <w:lang w:val="it-IT"/>
+        </w:rPr>
+      </w:pPr>
+      <w:r>
+        <w:rPr>
+          <w:highlight w:val="green"/>
           <w:lang w:val="it-IT"/>
         </w:rPr>
         <w:t>1. Installare `</w:t>
@@ -50177,6 +50195,7 @@
       <w:proofErr w:type="spellStart"/>
       <w:r>
         <w:rPr>
+          <w:highlight w:val="green"/>
           <w:lang w:val="it-IT"/>
         </w:rPr>
         <w:t>react</w:t>
@@ -50184,6 +50203,7 @@
       <w:proofErr w:type="spellEnd"/>
       <w:r>
         <w:rPr>
+          <w:highlight w:val="green"/>
           <w:lang w:val="it-IT"/>
         </w:rPr>
         <w:t>-aria` o libreria analoga solo se necessario; in alternativa, usare pattern accessibili manuali (ruoli ARIA, label, focus management).</w:t>
@@ -50192,11 +50212,13 @@
     <w:p>
       <w:pPr>
         <w:rPr>
-          <w:lang w:val="it-IT"/>
-        </w:rPr>
-      </w:pPr>
-      <w:r>
-        <w:rPr>
+          <w:highlight w:val="green"/>
+          <w:lang w:val="it-IT"/>
+        </w:rPr>
+      </w:pPr>
+      <w:r>
+        <w:rPr>
+          <w:highlight w:val="green"/>
           <w:lang w:val="it-IT"/>
         </w:rPr>
         <w:t>2. Aggiornare i componenti chiave (`</w:t>
@@ -50204,6 +50226,7 @@
       <w:proofErr w:type="spellStart"/>
       <w:r>
         <w:rPr>
+          <w:highlight w:val="green"/>
           <w:lang w:val="it-IT"/>
         </w:rPr>
         <w:t>EstimateForm</w:t>
@@ -50211,6 +50234,7 @@
       <w:proofErr w:type="spellEnd"/>
       <w:r>
         <w:rPr>
+          <w:highlight w:val="green"/>
           <w:lang w:val="it-IT"/>
         </w:rPr>
         <w:t>`, `</w:t>
@@ -50218,6 +50242,7 @@
       <w:proofErr w:type="spellStart"/>
       <w:r>
         <w:rPr>
+          <w:highlight w:val="green"/>
           <w:lang w:val="it-IT"/>
         </w:rPr>
         <w:t>EstimatesList</w:t>
@@ -50225,6 +50250,7 @@
       <w:proofErr w:type="spellEnd"/>
       <w:r>
         <w:rPr>
+          <w:highlight w:val="green"/>
           <w:lang w:val="it-IT"/>
         </w:rPr>
         <w:t>`, `Dashboard`) per:</w:t>
@@ -50233,11 +50259,13 @@
     <w:p>
       <w:pPr>
         <w:rPr>
-          <w:lang w:val="it-IT"/>
-        </w:rPr>
-      </w:pPr>
-      <w:r>
-        <w:rPr>
+          <w:highlight w:val="green"/>
+          <w:lang w:val="it-IT"/>
+        </w:rPr>
+      </w:pPr>
+      <w:r>
+        <w:rPr>
+          <w:highlight w:val="green"/>
           <w:lang w:val="it-IT"/>
         </w:rPr>
         <w:t xml:space="preserve">   - avere `aria-label`/`aria-</w:t>
@@ -50245,6 +50273,7 @@
       <w:proofErr w:type="spellStart"/>
       <w:r>
         <w:rPr>
+          <w:highlight w:val="green"/>
           <w:lang w:val="it-IT"/>
         </w:rPr>
         <w:t>describedby</w:t>
@@ -50252,6 +50281,7 @@
       <w:proofErr w:type="spellEnd"/>
       <w:r>
         <w:rPr>
+          <w:highlight w:val="green"/>
           <w:lang w:val="it-IT"/>
         </w:rPr>
         <w:t>` sui controlli di input,</w:t>
@@ -50260,11 +50290,13 @@
     <w:p>
       <w:pPr>
         <w:rPr>
-          <w:lang w:val="it-IT"/>
-        </w:rPr>
-      </w:pPr>
-      <w:r>
-        <w:rPr>
+          <w:highlight w:val="green"/>
+          <w:lang w:val="it-IT"/>
+        </w:rPr>
+      </w:pPr>
+      <w:r>
+        <w:rPr>
+          <w:highlight w:val="green"/>
           <w:lang w:val="it-IT"/>
         </w:rPr>
         <w:t xml:space="preserve">   - supportare navigazione da tastiera (tab </w:t>
@@ -50272,6 +50304,7 @@
       <w:proofErr w:type="spellStart"/>
       <w:r>
         <w:rPr>
+          <w:highlight w:val="green"/>
           <w:lang w:val="it-IT"/>
         </w:rPr>
         <w:t>order</w:t>
@@ -50279,6 +50312,7 @@
       <w:proofErr w:type="spellEnd"/>
       <w:r>
         <w:rPr>
+          <w:highlight w:val="green"/>
           <w:lang w:val="it-IT"/>
         </w:rPr>
         <w:t xml:space="preserve"> corretto, focus visibile),</w:t>
@@ -50287,11 +50321,13 @@
     <w:p>
       <w:pPr>
         <w:rPr>
-          <w:lang w:val="it-IT"/>
-        </w:rPr>
-      </w:pPr>
-      <w:r>
-        <w:rPr>
+          <w:highlight w:val="green"/>
+          <w:lang w:val="it-IT"/>
+        </w:rPr>
+      </w:pPr>
+      <w:r>
+        <w:rPr>
+          <w:highlight w:val="green"/>
           <w:lang w:val="it-IT"/>
         </w:rPr>
         <w:t xml:space="preserve">   - avere contrasti colore adeguati (verifica con strumenti </w:t>
@@ -50299,6 +50335,7 @@
       <w:proofErr w:type="spellStart"/>
       <w:r>
         <w:rPr>
+          <w:highlight w:val="green"/>
           <w:lang w:val="it-IT"/>
         </w:rPr>
         <w:t>DevTools</w:t>
@@ -50306,6 +50343,7 @@
       <w:proofErr w:type="spellEnd"/>
       <w:r>
         <w:rPr>
+          <w:highlight w:val="green"/>
           <w:lang w:val="it-IT"/>
         </w:rPr>
         <w:t>).</w:t>
@@ -50314,54 +50352,82 @@
     <w:p>
       <w:pPr>
         <w:rPr>
-          <w:lang w:val="it-IT"/>
-        </w:rPr>
-      </w:pPr>
-      <w:r>
-        <w:rPr>
+          <w:highlight w:val="green"/>
+          <w:lang w:val="it-IT"/>
+        </w:rPr>
+      </w:pPr>
+      <w:r>
+        <w:rPr>
+          <w:highlight w:val="green"/>
           <w:lang w:val="it-IT"/>
         </w:rPr>
         <w:t>3. Aggiungere libreria di i18n leggera (`react-i18next`) e creare:</w:t>
       </w:r>
     </w:p>
     <w:p>
-      <w:r>
-        <w:rPr>
+      <w:pPr>
+        <w:rPr>
+          <w:highlight w:val="green"/>
+        </w:rPr>
+      </w:pPr>
+      <w:r>
+        <w:rPr>
+          <w:highlight w:val="green"/>
           <w:lang w:val="it-IT"/>
         </w:rPr>
         <w:t xml:space="preserve">   </w:t>
       </w:r>
       <w:r>
+        <w:rPr>
+          <w:highlight w:val="green"/>
+        </w:rPr>
         <w:t>- `frontend/</w:t>
       </w:r>
       <w:proofErr w:type="spellStart"/>
       <w:r>
+        <w:rPr>
+          <w:highlight w:val="green"/>
+        </w:rPr>
         <w:t>src</w:t>
       </w:r>
       <w:proofErr w:type="spellEnd"/>
       <w:r>
+        <w:rPr>
+          <w:highlight w:val="green"/>
+        </w:rPr>
         <w:t>/shared/i18n/</w:t>
       </w:r>
       <w:proofErr w:type="spellStart"/>
       <w:r>
+        <w:rPr>
+          <w:highlight w:val="green"/>
+        </w:rPr>
         <w:t>config.ts</w:t>
       </w:r>
       <w:proofErr w:type="spellEnd"/>
       <w:r>
+        <w:rPr>
+          <w:highlight w:val="green"/>
+        </w:rPr>
         <w:t>`,</w:t>
       </w:r>
     </w:p>
     <w:p>
       <w:pPr>
         <w:rPr>
-          <w:lang w:val="it-IT"/>
-        </w:rPr>
-      </w:pPr>
-      <w:r>
+          <w:highlight w:val="green"/>
+          <w:lang w:val="it-IT"/>
+        </w:rPr>
+      </w:pPr>
+      <w:r>
+        <w:rPr>
+          <w:highlight w:val="green"/>
+        </w:rPr>
         <w:t xml:space="preserve">   </w:t>
       </w:r>
       <w:r>
         <w:rPr>
+          <w:highlight w:val="green"/>
           <w:lang w:val="it-IT"/>
         </w:rPr>
         <w:t>- file `</w:t>
@@ -50369,6 +50435,7 @@
       <w:proofErr w:type="spellStart"/>
       <w:r>
         <w:rPr>
+          <w:highlight w:val="green"/>
           <w:lang w:val="it-IT"/>
         </w:rPr>
         <w:t>locales</w:t>
@@ -50376,6 +50443,7 @@
       <w:proofErr w:type="spellEnd"/>
       <w:r>
         <w:rPr>
+          <w:highlight w:val="green"/>
           <w:lang w:val="it-IT"/>
         </w:rPr>
         <w:t>/</w:t>
@@ -50383,6 +50451,7 @@
       <w:proofErr w:type="spellStart"/>
       <w:r>
         <w:rPr>
+          <w:highlight w:val="green"/>
           <w:lang w:val="it-IT"/>
         </w:rPr>
         <w:t>it</w:t>
@@ -50390,6 +50459,7 @@
       <w:proofErr w:type="spellEnd"/>
       <w:r>
         <w:rPr>
+          <w:highlight w:val="green"/>
           <w:lang w:val="it-IT"/>
         </w:rPr>
         <w:t>/</w:t>
@@ -50397,6 +50467,7 @@
       <w:proofErr w:type="spellStart"/>
       <w:r>
         <w:rPr>
+          <w:highlight w:val="green"/>
           <w:lang w:val="it-IT"/>
         </w:rPr>
         <w:t>common.json</w:t>
@@ -50404,6 +50475,7 @@
       <w:proofErr w:type="spellEnd"/>
       <w:r>
         <w:rPr>
+          <w:highlight w:val="green"/>
           <w:lang w:val="it-IT"/>
         </w:rPr>
         <w:t>` e `</w:t>
@@ -50411,6 +50483,7 @@
       <w:proofErr w:type="spellStart"/>
       <w:r>
         <w:rPr>
+          <w:highlight w:val="green"/>
           <w:lang w:val="it-IT"/>
         </w:rPr>
         <w:t>locales</w:t>
@@ -50418,6 +50491,7 @@
       <w:proofErr w:type="spellEnd"/>
       <w:r>
         <w:rPr>
+          <w:highlight w:val="green"/>
           <w:lang w:val="it-IT"/>
         </w:rPr>
         <w:t>/en/</w:t>
@@ -50425,6 +50499,7 @@
       <w:proofErr w:type="spellStart"/>
       <w:r>
         <w:rPr>
+          <w:highlight w:val="green"/>
           <w:lang w:val="it-IT"/>
         </w:rPr>
         <w:t>common.json</w:t>
@@ -50432,6 +50507,7 @@
       <w:proofErr w:type="spellEnd"/>
       <w:r>
         <w:rPr>
+          <w:highlight w:val="green"/>
           <w:lang w:val="it-IT"/>
         </w:rPr>
         <w:t>` con un piccolo set di stringhe (titolo app, menu, etichette principali).</w:t>
@@ -50440,11 +50516,13 @@
     <w:p>
       <w:pPr>
         <w:rPr>
-          <w:lang w:val="it-IT"/>
-        </w:rPr>
-      </w:pPr>
-      <w:r>
-        <w:rPr>
+          <w:highlight w:val="green"/>
+          <w:lang w:val="it-IT"/>
+        </w:rPr>
+      </w:pPr>
+      <w:r>
+        <w:rPr>
+          <w:highlight w:val="green"/>
           <w:lang w:val="it-IT"/>
         </w:rPr>
         <w:t>4. Collegare il router/layout principale al provider i18n e usare `</w:t>
@@ -50452,6 +50530,7 @@
       <w:proofErr w:type="gramStart"/>
       <w:r>
         <w:rPr>
+          <w:highlight w:val="green"/>
           <w:lang w:val="it-IT"/>
         </w:rPr>
         <w:t>t(</w:t>
@@ -50459,6 +50538,7 @@
       <w:proofErr w:type="gramEnd"/>
       <w:r>
         <w:rPr>
+          <w:highlight w:val="green"/>
           <w:lang w:val="it-IT"/>
         </w:rPr>
         <w:t>)` in almeno 2–3 punti (es. titoli pagina, label bottoni principali).</w:t>
@@ -50467,11 +50547,13 @@
     <w:p>
       <w:pPr>
         <w:rPr>
-          <w:lang w:val="it-IT"/>
-        </w:rPr>
-      </w:pPr>
-      <w:r>
-        <w:rPr>
+          <w:highlight w:val="green"/>
+          <w:lang w:val="it-IT"/>
+        </w:rPr>
+      </w:pPr>
+      <w:r>
+        <w:rPr>
+          <w:highlight w:val="green"/>
           <w:lang w:val="it-IT"/>
         </w:rPr>
         <w:t xml:space="preserve">5. Documentare nel README di </w:t>
@@ -50479,6 +50561,7 @@
       <w:proofErr w:type="spellStart"/>
       <w:r>
         <w:rPr>
+          <w:highlight w:val="green"/>
           <w:lang w:val="it-IT"/>
         </w:rPr>
         <w:t>frontend</w:t>
@@ -50486,6 +50569,7 @@
       <w:proofErr w:type="spellEnd"/>
       <w:r>
         <w:rPr>
+          <w:highlight w:val="green"/>
           <w:lang w:val="it-IT"/>
         </w:rPr>
         <w:t xml:space="preserve"> come aggiungere nuove chiavi di traduzione.</w:t>
@@ -50494,18 +50578,21 @@
     <w:p>
       <w:pPr>
         <w:rPr>
-          <w:lang w:val="it-IT"/>
-        </w:rPr>
-      </w:pPr>
-    </w:p>
-    <w:p>
-      <w:pPr>
-        <w:rPr>
-          <w:lang w:val="it-IT"/>
-        </w:rPr>
-      </w:pPr>
-      <w:r>
-        <w:rPr>
+          <w:highlight w:val="green"/>
+          <w:lang w:val="it-IT"/>
+        </w:rPr>
+      </w:pPr>
+    </w:p>
+    <w:p>
+      <w:pPr>
+        <w:rPr>
+          <w:highlight w:val="green"/>
+          <w:lang w:val="it-IT"/>
+        </w:rPr>
+      </w:pPr>
+      <w:r>
+        <w:rPr>
+          <w:highlight w:val="green"/>
           <w:lang w:val="it-IT"/>
         </w:rPr>
         <w:t>**</w:t>
@@ -50513,6 +50600,7 @@
       <w:proofErr w:type="spellStart"/>
       <w:r>
         <w:rPr>
+          <w:highlight w:val="green"/>
           <w:lang w:val="it-IT"/>
         </w:rPr>
         <w:t>Acceptance</w:t>
@@ -50520,6 +50608,7 @@
       <w:proofErr w:type="spellEnd"/>
       <w:r>
         <w:rPr>
+          <w:highlight w:val="green"/>
           <w:lang w:val="it-IT"/>
         </w:rPr>
         <w:t xml:space="preserve"> </w:t>
@@ -50528,6 +50617,7 @@
       <w:proofErr w:type="gramStart"/>
       <w:r>
         <w:rPr>
+          <w:highlight w:val="green"/>
           <w:lang w:val="it-IT"/>
         </w:rPr>
         <w:t>Criteria</w:t>
@@ -50535,6 +50625,7 @@
       <w:proofErr w:type="spellEnd"/>
       <w:r>
         <w:rPr>
+          <w:highlight w:val="green"/>
           <w:lang w:val="it-IT"/>
         </w:rPr>
         <w:t>:*</w:t>
@@ -50542,6 +50633,7 @@
       <w:proofErr w:type="gramEnd"/>
       <w:r>
         <w:rPr>
+          <w:highlight w:val="green"/>
           <w:lang w:val="it-IT"/>
         </w:rPr>
         <w:t>*</w:t>
@@ -50550,18 +50642,21 @@
     <w:p>
       <w:pPr>
         <w:rPr>
-          <w:lang w:val="it-IT"/>
-        </w:rPr>
-      </w:pPr>
-    </w:p>
-    <w:p>
-      <w:pPr>
-        <w:rPr>
-          <w:lang w:val="it-IT"/>
-        </w:rPr>
-      </w:pPr>
-      <w:r>
-        <w:rPr>
+          <w:highlight w:val="green"/>
+          <w:lang w:val="it-IT"/>
+        </w:rPr>
+      </w:pPr>
+    </w:p>
+    <w:p>
+      <w:pPr>
+        <w:rPr>
+          <w:highlight w:val="green"/>
+          <w:lang w:val="it-IT"/>
+        </w:rPr>
+      </w:pPr>
+      <w:r>
+        <w:rPr>
+          <w:highlight w:val="green"/>
           <w:lang w:val="it-IT"/>
         </w:rPr>
         <w:t xml:space="preserve">- </w:t>
@@ -50569,6 +50664,7 @@
       <w:proofErr w:type="gramStart"/>
       <w:r>
         <w:rPr>
+          <w:highlight w:val="green"/>
           <w:lang w:val="it-IT"/>
         </w:rPr>
         <w:t>[ ]</w:t>
@@ -50576,6 +50672,7 @@
       <w:proofErr w:type="gramEnd"/>
       <w:r>
         <w:rPr>
+          <w:highlight w:val="green"/>
           <w:lang w:val="it-IT"/>
         </w:rPr>
         <w:t xml:space="preserve"> I principali flussi (creazione stima, lista stime) sono navigabili da tastiera.</w:t>
@@ -50584,11 +50681,13 @@
     <w:p>
       <w:pPr>
         <w:rPr>
-          <w:lang w:val="it-IT"/>
-        </w:rPr>
-      </w:pPr>
-      <w:r>
-        <w:rPr>
+          <w:highlight w:val="green"/>
+          <w:lang w:val="it-IT"/>
+        </w:rPr>
+      </w:pPr>
+      <w:r>
+        <w:rPr>
+          <w:highlight w:val="green"/>
           <w:lang w:val="it-IT"/>
         </w:rPr>
         <w:t xml:space="preserve">- </w:t>
@@ -50596,6 +50695,7 @@
       <w:proofErr w:type="gramStart"/>
       <w:r>
         <w:rPr>
+          <w:highlight w:val="green"/>
           <w:lang w:val="it-IT"/>
         </w:rPr>
         <w:t>[ ]</w:t>
@@ -50603,6 +50703,7 @@
       <w:proofErr w:type="gramEnd"/>
       <w:r>
         <w:rPr>
+          <w:highlight w:val="green"/>
           <w:lang w:val="it-IT"/>
         </w:rPr>
         <w:t xml:space="preserve"> I controlli di form hanno label chiare e leggibili anche da screen reader.</w:t>
@@ -50616,6 +50717,7 @@
       </w:pPr>
       <w:r>
         <w:rPr>
+          <w:highlight w:val="green"/>
           <w:lang w:val="it-IT"/>
         </w:rPr>
         <w:t xml:space="preserve">- </w:t>
@@ -50623,6 +50725,7 @@
       <w:proofErr w:type="gramStart"/>
       <w:r>
         <w:rPr>
+          <w:highlight w:val="green"/>
           <w:lang w:val="it-IT"/>
         </w:rPr>
         <w:t>[ ]</w:t>
@@ -50630,6 +50733,7 @@
       <w:proofErr w:type="gramEnd"/>
       <w:r>
         <w:rPr>
+          <w:highlight w:val="green"/>
           <w:lang w:val="it-IT"/>
         </w:rPr>
         <w:t xml:space="preserve"> Esiste un setup i18n funzionante con almeno IT/EN, anche se l'app resta principalmente in italiano.</w:t>

</xml_diff>

<commit_message>
Please provide the file changes to generate a commit message.
</commit_message>
<xml_diff>
--- a/Piano-operativo-v1.7.docx
+++ b/Piano-operativo-v1.7.docx
@@ -50763,11 +50763,13 @@
     <w:p>
       <w:pPr>
         <w:rPr>
-          <w:lang w:val="it-IT"/>
-        </w:rPr>
-      </w:pPr>
-      <w:r>
-        <w:rPr>
+          <w:highlight w:val="green"/>
+          <w:lang w:val="it-IT"/>
+        </w:rPr>
+      </w:pPr>
+      <w:r>
+        <w:rPr>
+          <w:highlight w:val="green"/>
           <w:lang w:val="it-IT"/>
         </w:rPr>
         <w:t>## TASK 4.13: Implementazione Dashboard Portfolio</w:t>
@@ -50776,18 +50778,21 @@
     <w:p>
       <w:pPr>
         <w:rPr>
-          <w:lang w:val="it-IT"/>
-        </w:rPr>
-      </w:pPr>
-    </w:p>
-    <w:p>
-      <w:pPr>
-        <w:rPr>
-          <w:lang w:val="it-IT"/>
-        </w:rPr>
-      </w:pPr>
-      <w:r>
-        <w:rPr>
+          <w:highlight w:val="green"/>
+          <w:lang w:val="it-IT"/>
+        </w:rPr>
+      </w:pPr>
+    </w:p>
+    <w:p>
+      <w:pPr>
+        <w:rPr>
+          <w:highlight w:val="green"/>
+          <w:lang w:val="it-IT"/>
+        </w:rPr>
+      </w:pPr>
+      <w:r>
+        <w:rPr>
+          <w:highlight w:val="green"/>
           <w:lang w:val="it-IT"/>
         </w:rPr>
         <w:t>**</w:t>
@@ -50795,6 +50800,7 @@
       <w:proofErr w:type="gramStart"/>
       <w:r>
         <w:rPr>
+          <w:highlight w:val="green"/>
           <w:lang w:val="it-IT"/>
         </w:rPr>
         <w:t>Descrizione:*</w:t>
@@ -50802,6 +50808,7 @@
       <w:proofErr w:type="gramEnd"/>
       <w:r>
         <w:rPr>
+          <w:highlight w:val="green"/>
           <w:lang w:val="it-IT"/>
         </w:rPr>
         <w:t>* Creare dashboard con metriche aggregate portfolio.</w:t>
@@ -50810,99 +50817,179 @@
     <w:p>
       <w:pPr>
         <w:rPr>
-          <w:lang w:val="it-IT"/>
-        </w:rPr>
-      </w:pPr>
-    </w:p>
-    <w:p>
-      <w:r>
+          <w:highlight w:val="green"/>
+          <w:lang w:val="it-IT"/>
+        </w:rPr>
+      </w:pPr>
+    </w:p>
+    <w:p>
+      <w:pPr>
+        <w:rPr>
+          <w:highlight w:val="green"/>
+        </w:rPr>
+      </w:pPr>
+      <w:r>
+        <w:rPr>
+          <w:highlight w:val="green"/>
+        </w:rPr>
         <w:t>**</w:t>
       </w:r>
       <w:proofErr w:type="spellStart"/>
       <w:proofErr w:type="gramStart"/>
       <w:r>
+        <w:rPr>
+          <w:highlight w:val="green"/>
+        </w:rPr>
         <w:t>Microstep</w:t>
       </w:r>
       <w:proofErr w:type="spellEnd"/>
       <w:r>
+        <w:rPr>
+          <w:highlight w:val="green"/>
+        </w:rPr>
         <w:t>:*</w:t>
       </w:r>
       <w:proofErr w:type="gramEnd"/>
       <w:r>
+        <w:rPr>
+          <w:highlight w:val="green"/>
+        </w:rPr>
         <w:t>*</w:t>
       </w:r>
     </w:p>
     <w:p>
-      <w:r>
+      <w:pPr>
+        <w:rPr>
+          <w:highlight w:val="green"/>
+        </w:rPr>
+      </w:pPr>
+      <w:r>
+        <w:rPr>
+          <w:highlight w:val="green"/>
+        </w:rPr>
         <w:t xml:space="preserve">1. </w:t>
       </w:r>
       <w:proofErr w:type="spellStart"/>
       <w:r>
+        <w:rPr>
+          <w:highlight w:val="green"/>
+        </w:rPr>
         <w:t>Creare</w:t>
       </w:r>
       <w:proofErr w:type="spellEnd"/>
       <w:r>
+        <w:rPr>
+          <w:highlight w:val="green"/>
+        </w:rPr>
         <w:t xml:space="preserve"> file `frontend/</w:t>
       </w:r>
       <w:proofErr w:type="spellStart"/>
       <w:r>
+        <w:rPr>
+          <w:highlight w:val="green"/>
+        </w:rPr>
         <w:t>src</w:t>
       </w:r>
       <w:proofErr w:type="spellEnd"/>
       <w:r>
+        <w:rPr>
+          <w:highlight w:val="green"/>
+        </w:rPr>
         <w:t>/features/portfolio/components/</w:t>
       </w:r>
       <w:proofErr w:type="spellStart"/>
       <w:r>
+        <w:rPr>
+          <w:highlight w:val="green"/>
+        </w:rPr>
         <w:t>Dashboard.tsx</w:t>
       </w:r>
       <w:proofErr w:type="spellEnd"/>
       <w:r>
+        <w:rPr>
+          <w:highlight w:val="green"/>
+        </w:rPr>
         <w:t>`</w:t>
       </w:r>
     </w:p>
     <w:p>
-      <w:r>
+      <w:pPr>
+        <w:rPr>
+          <w:highlight w:val="green"/>
+        </w:rPr>
+      </w:pPr>
+      <w:r>
+        <w:rPr>
+          <w:highlight w:val="green"/>
+        </w:rPr>
         <w:t xml:space="preserve">2. </w:t>
       </w:r>
       <w:proofErr w:type="spellStart"/>
       <w:r>
+        <w:rPr>
+          <w:highlight w:val="green"/>
+        </w:rPr>
         <w:t>Mostrare</w:t>
       </w:r>
       <w:proofErr w:type="spellEnd"/>
       <w:r>
+        <w:rPr>
+          <w:highlight w:val="green"/>
+        </w:rPr>
         <w:t xml:space="preserve"> </w:t>
       </w:r>
       <w:proofErr w:type="spellStart"/>
       <w:r>
+        <w:rPr>
+          <w:highlight w:val="green"/>
+        </w:rPr>
         <w:t>metriche</w:t>
       </w:r>
       <w:proofErr w:type="spellEnd"/>
       <w:r>
+        <w:rPr>
+          <w:highlight w:val="green"/>
+        </w:rPr>
         <w:t xml:space="preserve"> top-level: total P&amp;L, total invested, active estimates count</w:t>
       </w:r>
     </w:p>
     <w:p>
-      <w:r>
+      <w:pPr>
+        <w:rPr>
+          <w:highlight w:val="green"/>
+        </w:rPr>
+      </w:pPr>
+      <w:r>
+        <w:rPr>
+          <w:highlight w:val="green"/>
+        </w:rPr>
         <w:t xml:space="preserve">3. </w:t>
       </w:r>
       <w:proofErr w:type="spellStart"/>
       <w:r>
+        <w:rPr>
+          <w:highlight w:val="green"/>
+        </w:rPr>
         <w:t>Mostrare</w:t>
       </w:r>
       <w:proofErr w:type="spellEnd"/>
       <w:r>
+        <w:rPr>
+          <w:highlight w:val="green"/>
+        </w:rPr>
         <w:t xml:space="preserve"> breakdown per status: open, closed win, closed loss</w:t>
       </w:r>
     </w:p>
     <w:p>
       <w:pPr>
         <w:rPr>
-          <w:lang w:val="it-IT"/>
-        </w:rPr>
-      </w:pPr>
-      <w:r>
-        <w:rPr>
+          <w:highlight w:val="green"/>
+          <w:lang w:val="it-IT"/>
+        </w:rPr>
+      </w:pPr>
+      <w:r>
+        <w:rPr>
+          <w:highlight w:val="green"/>
           <w:lang w:val="it-IT"/>
         </w:rPr>
         <w:t>4. Implementare grafico P&amp;L cumulativo nel tempo (</w:t>
@@ -50910,6 +50997,7 @@
       <w:proofErr w:type="spellStart"/>
       <w:r>
         <w:rPr>
+          <w:highlight w:val="green"/>
           <w:lang w:val="it-IT"/>
         </w:rPr>
         <w:t>Recharts</w:t>
@@ -50917,6 +51005,7 @@
       <w:proofErr w:type="spellEnd"/>
       <w:r>
         <w:rPr>
+          <w:highlight w:val="green"/>
           <w:lang w:val="it-IT"/>
         </w:rPr>
         <w:t>)</w:t>
@@ -50925,45 +51014,69 @@
     <w:p>
       <w:pPr>
         <w:rPr>
-          <w:lang w:val="it-IT"/>
-        </w:rPr>
-      </w:pPr>
-      <w:r>
-        <w:rPr>
+          <w:highlight w:val="green"/>
+          <w:lang w:val="it-IT"/>
+        </w:rPr>
+      </w:pPr>
+      <w:r>
+        <w:rPr>
+          <w:highlight w:val="green"/>
           <w:lang w:val="it-IT"/>
         </w:rPr>
         <w:t>5. Implementare grafico distribuzione per ticker (pie chart)</w:t>
       </w:r>
     </w:p>
     <w:p>
-      <w:r>
+      <w:pPr>
+        <w:rPr>
+          <w:highlight w:val="green"/>
+        </w:rPr>
+      </w:pPr>
+      <w:r>
+        <w:rPr>
+          <w:highlight w:val="green"/>
+        </w:rPr>
         <w:t xml:space="preserve">6. </w:t>
       </w:r>
       <w:proofErr w:type="spellStart"/>
       <w:r>
+        <w:rPr>
+          <w:highlight w:val="green"/>
+        </w:rPr>
         <w:t>Implementare</w:t>
       </w:r>
       <w:proofErr w:type="spellEnd"/>
       <w:r>
+        <w:rPr>
+          <w:highlight w:val="green"/>
+        </w:rPr>
         <w:t xml:space="preserve"> </w:t>
       </w:r>
       <w:proofErr w:type="spellStart"/>
       <w:r>
+        <w:rPr>
+          <w:highlight w:val="green"/>
+        </w:rPr>
         <w:t>tabella</w:t>
       </w:r>
       <w:proofErr w:type="spellEnd"/>
       <w:r>
+        <w:rPr>
+          <w:highlight w:val="green"/>
+        </w:rPr>
         <w:t xml:space="preserve"> top performers / worst performers</w:t>
       </w:r>
     </w:p>
     <w:p>
       <w:pPr>
         <w:rPr>
-          <w:lang w:val="it-IT"/>
-        </w:rPr>
-      </w:pPr>
-      <w:r>
-        <w:rPr>
+          <w:highlight w:val="green"/>
+          <w:lang w:val="it-IT"/>
+        </w:rPr>
+      </w:pPr>
+      <w:r>
+        <w:rPr>
+          <w:highlight w:val="green"/>
           <w:lang w:val="it-IT"/>
         </w:rPr>
         <w:t>7. Usare aggregazioni server-side per performance</w:t>
@@ -50972,11 +51085,13 @@
     <w:p>
       <w:pPr>
         <w:rPr>
-          <w:lang w:val="it-IT"/>
-        </w:rPr>
-      </w:pPr>
-      <w:r>
-        <w:rPr>
+          <w:highlight w:val="green"/>
+          <w:lang w:val="it-IT"/>
+        </w:rPr>
+      </w:pPr>
+      <w:r>
+        <w:rPr>
+          <w:highlight w:val="green"/>
           <w:lang w:val="it-IT"/>
         </w:rPr>
         <w:t>8. Implementare refresh periodico (ogni 5 min)</w:t>
@@ -50985,18 +51100,21 @@
     <w:p>
       <w:pPr>
         <w:rPr>
-          <w:lang w:val="it-IT"/>
-        </w:rPr>
-      </w:pPr>
-    </w:p>
-    <w:p>
-      <w:pPr>
-        <w:rPr>
-          <w:lang w:val="it-IT"/>
-        </w:rPr>
-      </w:pPr>
-      <w:r>
-        <w:rPr>
+          <w:highlight w:val="green"/>
+          <w:lang w:val="it-IT"/>
+        </w:rPr>
+      </w:pPr>
+    </w:p>
+    <w:p>
+      <w:pPr>
+        <w:rPr>
+          <w:highlight w:val="green"/>
+          <w:lang w:val="it-IT"/>
+        </w:rPr>
+      </w:pPr>
+      <w:r>
+        <w:rPr>
+          <w:highlight w:val="green"/>
           <w:lang w:val="it-IT"/>
         </w:rPr>
         <w:t>**</w:t>
@@ -51004,6 +51122,7 @@
       <w:proofErr w:type="spellStart"/>
       <w:r>
         <w:rPr>
+          <w:highlight w:val="green"/>
           <w:lang w:val="it-IT"/>
         </w:rPr>
         <w:t>Acceptance</w:t>
@@ -51011,6 +51130,7 @@
       <w:proofErr w:type="spellEnd"/>
       <w:r>
         <w:rPr>
+          <w:highlight w:val="green"/>
           <w:lang w:val="it-IT"/>
         </w:rPr>
         <w:t xml:space="preserve"> </w:t>
@@ -51019,6 +51139,7 @@
       <w:proofErr w:type="gramStart"/>
       <w:r>
         <w:rPr>
+          <w:highlight w:val="green"/>
           <w:lang w:val="it-IT"/>
         </w:rPr>
         <w:t>Criteria</w:t>
@@ -51026,6 +51147,7 @@
       <w:proofErr w:type="spellEnd"/>
       <w:r>
         <w:rPr>
+          <w:highlight w:val="green"/>
           <w:lang w:val="it-IT"/>
         </w:rPr>
         <w:t>:*</w:t>
@@ -51033,6 +51155,7 @@
       <w:proofErr w:type="gramEnd"/>
       <w:r>
         <w:rPr>
+          <w:highlight w:val="green"/>
           <w:lang w:val="it-IT"/>
         </w:rPr>
         <w:t>*</w:t>
@@ -51041,11 +51164,13 @@
     <w:p>
       <w:pPr>
         <w:rPr>
-          <w:lang w:val="it-IT"/>
-        </w:rPr>
-      </w:pPr>
-      <w:r>
-        <w:rPr>
+          <w:highlight w:val="green"/>
+          <w:lang w:val="it-IT"/>
+        </w:rPr>
+      </w:pPr>
+      <w:r>
+        <w:rPr>
+          <w:highlight w:val="green"/>
           <w:lang w:val="it-IT"/>
         </w:rPr>
         <w:t xml:space="preserve">- </w:t>
@@ -51053,6 +51178,7 @@
       <w:proofErr w:type="gramStart"/>
       <w:r>
         <w:rPr>
+          <w:highlight w:val="green"/>
           <w:lang w:val="it-IT"/>
         </w:rPr>
         <w:t>[ ]</w:t>
@@ -51060,6 +51186,7 @@
       <w:proofErr w:type="gramEnd"/>
       <w:r>
         <w:rPr>
+          <w:highlight w:val="green"/>
           <w:lang w:val="it-IT"/>
         </w:rPr>
         <w:t xml:space="preserve"> Metriche aggregate corrette</w:t>
@@ -51068,11 +51195,13 @@
     <w:p>
       <w:pPr>
         <w:rPr>
-          <w:lang w:val="it-IT"/>
-        </w:rPr>
-      </w:pPr>
-      <w:r>
-        <w:rPr>
+          <w:highlight w:val="green"/>
+          <w:lang w:val="it-IT"/>
+        </w:rPr>
+      </w:pPr>
+      <w:r>
+        <w:rPr>
+          <w:highlight w:val="green"/>
           <w:lang w:val="it-IT"/>
         </w:rPr>
         <w:t xml:space="preserve">- </w:t>
@@ -51080,6 +51209,7 @@
       <w:proofErr w:type="gramStart"/>
       <w:r>
         <w:rPr>
+          <w:highlight w:val="green"/>
           <w:lang w:val="it-IT"/>
         </w:rPr>
         <w:t>[ ]</w:t>
@@ -51087,6 +51217,7 @@
       <w:proofErr w:type="gramEnd"/>
       <w:r>
         <w:rPr>
+          <w:highlight w:val="green"/>
           <w:lang w:val="it-IT"/>
         </w:rPr>
         <w:t xml:space="preserve"> Grafici interattivi con </w:t>
@@ -51094,6 +51225,7 @@
       <w:proofErr w:type="spellStart"/>
       <w:r>
         <w:rPr>
+          <w:highlight w:val="green"/>
           <w:lang w:val="it-IT"/>
         </w:rPr>
         <w:t>tooltip</w:t>
@@ -51103,11 +51235,13 @@
     <w:p>
       <w:pPr>
         <w:rPr>
-          <w:lang w:val="it-IT"/>
-        </w:rPr>
-      </w:pPr>
-      <w:r>
-        <w:rPr>
+          <w:highlight w:val="green"/>
+          <w:lang w:val="it-IT"/>
+        </w:rPr>
+      </w:pPr>
+      <w:r>
+        <w:rPr>
+          <w:highlight w:val="green"/>
           <w:lang w:val="it-IT"/>
         </w:rPr>
         <w:t xml:space="preserve">- </w:t>
@@ -51115,6 +51249,7 @@
       <w:proofErr w:type="gramStart"/>
       <w:r>
         <w:rPr>
+          <w:highlight w:val="green"/>
           <w:lang w:val="it-IT"/>
         </w:rPr>
         <w:t>[ ]</w:t>
@@ -51122,6 +51257,7 @@
       <w:proofErr w:type="gramEnd"/>
       <w:r>
         <w:rPr>
+          <w:highlight w:val="green"/>
           <w:lang w:val="it-IT"/>
         </w:rPr>
         <w:t xml:space="preserve"> Performance accettabile con molti dati</w:t>
@@ -51135,6 +51271,7 @@
       </w:pPr>
       <w:r>
         <w:rPr>
+          <w:highlight w:val="green"/>
           <w:lang w:val="it-IT"/>
         </w:rPr>
         <w:t xml:space="preserve">- </w:t>
@@ -51142,6 +51279,7 @@
       <w:proofErr w:type="gramStart"/>
       <w:r>
         <w:rPr>
+          <w:highlight w:val="green"/>
           <w:lang w:val="it-IT"/>
         </w:rPr>
         <w:t>[ ]</w:t>
@@ -51149,6 +51287,7 @@
       <w:proofErr w:type="gramEnd"/>
       <w:r>
         <w:rPr>
+          <w:highlight w:val="green"/>
           <w:lang w:val="it-IT"/>
         </w:rPr>
         <w:t xml:space="preserve"> Refresh automatico funzionante</w:t>

</xml_diff>

<commit_message>
feat: Introduce AGENTS.md as a comprehensive project plan and development guide for TickerTracker v3.0 agents.
</commit_message>
<xml_diff>
--- a/Piano-operativo-v1.7.docx
+++ b/Piano-operativo-v1.7.docx
@@ -51323,11 +51323,13 @@
     <w:p>
       <w:pPr>
         <w:rPr>
-          <w:lang w:val="it-IT"/>
-        </w:rPr>
-      </w:pPr>
-      <w:r>
-        <w:rPr>
+          <w:highlight w:val="green"/>
+          <w:lang w:val="it-IT"/>
+        </w:rPr>
+      </w:pPr>
+      <w:r>
+        <w:rPr>
+          <w:highlight w:val="green"/>
           <w:lang w:val="it-IT"/>
         </w:rPr>
         <w:t>## TASK 4.14: Implementazione Price Chart</w:t>
@@ -51336,18 +51338,21 @@
     <w:p>
       <w:pPr>
         <w:rPr>
-          <w:lang w:val="it-IT"/>
-        </w:rPr>
-      </w:pPr>
-    </w:p>
-    <w:p>
-      <w:pPr>
-        <w:rPr>
-          <w:lang w:val="it-IT"/>
-        </w:rPr>
-      </w:pPr>
-      <w:r>
-        <w:rPr>
+          <w:highlight w:val="green"/>
+          <w:lang w:val="it-IT"/>
+        </w:rPr>
+      </w:pPr>
+    </w:p>
+    <w:p>
+      <w:pPr>
+        <w:rPr>
+          <w:highlight w:val="green"/>
+          <w:lang w:val="it-IT"/>
+        </w:rPr>
+      </w:pPr>
+      <w:r>
+        <w:rPr>
+          <w:highlight w:val="green"/>
           <w:lang w:val="it-IT"/>
         </w:rPr>
         <w:lastRenderedPageBreak/>
@@ -51356,6 +51361,7 @@
       <w:proofErr w:type="gramStart"/>
       <w:r>
         <w:rPr>
+          <w:highlight w:val="green"/>
           <w:lang w:val="it-IT"/>
         </w:rPr>
         <w:t>Descrizione:*</w:t>
@@ -51363,6 +51369,7 @@
       <w:proofErr w:type="gramEnd"/>
       <w:r>
         <w:rPr>
+          <w:highlight w:val="green"/>
           <w:lang w:val="it-IT"/>
         </w:rPr>
         <w:t xml:space="preserve">* Creare componente grafico prezzi con </w:t>
@@ -51370,6 +51377,7 @@
       <w:proofErr w:type="spellStart"/>
       <w:r>
         <w:rPr>
+          <w:highlight w:val="green"/>
           <w:lang w:val="it-IT"/>
         </w:rPr>
         <w:t>candlestick</w:t>
@@ -51377,6 +51385,7 @@
       <w:proofErr w:type="spellEnd"/>
       <w:r>
         <w:rPr>
+          <w:highlight w:val="green"/>
           <w:lang w:val="it-IT"/>
         </w:rPr>
         <w:t>/line.</w:t>
@@ -51385,94 +51394,166 @@
     <w:p>
       <w:pPr>
         <w:rPr>
-          <w:lang w:val="it-IT"/>
-        </w:rPr>
-      </w:pPr>
-    </w:p>
-    <w:p>
-      <w:r>
+          <w:highlight w:val="green"/>
+          <w:lang w:val="it-IT"/>
+        </w:rPr>
+      </w:pPr>
+    </w:p>
+    <w:p>
+      <w:pPr>
+        <w:rPr>
+          <w:highlight w:val="green"/>
+        </w:rPr>
+      </w:pPr>
+      <w:r>
+        <w:rPr>
+          <w:highlight w:val="green"/>
+        </w:rPr>
         <w:t>**</w:t>
       </w:r>
       <w:proofErr w:type="spellStart"/>
       <w:proofErr w:type="gramStart"/>
       <w:r>
+        <w:rPr>
+          <w:highlight w:val="green"/>
+        </w:rPr>
         <w:t>Microstep</w:t>
       </w:r>
       <w:proofErr w:type="spellEnd"/>
       <w:r>
+        <w:rPr>
+          <w:highlight w:val="green"/>
+        </w:rPr>
         <w:t>:*</w:t>
       </w:r>
       <w:proofErr w:type="gramEnd"/>
       <w:r>
+        <w:rPr>
+          <w:highlight w:val="green"/>
+        </w:rPr>
         <w:t>*</w:t>
       </w:r>
     </w:p>
     <w:p>
-      <w:r>
+      <w:pPr>
+        <w:rPr>
+          <w:highlight w:val="green"/>
+        </w:rPr>
+      </w:pPr>
+      <w:r>
+        <w:rPr>
+          <w:highlight w:val="green"/>
+        </w:rPr>
         <w:t xml:space="preserve">1. </w:t>
       </w:r>
       <w:proofErr w:type="spellStart"/>
       <w:r>
+        <w:rPr>
+          <w:highlight w:val="green"/>
+        </w:rPr>
         <w:t>Creare</w:t>
       </w:r>
       <w:proofErr w:type="spellEnd"/>
       <w:r>
+        <w:rPr>
+          <w:highlight w:val="green"/>
+        </w:rPr>
         <w:t xml:space="preserve"> file `frontend/</w:t>
       </w:r>
       <w:proofErr w:type="spellStart"/>
       <w:r>
+        <w:rPr>
+          <w:highlight w:val="green"/>
+        </w:rPr>
         <w:t>src</w:t>
       </w:r>
       <w:proofErr w:type="spellEnd"/>
       <w:r>
+        <w:rPr>
+          <w:highlight w:val="green"/>
+        </w:rPr>
         <w:t>/features/market-data/components/</w:t>
       </w:r>
       <w:proofErr w:type="spellStart"/>
       <w:r>
+        <w:rPr>
+          <w:highlight w:val="green"/>
+        </w:rPr>
         <w:t>PriceChart.tsx</w:t>
       </w:r>
       <w:proofErr w:type="spellEnd"/>
       <w:r>
+        <w:rPr>
+          <w:highlight w:val="green"/>
+        </w:rPr>
         <w:t>`</w:t>
       </w:r>
     </w:p>
     <w:p>
-      <w:r>
+      <w:pPr>
+        <w:rPr>
+          <w:highlight w:val="green"/>
+        </w:rPr>
+      </w:pPr>
+      <w:r>
+        <w:rPr>
+          <w:highlight w:val="green"/>
+        </w:rPr>
         <w:t xml:space="preserve">2. </w:t>
       </w:r>
       <w:proofErr w:type="spellStart"/>
       <w:r>
+        <w:rPr>
+          <w:highlight w:val="green"/>
+        </w:rPr>
         <w:t>Accettare</w:t>
       </w:r>
       <w:proofErr w:type="spellEnd"/>
       <w:r>
+        <w:rPr>
+          <w:highlight w:val="green"/>
+        </w:rPr>
         <w:t xml:space="preserve"> props: ticker, </w:t>
       </w:r>
       <w:proofErr w:type="spellStart"/>
       <w:r>
+        <w:rPr>
+          <w:highlight w:val="green"/>
+        </w:rPr>
         <w:t>dateRange</w:t>
       </w:r>
       <w:proofErr w:type="spellEnd"/>
       <w:r>
+        <w:rPr>
+          <w:highlight w:val="green"/>
+        </w:rPr>
         <w:t xml:space="preserve">, </w:t>
       </w:r>
       <w:proofErr w:type="spellStart"/>
       <w:r>
+        <w:rPr>
+          <w:highlight w:val="green"/>
+        </w:rPr>
         <w:t>chartType</w:t>
       </w:r>
       <w:proofErr w:type="spellEnd"/>
       <w:r>
+        <w:rPr>
+          <w:highlight w:val="green"/>
+        </w:rPr>
         <w:t xml:space="preserve"> (line/candlestick)</w:t>
       </w:r>
     </w:p>
     <w:p>
       <w:pPr>
         <w:rPr>
-          <w:lang w:val="it-IT"/>
-        </w:rPr>
-      </w:pPr>
-      <w:r>
-        <w:rPr>
+          <w:highlight w:val="green"/>
+          <w:lang w:val="it-IT"/>
+        </w:rPr>
+      </w:pPr>
+      <w:r>
+        <w:rPr>
+          <w:highlight w:val="green"/>
           <w:lang w:val="it-IT"/>
         </w:rPr>
         <w:t>3. Usare hook per fetch dati storici con aggregazione appropriata</w:t>
@@ -51481,11 +51562,13 @@
     <w:p>
       <w:pPr>
         <w:rPr>
-          <w:lang w:val="it-IT"/>
-        </w:rPr>
-      </w:pPr>
-      <w:r>
-        <w:rPr>
+          <w:highlight w:val="green"/>
+          <w:lang w:val="it-IT"/>
+        </w:rPr>
+      </w:pPr>
+      <w:r>
+        <w:rPr>
+          <w:highlight w:val="green"/>
           <w:lang w:val="it-IT"/>
         </w:rPr>
         <w:t xml:space="preserve">4. Implementare grafico linea con </w:t>
@@ -51493,6 +51576,7 @@
       <w:proofErr w:type="spellStart"/>
       <w:r>
         <w:rPr>
+          <w:highlight w:val="green"/>
           <w:lang w:val="it-IT"/>
         </w:rPr>
         <w:t>Recharts</w:t>
@@ -51502,11 +51586,13 @@
     <w:p>
       <w:pPr>
         <w:rPr>
-          <w:lang w:val="it-IT"/>
-        </w:rPr>
-      </w:pPr>
-      <w:r>
-        <w:rPr>
+          <w:highlight w:val="green"/>
+          <w:lang w:val="it-IT"/>
+        </w:rPr>
+      </w:pPr>
+      <w:r>
+        <w:rPr>
+          <w:highlight w:val="green"/>
           <w:lang w:val="it-IT"/>
         </w:rPr>
         <w:t xml:space="preserve">5. Implementare overlay con entry price, target, stop </w:t>
@@ -51514,6 +51600,7 @@
       <w:proofErr w:type="spellStart"/>
       <w:r>
         <w:rPr>
+          <w:highlight w:val="green"/>
           <w:lang w:val="it-IT"/>
         </w:rPr>
         <w:t>loss</w:t>
@@ -51521,6 +51608,7 @@
       <w:proofErr w:type="spellEnd"/>
       <w:r>
         <w:rPr>
+          <w:highlight w:val="green"/>
           <w:lang w:val="it-IT"/>
         </w:rPr>
         <w:t xml:space="preserve"> della stima associata</w:t>
@@ -51529,11 +51617,13 @@
     <w:p>
       <w:pPr>
         <w:rPr>
-          <w:lang w:val="it-IT"/>
-        </w:rPr>
-      </w:pPr>
-      <w:r>
-        <w:rPr>
+          <w:highlight w:val="green"/>
+          <w:lang w:val="it-IT"/>
+        </w:rPr>
+      </w:pPr>
+      <w:r>
+        <w:rPr>
+          <w:highlight w:val="green"/>
           <w:lang w:val="it-IT"/>
         </w:rPr>
         <w:t>6. Implementare zoom in/out con cambio aggregazione (1D -&gt; 1W -&gt; 1M)</w:t>
@@ -51542,11 +51632,13 @@
     <w:p>
       <w:pPr>
         <w:rPr>
-          <w:lang w:val="it-IT"/>
-        </w:rPr>
-      </w:pPr>
-      <w:r>
-        <w:rPr>
+          <w:highlight w:val="green"/>
+          <w:lang w:val="it-IT"/>
+        </w:rPr>
+      </w:pPr>
+      <w:r>
+        <w:rPr>
+          <w:highlight w:val="green"/>
           <w:lang w:val="it-IT"/>
         </w:rPr>
         <w:t xml:space="preserve">7. Implementare </w:t>
@@ -51554,6 +51646,7 @@
       <w:proofErr w:type="spellStart"/>
       <w:r>
         <w:rPr>
+          <w:highlight w:val="green"/>
           <w:lang w:val="it-IT"/>
         </w:rPr>
         <w:t>tooltip</w:t>
@@ -51561,6 +51654,7 @@
       <w:proofErr w:type="spellEnd"/>
       <w:r>
         <w:rPr>
+          <w:highlight w:val="green"/>
           <w:lang w:val="it-IT"/>
         </w:rPr>
         <w:t xml:space="preserve"> con dettagli OHLCV</w:t>
@@ -51569,11 +51663,13 @@
     <w:p>
       <w:pPr>
         <w:rPr>
-          <w:lang w:val="it-IT"/>
-        </w:rPr>
-      </w:pPr>
-      <w:r>
-        <w:rPr>
+          <w:highlight w:val="green"/>
+          <w:lang w:val="it-IT"/>
+        </w:rPr>
+      </w:pPr>
+      <w:r>
+        <w:rPr>
+          <w:highlight w:val="green"/>
           <w:lang w:val="it-IT"/>
         </w:rPr>
         <w:t>8. Mostrare loading skeleton durante fetch</w:t>
@@ -51582,18 +51678,21 @@
     <w:p>
       <w:pPr>
         <w:rPr>
-          <w:lang w:val="it-IT"/>
-        </w:rPr>
-      </w:pPr>
-    </w:p>
-    <w:p>
-      <w:pPr>
-        <w:rPr>
-          <w:lang w:val="it-IT"/>
-        </w:rPr>
-      </w:pPr>
-      <w:r>
-        <w:rPr>
+          <w:highlight w:val="green"/>
+          <w:lang w:val="it-IT"/>
+        </w:rPr>
+      </w:pPr>
+    </w:p>
+    <w:p>
+      <w:pPr>
+        <w:rPr>
+          <w:highlight w:val="green"/>
+          <w:lang w:val="it-IT"/>
+        </w:rPr>
+      </w:pPr>
+      <w:r>
+        <w:rPr>
+          <w:highlight w:val="green"/>
           <w:lang w:val="it-IT"/>
         </w:rPr>
         <w:t>**</w:t>
@@ -51601,6 +51700,7 @@
       <w:proofErr w:type="spellStart"/>
       <w:r>
         <w:rPr>
+          <w:highlight w:val="green"/>
           <w:lang w:val="it-IT"/>
         </w:rPr>
         <w:t>Acceptance</w:t>
@@ -51608,6 +51708,7 @@
       <w:proofErr w:type="spellEnd"/>
       <w:r>
         <w:rPr>
+          <w:highlight w:val="green"/>
           <w:lang w:val="it-IT"/>
         </w:rPr>
         <w:t xml:space="preserve"> </w:t>
@@ -51616,6 +51717,7 @@
       <w:proofErr w:type="gramStart"/>
       <w:r>
         <w:rPr>
+          <w:highlight w:val="green"/>
           <w:lang w:val="it-IT"/>
         </w:rPr>
         <w:t>Criteria</w:t>
@@ -51623,6 +51725,7 @@
       <w:proofErr w:type="spellEnd"/>
       <w:r>
         <w:rPr>
+          <w:highlight w:val="green"/>
           <w:lang w:val="it-IT"/>
         </w:rPr>
         <w:t>:*</w:t>
@@ -51630,6 +51733,7 @@
       <w:proofErr w:type="gramEnd"/>
       <w:r>
         <w:rPr>
+          <w:highlight w:val="green"/>
           <w:lang w:val="it-IT"/>
         </w:rPr>
         <w:t>*</w:t>
@@ -51638,11 +51742,13 @@
     <w:p>
       <w:pPr>
         <w:rPr>
-          <w:lang w:val="it-IT"/>
-        </w:rPr>
-      </w:pPr>
-      <w:r>
-        <w:rPr>
+          <w:highlight w:val="green"/>
+          <w:lang w:val="it-IT"/>
+        </w:rPr>
+      </w:pPr>
+      <w:r>
+        <w:rPr>
+          <w:highlight w:val="green"/>
           <w:lang w:val="it-IT"/>
         </w:rPr>
         <w:t xml:space="preserve">- </w:t>
@@ -51650,6 +51756,7 @@
       <w:proofErr w:type="gramStart"/>
       <w:r>
         <w:rPr>
+          <w:highlight w:val="green"/>
           <w:lang w:val="it-IT"/>
         </w:rPr>
         <w:t>[ ]</w:t>
@@ -51657,6 +51764,7 @@
       <w:proofErr w:type="gramEnd"/>
       <w:r>
         <w:rPr>
+          <w:highlight w:val="green"/>
           <w:lang w:val="it-IT"/>
         </w:rPr>
         <w:t xml:space="preserve"> Grafico renderizza correttamente dati storici</w:t>
@@ -51665,11 +51773,13 @@
     <w:p>
       <w:pPr>
         <w:rPr>
-          <w:lang w:val="it-IT"/>
-        </w:rPr>
-      </w:pPr>
-      <w:r>
-        <w:rPr>
+          <w:highlight w:val="green"/>
+          <w:lang w:val="it-IT"/>
+        </w:rPr>
+      </w:pPr>
+      <w:r>
+        <w:rPr>
+          <w:highlight w:val="green"/>
           <w:lang w:val="it-IT"/>
         </w:rPr>
         <w:t xml:space="preserve">- </w:t>
@@ -51677,6 +51787,7 @@
       <w:proofErr w:type="gramStart"/>
       <w:r>
         <w:rPr>
+          <w:highlight w:val="green"/>
           <w:lang w:val="it-IT"/>
         </w:rPr>
         <w:t>[ ]</w:t>
@@ -51684,6 +51795,7 @@
       <w:proofErr w:type="gramEnd"/>
       <w:r>
         <w:rPr>
+          <w:highlight w:val="green"/>
           <w:lang w:val="it-IT"/>
         </w:rPr>
         <w:t xml:space="preserve"> Zoom cambia livello aggregazione</w:t>
@@ -51692,11 +51804,13 @@
     <w:p>
       <w:pPr>
         <w:rPr>
-          <w:lang w:val="it-IT"/>
-        </w:rPr>
-      </w:pPr>
-      <w:r>
-        <w:rPr>
+          <w:highlight w:val="green"/>
+          <w:lang w:val="it-IT"/>
+        </w:rPr>
+      </w:pPr>
+      <w:r>
+        <w:rPr>
+          <w:highlight w:val="green"/>
           <w:lang w:val="it-IT"/>
         </w:rPr>
         <w:t xml:space="preserve">- </w:t>
@@ -51704,6 +51818,7 @@
       <w:proofErr w:type="gramStart"/>
       <w:r>
         <w:rPr>
+          <w:highlight w:val="green"/>
           <w:lang w:val="it-IT"/>
         </w:rPr>
         <w:t>[ ]</w:t>
@@ -51711,6 +51826,7 @@
       <w:proofErr w:type="gramEnd"/>
       <w:r>
         <w:rPr>
+          <w:highlight w:val="green"/>
           <w:lang w:val="it-IT"/>
         </w:rPr>
         <w:t xml:space="preserve"> Overlay livelli prezzo visibili</w:t>
@@ -51719,11 +51835,13 @@
     <w:p>
       <w:pPr>
         <w:rPr>
-          <w:lang w:val="it-IT"/>
-        </w:rPr>
-      </w:pPr>
-      <w:r>
-        <w:rPr>
+          <w:highlight w:val="green"/>
+          <w:lang w:val="it-IT"/>
+        </w:rPr>
+      </w:pPr>
+      <w:r>
+        <w:rPr>
+          <w:highlight w:val="green"/>
           <w:lang w:val="it-IT"/>
         </w:rPr>
         <w:t xml:space="preserve">- </w:t>
@@ -51731,6 +51849,7 @@
       <w:proofErr w:type="gramStart"/>
       <w:r>
         <w:rPr>
+          <w:highlight w:val="green"/>
           <w:lang w:val="it-IT"/>
         </w:rPr>
         <w:t>[ ]</w:t>
@@ -51738,6 +51857,7 @@
       <w:proofErr w:type="gramEnd"/>
       <w:r>
         <w:rPr>
+          <w:highlight w:val="green"/>
           <w:lang w:val="it-IT"/>
         </w:rPr>
         <w:t xml:space="preserve"> </w:t>
@@ -51745,6 +51865,7 @@
       <w:proofErr w:type="spellStart"/>
       <w:r>
         <w:rPr>
+          <w:highlight w:val="green"/>
           <w:lang w:val="it-IT"/>
         </w:rPr>
         <w:t>Tooltip</w:t>
@@ -51752,6 +51873,7 @@
       <w:proofErr w:type="spellEnd"/>
       <w:r>
         <w:rPr>
+          <w:highlight w:val="green"/>
           <w:lang w:val="it-IT"/>
         </w:rPr>
         <w:t xml:space="preserve"> informativo</w:t>
@@ -51765,6 +51887,7 @@
       </w:pPr>
       <w:r>
         <w:rPr>
+          <w:highlight w:val="green"/>
           <w:lang w:val="it-IT"/>
         </w:rPr>
         <w:t xml:space="preserve">- </w:t>
@@ -51772,6 +51895,7 @@
       <w:proofErr w:type="gramStart"/>
       <w:r>
         <w:rPr>
+          <w:highlight w:val="green"/>
           <w:lang w:val="it-IT"/>
         </w:rPr>
         <w:t>[ ]</w:t>
@@ -51779,6 +51903,7 @@
       <w:proofErr w:type="gramEnd"/>
       <w:r>
         <w:rPr>
+          <w:highlight w:val="green"/>
           <w:lang w:val="it-IT"/>
         </w:rPr>
         <w:t xml:space="preserve"> Performance fluida anche con molti </w:t>
@@ -51786,6 +51911,7 @@
       <w:proofErr w:type="spellStart"/>
       <w:r>
         <w:rPr>
+          <w:highlight w:val="green"/>
           <w:lang w:val="it-IT"/>
         </w:rPr>
         <w:t>datapoint</w:t>
@@ -51822,11 +51948,13 @@
     <w:p>
       <w:pPr>
         <w:rPr>
-          <w:lang w:val="it-IT"/>
-        </w:rPr>
-      </w:pPr>
-      <w:r>
-        <w:rPr>
+          <w:highlight w:val="green"/>
+          <w:lang w:val="it-IT"/>
+        </w:rPr>
+      </w:pPr>
+      <w:r>
+        <w:rPr>
+          <w:highlight w:val="green"/>
           <w:lang w:val="it-IT"/>
         </w:rPr>
         <w:t>## TASK 4.15: Implementazione Chat AI Component</w:t>
@@ -51835,18 +51963,21 @@
     <w:p>
       <w:pPr>
         <w:rPr>
-          <w:lang w:val="it-IT"/>
-        </w:rPr>
-      </w:pPr>
-    </w:p>
-    <w:p>
-      <w:pPr>
-        <w:rPr>
-          <w:lang w:val="it-IT"/>
-        </w:rPr>
-      </w:pPr>
-      <w:r>
-        <w:rPr>
+          <w:highlight w:val="green"/>
+          <w:lang w:val="it-IT"/>
+        </w:rPr>
+      </w:pPr>
+    </w:p>
+    <w:p>
+      <w:pPr>
+        <w:rPr>
+          <w:highlight w:val="green"/>
+          <w:lang w:val="it-IT"/>
+        </w:rPr>
+      </w:pPr>
+      <w:r>
+        <w:rPr>
+          <w:highlight w:val="green"/>
           <w:lang w:val="it-IT"/>
         </w:rPr>
         <w:t>**</w:t>
@@ -51854,6 +51985,7 @@
       <w:proofErr w:type="gramStart"/>
       <w:r>
         <w:rPr>
+          <w:highlight w:val="green"/>
           <w:lang w:val="it-IT"/>
         </w:rPr>
         <w:t>Descrizione:*</w:t>
@@ -51861,6 +51993,7 @@
       <w:proofErr w:type="gramEnd"/>
       <w:r>
         <w:rPr>
+          <w:highlight w:val="green"/>
           <w:lang w:val="it-IT"/>
         </w:rPr>
         <w:t>* Creare componente chat per interazione con AI.</w:t>
@@ -51869,66 +52002,112 @@
     <w:p>
       <w:pPr>
         <w:rPr>
-          <w:lang w:val="it-IT"/>
-        </w:rPr>
-      </w:pPr>
-    </w:p>
-    <w:p>
-      <w:r>
+          <w:highlight w:val="green"/>
+          <w:lang w:val="it-IT"/>
+        </w:rPr>
+      </w:pPr>
+    </w:p>
+    <w:p>
+      <w:pPr>
+        <w:rPr>
+          <w:highlight w:val="green"/>
+        </w:rPr>
+      </w:pPr>
+      <w:r>
+        <w:rPr>
+          <w:highlight w:val="green"/>
+        </w:rPr>
         <w:t>**</w:t>
       </w:r>
       <w:proofErr w:type="spellStart"/>
       <w:proofErr w:type="gramStart"/>
       <w:r>
+        <w:rPr>
+          <w:highlight w:val="green"/>
+        </w:rPr>
         <w:t>Microstep</w:t>
       </w:r>
       <w:proofErr w:type="spellEnd"/>
       <w:r>
+        <w:rPr>
+          <w:highlight w:val="green"/>
+        </w:rPr>
         <w:t>:*</w:t>
       </w:r>
       <w:proofErr w:type="gramEnd"/>
       <w:r>
+        <w:rPr>
+          <w:highlight w:val="green"/>
+        </w:rPr>
         <w:t>*</w:t>
       </w:r>
     </w:p>
     <w:p>
-      <w:r>
+      <w:pPr>
+        <w:rPr>
+          <w:highlight w:val="green"/>
+        </w:rPr>
+      </w:pPr>
+      <w:r>
+        <w:rPr>
+          <w:highlight w:val="green"/>
+        </w:rPr>
         <w:lastRenderedPageBreak/>
         <w:t xml:space="preserve">1. </w:t>
       </w:r>
       <w:proofErr w:type="spellStart"/>
       <w:r>
+        <w:rPr>
+          <w:highlight w:val="green"/>
+        </w:rPr>
         <w:t>Creare</w:t>
       </w:r>
       <w:proofErr w:type="spellEnd"/>
       <w:r>
+        <w:rPr>
+          <w:highlight w:val="green"/>
+        </w:rPr>
         <w:t xml:space="preserve"> file `frontend/</w:t>
       </w:r>
       <w:proofErr w:type="spellStart"/>
       <w:r>
+        <w:rPr>
+          <w:highlight w:val="green"/>
+        </w:rPr>
         <w:t>src</w:t>
       </w:r>
       <w:proofErr w:type="spellEnd"/>
       <w:r>
+        <w:rPr>
+          <w:highlight w:val="green"/>
+        </w:rPr>
         <w:t>/features/chat-ai/components/</w:t>
       </w:r>
       <w:proofErr w:type="spellStart"/>
       <w:r>
+        <w:rPr>
+          <w:highlight w:val="green"/>
+        </w:rPr>
         <w:t>ChatInterface.tsx</w:t>
       </w:r>
       <w:proofErr w:type="spellEnd"/>
       <w:r>
+        <w:rPr>
+          <w:highlight w:val="green"/>
+        </w:rPr>
         <w:t>`</w:t>
       </w:r>
     </w:p>
     <w:p>
       <w:pPr>
         <w:rPr>
-          <w:lang w:val="it-IT"/>
-        </w:rPr>
-      </w:pPr>
-      <w:r>
-        <w:rPr>
+          <w:highlight w:val="green"/>
+          <w:lang w:val="it-IT"/>
+        </w:rPr>
+      </w:pPr>
+      <w:r>
+        <w:rPr>
+          <w:highlight w:val="green"/>
           <w:lang w:val="it-IT"/>
         </w:rPr>
         <w:t>2. Implementare lista messaggi con distinzione user/</w:t>
@@ -51936,6 +52115,7 @@
       <w:proofErr w:type="spellStart"/>
       <w:r>
         <w:rPr>
+          <w:highlight w:val="green"/>
           <w:lang w:val="it-IT"/>
         </w:rPr>
         <w:t>assistant</w:t>
@@ -51945,53 +52125,83 @@
     <w:p>
       <w:pPr>
         <w:rPr>
-          <w:lang w:val="it-IT"/>
-        </w:rPr>
-      </w:pPr>
-      <w:r>
-        <w:rPr>
+          <w:highlight w:val="green"/>
+          <w:lang w:val="it-IT"/>
+        </w:rPr>
+      </w:pPr>
+      <w:r>
+        <w:rPr>
+          <w:highlight w:val="green"/>
           <w:lang w:val="it-IT"/>
         </w:rPr>
         <w:t>3. Implementare input con invio su Enter e bottone</w:t>
       </w:r>
     </w:p>
     <w:p>
-      <w:r>
+      <w:pPr>
+        <w:rPr>
+          <w:highlight w:val="green"/>
+        </w:rPr>
+      </w:pPr>
+      <w:r>
+        <w:rPr>
+          <w:highlight w:val="green"/>
+        </w:rPr>
         <w:t xml:space="preserve">4. </w:t>
       </w:r>
       <w:proofErr w:type="spellStart"/>
       <w:r>
+        <w:rPr>
+          <w:highlight w:val="green"/>
+        </w:rPr>
         <w:t>Implementare</w:t>
       </w:r>
       <w:proofErr w:type="spellEnd"/>
       <w:r>
+        <w:rPr>
+          <w:highlight w:val="green"/>
+        </w:rPr>
         <w:t xml:space="preserve"> hook `</w:t>
       </w:r>
       <w:proofErr w:type="spellStart"/>
       <w:r>
+        <w:rPr>
+          <w:highlight w:val="green"/>
+        </w:rPr>
         <w:t>useSendChatMessage</w:t>
       </w:r>
       <w:proofErr w:type="spellEnd"/>
       <w:r>
+        <w:rPr>
+          <w:highlight w:val="green"/>
+        </w:rPr>
         <w:t>` per POST a /</w:t>
       </w:r>
       <w:proofErr w:type="spellStart"/>
       <w:r>
+        <w:rPr>
+          <w:highlight w:val="green"/>
+        </w:rPr>
         <w:t>api</w:t>
       </w:r>
       <w:proofErr w:type="spellEnd"/>
       <w:r>
+        <w:rPr>
+          <w:highlight w:val="green"/>
+        </w:rPr>
         <w:t>/chat</w:t>
       </w:r>
     </w:p>
     <w:p>
       <w:pPr>
         <w:rPr>
-          <w:lang w:val="it-IT"/>
-        </w:rPr>
-      </w:pPr>
-      <w:r>
-        <w:rPr>
+          <w:highlight w:val="green"/>
+          <w:lang w:val="it-IT"/>
+        </w:rPr>
+      </w:pPr>
+      <w:r>
+        <w:rPr>
+          <w:highlight w:val="green"/>
           <w:lang w:val="it-IT"/>
         </w:rPr>
         <w:t xml:space="preserve">5. Mostrare indicatore </w:t>
@@ -51999,6 +52209,7 @@
       <w:proofErr w:type="spellStart"/>
       <w:r>
         <w:rPr>
+          <w:highlight w:val="green"/>
           <w:lang w:val="it-IT"/>
         </w:rPr>
         <w:t>typing</w:t>
@@ -52006,6 +52217,7 @@
       <w:proofErr w:type="spellEnd"/>
       <w:r>
         <w:rPr>
+          <w:highlight w:val="green"/>
           <w:lang w:val="it-IT"/>
         </w:rPr>
         <w:t xml:space="preserve"> durante attesa risposta</w:t>
@@ -52014,11 +52226,13 @@
     <w:p>
       <w:pPr>
         <w:rPr>
-          <w:lang w:val="it-IT"/>
-        </w:rPr>
-      </w:pPr>
-      <w:r>
-        <w:rPr>
+          <w:highlight w:val="green"/>
+          <w:lang w:val="it-IT"/>
+        </w:rPr>
+      </w:pPr>
+      <w:r>
+        <w:rPr>
+          <w:highlight w:val="green"/>
           <w:lang w:val="it-IT"/>
         </w:rPr>
         <w:t xml:space="preserve">6. Supportare </w:t>
@@ -52026,6 +52240,7 @@
       <w:proofErr w:type="spellStart"/>
       <w:r>
         <w:rPr>
+          <w:highlight w:val="green"/>
           <w:lang w:val="it-IT"/>
         </w:rPr>
         <w:t>markdown</w:t>
@@ -52033,6 +52248,7 @@
       <w:proofErr w:type="spellEnd"/>
       <w:r>
         <w:rPr>
+          <w:highlight w:val="green"/>
           <w:lang w:val="it-IT"/>
         </w:rPr>
         <w:t xml:space="preserve"> nella risposta AI</w:t>
@@ -52041,11 +52257,13 @@
     <w:p>
       <w:pPr>
         <w:rPr>
-          <w:lang w:val="it-IT"/>
-        </w:rPr>
-      </w:pPr>
-      <w:r>
-        <w:rPr>
+          <w:highlight w:val="green"/>
+          <w:lang w:val="it-IT"/>
+        </w:rPr>
+      </w:pPr>
+      <w:r>
+        <w:rPr>
+          <w:highlight w:val="green"/>
           <w:lang w:val="it-IT"/>
         </w:rPr>
         <w:t>7. Implementare scroll automatico a nuovo messaggio</w:t>
@@ -52054,11 +52272,13 @@
     <w:p>
       <w:pPr>
         <w:rPr>
-          <w:lang w:val="it-IT"/>
-        </w:rPr>
-      </w:pPr>
-      <w:r>
-        <w:rPr>
+          <w:highlight w:val="green"/>
+          <w:lang w:val="it-IT"/>
+        </w:rPr>
+      </w:pPr>
+      <w:r>
+        <w:rPr>
+          <w:highlight w:val="green"/>
           <w:lang w:val="it-IT"/>
         </w:rPr>
         <w:t xml:space="preserve">8. Persistere cronologia chat in </w:t>
@@ -52066,6 +52286,7 @@
       <w:proofErr w:type="spellStart"/>
       <w:r>
         <w:rPr>
+          <w:highlight w:val="green"/>
           <w:lang w:val="it-IT"/>
         </w:rPr>
         <w:t>sessionStorage</w:t>
@@ -52075,18 +52296,21 @@
     <w:p>
       <w:pPr>
         <w:rPr>
-          <w:lang w:val="it-IT"/>
-        </w:rPr>
-      </w:pPr>
-    </w:p>
-    <w:p>
-      <w:pPr>
-        <w:rPr>
-          <w:lang w:val="it-IT"/>
-        </w:rPr>
-      </w:pPr>
-      <w:r>
-        <w:rPr>
+          <w:highlight w:val="green"/>
+          <w:lang w:val="it-IT"/>
+        </w:rPr>
+      </w:pPr>
+    </w:p>
+    <w:p>
+      <w:pPr>
+        <w:rPr>
+          <w:highlight w:val="green"/>
+          <w:lang w:val="it-IT"/>
+        </w:rPr>
+      </w:pPr>
+      <w:r>
+        <w:rPr>
+          <w:highlight w:val="green"/>
           <w:lang w:val="it-IT"/>
         </w:rPr>
         <w:t>**</w:t>
@@ -52094,6 +52318,7 @@
       <w:proofErr w:type="spellStart"/>
       <w:r>
         <w:rPr>
+          <w:highlight w:val="green"/>
           <w:lang w:val="it-IT"/>
         </w:rPr>
         <w:t>Acceptance</w:t>
@@ -52101,6 +52326,7 @@
       <w:proofErr w:type="spellEnd"/>
       <w:r>
         <w:rPr>
+          <w:highlight w:val="green"/>
           <w:lang w:val="it-IT"/>
         </w:rPr>
         <w:t xml:space="preserve"> </w:t>
@@ -52109,6 +52335,7 @@
       <w:proofErr w:type="gramStart"/>
       <w:r>
         <w:rPr>
+          <w:highlight w:val="green"/>
           <w:lang w:val="it-IT"/>
         </w:rPr>
         <w:t>Criteria</w:t>
@@ -52116,6 +52343,7 @@
       <w:proofErr w:type="spellEnd"/>
       <w:r>
         <w:rPr>
+          <w:highlight w:val="green"/>
           <w:lang w:val="it-IT"/>
         </w:rPr>
         <w:t>:*</w:t>
@@ -52123,6 +52351,7 @@
       <w:proofErr w:type="gramEnd"/>
       <w:r>
         <w:rPr>
+          <w:highlight w:val="green"/>
           <w:lang w:val="it-IT"/>
         </w:rPr>
         <w:t>*</w:t>
@@ -52131,11 +52360,13 @@
     <w:p>
       <w:pPr>
         <w:rPr>
-          <w:lang w:val="it-IT"/>
-        </w:rPr>
-      </w:pPr>
-      <w:r>
-        <w:rPr>
+          <w:highlight w:val="green"/>
+          <w:lang w:val="it-IT"/>
+        </w:rPr>
+      </w:pPr>
+      <w:r>
+        <w:rPr>
+          <w:highlight w:val="green"/>
           <w:lang w:val="it-IT"/>
         </w:rPr>
         <w:t xml:space="preserve">- </w:t>
@@ -52143,6 +52374,7 @@
       <w:proofErr w:type="gramStart"/>
       <w:r>
         <w:rPr>
+          <w:highlight w:val="green"/>
           <w:lang w:val="it-IT"/>
         </w:rPr>
         <w:t>[ ]</w:t>
@@ -52150,6 +52382,7 @@
       <w:proofErr w:type="gramEnd"/>
       <w:r>
         <w:rPr>
+          <w:highlight w:val="green"/>
           <w:lang w:val="it-IT"/>
         </w:rPr>
         <w:t xml:space="preserve"> Messaggi distinti visivamente per ruolo</w:t>
@@ -52158,11 +52391,13 @@
     <w:p>
       <w:pPr>
         <w:rPr>
-          <w:lang w:val="it-IT"/>
-        </w:rPr>
-      </w:pPr>
-      <w:r>
-        <w:rPr>
+          <w:highlight w:val="green"/>
+          <w:lang w:val="it-IT"/>
+        </w:rPr>
+      </w:pPr>
+      <w:r>
+        <w:rPr>
+          <w:highlight w:val="green"/>
           <w:lang w:val="it-IT"/>
         </w:rPr>
         <w:t xml:space="preserve">- </w:t>
@@ -52170,6 +52405,7 @@
       <w:proofErr w:type="gramStart"/>
       <w:r>
         <w:rPr>
+          <w:highlight w:val="green"/>
           <w:lang w:val="it-IT"/>
         </w:rPr>
         <w:t>[ ]</w:t>
@@ -52177,6 +52413,7 @@
       <w:proofErr w:type="gramEnd"/>
       <w:r>
         <w:rPr>
+          <w:highlight w:val="green"/>
           <w:lang w:val="it-IT"/>
         </w:rPr>
         <w:t xml:space="preserve"> Input funziona con Enter e click</w:t>
@@ -52185,11 +52422,13 @@
     <w:p>
       <w:pPr>
         <w:rPr>
-          <w:lang w:val="it-IT"/>
-        </w:rPr>
-      </w:pPr>
-      <w:r>
-        <w:rPr>
+          <w:highlight w:val="green"/>
+          <w:lang w:val="it-IT"/>
+        </w:rPr>
+      </w:pPr>
+      <w:r>
+        <w:rPr>
+          <w:highlight w:val="green"/>
           <w:lang w:val="it-IT"/>
         </w:rPr>
         <w:t xml:space="preserve">- </w:t>
@@ -52197,6 +52436,7 @@
       <w:proofErr w:type="gramStart"/>
       <w:r>
         <w:rPr>
+          <w:highlight w:val="green"/>
           <w:lang w:val="it-IT"/>
         </w:rPr>
         <w:t>[ ]</w:t>
@@ -52204,6 +52444,7 @@
       <w:proofErr w:type="gramEnd"/>
       <w:r>
         <w:rPr>
+          <w:highlight w:val="green"/>
           <w:lang w:val="it-IT"/>
         </w:rPr>
         <w:t xml:space="preserve"> Indicatore loading durante attesa</w:t>
@@ -52212,11 +52453,13 @@
     <w:p>
       <w:pPr>
         <w:rPr>
-          <w:lang w:val="it-IT"/>
-        </w:rPr>
-      </w:pPr>
-      <w:r>
-        <w:rPr>
+          <w:highlight w:val="green"/>
+          <w:lang w:val="it-IT"/>
+        </w:rPr>
+      </w:pPr>
+      <w:r>
+        <w:rPr>
+          <w:highlight w:val="green"/>
           <w:lang w:val="it-IT"/>
         </w:rPr>
         <w:t xml:space="preserve">- </w:t>
@@ -52224,6 +52467,7 @@
       <w:proofErr w:type="gramStart"/>
       <w:r>
         <w:rPr>
+          <w:highlight w:val="green"/>
           <w:lang w:val="it-IT"/>
         </w:rPr>
         <w:t>[ ]</w:t>
@@ -52231,6 +52475,7 @@
       <w:proofErr w:type="gramEnd"/>
       <w:r>
         <w:rPr>
+          <w:highlight w:val="green"/>
           <w:lang w:val="it-IT"/>
         </w:rPr>
         <w:t xml:space="preserve"> </w:t>
@@ -52238,6 +52483,7 @@
       <w:proofErr w:type="spellStart"/>
       <w:r>
         <w:rPr>
+          <w:highlight w:val="green"/>
           <w:lang w:val="it-IT"/>
         </w:rPr>
         <w:t>Markdown</w:t>
@@ -52245,6 +52491,7 @@
       <w:proofErr w:type="spellEnd"/>
       <w:r>
         <w:rPr>
+          <w:highlight w:val="green"/>
           <w:lang w:val="it-IT"/>
         </w:rPr>
         <w:t xml:space="preserve"> renderizzato (grassetto, elenchi, codice)</w:t>
@@ -52258,6 +52505,7 @@
       </w:pPr>
       <w:r>
         <w:rPr>
+          <w:highlight w:val="green"/>
           <w:lang w:val="it-IT"/>
         </w:rPr>
         <w:t xml:space="preserve">- </w:t>
@@ -52265,6 +52513,7 @@
       <w:proofErr w:type="gramStart"/>
       <w:r>
         <w:rPr>
+          <w:highlight w:val="green"/>
           <w:lang w:val="it-IT"/>
         </w:rPr>
         <w:t>[ ]</w:t>
@@ -52272,6 +52521,7 @@
       <w:proofErr w:type="gramEnd"/>
       <w:r>
         <w:rPr>
+          <w:highlight w:val="green"/>
           <w:lang w:val="it-IT"/>
         </w:rPr>
         <w:t xml:space="preserve"> Scroll a nuovo messaggio</w:t>

</xml_diff>

<commit_message>
feat: implement estimate creation form with real-time preview, supporting API queries, and type definitions.
</commit_message>
<xml_diff>
--- a/Piano-operativo-v1.7.docx
+++ b/Piano-operativo-v1.7.docx
@@ -8811,7 +8811,71 @@
           <w:highlight w:val="green"/>
           <w:lang w:val="it-IT"/>
         </w:rPr>
-        <w:t xml:space="preserve">Implementare funzioni: addPercentage, subtractPercentage, formatPercentage(percentage, </w:t>
+        <w:t>Implementare funzioni: </w:t>
+      </w:r>
+      <w:proofErr w:type="spellStart"/>
+      <w:r>
+        <w:rPr>
+          <w:highlight w:val="green"/>
+          <w:lang w:val="it-IT"/>
+        </w:rPr>
+        <w:t>addPercentage</w:t>
+      </w:r>
+      <w:proofErr w:type="spellEnd"/>
+      <w:r>
+        <w:rPr>
+          <w:highlight w:val="green"/>
+          <w:lang w:val="it-IT"/>
+        </w:rPr>
+        <w:t>, </w:t>
+      </w:r>
+      <w:proofErr w:type="spellStart"/>
+      <w:r>
+        <w:rPr>
+          <w:highlight w:val="green"/>
+          <w:lang w:val="it-IT"/>
+        </w:rPr>
+        <w:t>subtractPercentage</w:t>
+      </w:r>
+      <w:proofErr w:type="spellEnd"/>
+      <w:r>
+        <w:rPr>
+          <w:highlight w:val="green"/>
+          <w:lang w:val="it-IT"/>
+        </w:rPr>
+        <w:t>, </w:t>
+      </w:r>
+      <w:proofErr w:type="spellStart"/>
+      <w:r>
+        <w:rPr>
+          <w:highlight w:val="green"/>
+          <w:lang w:val="it-IT"/>
+        </w:rPr>
+        <w:t>formatPercentage</w:t>
+      </w:r>
+      <w:proofErr w:type="spellEnd"/>
+      <w:r>
+        <w:rPr>
+          <w:highlight w:val="green"/>
+          <w:lang w:val="it-IT"/>
+        </w:rPr>
+        <w:t>(</w:t>
+      </w:r>
+      <w:proofErr w:type="spellStart"/>
+      <w:r>
+        <w:rPr>
+          <w:highlight w:val="green"/>
+          <w:lang w:val="it-IT"/>
+        </w:rPr>
+        <w:t>percentage</w:t>
+      </w:r>
+      <w:proofErr w:type="spellEnd"/>
+      <w:r>
+        <w:rPr>
+          <w:highlight w:val="green"/>
+          <w:lang w:val="it-IT"/>
+        </w:rPr>
+        <w:t xml:space="preserve">, </w:t>
       </w:r>
       <w:proofErr w:type="spellStart"/>
       <w:r>
@@ -52569,6 +52633,7 @@
       </w:pPr>
       <w:r>
         <w:rPr>
+          <w:highlight w:val="green"/>
           <w:lang w:val="it-IT"/>
         </w:rPr>
         <w:t># SEZIONE 5: TESTING, CI/CD, OPERAZIONI</w:t>
@@ -53327,15 +53392,7 @@
       </w:r>
     </w:p>
     <w:p>
-      <w:pPr>
-        <w:rPr>
-          <w:lang w:val="it-IT"/>
-        </w:rPr>
-      </w:pPr>
-      <w:r>
-        <w:rPr>
-          <w:lang w:val="it-IT"/>
-        </w:rPr>
+      <w:r>
         <w:t>- [ ] Edge cases coperti (zero, negativo, overflow)</w:t>
       </w:r>
     </w:p>
@@ -53456,28 +53513,12 @@
       </w:pPr>
     </w:p>
     <w:p>
-      <w:pPr>
-        <w:rPr>
-          <w:lang w:val="it-IT"/>
-        </w:rPr>
-      </w:pPr>
-      <w:r>
-        <w:rPr>
-          <w:lang w:val="it-IT"/>
-        </w:rPr>
+      <w:r>
         <w:t>**Microstep:**</w:t>
       </w:r>
     </w:p>
     <w:p>
-      <w:pPr>
-        <w:rPr>
-          <w:lang w:val="it-IT"/>
-        </w:rPr>
-      </w:pPr>
-      <w:r>
-        <w:rPr>
-          <w:lang w:val="it-IT"/>
-        </w:rPr>
+      <w:r>
         <w:t>1. Creare file `backend/tests/unit/estimates/test_estimate_service.py`</w:t>
       </w:r>
     </w:p>
@@ -54842,15 +54883,7 @@
     </w:p>
     <w:p/>
     <w:p>
-      <w:pPr>
-        <w:rPr>
-          <w:lang w:val="it-IT"/>
-        </w:rPr>
-      </w:pPr>
-      <w:r>
-        <w:rPr>
-          <w:lang w:val="it-IT"/>
-        </w:rPr>
+      <w:r>
         <w:t>**Microstep:**</w:t>
       </w:r>
     </w:p>

</xml_diff>

<commit_message>
feat: Add initial testing infrastructure with pytest fixtures, in-memory database, and project configuration.
</commit_message>
<xml_diff>
--- a/Piano-operativo-v1.7.docx
+++ b/Piano-operativo-v1.7.docx
@@ -52653,306 +52653,600 @@
     </w:p>
     <w:p/>
     <w:p>
-      <w:r>
+      <w:pPr>
+        <w:rPr>
+          <w:highlight w:val="green"/>
+        </w:rPr>
+      </w:pPr>
+      <w:r>
+        <w:rPr>
+          <w:highlight w:val="green"/>
+        </w:rPr>
         <w:t>## TASK 5.1: Setup Test Framework Backend</w:t>
       </w:r>
     </w:p>
-    <w:p/>
-    <w:p>
-      <w:r>
+    <w:p>
+      <w:pPr>
+        <w:rPr>
+          <w:highlight w:val="green"/>
+        </w:rPr>
+      </w:pPr>
+    </w:p>
+    <w:p>
+      <w:pPr>
+        <w:rPr>
+          <w:highlight w:val="green"/>
+        </w:rPr>
+      </w:pPr>
+      <w:r>
+        <w:rPr>
+          <w:highlight w:val="green"/>
+        </w:rPr>
         <w:t>**</w:t>
       </w:r>
       <w:proofErr w:type="spellStart"/>
       <w:proofErr w:type="gramStart"/>
       <w:r>
+        <w:rPr>
+          <w:highlight w:val="green"/>
+        </w:rPr>
         <w:t>Descrizione</w:t>
       </w:r>
       <w:proofErr w:type="spellEnd"/>
       <w:r>
+        <w:rPr>
+          <w:highlight w:val="green"/>
+        </w:rPr>
         <w:t>:*</w:t>
       </w:r>
       <w:proofErr w:type="gramEnd"/>
       <w:r>
+        <w:rPr>
+          <w:highlight w:val="green"/>
+        </w:rPr>
         <w:t xml:space="preserve">* </w:t>
       </w:r>
       <w:proofErr w:type="spellStart"/>
       <w:r>
+        <w:rPr>
+          <w:highlight w:val="green"/>
+        </w:rPr>
         <w:t>Configurare</w:t>
       </w:r>
       <w:proofErr w:type="spellEnd"/>
       <w:r>
+        <w:rPr>
+          <w:highlight w:val="green"/>
+        </w:rPr>
         <w:t xml:space="preserve"> framework testing per backend Python.</w:t>
       </w:r>
     </w:p>
-    <w:p/>
-    <w:p>
-      <w:r>
+    <w:p>
+      <w:pPr>
+        <w:rPr>
+          <w:highlight w:val="green"/>
+        </w:rPr>
+      </w:pPr>
+    </w:p>
+    <w:p>
+      <w:pPr>
+        <w:rPr>
+          <w:highlight w:val="green"/>
+        </w:rPr>
+      </w:pPr>
+      <w:r>
+        <w:rPr>
+          <w:highlight w:val="green"/>
+        </w:rPr>
         <w:t>**</w:t>
       </w:r>
       <w:proofErr w:type="spellStart"/>
       <w:proofErr w:type="gramStart"/>
       <w:r>
+        <w:rPr>
+          <w:highlight w:val="green"/>
+        </w:rPr>
         <w:t>Microstep</w:t>
       </w:r>
       <w:proofErr w:type="spellEnd"/>
       <w:r>
+        <w:rPr>
+          <w:highlight w:val="green"/>
+        </w:rPr>
         <w:t>:*</w:t>
       </w:r>
       <w:proofErr w:type="gramEnd"/>
       <w:r>
+        <w:rPr>
+          <w:highlight w:val="green"/>
+        </w:rPr>
         <w:t>*</w:t>
       </w:r>
     </w:p>
     <w:p>
-      <w:r>
+      <w:pPr>
+        <w:rPr>
+          <w:highlight w:val="green"/>
+        </w:rPr>
+      </w:pPr>
+      <w:r>
+        <w:rPr>
+          <w:highlight w:val="green"/>
+        </w:rPr>
         <w:t xml:space="preserve">1. </w:t>
       </w:r>
       <w:proofErr w:type="spellStart"/>
       <w:r>
+        <w:rPr>
+          <w:highlight w:val="green"/>
+        </w:rPr>
         <w:t>Verificare</w:t>
       </w:r>
       <w:proofErr w:type="spellEnd"/>
       <w:r>
+        <w:rPr>
+          <w:highlight w:val="green"/>
+        </w:rPr>
         <w:t xml:space="preserve"> </w:t>
       </w:r>
       <w:proofErr w:type="spellStart"/>
       <w:r>
+        <w:rPr>
+          <w:highlight w:val="green"/>
+        </w:rPr>
         <w:t>dipendenze</w:t>
       </w:r>
       <w:proofErr w:type="spellEnd"/>
       <w:r>
+        <w:rPr>
+          <w:highlight w:val="green"/>
+        </w:rPr>
         <w:t xml:space="preserve">: </w:t>
       </w:r>
       <w:proofErr w:type="spellStart"/>
       <w:r>
+        <w:rPr>
+          <w:highlight w:val="green"/>
+        </w:rPr>
         <w:t>pytest</w:t>
       </w:r>
       <w:proofErr w:type="spellEnd"/>
       <w:r>
+        <w:rPr>
+          <w:highlight w:val="green"/>
+        </w:rPr>
         <w:t xml:space="preserve">, </w:t>
       </w:r>
       <w:proofErr w:type="spellStart"/>
       <w:r>
+        <w:rPr>
+          <w:highlight w:val="green"/>
+        </w:rPr>
         <w:t>pytest-asyncio</w:t>
       </w:r>
       <w:proofErr w:type="spellEnd"/>
       <w:r>
+        <w:rPr>
+          <w:highlight w:val="green"/>
+        </w:rPr>
         <w:t xml:space="preserve">, </w:t>
       </w:r>
       <w:proofErr w:type="spellStart"/>
       <w:r>
+        <w:rPr>
+          <w:highlight w:val="green"/>
+        </w:rPr>
         <w:t>pytest-cov</w:t>
       </w:r>
       <w:proofErr w:type="spellEnd"/>
       <w:r>
+        <w:rPr>
+          <w:highlight w:val="green"/>
+        </w:rPr>
         <w:t xml:space="preserve">, </w:t>
       </w:r>
       <w:proofErr w:type="spellStart"/>
       <w:r>
+        <w:rPr>
+          <w:highlight w:val="green"/>
+        </w:rPr>
         <w:t>httpx</w:t>
       </w:r>
       <w:proofErr w:type="spellEnd"/>
     </w:p>
     <w:p>
-      <w:r>
+      <w:pPr>
+        <w:rPr>
+          <w:highlight w:val="green"/>
+        </w:rPr>
+      </w:pPr>
+      <w:r>
+        <w:rPr>
+          <w:highlight w:val="green"/>
+        </w:rPr>
         <w:t xml:space="preserve">2. </w:t>
       </w:r>
       <w:proofErr w:type="spellStart"/>
       <w:r>
+        <w:rPr>
+          <w:highlight w:val="green"/>
+        </w:rPr>
         <w:t>Creare</w:t>
       </w:r>
       <w:proofErr w:type="spellEnd"/>
       <w:r>
+        <w:rPr>
+          <w:highlight w:val="green"/>
+        </w:rPr>
         <w:t xml:space="preserve"> file `backend/tests/conftest.py`</w:t>
       </w:r>
     </w:p>
     <w:p>
-      <w:r>
+      <w:pPr>
+        <w:rPr>
+          <w:highlight w:val="green"/>
+        </w:rPr>
+      </w:pPr>
+      <w:r>
+        <w:rPr>
+          <w:highlight w:val="green"/>
+        </w:rPr>
         <w:t xml:space="preserve">3. </w:t>
       </w:r>
       <w:proofErr w:type="spellStart"/>
       <w:r>
+        <w:rPr>
+          <w:highlight w:val="green"/>
+        </w:rPr>
         <w:t>Configurare</w:t>
       </w:r>
       <w:proofErr w:type="spellEnd"/>
       <w:r>
+        <w:rPr>
+          <w:highlight w:val="green"/>
+        </w:rPr>
         <w:t xml:space="preserve"> fixture per database test (PostgreSQL in container o SQLite </w:t>
       </w:r>
       <w:proofErr w:type="gramStart"/>
       <w:r>
+        <w:rPr>
+          <w:highlight w:val="green"/>
+        </w:rPr>
         <w:t>in-memory</w:t>
       </w:r>
       <w:proofErr w:type="gramEnd"/>
       <w:r>
+        <w:rPr>
+          <w:highlight w:val="green"/>
+        </w:rPr>
         <w:t>)</w:t>
       </w:r>
     </w:p>
     <w:p>
-      <w:r>
+      <w:pPr>
+        <w:rPr>
+          <w:highlight w:val="green"/>
+        </w:rPr>
+      </w:pPr>
+      <w:r>
+        <w:rPr>
+          <w:highlight w:val="green"/>
+        </w:rPr>
         <w:t xml:space="preserve">4. </w:t>
       </w:r>
       <w:proofErr w:type="spellStart"/>
       <w:r>
+        <w:rPr>
+          <w:highlight w:val="green"/>
+        </w:rPr>
         <w:t>Configurare</w:t>
       </w:r>
       <w:proofErr w:type="spellEnd"/>
       <w:r>
+        <w:rPr>
+          <w:highlight w:val="green"/>
+        </w:rPr>
         <w:t xml:space="preserve"> fixture per client HTTP (</w:t>
       </w:r>
       <w:proofErr w:type="spellStart"/>
       <w:r>
+        <w:rPr>
+          <w:highlight w:val="green"/>
+        </w:rPr>
         <w:t>TestClient</w:t>
       </w:r>
       <w:proofErr w:type="spellEnd"/>
       <w:r>
+        <w:rPr>
+          <w:highlight w:val="green"/>
+        </w:rPr>
         <w:t xml:space="preserve"> async)</w:t>
       </w:r>
     </w:p>
     <w:p>
-      <w:r>
+      <w:pPr>
+        <w:rPr>
+          <w:highlight w:val="green"/>
+        </w:rPr>
+      </w:pPr>
+      <w:r>
+        <w:rPr>
+          <w:highlight w:val="green"/>
+        </w:rPr>
         <w:t xml:space="preserve">5. </w:t>
       </w:r>
       <w:proofErr w:type="spellStart"/>
       <w:r>
+        <w:rPr>
+          <w:highlight w:val="green"/>
+        </w:rPr>
         <w:t>Configurare</w:t>
       </w:r>
       <w:proofErr w:type="spellEnd"/>
       <w:r>
+        <w:rPr>
+          <w:highlight w:val="green"/>
+        </w:rPr>
         <w:t xml:space="preserve"> fixture per mock services (Yahoo, Drive)</w:t>
       </w:r>
     </w:p>
     <w:p>
-      <w:r>
+      <w:pPr>
+        <w:rPr>
+          <w:highlight w:val="green"/>
+        </w:rPr>
+      </w:pPr>
+      <w:r>
+        <w:rPr>
+          <w:highlight w:val="green"/>
+        </w:rPr>
         <w:t xml:space="preserve">6. </w:t>
       </w:r>
       <w:proofErr w:type="spellStart"/>
       <w:r>
+        <w:rPr>
+          <w:highlight w:val="green"/>
+        </w:rPr>
         <w:t>Creare</w:t>
       </w:r>
       <w:proofErr w:type="spellEnd"/>
       <w:r>
+        <w:rPr>
+          <w:highlight w:val="green"/>
+        </w:rPr>
         <w:t xml:space="preserve"> </w:t>
       </w:r>
       <w:proofErr w:type="spellStart"/>
       <w:r>
+        <w:rPr>
+          <w:highlight w:val="green"/>
+        </w:rPr>
         <w:t>cartelle</w:t>
       </w:r>
       <w:proofErr w:type="spellEnd"/>
       <w:r>
+        <w:rPr>
+          <w:highlight w:val="green"/>
+        </w:rPr>
         <w:t>: `tests/unit/`, `tests/integration/`, `tests/e2e/`</w:t>
       </w:r>
     </w:p>
     <w:p>
-      <w:r>
+      <w:pPr>
+        <w:rPr>
+          <w:highlight w:val="green"/>
+        </w:rPr>
+      </w:pPr>
+      <w:r>
+        <w:rPr>
+          <w:highlight w:val="green"/>
+        </w:rPr>
         <w:t xml:space="preserve">7. </w:t>
       </w:r>
       <w:proofErr w:type="spellStart"/>
       <w:r>
+        <w:rPr>
+          <w:highlight w:val="green"/>
+        </w:rPr>
         <w:t>Configurare</w:t>
       </w:r>
       <w:proofErr w:type="spellEnd"/>
       <w:r>
+        <w:rPr>
+          <w:highlight w:val="green"/>
+        </w:rPr>
         <w:t xml:space="preserve"> pytest.ini con markers (unit, integration, e2e)</w:t>
       </w:r>
     </w:p>
     <w:p>
-      <w:r>
+      <w:pPr>
+        <w:rPr>
+          <w:highlight w:val="green"/>
+        </w:rPr>
+      </w:pPr>
+      <w:r>
+        <w:rPr>
+          <w:highlight w:val="green"/>
+        </w:rPr>
         <w:t xml:space="preserve">8. </w:t>
       </w:r>
       <w:proofErr w:type="spellStart"/>
       <w:r>
+        <w:rPr>
+          <w:highlight w:val="green"/>
+        </w:rPr>
         <w:t>Configurare</w:t>
       </w:r>
       <w:proofErr w:type="spellEnd"/>
       <w:r>
+        <w:rPr>
+          <w:highlight w:val="green"/>
+        </w:rPr>
         <w:t xml:space="preserve"> coverage minima 80%</w:t>
       </w:r>
     </w:p>
-    <w:p/>
-    <w:p>
-      <w:r>
+    <w:p>
+      <w:pPr>
+        <w:rPr>
+          <w:highlight w:val="green"/>
+        </w:rPr>
+      </w:pPr>
+    </w:p>
+    <w:p>
+      <w:pPr>
+        <w:rPr>
+          <w:highlight w:val="green"/>
+        </w:rPr>
+      </w:pPr>
+      <w:r>
+        <w:rPr>
+          <w:highlight w:val="green"/>
+        </w:rPr>
         <w:t xml:space="preserve">**Acceptance </w:t>
       </w:r>
       <w:proofErr w:type="gramStart"/>
       <w:r>
+        <w:rPr>
+          <w:highlight w:val="green"/>
+        </w:rPr>
         <w:t>Criteria:*</w:t>
       </w:r>
       <w:proofErr w:type="gramEnd"/>
       <w:r>
+        <w:rPr>
+          <w:highlight w:val="green"/>
+        </w:rPr>
         <w:t>*</w:t>
       </w:r>
     </w:p>
     <w:p>
-      <w:r>
+      <w:pPr>
+        <w:rPr>
+          <w:highlight w:val="green"/>
+        </w:rPr>
+      </w:pPr>
+      <w:r>
+        <w:rPr>
+          <w:highlight w:val="green"/>
+        </w:rPr>
         <w:t xml:space="preserve">- </w:t>
       </w:r>
       <w:proofErr w:type="gramStart"/>
       <w:r>
+        <w:rPr>
+          <w:highlight w:val="green"/>
+        </w:rPr>
         <w:t>[ ]</w:t>
       </w:r>
       <w:proofErr w:type="gramEnd"/>
       <w:r>
+        <w:rPr>
+          <w:highlight w:val="green"/>
+        </w:rPr>
         <w:t xml:space="preserve"> `</w:t>
       </w:r>
       <w:proofErr w:type="spellStart"/>
       <w:r>
+        <w:rPr>
+          <w:highlight w:val="green"/>
+        </w:rPr>
         <w:t>pytest</w:t>
       </w:r>
       <w:proofErr w:type="spellEnd"/>
       <w:r>
+        <w:rPr>
+          <w:highlight w:val="green"/>
+        </w:rPr>
         <w:t xml:space="preserve"> tests/unit` </w:t>
       </w:r>
       <w:proofErr w:type="spellStart"/>
       <w:r>
+        <w:rPr>
+          <w:highlight w:val="green"/>
+        </w:rPr>
         <w:t>esegue</w:t>
       </w:r>
       <w:proofErr w:type="spellEnd"/>
       <w:r>
+        <w:rPr>
+          <w:highlight w:val="green"/>
+        </w:rPr>
         <w:t xml:space="preserve"> test </w:t>
       </w:r>
       <w:proofErr w:type="spellStart"/>
       <w:r>
+        <w:rPr>
+          <w:highlight w:val="green"/>
+        </w:rPr>
         <w:t>unitari</w:t>
       </w:r>
       <w:proofErr w:type="spellEnd"/>
     </w:p>
     <w:p>
-      <w:r>
+      <w:pPr>
+        <w:rPr>
+          <w:highlight w:val="green"/>
+        </w:rPr>
+      </w:pPr>
+      <w:r>
+        <w:rPr>
+          <w:highlight w:val="green"/>
+        </w:rPr>
         <w:t xml:space="preserve">- </w:t>
       </w:r>
       <w:proofErr w:type="gramStart"/>
       <w:r>
+        <w:rPr>
+          <w:highlight w:val="green"/>
+        </w:rPr>
         <w:t>[ ]</w:t>
       </w:r>
       <w:proofErr w:type="gramEnd"/>
       <w:r>
+        <w:rPr>
+          <w:highlight w:val="green"/>
+        </w:rPr>
         <w:t xml:space="preserve"> `</w:t>
       </w:r>
       <w:proofErr w:type="spellStart"/>
       <w:r>
+        <w:rPr>
+          <w:highlight w:val="green"/>
+        </w:rPr>
         <w:t>pytest</w:t>
       </w:r>
       <w:proofErr w:type="spellEnd"/>
       <w:r>
+        <w:rPr>
+          <w:highlight w:val="green"/>
+        </w:rPr>
         <w:t xml:space="preserve"> tests/integration` </w:t>
       </w:r>
       <w:proofErr w:type="spellStart"/>
       <w:r>
+        <w:rPr>
+          <w:highlight w:val="green"/>
+        </w:rPr>
         <w:t>esegue</w:t>
       </w:r>
       <w:proofErr w:type="spellEnd"/>
       <w:r>
+        <w:rPr>
+          <w:highlight w:val="green"/>
+        </w:rPr>
         <w:t xml:space="preserve"> test con DB</w:t>
       </w:r>
     </w:p>
     <w:p>
       <w:pPr>
         <w:rPr>
-          <w:lang w:val="it-IT"/>
-        </w:rPr>
-      </w:pPr>
-      <w:r>
-        <w:rPr>
+          <w:highlight w:val="green"/>
+          <w:lang w:val="it-IT"/>
+        </w:rPr>
+      </w:pPr>
+      <w:r>
+        <w:rPr>
+          <w:highlight w:val="green"/>
           <w:lang w:val="it-IT"/>
         </w:rPr>
         <w:t xml:space="preserve">- </w:t>
@@ -52960,6 +53254,7 @@
       <w:proofErr w:type="gramStart"/>
       <w:r>
         <w:rPr>
+          <w:highlight w:val="green"/>
           <w:lang w:val="it-IT"/>
         </w:rPr>
         <w:t>[ ]</w:t>
@@ -52967,6 +53262,7 @@
       <w:proofErr w:type="gramEnd"/>
       <w:r>
         <w:rPr>
+          <w:highlight w:val="green"/>
           <w:lang w:val="it-IT"/>
         </w:rPr>
         <w:t xml:space="preserve"> Database test isolato da produzione</w:t>
@@ -52980,6 +53276,7 @@
       </w:pPr>
       <w:r>
         <w:rPr>
+          <w:highlight w:val="green"/>
           <w:lang w:val="it-IT"/>
         </w:rPr>
         <w:t xml:space="preserve">- </w:t>
@@ -52987,6 +53284,7 @@
       <w:proofErr w:type="gramStart"/>
       <w:r>
         <w:rPr>
+          <w:highlight w:val="green"/>
           <w:lang w:val="it-IT"/>
         </w:rPr>
         <w:t>[ ]</w:t>
@@ -52994,6 +53292,7 @@
       <w:proofErr w:type="gramEnd"/>
       <w:r>
         <w:rPr>
+          <w:highlight w:val="green"/>
           <w:lang w:val="it-IT"/>
         </w:rPr>
         <w:t xml:space="preserve"> Coverage report generato</w:t>

</xml_diff>

<commit_message>
feat: Introduce AGENTS.md documentation outlining testing tasks and add unit tests for Money, Percentage, and PriceTarget value objects.
</commit_message>
<xml_diff>
--- a/Piano-operativo-v1.7.docx
+++ b/Piano-operativo-v1.7.docx
@@ -8811,71 +8811,7 @@
           <w:highlight w:val="green"/>
           <w:lang w:val="it-IT"/>
         </w:rPr>
-        <w:t>Implementare funzioni: </w:t>
-      </w:r>
-      <w:proofErr w:type="spellStart"/>
-      <w:r>
-        <w:rPr>
-          <w:highlight w:val="green"/>
-          <w:lang w:val="it-IT"/>
-        </w:rPr>
-        <w:t>addPercentage</w:t>
-      </w:r>
-      <w:proofErr w:type="spellEnd"/>
-      <w:r>
-        <w:rPr>
-          <w:highlight w:val="green"/>
-          <w:lang w:val="it-IT"/>
-        </w:rPr>
-        <w:t>, </w:t>
-      </w:r>
-      <w:proofErr w:type="spellStart"/>
-      <w:r>
-        <w:rPr>
-          <w:highlight w:val="green"/>
-          <w:lang w:val="it-IT"/>
-        </w:rPr>
-        <w:t>subtractPercentage</w:t>
-      </w:r>
-      <w:proofErr w:type="spellEnd"/>
-      <w:r>
-        <w:rPr>
-          <w:highlight w:val="green"/>
-          <w:lang w:val="it-IT"/>
-        </w:rPr>
-        <w:t>, </w:t>
-      </w:r>
-      <w:proofErr w:type="spellStart"/>
-      <w:r>
-        <w:rPr>
-          <w:highlight w:val="green"/>
-          <w:lang w:val="it-IT"/>
-        </w:rPr>
-        <w:t>formatPercentage</w:t>
-      </w:r>
-      <w:proofErr w:type="spellEnd"/>
-      <w:r>
-        <w:rPr>
-          <w:highlight w:val="green"/>
-          <w:lang w:val="it-IT"/>
-        </w:rPr>
-        <w:t>(</w:t>
-      </w:r>
-      <w:proofErr w:type="spellStart"/>
-      <w:r>
-        <w:rPr>
-          <w:highlight w:val="green"/>
-          <w:lang w:val="it-IT"/>
-        </w:rPr>
-        <w:t>percentage</w:t>
-      </w:r>
-      <w:proofErr w:type="spellEnd"/>
-      <w:r>
-        <w:rPr>
-          <w:highlight w:val="green"/>
-          <w:lang w:val="it-IT"/>
-        </w:rPr>
-        <w:t xml:space="preserve">, </w:t>
+        <w:t xml:space="preserve">Implementare funzioni: addPercentage, subtractPercentage, formatPercentage(percentage, </w:t>
       </w:r>
       <w:proofErr w:type="spellStart"/>
       <w:r>
@@ -53312,93 +53248,181 @@
     </w:p>
     <w:p/>
     <w:p>
-      <w:r>
+      <w:pPr>
+        <w:rPr>
+          <w:highlight w:val="green"/>
+        </w:rPr>
+      </w:pPr>
+      <w:r>
+        <w:rPr>
+          <w:highlight w:val="green"/>
+        </w:rPr>
         <w:t xml:space="preserve">## TASK 5.2: </w:t>
       </w:r>
       <w:proofErr w:type="spellStart"/>
       <w:r>
+        <w:rPr>
+          <w:highlight w:val="green"/>
+        </w:rPr>
         <w:t>Scrivere</w:t>
       </w:r>
       <w:proofErr w:type="spellEnd"/>
       <w:r>
+        <w:rPr>
+          <w:highlight w:val="green"/>
+        </w:rPr>
         <w:t xml:space="preserve"> Unit Test per Value Objects</w:t>
       </w:r>
     </w:p>
-    <w:p/>
-    <w:p>
-      <w:r>
+    <w:p>
+      <w:pPr>
+        <w:rPr>
+          <w:highlight w:val="green"/>
+        </w:rPr>
+      </w:pPr>
+    </w:p>
+    <w:p>
+      <w:pPr>
+        <w:rPr>
+          <w:highlight w:val="green"/>
+        </w:rPr>
+      </w:pPr>
+      <w:r>
+        <w:rPr>
+          <w:highlight w:val="green"/>
+        </w:rPr>
         <w:t>**</w:t>
       </w:r>
       <w:proofErr w:type="spellStart"/>
       <w:proofErr w:type="gramStart"/>
       <w:r>
+        <w:rPr>
+          <w:highlight w:val="green"/>
+        </w:rPr>
         <w:t>Descrizione</w:t>
       </w:r>
       <w:proofErr w:type="spellEnd"/>
       <w:r>
+        <w:rPr>
+          <w:highlight w:val="green"/>
+        </w:rPr>
         <w:t>:*</w:t>
       </w:r>
       <w:proofErr w:type="gramEnd"/>
       <w:r>
+        <w:rPr>
+          <w:highlight w:val="green"/>
+        </w:rPr>
         <w:t xml:space="preserve">* Test </w:t>
       </w:r>
       <w:proofErr w:type="spellStart"/>
       <w:r>
+        <w:rPr>
+          <w:highlight w:val="green"/>
+        </w:rPr>
         <w:t>completi</w:t>
       </w:r>
       <w:proofErr w:type="spellEnd"/>
       <w:r>
+        <w:rPr>
+          <w:highlight w:val="green"/>
+        </w:rPr>
         <w:t xml:space="preserve"> per Money, Percentage, </w:t>
       </w:r>
       <w:proofErr w:type="spellStart"/>
       <w:r>
+        <w:rPr>
+          <w:highlight w:val="green"/>
+        </w:rPr>
         <w:t>PriceTarget</w:t>
       </w:r>
       <w:proofErr w:type="spellEnd"/>
       <w:r>
+        <w:rPr>
+          <w:highlight w:val="green"/>
+        </w:rPr>
         <w:t>.</w:t>
       </w:r>
     </w:p>
-    <w:p/>
-    <w:p>
-      <w:r>
+    <w:p>
+      <w:pPr>
+        <w:rPr>
+          <w:highlight w:val="green"/>
+        </w:rPr>
+      </w:pPr>
+    </w:p>
+    <w:p>
+      <w:pPr>
+        <w:rPr>
+          <w:highlight w:val="green"/>
+        </w:rPr>
+      </w:pPr>
+      <w:r>
+        <w:rPr>
+          <w:highlight w:val="green"/>
+        </w:rPr>
         <w:t>**</w:t>
       </w:r>
       <w:proofErr w:type="spellStart"/>
       <w:proofErr w:type="gramStart"/>
       <w:r>
+        <w:rPr>
+          <w:highlight w:val="green"/>
+        </w:rPr>
         <w:t>Microstep</w:t>
       </w:r>
       <w:proofErr w:type="spellEnd"/>
       <w:r>
+        <w:rPr>
+          <w:highlight w:val="green"/>
+        </w:rPr>
         <w:t>:*</w:t>
       </w:r>
       <w:proofErr w:type="gramEnd"/>
       <w:r>
+        <w:rPr>
+          <w:highlight w:val="green"/>
+        </w:rPr>
         <w:t>*</w:t>
       </w:r>
     </w:p>
     <w:p>
-      <w:r>
+      <w:pPr>
+        <w:rPr>
+          <w:highlight w:val="green"/>
+        </w:rPr>
+      </w:pPr>
+      <w:r>
+        <w:rPr>
+          <w:highlight w:val="green"/>
+        </w:rPr>
         <w:t xml:space="preserve">1. </w:t>
       </w:r>
       <w:proofErr w:type="spellStart"/>
       <w:r>
+        <w:rPr>
+          <w:highlight w:val="green"/>
+        </w:rPr>
         <w:t>Creare</w:t>
       </w:r>
       <w:proofErr w:type="spellEnd"/>
       <w:r>
+        <w:rPr>
+          <w:highlight w:val="green"/>
+        </w:rPr>
         <w:t xml:space="preserve"> file `backend/tests/unit/shared/test_money.py`</w:t>
       </w:r>
     </w:p>
     <w:p>
       <w:pPr>
         <w:rPr>
-          <w:lang w:val="it-IT"/>
-        </w:rPr>
-      </w:pPr>
-      <w:r>
-        <w:rPr>
+          <w:highlight w:val="green"/>
+          <w:lang w:val="it-IT"/>
+        </w:rPr>
+      </w:pPr>
+      <w:r>
+        <w:rPr>
+          <w:highlight w:val="green"/>
           <w:lang w:val="it-IT"/>
         </w:rPr>
         <w:t>2. Testare creazione Money con vari input (</w:t>
@@ -53406,6 +53430,7 @@
       <w:proofErr w:type="spellStart"/>
       <w:r>
         <w:rPr>
+          <w:highlight w:val="green"/>
           <w:lang w:val="it-IT"/>
         </w:rPr>
         <w:t>Decimal</w:t>
@@ -53413,6 +53438,7 @@
       <w:proofErr w:type="spellEnd"/>
       <w:r>
         <w:rPr>
+          <w:highlight w:val="green"/>
           <w:lang w:val="it-IT"/>
         </w:rPr>
         <w:t xml:space="preserve">, </w:t>
@@ -53420,6 +53446,7 @@
       <w:proofErr w:type="spellStart"/>
       <w:r>
         <w:rPr>
+          <w:highlight w:val="green"/>
           <w:lang w:val="it-IT"/>
         </w:rPr>
         <w:t>int</w:t>
@@ -53427,6 +53454,7 @@
       <w:proofErr w:type="spellEnd"/>
       <w:r>
         <w:rPr>
+          <w:highlight w:val="green"/>
           <w:lang w:val="it-IT"/>
         </w:rPr>
         <w:t xml:space="preserve">, float, </w:t>
@@ -53434,6 +53462,7 @@
       <w:proofErr w:type="spellStart"/>
       <w:r>
         <w:rPr>
+          <w:highlight w:val="green"/>
           <w:lang w:val="it-IT"/>
         </w:rPr>
         <w:t>string</w:t>
@@ -53441,6 +53470,7 @@
       <w:proofErr w:type="spellEnd"/>
       <w:r>
         <w:rPr>
+          <w:highlight w:val="green"/>
           <w:lang w:val="it-IT"/>
         </w:rPr>
         <w:t>)</w:t>
@@ -53449,11 +53479,13 @@
     <w:p>
       <w:pPr>
         <w:rPr>
-          <w:lang w:val="it-IT"/>
-        </w:rPr>
-      </w:pPr>
-      <w:r>
-        <w:rPr>
+          <w:highlight w:val="green"/>
+          <w:lang w:val="it-IT"/>
+        </w:rPr>
+      </w:pPr>
+      <w:r>
+        <w:rPr>
+          <w:highlight w:val="green"/>
           <w:lang w:val="it-IT"/>
         </w:rPr>
         <w:lastRenderedPageBreak/>
@@ -53462,6 +53494,7 @@
       <w:proofErr w:type="spellStart"/>
       <w:r>
         <w:rPr>
+          <w:highlight w:val="green"/>
           <w:lang w:val="it-IT"/>
         </w:rPr>
         <w:t>add</w:t>
@@ -53469,6 +53502,7 @@
       <w:proofErr w:type="spellEnd"/>
       <w:r>
         <w:rPr>
+          <w:highlight w:val="green"/>
           <w:lang w:val="it-IT"/>
         </w:rPr>
         <w:t xml:space="preserve">, sub, </w:t>
@@ -53476,6 +53510,7 @@
       <w:proofErr w:type="spellStart"/>
       <w:r>
         <w:rPr>
+          <w:highlight w:val="green"/>
           <w:lang w:val="it-IT"/>
         </w:rPr>
         <w:t>mul</w:t>
@@ -53483,6 +53518,7 @@
       <w:proofErr w:type="spellEnd"/>
       <w:r>
         <w:rPr>
+          <w:highlight w:val="green"/>
           <w:lang w:val="it-IT"/>
         </w:rPr>
         <w:t>)</w:t>
@@ -53491,11 +53527,13 @@
     <w:p>
       <w:pPr>
         <w:rPr>
-          <w:lang w:val="it-IT"/>
-        </w:rPr>
-      </w:pPr>
-      <w:r>
-        <w:rPr>
+          <w:highlight w:val="green"/>
+          <w:lang w:val="it-IT"/>
+        </w:rPr>
+      </w:pPr>
+      <w:r>
+        <w:rPr>
+          <w:highlight w:val="green"/>
           <w:lang w:val="it-IT"/>
         </w:rPr>
         <w:t xml:space="preserve">4. Testare errore su </w:t>
@@ -53503,6 +53541,7 @@
       <w:proofErr w:type="spellStart"/>
       <w:r>
         <w:rPr>
+          <w:highlight w:val="green"/>
           <w:lang w:val="it-IT"/>
         </w:rPr>
         <w:t>currency</w:t>
@@ -53510,6 +53549,7 @@
       <w:proofErr w:type="spellEnd"/>
       <w:r>
         <w:rPr>
+          <w:highlight w:val="green"/>
           <w:lang w:val="it-IT"/>
         </w:rPr>
         <w:t xml:space="preserve"> mismatch</w:t>
@@ -53518,11 +53558,13 @@
     <w:p>
       <w:pPr>
         <w:rPr>
-          <w:lang w:val="it-IT"/>
-        </w:rPr>
-      </w:pPr>
-      <w:r>
-        <w:rPr>
+          <w:highlight w:val="green"/>
+          <w:lang w:val="it-IT"/>
+        </w:rPr>
+      </w:pPr>
+      <w:r>
+        <w:rPr>
+          <w:highlight w:val="green"/>
           <w:lang w:val="it-IT"/>
         </w:rPr>
         <w:t>5. Testare round con vari decimali</w:t>
@@ -53531,11 +53573,13 @@
     <w:p>
       <w:pPr>
         <w:rPr>
-          <w:lang w:val="it-IT"/>
-        </w:rPr>
-      </w:pPr>
-      <w:r>
-        <w:rPr>
+          <w:highlight w:val="green"/>
+          <w:lang w:val="it-IT"/>
+        </w:rPr>
+      </w:pPr>
+      <w:r>
+        <w:rPr>
+          <w:highlight w:val="green"/>
           <w:lang w:val="it-IT"/>
         </w:rPr>
         <w:t>6. Testare serializzazione/</w:t>
@@ -53543,6 +53587,7 @@
       <w:proofErr w:type="spellStart"/>
       <w:r>
         <w:rPr>
+          <w:highlight w:val="green"/>
           <w:lang w:val="it-IT"/>
         </w:rPr>
         <w:t>deserializzazione</w:t>
@@ -53550,148 +53595,298 @@
       <w:proofErr w:type="spellEnd"/>
     </w:p>
     <w:p>
-      <w:r>
+      <w:pPr>
+        <w:rPr>
+          <w:highlight w:val="green"/>
+        </w:rPr>
+      </w:pPr>
+      <w:r>
+        <w:rPr>
+          <w:highlight w:val="green"/>
+        </w:rPr>
         <w:t xml:space="preserve">7. </w:t>
       </w:r>
       <w:proofErr w:type="spellStart"/>
       <w:r>
+        <w:rPr>
+          <w:highlight w:val="green"/>
+        </w:rPr>
         <w:t>Creare</w:t>
       </w:r>
       <w:proofErr w:type="spellEnd"/>
       <w:r>
+        <w:rPr>
+          <w:highlight w:val="green"/>
+        </w:rPr>
         <w:t xml:space="preserve"> file `backend/tests/unit/shared/test_percentage.py`</w:t>
       </w:r>
     </w:p>
     <w:p>
-      <w:r>
+      <w:pPr>
+        <w:rPr>
+          <w:highlight w:val="green"/>
+        </w:rPr>
+      </w:pPr>
+      <w:r>
+        <w:rPr>
+          <w:highlight w:val="green"/>
+        </w:rPr>
         <w:t xml:space="preserve">8. </w:t>
       </w:r>
       <w:proofErr w:type="spellStart"/>
       <w:r>
+        <w:rPr>
+          <w:highlight w:val="green"/>
+        </w:rPr>
         <w:t>Testare</w:t>
       </w:r>
       <w:proofErr w:type="spellEnd"/>
       <w:r>
+        <w:rPr>
+          <w:highlight w:val="green"/>
+        </w:rPr>
         <w:t xml:space="preserve"> </w:t>
       </w:r>
       <w:proofErr w:type="spellStart"/>
       <w:r>
+        <w:rPr>
+          <w:highlight w:val="green"/>
+        </w:rPr>
         <w:t>from_basis_points</w:t>
       </w:r>
       <w:proofErr w:type="spellEnd"/>
     </w:p>
     <w:p>
-      <w:r>
+      <w:pPr>
+        <w:rPr>
+          <w:highlight w:val="green"/>
+        </w:rPr>
+      </w:pPr>
+      <w:r>
+        <w:rPr>
+          <w:highlight w:val="green"/>
+        </w:rPr>
         <w:t xml:space="preserve">9. </w:t>
       </w:r>
       <w:proofErr w:type="spellStart"/>
       <w:r>
+        <w:rPr>
+          <w:highlight w:val="green"/>
+        </w:rPr>
         <w:t>Testare</w:t>
       </w:r>
       <w:proofErr w:type="spellEnd"/>
       <w:r>
+        <w:rPr>
+          <w:highlight w:val="green"/>
+        </w:rPr>
         <w:t xml:space="preserve"> </w:t>
       </w:r>
       <w:proofErr w:type="spellStart"/>
       <w:proofErr w:type="gramStart"/>
       <w:r>
+        <w:rPr>
+          <w:highlight w:val="green"/>
+        </w:rPr>
         <w:t>apply_</w:t>
       </w:r>
       <w:proofErr w:type="gramEnd"/>
       <w:r>
+        <w:rPr>
+          <w:highlight w:val="green"/>
+        </w:rPr>
         <w:t>to</w:t>
       </w:r>
       <w:proofErr w:type="spellEnd"/>
       <w:r>
+        <w:rPr>
+          <w:highlight w:val="green"/>
+        </w:rPr>
         <w:t xml:space="preserve"> Money</w:t>
       </w:r>
     </w:p>
     <w:p>
-      <w:r>
+      <w:pPr>
+        <w:rPr>
+          <w:highlight w:val="green"/>
+        </w:rPr>
+      </w:pPr>
+      <w:r>
+        <w:rPr>
+          <w:highlight w:val="green"/>
+        </w:rPr>
         <w:t xml:space="preserve">10. </w:t>
       </w:r>
       <w:proofErr w:type="spellStart"/>
       <w:r>
+        <w:rPr>
+          <w:highlight w:val="green"/>
+        </w:rPr>
         <w:t>Creare</w:t>
       </w:r>
       <w:proofErr w:type="spellEnd"/>
       <w:r>
+        <w:rPr>
+          <w:highlight w:val="green"/>
+        </w:rPr>
         <w:t xml:space="preserve"> file `backend/tests/unit/shared/test_price_target.py`</w:t>
       </w:r>
     </w:p>
     <w:p>
-      <w:r>
+      <w:pPr>
+        <w:rPr>
+          <w:highlight w:val="green"/>
+        </w:rPr>
+      </w:pPr>
+      <w:r>
+        <w:rPr>
+          <w:highlight w:val="green"/>
+        </w:rPr>
         <w:t xml:space="preserve">11. </w:t>
       </w:r>
       <w:proofErr w:type="spellStart"/>
       <w:r>
+        <w:rPr>
+          <w:highlight w:val="green"/>
+        </w:rPr>
         <w:t>Testare</w:t>
       </w:r>
       <w:proofErr w:type="spellEnd"/>
       <w:r>
+        <w:rPr>
+          <w:highlight w:val="green"/>
+        </w:rPr>
         <w:t xml:space="preserve"> </w:t>
       </w:r>
       <w:proofErr w:type="spellStart"/>
       <w:r>
+        <w:rPr>
+          <w:highlight w:val="green"/>
+        </w:rPr>
         <w:t>validazioni</w:t>
       </w:r>
       <w:proofErr w:type="spellEnd"/>
       <w:r>
+        <w:rPr>
+          <w:highlight w:val="green"/>
+        </w:rPr>
         <w:t xml:space="preserve"> LONG e SHORT</w:t>
       </w:r>
     </w:p>
     <w:p>
-      <w:r>
+      <w:pPr>
+        <w:rPr>
+          <w:highlight w:val="green"/>
+        </w:rPr>
+      </w:pPr>
+      <w:r>
+        <w:rPr>
+          <w:highlight w:val="green"/>
+        </w:rPr>
         <w:t xml:space="preserve">12. </w:t>
       </w:r>
       <w:proofErr w:type="spellStart"/>
       <w:r>
+        <w:rPr>
+          <w:highlight w:val="green"/>
+        </w:rPr>
         <w:t>Testare</w:t>
       </w:r>
       <w:proofErr w:type="spellEnd"/>
       <w:r>
+        <w:rPr>
+          <w:highlight w:val="green"/>
+        </w:rPr>
         <w:t xml:space="preserve"> </w:t>
       </w:r>
       <w:proofErr w:type="spellStart"/>
       <w:proofErr w:type="gramStart"/>
       <w:r>
+        <w:rPr>
+          <w:highlight w:val="green"/>
+        </w:rPr>
         <w:t>risk_reward_</w:t>
       </w:r>
       <w:proofErr w:type="gramEnd"/>
       <w:r>
+        <w:rPr>
+          <w:highlight w:val="green"/>
+        </w:rPr>
         <w:t>ratio</w:t>
       </w:r>
       <w:proofErr w:type="spellEnd"/>
     </w:p>
-    <w:p/>
-    <w:p>
-      <w:r>
+    <w:p>
+      <w:pPr>
+        <w:rPr>
+          <w:highlight w:val="green"/>
+        </w:rPr>
+      </w:pPr>
+    </w:p>
+    <w:p>
+      <w:pPr>
+        <w:rPr>
+          <w:highlight w:val="green"/>
+        </w:rPr>
+      </w:pPr>
+      <w:r>
+        <w:rPr>
+          <w:highlight w:val="green"/>
+        </w:rPr>
         <w:t xml:space="preserve">**Acceptance </w:t>
       </w:r>
       <w:proofErr w:type="gramStart"/>
       <w:r>
+        <w:rPr>
+          <w:highlight w:val="green"/>
+        </w:rPr>
         <w:t>Criteria:*</w:t>
       </w:r>
       <w:proofErr w:type="gramEnd"/>
       <w:r>
+        <w:rPr>
+          <w:highlight w:val="green"/>
+        </w:rPr>
         <w:t>*</w:t>
       </w:r>
     </w:p>
     <w:p>
-      <w:r>
+      <w:pPr>
+        <w:rPr>
+          <w:highlight w:val="green"/>
+        </w:rPr>
+      </w:pPr>
+      <w:r>
+        <w:rPr>
+          <w:highlight w:val="green"/>
+        </w:rPr>
         <w:t xml:space="preserve">- </w:t>
       </w:r>
       <w:proofErr w:type="gramStart"/>
       <w:r>
+        <w:rPr>
+          <w:highlight w:val="green"/>
+        </w:rPr>
         <w:t>[ ]</w:t>
       </w:r>
       <w:proofErr w:type="gramEnd"/>
       <w:r>
+        <w:rPr>
+          <w:highlight w:val="green"/>
+        </w:rPr>
         <w:t xml:space="preserve"> Coverage 100% sui value objects</w:t>
       </w:r>
     </w:p>
     <w:p>
-      <w:r>
+      <w:pPr>
+        <w:rPr>
+          <w:highlight w:val="green"/>
+        </w:rPr>
+      </w:pPr>
+      <w:r>
+        <w:rPr>
+          <w:highlight w:val="green"/>
+        </w:rPr>
         <w:t>- [ ] Edge cases coperti (zero, negativo, overflow)</w:t>
       </w:r>
     </w:p>
@@ -53703,6 +53898,7 @@
       </w:pPr>
       <w:r>
         <w:rPr>
+          <w:highlight w:val="green"/>
           <w:lang w:val="it-IT"/>
         </w:rPr>
         <w:t xml:space="preserve">- </w:t>
@@ -53710,6 +53906,7 @@
       <w:proofErr w:type="gramStart"/>
       <w:r>
         <w:rPr>
+          <w:highlight w:val="green"/>
           <w:lang w:val="it-IT"/>
         </w:rPr>
         <w:t>[ ]</w:t>
@@ -53717,6 +53914,7 @@
       <w:proofErr w:type="gramEnd"/>
       <w:r>
         <w:rPr>
+          <w:highlight w:val="green"/>
           <w:lang w:val="it-IT"/>
         </w:rPr>
         <w:t xml:space="preserve"> Errori attesi sollevano eccezioni corrette</w:t>

</xml_diff>